<commit_message>
Agregue los puntos 5, 6
Solo están 4 microservicios
</commit_message>
<xml_diff>
--- a/Guía_actividad.docx
+++ b/Guía_actividad.docx
@@ -1,6 +1,6 @@
 
 <file path=word/document.xml><?xml version="1.0" encoding="utf-8"?>
-<w:document xmlns:wpc="http://schemas.microsoft.com/office/word/2010/wordprocessingCanvas" xmlns:mc="http://schemas.openxmlformats.org/markup-compatibility/2006" xmlns:o="urn:schemas-microsoft-com:office:office" xmlns:r="http://schemas.openxmlformats.org/officeDocument/2006/relationships" xmlns:m="http://schemas.openxmlformats.org/officeDocument/2006/math" xmlns:v="urn:schemas-microsoft-com:vml" xmlns:wp14="http://schemas.microsoft.com/office/word/2010/wordprocessingDrawing" xmlns:wp="http://schemas.openxmlformats.org/drawingml/2006/wordprocessingDrawing" xmlns:w10="urn:schemas-microsoft-com:office:word" xmlns:w="http://schemas.openxmlformats.org/wordprocessingml/2006/main" xmlns:w14="http://schemas.microsoft.com/office/word/2010/wordml" xmlns:w15="http://schemas.microsoft.com/office/word/2012/wordml" xmlns:wpg="http://schemas.microsoft.com/office/word/2010/wordprocessingGroup" xmlns:wpi="http://schemas.microsoft.com/office/word/2010/wordprocessingInk" xmlns:wne="http://schemas.microsoft.com/office/word/2006/wordml" xmlns:wps="http://schemas.microsoft.com/office/word/2010/wordprocessingShape" mc:Ignorable="w14 w15 wp14">
+<w:document xmlns:wpc="http://schemas.microsoft.com/office/word/2010/wordprocessingCanvas" xmlns:cx="http://schemas.microsoft.com/office/drawing/2014/chartex" xmlns:cx1="http://schemas.microsoft.com/office/drawing/2015/9/8/chartex" xmlns:cx2="http://schemas.microsoft.com/office/drawing/2015/10/21/chartex" xmlns:cx3="http://schemas.microsoft.com/office/drawing/2016/5/9/chartex" xmlns:cx4="http://schemas.microsoft.com/office/drawing/2016/5/10/chartex" xmlns:cx5="http://schemas.microsoft.com/office/drawing/2016/5/11/chartex" xmlns:cx6="http://schemas.microsoft.com/office/drawing/2016/5/12/chartex" xmlns:cx7="http://schemas.microsoft.com/office/drawing/2016/5/13/chartex" xmlns:cx8="http://schemas.microsoft.com/office/drawing/2016/5/14/chartex" xmlns:mc="http://schemas.openxmlformats.org/markup-compatibility/2006" xmlns:aink="http://schemas.microsoft.com/office/drawing/2016/ink" xmlns:am3d="http://schemas.microsoft.com/office/drawing/2017/model3d" xmlns:o="urn:schemas-microsoft-com:office:office" xmlns:oel="http://schemas.microsoft.com/office/2019/extlst" xmlns:r="http://schemas.openxmlformats.org/officeDocument/2006/relationships" xmlns:m="http://schemas.openxmlformats.org/officeDocument/2006/math" xmlns:v="urn:schemas-microsoft-com:vml" xmlns:wp14="http://schemas.microsoft.com/office/word/2010/wordprocessingDrawing" xmlns:wp="http://schemas.openxmlformats.org/drawingml/2006/wordprocessingDrawing" xmlns:w10="urn:schemas-microsoft-com:office:word" xmlns:w="http://schemas.openxmlformats.org/wordprocessingml/2006/main" xmlns:w14="http://schemas.microsoft.com/office/word/2010/wordml" xmlns:w15="http://schemas.microsoft.com/office/word/2012/wordml" xmlns:w16cex="http://schemas.microsoft.com/office/word/2018/wordml/cex" xmlns:w16cid="http://schemas.microsoft.com/office/word/2016/wordml/cid" xmlns:w16="http://schemas.microsoft.com/office/word/2018/wordml" xmlns:w16du="http://schemas.microsoft.com/office/word/2023/wordml/word16du" xmlns:w16sdtdh="http://schemas.microsoft.com/office/word/2020/wordml/sdtdatahash" xmlns:w16sdtfl="http://schemas.microsoft.com/office/word/2024/wordml/sdtformatlock" xmlns:w16se="http://schemas.microsoft.com/office/word/2015/wordml/symex" xmlns:wpg="http://schemas.microsoft.com/office/word/2010/wordprocessingGroup" xmlns:wpi="http://schemas.microsoft.com/office/word/2010/wordprocessingInk" xmlns:wne="http://schemas.microsoft.com/office/word/2006/wordml" xmlns:wps="http://schemas.microsoft.com/office/word/2010/wordprocessingShape" mc:Ignorable="w14 w15 w16se w16cid w16 w16cex w16sdtdh w16sdtfl w16du wp14">
   <w:body>
     <w:p>
       <w:pPr>
@@ -46,19 +46,8 @@
           <w:iCs w:val="0"/>
           <w:color w:val="auto"/>
         </w:rPr>
-        <w:t xml:space="preserve">Arquitectura del Sistema en </w:t>
-      </w:r>
-      <w:proofErr w:type="spellStart"/>
-      <w:r>
-        <w:rPr>
-          <w:rFonts w:ascii="Arial" w:hAnsi="Arial" w:cs="Arial"/>
-          <w:i w:val="0"/>
-          <w:iCs w:val="0"/>
-          <w:color w:val="auto"/>
-        </w:rPr>
-        <w:t>GitHub</w:t>
-      </w:r>
-      <w:proofErr w:type="spellEnd"/>
+        <w:t>Arquitectura del Sistema en GitHub</w:t>
+      </w:r>
     </w:p>
     <w:p>
       <w:pPr>
@@ -235,19 +224,8 @@
           <w:szCs w:val="24"/>
           <w:lang w:eastAsia="es-CO"/>
         </w:rPr>
-        <w:t xml:space="preserve">Acceso al repositorio en </w:t>
-      </w:r>
-      <w:proofErr w:type="spellStart"/>
-      <w:r>
-        <w:rPr>
-          <w:rFonts w:ascii="Arial" w:eastAsia="Times New Roman" w:hAnsi="Arial" w:cs="Arial"/>
-          <w:sz w:val="24"/>
-          <w:szCs w:val="24"/>
-          <w:lang w:eastAsia="es-CO"/>
-        </w:rPr>
-        <w:t>GitHub</w:t>
-      </w:r>
-      <w:proofErr w:type="spellEnd"/>
+        <w:t>Acceso al repositorio en GitHub</w:t>
+      </w:r>
     </w:p>
     <w:p>
       <w:pPr>
@@ -796,30 +774,6 @@
     </w:p>
     <w:p>
       <w:pPr>
-        <w:pStyle w:val="Prrafodelista"/>
-        <w:numPr>
-          <w:ilvl w:val="0"/>
-          <w:numId w:val="31"/>
-        </w:numPr>
-        <w:spacing w:before="100" w:beforeAutospacing="1" w:after="100" w:afterAutospacing="1"/>
-        <w:jc w:val="both"/>
-        <w:rPr>
-          <w:rFonts w:ascii="Arial" w:hAnsi="Arial" w:cs="Arial"/>
-          <w:sz w:val="24"/>
-          <w:szCs w:val="24"/>
-        </w:rPr>
-      </w:pPr>
-      <w:r>
-        <w:rPr>
-          <w:rFonts w:ascii="Arial" w:hAnsi="Arial" w:cs="Arial"/>
-          <w:sz w:val="24"/>
-          <w:szCs w:val="24"/>
-        </w:rPr>
-        <w:t>Sistemas de geolocalización: Sugiere al cliente la sucursal más cercana o con menor tiempo de espera.</w:t>
-      </w:r>
-    </w:p>
-    <w:p>
-      <w:pPr>
         <w:numPr>
           <w:ilvl w:val="0"/>
           <w:numId w:val="2"/>
@@ -1134,7 +1088,6 @@
         <w:rPr>
           <w:rFonts w:ascii="Arial" w:hAnsi="Arial" w:cs="Arial"/>
         </w:rPr>
-        <w:lastRenderedPageBreak/>
         <w:t>¿Qué funciones principales tiene el sistema?</w:t>
       </w:r>
     </w:p>
@@ -1173,13 +1126,7 @@
         <w:rPr>
           <w:rFonts w:ascii="Arial" w:hAnsi="Arial" w:cs="Arial"/>
         </w:rPr>
-        <w:t>Registro de clientes</w:t>
-      </w:r>
-      <w:r>
-        <w:rPr>
-          <w:rFonts w:ascii="Arial" w:hAnsi="Arial" w:cs="Arial"/>
-        </w:rPr>
-        <w:t xml:space="preserve"> </w:t>
+        <w:t xml:space="preserve">Registro de clientes </w:t>
       </w:r>
     </w:p>
     <w:p>
@@ -1198,6 +1145,7 @@
         <w:rPr>
           <w:rFonts w:ascii="Arial" w:hAnsi="Arial" w:cs="Arial"/>
         </w:rPr>
+        <w:lastRenderedPageBreak/>
         <w:t xml:space="preserve">Asignación de ventanillas </w:t>
       </w:r>
     </w:p>
@@ -1217,13 +1165,7 @@
         <w:rPr>
           <w:rFonts w:ascii="Arial" w:hAnsi="Arial" w:cs="Arial"/>
         </w:rPr>
-        <w:t>Notificación al usuario</w:t>
-      </w:r>
-      <w:r>
-        <w:rPr>
-          <w:rFonts w:ascii="Arial" w:hAnsi="Arial" w:cs="Arial"/>
-        </w:rPr>
-        <w:t xml:space="preserve"> el estado de su turno</w:t>
+        <w:t>Notificación al usuario el estado de su turno</w:t>
       </w:r>
     </w:p>
     <w:p>
@@ -1591,6 +1533,42 @@
         <w:rPr>
           <w:rFonts w:ascii="Segoe UI Symbol" w:hAnsi="Segoe UI Symbol" w:cs="Segoe UI Symbol"/>
         </w:rPr>
+        <w:t>☐</w:t>
+      </w:r>
+      <w:r>
+        <w:rPr>
+          <w:rFonts w:ascii="Arial" w:hAnsi="Arial" w:cs="Arial"/>
+        </w:rPr>
+        <w:t xml:space="preserve"> Cliente–Servidor</w:t>
+      </w:r>
+      <w:r>
+        <w:rPr>
+          <w:rFonts w:ascii="Arial" w:hAnsi="Arial" w:cs="Arial"/>
+        </w:rPr>
+        <w:br/>
+      </w:r>
+      <w:r>
+        <w:rPr>
+          <w:rFonts w:ascii="Segoe UI Symbol" w:hAnsi="Segoe UI Symbol" w:cs="Segoe UI Symbol"/>
+        </w:rPr>
+        <w:t>☐</w:t>
+      </w:r>
+      <w:r>
+        <w:rPr>
+          <w:rFonts w:ascii="Arial" w:hAnsi="Arial" w:cs="Arial"/>
+        </w:rPr>
+        <w:t xml:space="preserve"> Arquitectura en capas</w:t>
+      </w:r>
+      <w:r>
+        <w:rPr>
+          <w:rFonts w:ascii="Arial" w:hAnsi="Arial" w:cs="Arial"/>
+        </w:rPr>
+        <w:br/>
+      </w:r>
+      <w:r>
+        <w:rPr>
+          <w:rFonts w:ascii="Segoe UI Symbol" w:hAnsi="Segoe UI Symbol" w:cs="Segoe UI Symbol"/>
+        </w:rPr>
         <w:lastRenderedPageBreak/>
         <w:t>☐</w:t>
       </w:r>
@@ -1598,52 +1576,8 @@
         <w:rPr>
           <w:rFonts w:ascii="Arial" w:hAnsi="Arial" w:cs="Arial"/>
         </w:rPr>
-        <w:t xml:space="preserve"> Cliente–Servidor</w:t>
-      </w:r>
-      <w:r>
-        <w:rPr>
-          <w:rFonts w:ascii="Arial" w:hAnsi="Arial" w:cs="Arial"/>
-        </w:rPr>
-        <w:br/>
-      </w:r>
-      <w:r>
-        <w:rPr>
-          <w:rFonts w:ascii="Segoe UI Symbol" w:hAnsi="Segoe UI Symbol" w:cs="Segoe UI Symbol"/>
-        </w:rPr>
-        <w:t>☐</w:t>
-      </w:r>
-      <w:r>
-        <w:rPr>
-          <w:rFonts w:ascii="Arial" w:hAnsi="Arial" w:cs="Arial"/>
-        </w:rPr>
-        <w:t xml:space="preserve"> Arquitectura en capas</w:t>
-      </w:r>
-      <w:r>
-        <w:rPr>
-          <w:rFonts w:ascii="Arial" w:hAnsi="Arial" w:cs="Arial"/>
-        </w:rPr>
-        <w:br/>
-      </w:r>
-      <w:r>
-        <w:rPr>
-          <w:rFonts w:ascii="Segoe UI Symbol" w:hAnsi="Segoe UI Symbol" w:cs="Segoe UI Symbol"/>
-        </w:rPr>
-        <w:t>☐</w:t>
-      </w:r>
-      <w:r>
-        <w:rPr>
-          <w:rFonts w:ascii="Arial" w:hAnsi="Arial" w:cs="Arial"/>
-        </w:rPr>
-        <w:t xml:space="preserve"> </w:t>
-      </w:r>
-      <w:proofErr w:type="spellStart"/>
-      <w:r>
-        <w:rPr>
-          <w:rFonts w:ascii="Arial" w:hAnsi="Arial" w:cs="Arial"/>
-        </w:rPr>
-        <w:t>Microservicios</w:t>
-      </w:r>
-      <w:proofErr w:type="spellEnd"/>
+        <w:t xml:space="preserve"> Microservicios</w:t>
+      </w:r>
       <w:r>
         <w:rPr>
           <w:rFonts w:ascii="Arial" w:hAnsi="Arial" w:cs="Arial"/>
@@ -1862,13 +1796,17 @@
         <w:jc w:val="both"/>
         <w:rPr>
           <w:rFonts w:ascii="Arial" w:hAnsi="Arial" w:cs="Arial"/>
-        </w:rPr>
-      </w:pPr>
-      <w:r>
-        <w:rPr>
-          <w:rFonts w:ascii="Arial" w:hAnsi="Arial" w:cs="Arial"/>
-        </w:rPr>
-        <w:t>Respondan:</w:t>
+          <w:b/>
+          <w:bCs/>
+        </w:rPr>
+      </w:pPr>
+      <w:r>
+        <w:rPr>
+          <w:rFonts w:ascii="Arial" w:hAnsi="Arial" w:cs="Arial"/>
+          <w:b/>
+          <w:bCs/>
+        </w:rPr>
+        <w:t>¿Qué información debe guardarse?</w:t>
       </w:r>
     </w:p>
     <w:p>
@@ -1876,7 +1814,7 @@
         <w:pStyle w:val="NormalWeb"/>
         <w:numPr>
           <w:ilvl w:val="0"/>
-          <w:numId w:val="23"/>
+          <w:numId w:val="36"/>
         </w:numPr>
         <w:jc w:val="both"/>
         <w:rPr>
@@ -1887,7 +1825,7 @@
         <w:rPr>
           <w:rFonts w:ascii="Arial" w:hAnsi="Arial" w:cs="Arial"/>
         </w:rPr>
-        <w:t>¿Qué información debe guardarse?</w:t>
+        <w:t>Clientes: Cédula, nombre, tipo de trámite solicitado.</w:t>
       </w:r>
     </w:p>
     <w:p>
@@ -1895,7 +1833,7 @@
         <w:pStyle w:val="NormalWeb"/>
         <w:numPr>
           <w:ilvl w:val="0"/>
-          <w:numId w:val="23"/>
+          <w:numId w:val="36"/>
         </w:numPr>
         <w:jc w:val="both"/>
         <w:rPr>
@@ -1906,7 +1844,7 @@
         <w:rPr>
           <w:rFonts w:ascii="Arial" w:hAnsi="Arial" w:cs="Arial"/>
         </w:rPr>
-        <w:t>¿Qué datos son críticos?</w:t>
+        <w:t>Turnos: Número de turno, categoría/prioridad, estado (en espera, llamado, atendido, cancelado), marca de tiempo.</w:t>
       </w:r>
     </w:p>
     <w:p>
@@ -1914,7 +1852,7 @@
         <w:pStyle w:val="NormalWeb"/>
         <w:numPr>
           <w:ilvl w:val="0"/>
-          <w:numId w:val="23"/>
+          <w:numId w:val="36"/>
         </w:numPr>
         <w:jc w:val="both"/>
         <w:rPr>
@@ -1925,22 +1863,19 @@
         <w:rPr>
           <w:rFonts w:ascii="Arial" w:hAnsi="Arial" w:cs="Arial"/>
         </w:rPr>
-        <w:t>¿Qué pasaría si se pierden?</w:t>
-      </w:r>
-    </w:p>
-    <w:p>
-      <w:pPr>
-        <w:pStyle w:val="NormalWeb"/>
-        <w:jc w:val="both"/>
-        <w:rPr>
-          <w:rFonts w:ascii="Arial" w:hAnsi="Arial" w:cs="Arial"/>
-        </w:rPr>
-      </w:pPr>
-      <w:r>
-        <w:rPr>
-          <w:rFonts w:ascii="Arial" w:hAnsi="Arial" w:cs="Arial"/>
-        </w:rPr>
-        <w:t>Ejemplos:</w:t>
+        <w:t>Ventanillas: Identificador de ventanilla, cajero asignado, estado (libre</w:t>
+      </w:r>
+      <w:r>
+        <w:rPr>
+          <w:rFonts w:ascii="Arial" w:hAnsi="Arial" w:cs="Arial"/>
+        </w:rPr>
+        <w:t xml:space="preserve"> u </w:t>
+      </w:r>
+      <w:r>
+        <w:rPr>
+          <w:rFonts w:ascii="Arial" w:hAnsi="Arial" w:cs="Arial"/>
+        </w:rPr>
+        <w:t>ocupada).</w:t>
       </w:r>
     </w:p>
     <w:p>
@@ -1948,7 +1883,7 @@
         <w:pStyle w:val="NormalWeb"/>
         <w:numPr>
           <w:ilvl w:val="0"/>
-          <w:numId w:val="22"/>
+          <w:numId w:val="36"/>
         </w:numPr>
         <w:jc w:val="both"/>
         <w:rPr>
@@ -1959,68 +1894,25 @@
         <w:rPr>
           <w:rFonts w:ascii="Arial" w:hAnsi="Arial" w:cs="Arial"/>
         </w:rPr>
-        <w:t>usuarios</w:t>
+        <w:t xml:space="preserve">Notificaciones: </w:t>
+      </w:r>
+      <w:r>
+        <w:rPr>
+          <w:rFonts w:ascii="Arial" w:hAnsi="Arial" w:cs="Arial"/>
+        </w:rPr>
+        <w:t>H</w:t>
+      </w:r>
+      <w:r>
+        <w:rPr>
+          <w:rFonts w:ascii="Arial" w:hAnsi="Arial" w:cs="Arial"/>
+        </w:rPr>
+        <w:t>istorial de avisos enviados y su estado de entrega.</w:t>
       </w:r>
     </w:p>
     <w:p>
       <w:pPr>
         <w:pStyle w:val="NormalWeb"/>
-        <w:numPr>
-          <w:ilvl w:val="0"/>
-          <w:numId w:val="22"/>
-        </w:numPr>
-        <w:jc w:val="both"/>
-        <w:rPr>
-          <w:rFonts w:ascii="Arial" w:hAnsi="Arial" w:cs="Arial"/>
-        </w:rPr>
-      </w:pPr>
-      <w:r>
-        <w:rPr>
-          <w:rFonts w:ascii="Arial" w:hAnsi="Arial" w:cs="Arial"/>
-        </w:rPr>
-        <w:t>pedidos</w:t>
-      </w:r>
-    </w:p>
-    <w:p>
-      <w:pPr>
-        <w:pStyle w:val="NormalWeb"/>
-        <w:numPr>
-          <w:ilvl w:val="0"/>
-          <w:numId w:val="22"/>
-        </w:numPr>
-        <w:jc w:val="both"/>
-        <w:rPr>
-          <w:rFonts w:ascii="Arial" w:hAnsi="Arial" w:cs="Arial"/>
-        </w:rPr>
-      </w:pPr>
-      <w:r>
-        <w:rPr>
-          <w:rFonts w:ascii="Arial" w:hAnsi="Arial" w:cs="Arial"/>
-        </w:rPr>
-        <w:t>pagos</w:t>
-      </w:r>
-    </w:p>
-    <w:p>
-      <w:pPr>
-        <w:pStyle w:val="NormalWeb"/>
-        <w:numPr>
-          <w:ilvl w:val="0"/>
-          <w:numId w:val="22"/>
-        </w:numPr>
-        <w:rPr>
-          <w:rFonts w:ascii="Arial" w:hAnsi="Arial" w:cs="Arial"/>
-        </w:rPr>
-      </w:pPr>
-      <w:r>
-        <w:rPr>
-          <w:rFonts w:ascii="Arial" w:hAnsi="Arial" w:cs="Arial"/>
-        </w:rPr>
-        <w:t>historial</w:t>
-      </w:r>
-    </w:p>
-    <w:p>
-      <w:pPr>
-        <w:pStyle w:val="NormalWeb"/>
+        <w:jc w:val="both"/>
         <w:rPr>
           <w:rFonts w:ascii="Arial" w:hAnsi="Arial" w:cs="Arial"/>
         </w:rPr>
@@ -2031,14 +1923,138 @@
           <w:b/>
           <w:bCs/>
         </w:rPr>
-        <w:t>Pregunta clave:</w:t>
-      </w:r>
-      <w:r>
-        <w:rPr>
-          <w:rFonts w:ascii="Arial" w:hAnsi="Arial" w:cs="Arial"/>
-        </w:rPr>
-        <w:br/>
-        <w:t>¿Todos los servicios usan la misma base de datos o cada uno tiene la suya?</w:t>
+        <w:t>¿Qué datos son críticos?:</w:t>
+      </w:r>
+      <w:r>
+        <w:rPr>
+          <w:rFonts w:ascii="Arial" w:hAnsi="Arial" w:cs="Arial"/>
+        </w:rPr>
+        <w:t xml:space="preserve"> El número de turno, su estado y el orden de la cola son críticos: un error aquí implica atender a un cliente fuera de turno. Los datos del cliente (cédula) también son sensibles y deben protegerse.</w:t>
+      </w:r>
+    </w:p>
+    <w:p>
+      <w:pPr>
+        <w:pStyle w:val="NormalWeb"/>
+        <w:jc w:val="both"/>
+        <w:rPr>
+          <w:rFonts w:ascii="Arial" w:hAnsi="Arial" w:cs="Arial"/>
+        </w:rPr>
+      </w:pPr>
+      <w:r>
+        <w:rPr>
+          <w:rFonts w:ascii="Arial" w:hAnsi="Arial" w:cs="Arial"/>
+          <w:b/>
+          <w:bCs/>
+        </w:rPr>
+        <w:t>¿Qué pasaría si se pierden?</w:t>
+      </w:r>
+      <w:r>
+        <w:rPr>
+          <w:rFonts w:ascii="Arial" w:hAnsi="Arial" w:cs="Arial"/>
+        </w:rPr>
+        <w:t xml:space="preserve"> Se perdería la trazabilidad de quién debía ser atendido y en qué orden, generando reclamos y posible pérdida de confianza del cliente; por eso se recomienda respaldo periódico (</w:t>
+      </w:r>
+      <w:proofErr w:type="spellStart"/>
+      <w:r>
+        <w:rPr>
+          <w:rFonts w:ascii="Arial" w:hAnsi="Arial" w:cs="Arial"/>
+        </w:rPr>
+        <w:t>backup</w:t>
+      </w:r>
+      <w:proofErr w:type="spellEnd"/>
+      <w:r>
+        <w:rPr>
+          <w:rFonts w:ascii="Arial" w:hAnsi="Arial" w:cs="Arial"/>
+        </w:rPr>
+        <w:t>) y replicación de la base de datos de Turnos</w:t>
+      </w:r>
+    </w:p>
+    <w:p>
+      <w:pPr>
+        <w:pStyle w:val="NormalWeb"/>
+        <w:jc w:val="both"/>
+        <w:rPr>
+          <w:rFonts w:ascii="Arial" w:hAnsi="Arial" w:cs="Arial"/>
+        </w:rPr>
+      </w:pPr>
+      <w:r>
+        <w:rPr>
+          <w:rFonts w:ascii="Arial" w:hAnsi="Arial" w:cs="Arial"/>
+          <w:b/>
+          <w:bCs/>
+          <w:i/>
+          <w:iCs/>
+        </w:rPr>
+        <w:t xml:space="preserve">Pregunta clave: ¿una base de datos compartida o una por servicio?: </w:t>
+      </w:r>
+      <w:r>
+        <w:rPr>
+          <w:rFonts w:ascii="Arial" w:hAnsi="Arial" w:cs="Arial"/>
+        </w:rPr>
+        <w:t>Cada microservicio tendrá su propia base de datos (</w:t>
+      </w:r>
+      <w:proofErr w:type="spellStart"/>
+      <w:r>
+        <w:rPr>
+          <w:rFonts w:ascii="Arial" w:hAnsi="Arial" w:cs="Arial"/>
+        </w:rPr>
+        <w:t>bd_turnos</w:t>
+      </w:r>
+      <w:proofErr w:type="spellEnd"/>
+      <w:r>
+        <w:rPr>
+          <w:rFonts w:ascii="Arial" w:hAnsi="Arial" w:cs="Arial"/>
+        </w:rPr>
+        <w:t xml:space="preserve">, </w:t>
+      </w:r>
+      <w:proofErr w:type="spellStart"/>
+      <w:r>
+        <w:rPr>
+          <w:rFonts w:ascii="Arial" w:hAnsi="Arial" w:cs="Arial"/>
+        </w:rPr>
+        <w:t>bd_clientes</w:t>
+      </w:r>
+      <w:proofErr w:type="spellEnd"/>
+      <w:r>
+        <w:rPr>
+          <w:rFonts w:ascii="Arial" w:hAnsi="Arial" w:cs="Arial"/>
+        </w:rPr>
+        <w:t xml:space="preserve">, </w:t>
+      </w:r>
+      <w:proofErr w:type="spellStart"/>
+      <w:r>
+        <w:rPr>
+          <w:rFonts w:ascii="Arial" w:hAnsi="Arial" w:cs="Arial"/>
+        </w:rPr>
+        <w:t>bd_ventanillas</w:t>
+      </w:r>
+      <w:proofErr w:type="spellEnd"/>
+      <w:r>
+        <w:rPr>
+          <w:rFonts w:ascii="Arial" w:hAnsi="Arial" w:cs="Arial"/>
+        </w:rPr>
+        <w:t xml:space="preserve">, </w:t>
+      </w:r>
+      <w:proofErr w:type="spellStart"/>
+      <w:r>
+        <w:rPr>
+          <w:rFonts w:ascii="Arial" w:hAnsi="Arial" w:cs="Arial"/>
+        </w:rPr>
+        <w:t>bd_notificaciones</w:t>
+      </w:r>
+      <w:proofErr w:type="spellEnd"/>
+      <w:r>
+        <w:rPr>
+          <w:rFonts w:ascii="Arial" w:hAnsi="Arial" w:cs="Arial"/>
+        </w:rPr>
+        <w:t xml:space="preserve">), evitando el acoplamiento que se genera cuando varios servicios comparten una sola base de datos y permitiendo que cada uno </w:t>
+      </w:r>
+      <w:r>
+        <w:rPr>
+          <w:rFonts w:ascii="Arial" w:hAnsi="Arial" w:cs="Arial"/>
+        </w:rPr>
+        <w:lastRenderedPageBreak/>
+        <w:t>evolucione su esquema de forma independiente. La comunicación entre servicios se hace exclusivamente a través de sus APIS REST, nunca accediendo directamente a la base de datos de otro servicio.</w:t>
       </w:r>
     </w:p>
     <w:p>
@@ -2072,7 +2088,6 @@
           <w:sz w:val="24"/>
           <w:szCs w:val="24"/>
         </w:rPr>
-        <w:lastRenderedPageBreak/>
         <w:t xml:space="preserve">PARTE 6 – </w:t>
       </w:r>
       <w:r>
@@ -2118,22 +2133,7 @@
         <w:rPr>
           <w:rFonts w:ascii="Arial" w:hAnsi="Arial" w:cs="Arial"/>
         </w:rPr>
-        <w:t>¿Quién usará el sistema?</w:t>
-      </w:r>
-    </w:p>
-    <w:p>
-      <w:pPr>
-        <w:pStyle w:val="NormalWeb"/>
-        <w:jc w:val="both"/>
-        <w:rPr>
-          <w:rFonts w:ascii="Arial" w:hAnsi="Arial" w:cs="Arial"/>
-        </w:rPr>
-      </w:pPr>
-      <w:r>
-        <w:rPr>
-          <w:rFonts w:ascii="Arial" w:hAnsi="Arial" w:cs="Arial"/>
-        </w:rPr>
-        <w:t>Ejemplo:</w:t>
+        <w:t>¿Que usará el sistema?</w:t>
       </w:r>
     </w:p>
     <w:p>
@@ -2141,7 +2141,7 @@
         <w:pStyle w:val="NormalWeb"/>
         <w:numPr>
           <w:ilvl w:val="0"/>
-          <w:numId w:val="26"/>
+          <w:numId w:val="35"/>
         </w:numPr>
         <w:jc w:val="both"/>
         <w:rPr>
@@ -2152,7 +2152,19 @@
         <w:rPr>
           <w:rFonts w:ascii="Arial" w:hAnsi="Arial" w:cs="Arial"/>
         </w:rPr>
-        <w:t>administrador</w:t>
+        <w:t xml:space="preserve">Cliente: </w:t>
+      </w:r>
+      <w:r>
+        <w:rPr>
+          <w:rFonts w:ascii="Arial" w:hAnsi="Arial" w:cs="Arial"/>
+        </w:rPr>
+        <w:t>S</w:t>
+      </w:r>
+      <w:r>
+        <w:rPr>
+          <w:rFonts w:ascii="Arial" w:hAnsi="Arial" w:cs="Arial"/>
+        </w:rPr>
+        <w:t>olicita un turno y consulta su posición en la fila; no puede modificar el estado de otros turnos.</w:t>
       </w:r>
     </w:p>
     <w:p>
@@ -2160,7 +2172,7 @@
         <w:pStyle w:val="NormalWeb"/>
         <w:numPr>
           <w:ilvl w:val="0"/>
-          <w:numId w:val="26"/>
+          <w:numId w:val="35"/>
         </w:numPr>
         <w:jc w:val="both"/>
         <w:rPr>
@@ -2171,7 +2183,19 @@
         <w:rPr>
           <w:rFonts w:ascii="Arial" w:hAnsi="Arial" w:cs="Arial"/>
         </w:rPr>
-        <w:t>cliente</w:t>
+        <w:t xml:space="preserve">Cajero / Asesor (operador): </w:t>
+      </w:r>
+      <w:r>
+        <w:rPr>
+          <w:rFonts w:ascii="Arial" w:hAnsi="Arial" w:cs="Arial"/>
+        </w:rPr>
+        <w:t>L</w:t>
+      </w:r>
+      <w:r>
+        <w:rPr>
+          <w:rFonts w:ascii="Arial" w:hAnsi="Arial" w:cs="Arial"/>
+        </w:rPr>
+        <w:t>lama al siguiente turno, marca la atención como finalizada o cancelada.</w:t>
       </w:r>
     </w:p>
     <w:p>
@@ -2179,7 +2203,7 @@
         <w:pStyle w:val="NormalWeb"/>
         <w:numPr>
           <w:ilvl w:val="0"/>
-          <w:numId w:val="26"/>
+          <w:numId w:val="35"/>
         </w:numPr>
         <w:jc w:val="both"/>
         <w:rPr>
@@ -2190,7 +2214,19 @@
         <w:rPr>
           <w:rFonts w:ascii="Arial" w:hAnsi="Arial" w:cs="Arial"/>
         </w:rPr>
-        <w:t>operador</w:t>
+        <w:t xml:space="preserve">Administrador de sucursal: </w:t>
+      </w:r>
+      <w:r>
+        <w:rPr>
+          <w:rFonts w:ascii="Arial" w:hAnsi="Arial" w:cs="Arial"/>
+        </w:rPr>
+        <w:t>C</w:t>
+      </w:r>
+      <w:r>
+        <w:rPr>
+          <w:rFonts w:ascii="Arial" w:hAnsi="Arial" w:cs="Arial"/>
+        </w:rPr>
+        <w:t>rea y edita ventanillas, consulta reportes de tiempos de espera, reasigna las prioridades.</w:t>
       </w:r>
     </w:p>
     <w:p>
@@ -2198,7 +2234,7 @@
         <w:pStyle w:val="NormalWeb"/>
         <w:numPr>
           <w:ilvl w:val="0"/>
-          <w:numId w:val="26"/>
+          <w:numId w:val="35"/>
         </w:numPr>
         <w:jc w:val="both"/>
         <w:rPr>
@@ -2209,7 +2245,70 @@
         <w:rPr>
           <w:rFonts w:ascii="Arial" w:hAnsi="Arial" w:cs="Arial"/>
         </w:rPr>
-        <w:t>proveedor</w:t>
+        <w:t xml:space="preserve">Sistema de autoservicio: </w:t>
+      </w:r>
+      <w:r>
+        <w:rPr>
+          <w:rFonts w:ascii="Arial" w:hAnsi="Arial" w:cs="Arial"/>
+        </w:rPr>
+        <w:t>A</w:t>
+      </w:r>
+      <w:r>
+        <w:rPr>
+          <w:rFonts w:ascii="Arial" w:hAnsi="Arial" w:cs="Arial"/>
+        </w:rPr>
+        <w:t>ctúa como cliente automatizado que genera turnos desde la sucursal física.</w:t>
+      </w:r>
+    </w:p>
+    <w:p>
+      <w:pPr>
+        <w:pStyle w:val="NormalWeb"/>
+        <w:jc w:val="both"/>
+        <w:rPr>
+          <w:rFonts w:ascii="Arial" w:hAnsi="Arial" w:cs="Arial"/>
+        </w:rPr>
+      </w:pPr>
+      <w:r>
+        <w:rPr>
+          <w:rFonts w:ascii="Arial" w:hAnsi="Arial" w:cs="Arial"/>
+          <w:b/>
+          <w:bCs/>
+        </w:rPr>
+        <w:t>Pregunta clave: ¿todos pueden hacer lo mismo?</w:t>
+      </w:r>
+      <w:r>
+        <w:rPr>
+          <w:rFonts w:ascii="Arial" w:hAnsi="Arial" w:cs="Arial"/>
+        </w:rPr>
+        <w:t xml:space="preserve"> No, se manejan permisos diferenciados por el rol, el cliente solo lee o crea su propio turno, el cajero solo gestiona los turnos asignados a su ventanilla y solo el administrador tiene permisos de configuración del sistema.</w:t>
+      </w:r>
+    </w:p>
+    <w:p>
+      <w:pPr>
+        <w:pStyle w:val="NormalWeb"/>
+        <w:jc w:val="both"/>
+        <w:rPr>
+          <w:rFonts w:ascii="Arial" w:hAnsi="Arial" w:cs="Arial"/>
+        </w:rPr>
+      </w:pPr>
+    </w:p>
+    <w:p>
+      <w:pPr>
+        <w:pStyle w:val="NormalWeb"/>
+        <w:jc w:val="both"/>
+        <w:rPr>
+          <w:rFonts w:ascii="Arial" w:hAnsi="Arial" w:cs="Arial"/>
+          <w:b/>
+          <w:bCs/>
+        </w:rPr>
+      </w:pPr>
+      <w:r>
+        <w:rPr>
+          <w:rFonts w:ascii="Arial" w:hAnsi="Arial" w:cs="Arial"/>
+          <w:b/>
+          <w:bCs/>
+        </w:rPr>
+        <w:t>PARTE 7 — FALLAS Y RIESGOS</w:t>
       </w:r>
     </w:p>
     <w:p>
@@ -2228,7 +2327,7 @@
           <w:sz w:val="24"/>
           <w:szCs w:val="24"/>
         </w:rPr>
-        <w:t>Pregunta clave:</w:t>
+        <w:t>Paso 7: Pensar como ingenieros reales</w:t>
       </w:r>
     </w:p>
     <w:p>
@@ -2243,77 +2342,7 @@
         <w:rPr>
           <w:rFonts w:ascii="Arial" w:hAnsi="Arial" w:cs="Arial"/>
         </w:rPr>
-        <w:t>¿Todos pueden hacer lo mismo?</w:t>
-      </w:r>
-    </w:p>
-    <w:p>
-      <w:pPr>
-        <w:pStyle w:val="NormalWeb"/>
-        <w:jc w:val="both"/>
-        <w:rPr>
-          <w:rFonts w:ascii="Arial" w:hAnsi="Arial" w:cs="Arial"/>
-        </w:rPr>
-      </w:pPr>
-    </w:p>
-    <w:p>
-      <w:pPr>
-        <w:pStyle w:val="NormalWeb"/>
-        <w:jc w:val="both"/>
-        <w:rPr>
-          <w:rFonts w:ascii="Arial" w:hAnsi="Arial" w:cs="Arial"/>
-          <w:b/>
-          <w:bCs/>
-        </w:rPr>
-      </w:pPr>
-      <w:r>
-        <w:rPr>
-          <w:rFonts w:ascii="Arial" w:hAnsi="Arial" w:cs="Arial"/>
-          <w:b/>
-          <w:bCs/>
-        </w:rPr>
-        <w:t>PARTE 7 — FALLAS Y RIESGOS</w:t>
-      </w:r>
-    </w:p>
-    <w:p>
-      <w:pPr>
-        <w:pStyle w:val="Ttulo2"/>
-        <w:jc w:val="both"/>
-        <w:rPr>
-          <w:rFonts w:ascii="Arial" w:hAnsi="Arial" w:cs="Arial"/>
-          <w:sz w:val="24"/>
-          <w:szCs w:val="24"/>
-        </w:rPr>
-      </w:pPr>
-      <w:r>
-        <w:rPr>
-          <w:rFonts w:ascii="Arial" w:hAnsi="Arial" w:cs="Arial"/>
-          <w:sz w:val="24"/>
-          <w:szCs w:val="24"/>
-        </w:rPr>
-        <w:t>Paso 7: Pensar como ingenieros reales</w:t>
-      </w:r>
-    </w:p>
-    <w:p>
-      <w:pPr>
-        <w:pStyle w:val="NormalWeb"/>
-        <w:jc w:val="both"/>
-        <w:rPr>
-          <w:rFonts w:ascii="Arial" w:hAnsi="Arial" w:cs="Arial"/>
-        </w:rPr>
-      </w:pPr>
-      <w:proofErr w:type="gramStart"/>
-      <w:r>
-        <w:rPr>
-          <w:rFonts w:ascii="Arial" w:hAnsi="Arial" w:cs="Arial"/>
-        </w:rPr>
-        <w:t>¿</w:t>
-      </w:r>
-      <w:proofErr w:type="gramEnd"/>
-      <w:r>
-        <w:rPr>
-          <w:rFonts w:ascii="Arial" w:hAnsi="Arial" w:cs="Arial"/>
-        </w:rPr>
-        <w:t>Qué pasaría si falla:</w:t>
+        <w:t>¿Qué pasaría si falla:</w:t>
       </w:r>
     </w:p>
     <w:p>
@@ -2508,7 +2537,6 @@
           <w:noProof/>
           <w:lang w:val="es-ES" w:eastAsia="es-ES"/>
         </w:rPr>
-        <w:lastRenderedPageBreak/>
         <w:drawing>
           <wp:inline distT="0" distB="0" distL="0" distR="0" wp14:anchorId="3A3C42B8" wp14:editId="5585BEB2">
             <wp:extent cx="5612130" cy="6024245"/>
@@ -2573,6 +2601,7 @@
           <w:sz w:val="24"/>
           <w:szCs w:val="24"/>
         </w:rPr>
+        <w:lastRenderedPageBreak/>
         <w:t>PARTE 9 — COMMIT Y PULL REQUEST</w:t>
       </w:r>
     </w:p>
@@ -2625,19 +2654,15 @@
           <w:lang w:eastAsia="es-CO"/>
         </w:rPr>
       </w:pPr>
-      <w:bookmarkStart w:id="0" w:name="_GoBack"/>
       <w:proofErr w:type="spellStart"/>
-      <w:proofErr w:type="gramStart"/>
       <w:r>
         <w:rPr>
           <w:rFonts w:ascii="Arial" w:eastAsia="Times New Roman" w:hAnsi="Arial" w:cs="Arial"/>
           <w:lang w:eastAsia="es-CO"/>
         </w:rPr>
-        <w:lastRenderedPageBreak/>
         <w:t>doc</w:t>
       </w:r>
       <w:proofErr w:type="spellEnd"/>
-      <w:proofErr w:type="gramEnd"/>
       <w:r>
         <w:rPr>
           <w:rFonts w:ascii="Arial" w:eastAsia="Times New Roman" w:hAnsi="Arial" w:cs="Arial"/>
@@ -2715,7 +2740,6 @@
         <w:t>: usuarios del sistema</w:t>
       </w:r>
     </w:p>
-    <w:bookmarkEnd w:id="0"/>
     <w:p>
       <w:pPr>
         <w:pStyle w:val="NormalWeb"/>
@@ -2728,34 +2752,20 @@
         <w:rPr>
           <w:rFonts w:ascii="Arial" w:hAnsi="Arial" w:cs="Arial"/>
         </w:rPr>
-        <w:t xml:space="preserve">Luego crear </w:t>
+        <w:t xml:space="preserve">Luego crear Pull </w:t>
       </w:r>
       <w:proofErr w:type="spellStart"/>
       <w:r>
         <w:rPr>
           <w:rFonts w:ascii="Arial" w:hAnsi="Arial" w:cs="Arial"/>
         </w:rPr>
-        <w:t>Pull</w:t>
+        <w:t>Request</w:t>
       </w:r>
       <w:proofErr w:type="spellEnd"/>
       <w:r>
         <w:rPr>
           <w:rFonts w:ascii="Arial" w:hAnsi="Arial" w:cs="Arial"/>
         </w:rPr>
-        <w:t xml:space="preserve"> </w:t>
-      </w:r>
-      <w:proofErr w:type="spellStart"/>
-      <w:r>
-        <w:rPr>
-          <w:rFonts w:ascii="Arial" w:hAnsi="Arial" w:cs="Arial"/>
-        </w:rPr>
-        <w:t>Request</w:t>
-      </w:r>
-      <w:proofErr w:type="spellEnd"/>
-      <w:r>
-        <w:rPr>
-          <w:rFonts w:ascii="Arial" w:hAnsi="Arial" w:cs="Arial"/>
-        </w:rPr>
         <w:t>:</w:t>
       </w:r>
     </w:p>
@@ -2769,7 +2779,7 @@
       </w:pPr>
       <w:r>
         <w:rPr>
-          <w:rStyle w:val="Textoennegrita"/>
+          <w:rStyle w:val="Fuerte"/>
           <w:rFonts w:ascii="Arial" w:hAnsi="Arial" w:cs="Arial"/>
         </w:rPr>
         <w:t>Título:</w:t>
@@ -2792,7 +2802,7 @@
       </w:pPr>
       <w:r>
         <w:rPr>
-          <w:rStyle w:val="Textoennegrita"/>
+          <w:rStyle w:val="Fuerte"/>
           <w:rFonts w:ascii="Arial" w:hAnsi="Arial" w:cs="Arial"/>
         </w:rPr>
         <w:t>Descripción:</w:t>
@@ -2988,7 +2998,7 @@
 </file>
 
 <file path=word/endnotes.xml><?xml version="1.0" encoding="utf-8"?>
-<w:endnotes xmlns:wpc="http://schemas.microsoft.com/office/word/2010/wordprocessingCanvas" xmlns:mc="http://schemas.openxmlformats.org/markup-compatibility/2006" xmlns:o="urn:schemas-microsoft-com:office:office" xmlns:r="http://schemas.openxmlformats.org/officeDocument/2006/relationships" xmlns:m="http://schemas.openxmlformats.org/officeDocument/2006/math" xmlns:v="urn:schemas-microsoft-com:vml" xmlns:wp14="http://schemas.microsoft.com/office/word/2010/wordprocessingDrawing" xmlns:wp="http://schemas.openxmlformats.org/drawingml/2006/wordprocessingDrawing" xmlns:w10="urn:schemas-microsoft-com:office:word" xmlns:w="http://schemas.openxmlformats.org/wordprocessingml/2006/main" xmlns:w14="http://schemas.microsoft.com/office/word/2010/wordml" xmlns:w15="http://schemas.microsoft.com/office/word/2012/wordml" xmlns:wpg="http://schemas.microsoft.com/office/word/2010/wordprocessingGroup" xmlns:wpi="http://schemas.microsoft.com/office/word/2010/wordprocessingInk" xmlns:wne="http://schemas.microsoft.com/office/word/2006/wordml" xmlns:wps="http://schemas.microsoft.com/office/word/2010/wordprocessingShape" mc:Ignorable="w14 w15 wp14">
+<w:endnotes xmlns:wpc="http://schemas.microsoft.com/office/word/2010/wordprocessingCanvas" xmlns:cx="http://schemas.microsoft.com/office/drawing/2014/chartex" xmlns:cx1="http://schemas.microsoft.com/office/drawing/2015/9/8/chartex" xmlns:cx2="http://schemas.microsoft.com/office/drawing/2015/10/21/chartex" xmlns:cx3="http://schemas.microsoft.com/office/drawing/2016/5/9/chartex" xmlns:cx4="http://schemas.microsoft.com/office/drawing/2016/5/10/chartex" xmlns:cx5="http://schemas.microsoft.com/office/drawing/2016/5/11/chartex" xmlns:cx6="http://schemas.microsoft.com/office/drawing/2016/5/12/chartex" xmlns:cx7="http://schemas.microsoft.com/office/drawing/2016/5/13/chartex" xmlns:cx8="http://schemas.microsoft.com/office/drawing/2016/5/14/chartex" xmlns:mc="http://schemas.openxmlformats.org/markup-compatibility/2006" xmlns:aink="http://schemas.microsoft.com/office/drawing/2016/ink" xmlns:am3d="http://schemas.microsoft.com/office/drawing/2017/model3d" xmlns:o="urn:schemas-microsoft-com:office:office" xmlns:oel="http://schemas.microsoft.com/office/2019/extlst" xmlns:r="http://schemas.openxmlformats.org/officeDocument/2006/relationships" xmlns:m="http://schemas.openxmlformats.org/officeDocument/2006/math" xmlns:v="urn:schemas-microsoft-com:vml" xmlns:wp14="http://schemas.microsoft.com/office/word/2010/wordprocessingDrawing" xmlns:wp="http://schemas.openxmlformats.org/drawingml/2006/wordprocessingDrawing" xmlns:w10="urn:schemas-microsoft-com:office:word" xmlns:w="http://schemas.openxmlformats.org/wordprocessingml/2006/main" xmlns:w14="http://schemas.microsoft.com/office/word/2010/wordml" xmlns:w15="http://schemas.microsoft.com/office/word/2012/wordml" xmlns:w16cex="http://schemas.microsoft.com/office/word/2018/wordml/cex" xmlns:w16cid="http://schemas.microsoft.com/office/word/2016/wordml/cid" xmlns:w16="http://schemas.microsoft.com/office/word/2018/wordml" xmlns:w16du="http://schemas.microsoft.com/office/word/2023/wordml/word16du" xmlns:w16sdtdh="http://schemas.microsoft.com/office/word/2020/wordml/sdtdatahash" xmlns:w16sdtfl="http://schemas.microsoft.com/office/word/2024/wordml/sdtformatlock" xmlns:w16se="http://schemas.microsoft.com/office/word/2015/wordml/symex" xmlns:wpg="http://schemas.microsoft.com/office/word/2010/wordprocessingGroup" xmlns:wpi="http://schemas.microsoft.com/office/word/2010/wordprocessingInk" xmlns:wne="http://schemas.microsoft.com/office/word/2006/wordml" xmlns:wps="http://schemas.microsoft.com/office/word/2010/wordprocessingShape" mc:Ignorable="w14 w15 w16se w16cid w16 w16cex w16sdtdh w16sdtfl w16du wp14">
   <w:endnote w:type="separator" w:id="-1">
     <w:p>
       <w:r>
@@ -3007,7 +3017,7 @@
 </file>
 
 <file path=word/footnotes.xml><?xml version="1.0" encoding="utf-8"?>
-<w:footnotes xmlns:wpc="http://schemas.microsoft.com/office/word/2010/wordprocessingCanvas" xmlns:mc="http://schemas.openxmlformats.org/markup-compatibility/2006" xmlns:o="urn:schemas-microsoft-com:office:office" xmlns:r="http://schemas.openxmlformats.org/officeDocument/2006/relationships" xmlns:m="http://schemas.openxmlformats.org/officeDocument/2006/math" xmlns:v="urn:schemas-microsoft-com:vml" xmlns:wp14="http://schemas.microsoft.com/office/word/2010/wordprocessingDrawing" xmlns:wp="http://schemas.openxmlformats.org/drawingml/2006/wordprocessingDrawing" xmlns:w10="urn:schemas-microsoft-com:office:word" xmlns:w="http://schemas.openxmlformats.org/wordprocessingml/2006/main" xmlns:w14="http://schemas.microsoft.com/office/word/2010/wordml" xmlns:w15="http://schemas.microsoft.com/office/word/2012/wordml" xmlns:wpg="http://schemas.microsoft.com/office/word/2010/wordprocessingGroup" xmlns:wpi="http://schemas.microsoft.com/office/word/2010/wordprocessingInk" xmlns:wne="http://schemas.microsoft.com/office/word/2006/wordml" xmlns:wps="http://schemas.microsoft.com/office/word/2010/wordprocessingShape" mc:Ignorable="w14 w15 wp14">
+<w:footnotes xmlns:wpc="http://schemas.microsoft.com/office/word/2010/wordprocessingCanvas" xmlns:cx="http://schemas.microsoft.com/office/drawing/2014/chartex" xmlns:cx1="http://schemas.microsoft.com/office/drawing/2015/9/8/chartex" xmlns:cx2="http://schemas.microsoft.com/office/drawing/2015/10/21/chartex" xmlns:cx3="http://schemas.microsoft.com/office/drawing/2016/5/9/chartex" xmlns:cx4="http://schemas.microsoft.com/office/drawing/2016/5/10/chartex" xmlns:cx5="http://schemas.microsoft.com/office/drawing/2016/5/11/chartex" xmlns:cx6="http://schemas.microsoft.com/office/drawing/2016/5/12/chartex" xmlns:cx7="http://schemas.microsoft.com/office/drawing/2016/5/13/chartex" xmlns:cx8="http://schemas.microsoft.com/office/drawing/2016/5/14/chartex" xmlns:mc="http://schemas.openxmlformats.org/markup-compatibility/2006" xmlns:aink="http://schemas.microsoft.com/office/drawing/2016/ink" xmlns:am3d="http://schemas.microsoft.com/office/drawing/2017/model3d" xmlns:o="urn:schemas-microsoft-com:office:office" xmlns:oel="http://schemas.microsoft.com/office/2019/extlst" xmlns:r="http://schemas.openxmlformats.org/officeDocument/2006/relationships" xmlns:m="http://schemas.openxmlformats.org/officeDocument/2006/math" xmlns:v="urn:schemas-microsoft-com:vml" xmlns:wp14="http://schemas.microsoft.com/office/word/2010/wordprocessingDrawing" xmlns:wp="http://schemas.openxmlformats.org/drawingml/2006/wordprocessingDrawing" xmlns:w10="urn:schemas-microsoft-com:office:word" xmlns:w="http://schemas.openxmlformats.org/wordprocessingml/2006/main" xmlns:w14="http://schemas.microsoft.com/office/word/2010/wordml" xmlns:w15="http://schemas.microsoft.com/office/word/2012/wordml" xmlns:w16cex="http://schemas.microsoft.com/office/word/2018/wordml/cex" xmlns:w16cid="http://schemas.microsoft.com/office/word/2016/wordml/cid" xmlns:w16="http://schemas.microsoft.com/office/word/2018/wordml" xmlns:w16du="http://schemas.microsoft.com/office/word/2023/wordml/word16du" xmlns:w16sdtdh="http://schemas.microsoft.com/office/word/2020/wordml/sdtdatahash" xmlns:w16sdtfl="http://schemas.microsoft.com/office/word/2024/wordml/sdtformatlock" xmlns:w16se="http://schemas.microsoft.com/office/word/2015/wordml/symex" xmlns:wpg="http://schemas.microsoft.com/office/word/2010/wordprocessingGroup" xmlns:wpi="http://schemas.microsoft.com/office/word/2010/wordprocessingInk" xmlns:wne="http://schemas.microsoft.com/office/word/2006/wordml" xmlns:wps="http://schemas.microsoft.com/office/word/2010/wordprocessingShape" mc:Ignorable="w14 w15 w16se w16cid w16 w16cex w16sdtdh w16sdtfl w16du wp14">
   <w:footnote w:type="separator" w:id="-1">
     <w:p>
       <w:r>
@@ -3026,7 +3036,7 @@
 </file>
 
 <file path=word/header1.xml><?xml version="1.0" encoding="utf-8"?>
-<w:hdr xmlns:wpc="http://schemas.microsoft.com/office/word/2010/wordprocessingCanvas" xmlns:mc="http://schemas.openxmlformats.org/markup-compatibility/2006" xmlns:o="urn:schemas-microsoft-com:office:office" xmlns:r="http://schemas.openxmlformats.org/officeDocument/2006/relationships" xmlns:m="http://schemas.openxmlformats.org/officeDocument/2006/math" xmlns:v="urn:schemas-microsoft-com:vml" xmlns:wp14="http://schemas.microsoft.com/office/word/2010/wordprocessingDrawing" xmlns:wp="http://schemas.openxmlformats.org/drawingml/2006/wordprocessingDrawing" xmlns:w10="urn:schemas-microsoft-com:office:word" xmlns:w="http://schemas.openxmlformats.org/wordprocessingml/2006/main" xmlns:w14="http://schemas.microsoft.com/office/word/2010/wordml" xmlns:w15="http://schemas.microsoft.com/office/word/2012/wordml" xmlns:wpg="http://schemas.microsoft.com/office/word/2010/wordprocessingGroup" xmlns:wpi="http://schemas.microsoft.com/office/word/2010/wordprocessingInk" xmlns:wne="http://schemas.microsoft.com/office/word/2006/wordml" xmlns:wps="http://schemas.microsoft.com/office/word/2010/wordprocessingShape" mc:Ignorable="w14 w15 wp14">
+<w:hdr xmlns:wpc="http://schemas.microsoft.com/office/word/2010/wordprocessingCanvas" xmlns:cx="http://schemas.microsoft.com/office/drawing/2014/chartex" xmlns:cx1="http://schemas.microsoft.com/office/drawing/2015/9/8/chartex" xmlns:cx2="http://schemas.microsoft.com/office/drawing/2015/10/21/chartex" xmlns:cx3="http://schemas.microsoft.com/office/drawing/2016/5/9/chartex" xmlns:cx4="http://schemas.microsoft.com/office/drawing/2016/5/10/chartex" xmlns:cx5="http://schemas.microsoft.com/office/drawing/2016/5/11/chartex" xmlns:cx6="http://schemas.microsoft.com/office/drawing/2016/5/12/chartex" xmlns:cx7="http://schemas.microsoft.com/office/drawing/2016/5/13/chartex" xmlns:cx8="http://schemas.microsoft.com/office/drawing/2016/5/14/chartex" xmlns:mc="http://schemas.openxmlformats.org/markup-compatibility/2006" xmlns:aink="http://schemas.microsoft.com/office/drawing/2016/ink" xmlns:am3d="http://schemas.microsoft.com/office/drawing/2017/model3d" xmlns:o="urn:schemas-microsoft-com:office:office" xmlns:oel="http://schemas.microsoft.com/office/2019/extlst" xmlns:r="http://schemas.openxmlformats.org/officeDocument/2006/relationships" xmlns:m="http://schemas.openxmlformats.org/officeDocument/2006/math" xmlns:v="urn:schemas-microsoft-com:vml" xmlns:wp14="http://schemas.microsoft.com/office/word/2010/wordprocessingDrawing" xmlns:wp="http://schemas.openxmlformats.org/drawingml/2006/wordprocessingDrawing" xmlns:w10="urn:schemas-microsoft-com:office:word" xmlns:w="http://schemas.openxmlformats.org/wordprocessingml/2006/main" xmlns:w14="http://schemas.microsoft.com/office/word/2010/wordml" xmlns:w15="http://schemas.microsoft.com/office/word/2012/wordml" xmlns:w16cex="http://schemas.microsoft.com/office/word/2018/wordml/cex" xmlns:w16cid="http://schemas.microsoft.com/office/word/2016/wordml/cid" xmlns:w16="http://schemas.microsoft.com/office/word/2018/wordml" xmlns:w16du="http://schemas.microsoft.com/office/word/2023/wordml/word16du" xmlns:w16sdtdh="http://schemas.microsoft.com/office/word/2020/wordml/sdtdatahash" xmlns:w16sdtfl="http://schemas.microsoft.com/office/word/2024/wordml/sdtformatlock" xmlns:w16se="http://schemas.microsoft.com/office/word/2015/wordml/symex" xmlns:wpg="http://schemas.microsoft.com/office/word/2010/wordprocessingGroup" xmlns:wpi="http://schemas.microsoft.com/office/word/2010/wordprocessingInk" xmlns:wne="http://schemas.microsoft.com/office/word/2006/wordml" xmlns:wps="http://schemas.microsoft.com/office/word/2010/wordprocessingShape" mc:Ignorable="w14 w15 w16se w16cid w16 w16cex w16sdtdh w16sdtfl w16du wp14">
   <w:p>
     <w:pPr>
       <w:pStyle w:val="Encabezado"/>
@@ -3097,8 +3107,157 @@
 </file>
 
 <file path=word/numbering.xml><?xml version="1.0" encoding="utf-8"?>
-<w:numbering xmlns:wpc="http://schemas.microsoft.com/office/word/2010/wordprocessingCanvas" xmlns:mc="http://schemas.openxmlformats.org/markup-compatibility/2006" xmlns:o="urn:schemas-microsoft-com:office:office" xmlns:r="http://schemas.openxmlformats.org/officeDocument/2006/relationships" xmlns:m="http://schemas.openxmlformats.org/officeDocument/2006/math" xmlns:v="urn:schemas-microsoft-com:vml" xmlns:wp14="http://schemas.microsoft.com/office/word/2010/wordprocessingDrawing" xmlns:wp="http://schemas.openxmlformats.org/drawingml/2006/wordprocessingDrawing" xmlns:w10="urn:schemas-microsoft-com:office:word" xmlns:w="http://schemas.openxmlformats.org/wordprocessingml/2006/main" xmlns:w14="http://schemas.microsoft.com/office/word/2010/wordml" xmlns:w15="http://schemas.microsoft.com/office/word/2012/wordml" xmlns:wpg="http://schemas.microsoft.com/office/word/2010/wordprocessingGroup" xmlns:wpi="http://schemas.microsoft.com/office/word/2010/wordprocessingInk" xmlns:wne="http://schemas.microsoft.com/office/word/2006/wordml" xmlns:wps="http://schemas.microsoft.com/office/word/2010/wordprocessingShape" mc:Ignorable="w14 w15 wp14">
+<w:numbering xmlns:wpc="http://schemas.microsoft.com/office/word/2010/wordprocessingCanvas" xmlns:cx="http://schemas.microsoft.com/office/drawing/2014/chartex" xmlns:cx1="http://schemas.microsoft.com/office/drawing/2015/9/8/chartex" xmlns:cx2="http://schemas.microsoft.com/office/drawing/2015/10/21/chartex" xmlns:cx3="http://schemas.microsoft.com/office/drawing/2016/5/9/chartex" xmlns:cx4="http://schemas.microsoft.com/office/drawing/2016/5/10/chartex" xmlns:cx5="http://schemas.microsoft.com/office/drawing/2016/5/11/chartex" xmlns:cx6="http://schemas.microsoft.com/office/drawing/2016/5/12/chartex" xmlns:cx7="http://schemas.microsoft.com/office/drawing/2016/5/13/chartex" xmlns:cx8="http://schemas.microsoft.com/office/drawing/2016/5/14/chartex" xmlns:mc="http://schemas.openxmlformats.org/markup-compatibility/2006" xmlns:aink="http://schemas.microsoft.com/office/drawing/2016/ink" xmlns:am3d="http://schemas.microsoft.com/office/drawing/2017/model3d" xmlns:o="urn:schemas-microsoft-com:office:office" xmlns:oel="http://schemas.microsoft.com/office/2019/extlst" xmlns:r="http://schemas.openxmlformats.org/officeDocument/2006/relationships" xmlns:m="http://schemas.openxmlformats.org/officeDocument/2006/math" xmlns:v="urn:schemas-microsoft-com:vml" xmlns:wp14="http://schemas.microsoft.com/office/word/2010/wordprocessingDrawing" xmlns:wp="http://schemas.openxmlformats.org/drawingml/2006/wordprocessingDrawing" xmlns:w10="urn:schemas-microsoft-com:office:word" xmlns:w="http://schemas.openxmlformats.org/wordprocessingml/2006/main" xmlns:w14="http://schemas.microsoft.com/office/word/2010/wordml" xmlns:w15="http://schemas.microsoft.com/office/word/2012/wordml" xmlns:w16cex="http://schemas.microsoft.com/office/word/2018/wordml/cex" xmlns:w16cid="http://schemas.microsoft.com/office/word/2016/wordml/cid" xmlns:w16="http://schemas.microsoft.com/office/word/2018/wordml" xmlns:w16du="http://schemas.microsoft.com/office/word/2023/wordml/word16du" xmlns:w16sdtdh="http://schemas.microsoft.com/office/word/2020/wordml/sdtdatahash" xmlns:w16sdtfl="http://schemas.microsoft.com/office/word/2024/wordml/sdtformatlock" xmlns:w16se="http://schemas.microsoft.com/office/word/2015/wordml/symex" xmlns:wpg="http://schemas.microsoft.com/office/word/2010/wordprocessingGroup" xmlns:wpi="http://schemas.microsoft.com/office/word/2010/wordprocessingInk" xmlns:wne="http://schemas.microsoft.com/office/word/2006/wordml" xmlns:wps="http://schemas.microsoft.com/office/word/2010/wordprocessingShape" mc:Ignorable="w14 w15 w16se w16cid w16 w16cex w16sdtdh w16sdtfl w16du wp14">
   <w:abstractNum w:abstractNumId="0" w15:restartNumberingAfterBreak="0">
+    <w:nsid w:val="06051E9F"/>
+    <w:multiLevelType w:val="multilevel"/>
+    <w:tmpl w:val="E04EAB4E"/>
+    <w:lvl w:ilvl="0">
+      <w:start w:val="1"/>
+      <w:numFmt w:val="bullet"/>
+      <w:lvlText w:val=""/>
+      <w:lvlJc w:val="left"/>
+      <w:pPr>
+        <w:tabs>
+          <w:tab w:val="num" w:pos="720"/>
+        </w:tabs>
+        <w:ind w:left="720" w:hanging="360"/>
+      </w:pPr>
+      <w:rPr>
+        <w:rFonts w:ascii="Symbol" w:hAnsi="Symbol" w:hint="default"/>
+        <w:sz w:val="20"/>
+      </w:rPr>
+    </w:lvl>
+    <w:lvl w:ilvl="1" w:tentative="1">
+      <w:start w:val="1"/>
+      <w:numFmt w:val="bullet"/>
+      <w:lvlText w:val="o"/>
+      <w:lvlJc w:val="left"/>
+      <w:pPr>
+        <w:tabs>
+          <w:tab w:val="num" w:pos="1440"/>
+        </w:tabs>
+        <w:ind w:left="1440" w:hanging="360"/>
+      </w:pPr>
+      <w:rPr>
+        <w:rFonts w:ascii="Courier New" w:hAnsi="Courier New" w:hint="default"/>
+        <w:sz w:val="20"/>
+      </w:rPr>
+    </w:lvl>
+    <w:lvl w:ilvl="2" w:tentative="1">
+      <w:start w:val="1"/>
+      <w:numFmt w:val="bullet"/>
+      <w:lvlText w:val=""/>
+      <w:lvlJc w:val="left"/>
+      <w:pPr>
+        <w:tabs>
+          <w:tab w:val="num" w:pos="2160"/>
+        </w:tabs>
+        <w:ind w:left="2160" w:hanging="360"/>
+      </w:pPr>
+      <w:rPr>
+        <w:rFonts w:ascii="Wingdings" w:hAnsi="Wingdings" w:hint="default"/>
+        <w:sz w:val="20"/>
+      </w:rPr>
+    </w:lvl>
+    <w:lvl w:ilvl="3" w:tentative="1">
+      <w:start w:val="1"/>
+      <w:numFmt w:val="bullet"/>
+      <w:lvlText w:val=""/>
+      <w:lvlJc w:val="left"/>
+      <w:pPr>
+        <w:tabs>
+          <w:tab w:val="num" w:pos="2880"/>
+        </w:tabs>
+        <w:ind w:left="2880" w:hanging="360"/>
+      </w:pPr>
+      <w:rPr>
+        <w:rFonts w:ascii="Wingdings" w:hAnsi="Wingdings" w:hint="default"/>
+        <w:sz w:val="20"/>
+      </w:rPr>
+    </w:lvl>
+    <w:lvl w:ilvl="4" w:tentative="1">
+      <w:start w:val="1"/>
+      <w:numFmt w:val="bullet"/>
+      <w:lvlText w:val=""/>
+      <w:lvlJc w:val="left"/>
+      <w:pPr>
+        <w:tabs>
+          <w:tab w:val="num" w:pos="3600"/>
+        </w:tabs>
+        <w:ind w:left="3600" w:hanging="360"/>
+      </w:pPr>
+      <w:rPr>
+        <w:rFonts w:ascii="Wingdings" w:hAnsi="Wingdings" w:hint="default"/>
+        <w:sz w:val="20"/>
+      </w:rPr>
+    </w:lvl>
+    <w:lvl w:ilvl="5" w:tentative="1">
+      <w:start w:val="1"/>
+      <w:numFmt w:val="bullet"/>
+      <w:lvlText w:val=""/>
+      <w:lvlJc w:val="left"/>
+      <w:pPr>
+        <w:tabs>
+          <w:tab w:val="num" w:pos="4320"/>
+        </w:tabs>
+        <w:ind w:left="4320" w:hanging="360"/>
+      </w:pPr>
+      <w:rPr>
+        <w:rFonts w:ascii="Wingdings" w:hAnsi="Wingdings" w:hint="default"/>
+        <w:sz w:val="20"/>
+      </w:rPr>
+    </w:lvl>
+    <w:lvl w:ilvl="6" w:tentative="1">
+      <w:start w:val="1"/>
+      <w:numFmt w:val="bullet"/>
+      <w:lvlText w:val=""/>
+      <w:lvlJc w:val="left"/>
+      <w:pPr>
+        <w:tabs>
+          <w:tab w:val="num" w:pos="5040"/>
+        </w:tabs>
+        <w:ind w:left="5040" w:hanging="360"/>
+      </w:pPr>
+      <w:rPr>
+        <w:rFonts w:ascii="Wingdings" w:hAnsi="Wingdings" w:hint="default"/>
+        <w:sz w:val="20"/>
+      </w:rPr>
+    </w:lvl>
+    <w:lvl w:ilvl="7" w:tentative="1">
+      <w:start w:val="1"/>
+      <w:numFmt w:val="bullet"/>
+      <w:lvlText w:val=""/>
+      <w:lvlJc w:val="left"/>
+      <w:pPr>
+        <w:tabs>
+          <w:tab w:val="num" w:pos="5760"/>
+        </w:tabs>
+        <w:ind w:left="5760" w:hanging="360"/>
+      </w:pPr>
+      <w:rPr>
+        <w:rFonts w:ascii="Wingdings" w:hAnsi="Wingdings" w:hint="default"/>
+        <w:sz w:val="20"/>
+      </w:rPr>
+    </w:lvl>
+    <w:lvl w:ilvl="8" w:tentative="1">
+      <w:start w:val="1"/>
+      <w:numFmt w:val="bullet"/>
+      <w:lvlText w:val=""/>
+      <w:lvlJc w:val="left"/>
+      <w:pPr>
+        <w:tabs>
+          <w:tab w:val="num" w:pos="6480"/>
+        </w:tabs>
+        <w:ind w:left="6480" w:hanging="360"/>
+      </w:pPr>
+      <w:rPr>
+        <w:rFonts w:ascii="Wingdings" w:hAnsi="Wingdings" w:hint="default"/>
+        <w:sz w:val="20"/>
+      </w:rPr>
+    </w:lvl>
+  </w:abstractNum>
+  <w:abstractNum w:abstractNumId="1" w15:restartNumberingAfterBreak="0">
     <w:nsid w:val="098E43C6"/>
     <w:multiLevelType w:val="hybridMultilevel"/>
     <w:tmpl w:val="67E2CEF0"/>
@@ -3187,7 +3346,7 @@
       </w:pPr>
     </w:lvl>
   </w:abstractNum>
-  <w:abstractNum w:abstractNumId="1" w15:restartNumberingAfterBreak="0">
+  <w:abstractNum w:abstractNumId="2" w15:restartNumberingAfterBreak="0">
     <w:nsid w:val="0ED77C8B"/>
     <w:multiLevelType w:val="multilevel"/>
     <w:tmpl w:val="75C48196"/>
@@ -3300,7 +3459,156 @@
       </w:pPr>
     </w:lvl>
   </w:abstractNum>
-  <w:abstractNum w:abstractNumId="2" w15:restartNumberingAfterBreak="0">
+  <w:abstractNum w:abstractNumId="3" w15:restartNumberingAfterBreak="0">
+    <w:nsid w:val="10D575F9"/>
+    <w:multiLevelType w:val="multilevel"/>
+    <w:tmpl w:val="446C2F2A"/>
+    <w:lvl w:ilvl="0">
+      <w:start w:val="1"/>
+      <w:numFmt w:val="bullet"/>
+      <w:lvlText w:val=""/>
+      <w:lvlJc w:val="left"/>
+      <w:pPr>
+        <w:tabs>
+          <w:tab w:val="num" w:pos="720"/>
+        </w:tabs>
+        <w:ind w:left="720" w:hanging="360"/>
+      </w:pPr>
+      <w:rPr>
+        <w:rFonts w:ascii="Symbol" w:hAnsi="Symbol" w:hint="default"/>
+        <w:sz w:val="20"/>
+      </w:rPr>
+    </w:lvl>
+    <w:lvl w:ilvl="1" w:tentative="1">
+      <w:start w:val="1"/>
+      <w:numFmt w:val="bullet"/>
+      <w:lvlText w:val="o"/>
+      <w:lvlJc w:val="left"/>
+      <w:pPr>
+        <w:tabs>
+          <w:tab w:val="num" w:pos="1440"/>
+        </w:tabs>
+        <w:ind w:left="1440" w:hanging="360"/>
+      </w:pPr>
+      <w:rPr>
+        <w:rFonts w:ascii="Courier New" w:hAnsi="Courier New" w:hint="default"/>
+        <w:sz w:val="20"/>
+      </w:rPr>
+    </w:lvl>
+    <w:lvl w:ilvl="2" w:tentative="1">
+      <w:start w:val="1"/>
+      <w:numFmt w:val="bullet"/>
+      <w:lvlText w:val=""/>
+      <w:lvlJc w:val="left"/>
+      <w:pPr>
+        <w:tabs>
+          <w:tab w:val="num" w:pos="2160"/>
+        </w:tabs>
+        <w:ind w:left="2160" w:hanging="360"/>
+      </w:pPr>
+      <w:rPr>
+        <w:rFonts w:ascii="Wingdings" w:hAnsi="Wingdings" w:hint="default"/>
+        <w:sz w:val="20"/>
+      </w:rPr>
+    </w:lvl>
+    <w:lvl w:ilvl="3" w:tentative="1">
+      <w:start w:val="1"/>
+      <w:numFmt w:val="bullet"/>
+      <w:lvlText w:val=""/>
+      <w:lvlJc w:val="left"/>
+      <w:pPr>
+        <w:tabs>
+          <w:tab w:val="num" w:pos="2880"/>
+        </w:tabs>
+        <w:ind w:left="2880" w:hanging="360"/>
+      </w:pPr>
+      <w:rPr>
+        <w:rFonts w:ascii="Wingdings" w:hAnsi="Wingdings" w:hint="default"/>
+        <w:sz w:val="20"/>
+      </w:rPr>
+    </w:lvl>
+    <w:lvl w:ilvl="4" w:tentative="1">
+      <w:start w:val="1"/>
+      <w:numFmt w:val="bullet"/>
+      <w:lvlText w:val=""/>
+      <w:lvlJc w:val="left"/>
+      <w:pPr>
+        <w:tabs>
+          <w:tab w:val="num" w:pos="3600"/>
+        </w:tabs>
+        <w:ind w:left="3600" w:hanging="360"/>
+      </w:pPr>
+      <w:rPr>
+        <w:rFonts w:ascii="Wingdings" w:hAnsi="Wingdings" w:hint="default"/>
+        <w:sz w:val="20"/>
+      </w:rPr>
+    </w:lvl>
+    <w:lvl w:ilvl="5" w:tentative="1">
+      <w:start w:val="1"/>
+      <w:numFmt w:val="bullet"/>
+      <w:lvlText w:val=""/>
+      <w:lvlJc w:val="left"/>
+      <w:pPr>
+        <w:tabs>
+          <w:tab w:val="num" w:pos="4320"/>
+        </w:tabs>
+        <w:ind w:left="4320" w:hanging="360"/>
+      </w:pPr>
+      <w:rPr>
+        <w:rFonts w:ascii="Wingdings" w:hAnsi="Wingdings" w:hint="default"/>
+        <w:sz w:val="20"/>
+      </w:rPr>
+    </w:lvl>
+    <w:lvl w:ilvl="6" w:tentative="1">
+      <w:start w:val="1"/>
+      <w:numFmt w:val="bullet"/>
+      <w:lvlText w:val=""/>
+      <w:lvlJc w:val="left"/>
+      <w:pPr>
+        <w:tabs>
+          <w:tab w:val="num" w:pos="5040"/>
+        </w:tabs>
+        <w:ind w:left="5040" w:hanging="360"/>
+      </w:pPr>
+      <w:rPr>
+        <w:rFonts w:ascii="Wingdings" w:hAnsi="Wingdings" w:hint="default"/>
+        <w:sz w:val="20"/>
+      </w:rPr>
+    </w:lvl>
+    <w:lvl w:ilvl="7" w:tentative="1">
+      <w:start w:val="1"/>
+      <w:numFmt w:val="bullet"/>
+      <w:lvlText w:val=""/>
+      <w:lvlJc w:val="left"/>
+      <w:pPr>
+        <w:tabs>
+          <w:tab w:val="num" w:pos="5760"/>
+        </w:tabs>
+        <w:ind w:left="5760" w:hanging="360"/>
+      </w:pPr>
+      <w:rPr>
+        <w:rFonts w:ascii="Wingdings" w:hAnsi="Wingdings" w:hint="default"/>
+        <w:sz w:val="20"/>
+      </w:rPr>
+    </w:lvl>
+    <w:lvl w:ilvl="8" w:tentative="1">
+      <w:start w:val="1"/>
+      <w:numFmt w:val="bullet"/>
+      <w:lvlText w:val=""/>
+      <w:lvlJc w:val="left"/>
+      <w:pPr>
+        <w:tabs>
+          <w:tab w:val="num" w:pos="6480"/>
+        </w:tabs>
+        <w:ind w:left="6480" w:hanging="360"/>
+      </w:pPr>
+      <w:rPr>
+        <w:rFonts w:ascii="Wingdings" w:hAnsi="Wingdings" w:hint="default"/>
+        <w:sz w:val="20"/>
+      </w:rPr>
+    </w:lvl>
+  </w:abstractNum>
+  <w:abstractNum w:abstractNumId="4" w15:restartNumberingAfterBreak="0">
     <w:nsid w:val="11ED5ECB"/>
     <w:multiLevelType w:val="multilevel"/>
     <w:tmpl w:val="A6545128"/>
@@ -3449,7 +3757,7 @@
       </w:rPr>
     </w:lvl>
   </w:abstractNum>
-  <w:abstractNum w:abstractNumId="3" w15:restartNumberingAfterBreak="0">
+  <w:abstractNum w:abstractNumId="5" w15:restartNumberingAfterBreak="0">
     <w:nsid w:val="11EE02DD"/>
     <w:multiLevelType w:val="hybridMultilevel"/>
     <w:tmpl w:val="1F28CA28"/>
@@ -3562,7 +3870,7 @@
       </w:rPr>
     </w:lvl>
   </w:abstractNum>
-  <w:abstractNum w:abstractNumId="4" w15:restartNumberingAfterBreak="0">
+  <w:abstractNum w:abstractNumId="6" w15:restartNumberingAfterBreak="0">
     <w:nsid w:val="1500540A"/>
     <w:multiLevelType w:val="multilevel"/>
     <w:tmpl w:val="9A88DA6C"/>
@@ -3675,7 +3983,7 @@
       </w:pPr>
     </w:lvl>
   </w:abstractNum>
-  <w:abstractNum w:abstractNumId="5" w15:restartNumberingAfterBreak="0">
+  <w:abstractNum w:abstractNumId="7" w15:restartNumberingAfterBreak="0">
     <w:nsid w:val="181B0935"/>
     <w:multiLevelType w:val="multilevel"/>
     <w:tmpl w:val="A7E0AE34"/>
@@ -3791,7 +4099,7 @@
       </w:pPr>
     </w:lvl>
   </w:abstractNum>
-  <w:abstractNum w:abstractNumId="6" w15:restartNumberingAfterBreak="0">
+  <w:abstractNum w:abstractNumId="8" w15:restartNumberingAfterBreak="0">
     <w:nsid w:val="201A32AF"/>
     <w:multiLevelType w:val="multilevel"/>
     <w:tmpl w:val="5606B116"/>
@@ -3907,7 +4215,7 @@
       </w:pPr>
     </w:lvl>
   </w:abstractNum>
-  <w:abstractNum w:abstractNumId="7" w15:restartNumberingAfterBreak="0">
+  <w:abstractNum w:abstractNumId="9" w15:restartNumberingAfterBreak="0">
     <w:nsid w:val="28016436"/>
     <w:multiLevelType w:val="hybridMultilevel"/>
     <w:tmpl w:val="87D0CED6"/>
@@ -4020,7 +4328,7 @@
       </w:rPr>
     </w:lvl>
   </w:abstractNum>
-  <w:abstractNum w:abstractNumId="8" w15:restartNumberingAfterBreak="0">
+  <w:abstractNum w:abstractNumId="10" w15:restartNumberingAfterBreak="0">
     <w:nsid w:val="319D15EA"/>
     <w:multiLevelType w:val="hybridMultilevel"/>
     <w:tmpl w:val="BE78A338"/>
@@ -4133,7 +4441,120 @@
       </w:rPr>
     </w:lvl>
   </w:abstractNum>
-  <w:abstractNum w:abstractNumId="9" w15:restartNumberingAfterBreak="0">
+  <w:abstractNum w:abstractNumId="11" w15:restartNumberingAfterBreak="0">
+    <w:nsid w:val="34E60CD4"/>
+    <w:multiLevelType w:val="hybridMultilevel"/>
+    <w:tmpl w:val="BB64676E"/>
+    <w:lvl w:ilvl="0" w:tplc="240A0001">
+      <w:start w:val="1"/>
+      <w:numFmt w:val="bullet"/>
+      <w:lvlText w:val=""/>
+      <w:lvlJc w:val="left"/>
+      <w:pPr>
+        <w:ind w:left="720" w:hanging="360"/>
+      </w:pPr>
+      <w:rPr>
+        <w:rFonts w:ascii="Symbol" w:hAnsi="Symbol" w:hint="default"/>
+      </w:rPr>
+    </w:lvl>
+    <w:lvl w:ilvl="1" w:tplc="240A0003" w:tentative="1">
+      <w:start w:val="1"/>
+      <w:numFmt w:val="bullet"/>
+      <w:lvlText w:val="o"/>
+      <w:lvlJc w:val="left"/>
+      <w:pPr>
+        <w:ind w:left="1440" w:hanging="360"/>
+      </w:pPr>
+      <w:rPr>
+        <w:rFonts w:ascii="Courier New" w:hAnsi="Courier New" w:cs="Courier New" w:hint="default"/>
+      </w:rPr>
+    </w:lvl>
+    <w:lvl w:ilvl="2" w:tplc="240A0005" w:tentative="1">
+      <w:start w:val="1"/>
+      <w:numFmt w:val="bullet"/>
+      <w:lvlText w:val=""/>
+      <w:lvlJc w:val="left"/>
+      <w:pPr>
+        <w:ind w:left="2160" w:hanging="360"/>
+      </w:pPr>
+      <w:rPr>
+        <w:rFonts w:ascii="Wingdings" w:hAnsi="Wingdings" w:hint="default"/>
+      </w:rPr>
+    </w:lvl>
+    <w:lvl w:ilvl="3" w:tplc="240A0001" w:tentative="1">
+      <w:start w:val="1"/>
+      <w:numFmt w:val="bullet"/>
+      <w:lvlText w:val=""/>
+      <w:lvlJc w:val="left"/>
+      <w:pPr>
+        <w:ind w:left="2880" w:hanging="360"/>
+      </w:pPr>
+      <w:rPr>
+        <w:rFonts w:ascii="Symbol" w:hAnsi="Symbol" w:hint="default"/>
+      </w:rPr>
+    </w:lvl>
+    <w:lvl w:ilvl="4" w:tplc="240A0003" w:tentative="1">
+      <w:start w:val="1"/>
+      <w:numFmt w:val="bullet"/>
+      <w:lvlText w:val="o"/>
+      <w:lvlJc w:val="left"/>
+      <w:pPr>
+        <w:ind w:left="3600" w:hanging="360"/>
+      </w:pPr>
+      <w:rPr>
+        <w:rFonts w:ascii="Courier New" w:hAnsi="Courier New" w:cs="Courier New" w:hint="default"/>
+      </w:rPr>
+    </w:lvl>
+    <w:lvl w:ilvl="5" w:tplc="240A0005" w:tentative="1">
+      <w:start w:val="1"/>
+      <w:numFmt w:val="bullet"/>
+      <w:lvlText w:val=""/>
+      <w:lvlJc w:val="left"/>
+      <w:pPr>
+        <w:ind w:left="4320" w:hanging="360"/>
+      </w:pPr>
+      <w:rPr>
+        <w:rFonts w:ascii="Wingdings" w:hAnsi="Wingdings" w:hint="default"/>
+      </w:rPr>
+    </w:lvl>
+    <w:lvl w:ilvl="6" w:tplc="240A0001" w:tentative="1">
+      <w:start w:val="1"/>
+      <w:numFmt w:val="bullet"/>
+      <w:lvlText w:val=""/>
+      <w:lvlJc w:val="left"/>
+      <w:pPr>
+        <w:ind w:left="5040" w:hanging="360"/>
+      </w:pPr>
+      <w:rPr>
+        <w:rFonts w:ascii="Symbol" w:hAnsi="Symbol" w:hint="default"/>
+      </w:rPr>
+    </w:lvl>
+    <w:lvl w:ilvl="7" w:tplc="240A0003" w:tentative="1">
+      <w:start w:val="1"/>
+      <w:numFmt w:val="bullet"/>
+      <w:lvlText w:val="o"/>
+      <w:lvlJc w:val="left"/>
+      <w:pPr>
+        <w:ind w:left="5760" w:hanging="360"/>
+      </w:pPr>
+      <w:rPr>
+        <w:rFonts w:ascii="Courier New" w:hAnsi="Courier New" w:cs="Courier New" w:hint="default"/>
+      </w:rPr>
+    </w:lvl>
+    <w:lvl w:ilvl="8" w:tplc="240A0005" w:tentative="1">
+      <w:start w:val="1"/>
+      <w:numFmt w:val="bullet"/>
+      <w:lvlText w:val=""/>
+      <w:lvlJc w:val="left"/>
+      <w:pPr>
+        <w:ind w:left="6480" w:hanging="360"/>
+      </w:pPr>
+      <w:rPr>
+        <w:rFonts w:ascii="Wingdings" w:hAnsi="Wingdings" w:hint="default"/>
+      </w:rPr>
+    </w:lvl>
+  </w:abstractNum>
+  <w:abstractNum w:abstractNumId="12" w15:restartNumberingAfterBreak="0">
     <w:nsid w:val="365E72FC"/>
     <w:multiLevelType w:val="multilevel"/>
     <w:tmpl w:val="1542E52E"/>
@@ -4246,7 +4667,7 @@
       </w:pPr>
     </w:lvl>
   </w:abstractNum>
-  <w:abstractNum w:abstractNumId="10" w15:restartNumberingAfterBreak="0">
+  <w:abstractNum w:abstractNumId="13" w15:restartNumberingAfterBreak="0">
     <w:nsid w:val="37BF4FAA"/>
     <w:multiLevelType w:val="hybridMultilevel"/>
     <w:tmpl w:val="F71C8916"/>
@@ -4332,7 +4753,156 @@
       </w:pPr>
     </w:lvl>
   </w:abstractNum>
-  <w:abstractNum w:abstractNumId="11" w15:restartNumberingAfterBreak="0">
+  <w:abstractNum w:abstractNumId="14" w15:restartNumberingAfterBreak="0">
+    <w:nsid w:val="3B4207A2"/>
+    <w:multiLevelType w:val="multilevel"/>
+    <w:tmpl w:val="04521ACC"/>
+    <w:lvl w:ilvl="0">
+      <w:start w:val="1"/>
+      <w:numFmt w:val="bullet"/>
+      <w:lvlText w:val=""/>
+      <w:lvlJc w:val="left"/>
+      <w:pPr>
+        <w:tabs>
+          <w:tab w:val="num" w:pos="720"/>
+        </w:tabs>
+        <w:ind w:left="720" w:hanging="360"/>
+      </w:pPr>
+      <w:rPr>
+        <w:rFonts w:ascii="Symbol" w:hAnsi="Symbol" w:hint="default"/>
+        <w:sz w:val="20"/>
+      </w:rPr>
+    </w:lvl>
+    <w:lvl w:ilvl="1" w:tentative="1">
+      <w:start w:val="1"/>
+      <w:numFmt w:val="bullet"/>
+      <w:lvlText w:val="o"/>
+      <w:lvlJc w:val="left"/>
+      <w:pPr>
+        <w:tabs>
+          <w:tab w:val="num" w:pos="1440"/>
+        </w:tabs>
+        <w:ind w:left="1440" w:hanging="360"/>
+      </w:pPr>
+      <w:rPr>
+        <w:rFonts w:ascii="Courier New" w:hAnsi="Courier New" w:hint="default"/>
+        <w:sz w:val="20"/>
+      </w:rPr>
+    </w:lvl>
+    <w:lvl w:ilvl="2" w:tentative="1">
+      <w:start w:val="1"/>
+      <w:numFmt w:val="bullet"/>
+      <w:lvlText w:val=""/>
+      <w:lvlJc w:val="left"/>
+      <w:pPr>
+        <w:tabs>
+          <w:tab w:val="num" w:pos="2160"/>
+        </w:tabs>
+        <w:ind w:left="2160" w:hanging="360"/>
+      </w:pPr>
+      <w:rPr>
+        <w:rFonts w:ascii="Wingdings" w:hAnsi="Wingdings" w:hint="default"/>
+        <w:sz w:val="20"/>
+      </w:rPr>
+    </w:lvl>
+    <w:lvl w:ilvl="3" w:tentative="1">
+      <w:start w:val="1"/>
+      <w:numFmt w:val="bullet"/>
+      <w:lvlText w:val=""/>
+      <w:lvlJc w:val="left"/>
+      <w:pPr>
+        <w:tabs>
+          <w:tab w:val="num" w:pos="2880"/>
+        </w:tabs>
+        <w:ind w:left="2880" w:hanging="360"/>
+      </w:pPr>
+      <w:rPr>
+        <w:rFonts w:ascii="Wingdings" w:hAnsi="Wingdings" w:hint="default"/>
+        <w:sz w:val="20"/>
+      </w:rPr>
+    </w:lvl>
+    <w:lvl w:ilvl="4" w:tentative="1">
+      <w:start w:val="1"/>
+      <w:numFmt w:val="bullet"/>
+      <w:lvlText w:val=""/>
+      <w:lvlJc w:val="left"/>
+      <w:pPr>
+        <w:tabs>
+          <w:tab w:val="num" w:pos="3600"/>
+        </w:tabs>
+        <w:ind w:left="3600" w:hanging="360"/>
+      </w:pPr>
+      <w:rPr>
+        <w:rFonts w:ascii="Wingdings" w:hAnsi="Wingdings" w:hint="default"/>
+        <w:sz w:val="20"/>
+      </w:rPr>
+    </w:lvl>
+    <w:lvl w:ilvl="5" w:tentative="1">
+      <w:start w:val="1"/>
+      <w:numFmt w:val="bullet"/>
+      <w:lvlText w:val=""/>
+      <w:lvlJc w:val="left"/>
+      <w:pPr>
+        <w:tabs>
+          <w:tab w:val="num" w:pos="4320"/>
+        </w:tabs>
+        <w:ind w:left="4320" w:hanging="360"/>
+      </w:pPr>
+      <w:rPr>
+        <w:rFonts w:ascii="Wingdings" w:hAnsi="Wingdings" w:hint="default"/>
+        <w:sz w:val="20"/>
+      </w:rPr>
+    </w:lvl>
+    <w:lvl w:ilvl="6" w:tentative="1">
+      <w:start w:val="1"/>
+      <w:numFmt w:val="bullet"/>
+      <w:lvlText w:val=""/>
+      <w:lvlJc w:val="left"/>
+      <w:pPr>
+        <w:tabs>
+          <w:tab w:val="num" w:pos="5040"/>
+        </w:tabs>
+        <w:ind w:left="5040" w:hanging="360"/>
+      </w:pPr>
+      <w:rPr>
+        <w:rFonts w:ascii="Wingdings" w:hAnsi="Wingdings" w:hint="default"/>
+        <w:sz w:val="20"/>
+      </w:rPr>
+    </w:lvl>
+    <w:lvl w:ilvl="7" w:tentative="1">
+      <w:start w:val="1"/>
+      <w:numFmt w:val="bullet"/>
+      <w:lvlText w:val=""/>
+      <w:lvlJc w:val="left"/>
+      <w:pPr>
+        <w:tabs>
+          <w:tab w:val="num" w:pos="5760"/>
+        </w:tabs>
+        <w:ind w:left="5760" w:hanging="360"/>
+      </w:pPr>
+      <w:rPr>
+        <w:rFonts w:ascii="Wingdings" w:hAnsi="Wingdings" w:hint="default"/>
+        <w:sz w:val="20"/>
+      </w:rPr>
+    </w:lvl>
+    <w:lvl w:ilvl="8" w:tentative="1">
+      <w:start w:val="1"/>
+      <w:numFmt w:val="bullet"/>
+      <w:lvlText w:val=""/>
+      <w:lvlJc w:val="left"/>
+      <w:pPr>
+        <w:tabs>
+          <w:tab w:val="num" w:pos="6480"/>
+        </w:tabs>
+        <w:ind w:left="6480" w:hanging="360"/>
+      </w:pPr>
+      <w:rPr>
+        <w:rFonts w:ascii="Wingdings" w:hAnsi="Wingdings" w:hint="default"/>
+        <w:sz w:val="20"/>
+      </w:rPr>
+    </w:lvl>
+  </w:abstractNum>
+  <w:abstractNum w:abstractNumId="15" w15:restartNumberingAfterBreak="0">
     <w:nsid w:val="3CF834AF"/>
     <w:multiLevelType w:val="multilevel"/>
     <w:tmpl w:val="A7E0AE34"/>
@@ -4448,7 +5018,7 @@
       </w:pPr>
     </w:lvl>
   </w:abstractNum>
-  <w:abstractNum w:abstractNumId="12" w15:restartNumberingAfterBreak="0">
+  <w:abstractNum w:abstractNumId="16" w15:restartNumberingAfterBreak="0">
     <w:nsid w:val="3CFD72A3"/>
     <w:multiLevelType w:val="multilevel"/>
     <w:tmpl w:val="75EAFADE"/>
@@ -4561,7 +5131,7 @@
       </w:pPr>
     </w:lvl>
   </w:abstractNum>
-  <w:abstractNum w:abstractNumId="13" w15:restartNumberingAfterBreak="0">
+  <w:abstractNum w:abstractNumId="17" w15:restartNumberingAfterBreak="0">
     <w:nsid w:val="403F0003"/>
     <w:multiLevelType w:val="multilevel"/>
     <w:tmpl w:val="42668D3C"/>
@@ -4674,7 +5244,7 @@
       </w:pPr>
     </w:lvl>
   </w:abstractNum>
-  <w:abstractNum w:abstractNumId="14" w15:restartNumberingAfterBreak="0">
+  <w:abstractNum w:abstractNumId="18" w15:restartNumberingAfterBreak="0">
     <w:nsid w:val="425C02AD"/>
     <w:multiLevelType w:val="multilevel"/>
     <w:tmpl w:val="C38410E2"/>
@@ -4823,7 +5393,7 @@
       </w:rPr>
     </w:lvl>
   </w:abstractNum>
-  <w:abstractNum w:abstractNumId="15" w15:restartNumberingAfterBreak="0">
+  <w:abstractNum w:abstractNumId="19" w15:restartNumberingAfterBreak="0">
     <w:nsid w:val="427A018E"/>
     <w:multiLevelType w:val="multilevel"/>
     <w:tmpl w:val="9E3A91FA"/>
@@ -4972,7 +5542,7 @@
       </w:rPr>
     </w:lvl>
   </w:abstractNum>
-  <w:abstractNum w:abstractNumId="16" w15:restartNumberingAfterBreak="0">
+  <w:abstractNum w:abstractNumId="20" w15:restartNumberingAfterBreak="0">
     <w:nsid w:val="446525E2"/>
     <w:multiLevelType w:val="multilevel"/>
     <w:tmpl w:val="0DB42DFE"/>
@@ -5121,7 +5691,7 @@
       </w:rPr>
     </w:lvl>
   </w:abstractNum>
-  <w:abstractNum w:abstractNumId="17" w15:restartNumberingAfterBreak="0">
+  <w:abstractNum w:abstractNumId="21" w15:restartNumberingAfterBreak="0">
     <w:nsid w:val="45010147"/>
     <w:multiLevelType w:val="multilevel"/>
     <w:tmpl w:val="6E8C85EC"/>
@@ -5270,7 +5840,7 @@
       </w:rPr>
     </w:lvl>
   </w:abstractNum>
-  <w:abstractNum w:abstractNumId="18" w15:restartNumberingAfterBreak="0">
+  <w:abstractNum w:abstractNumId="22" w15:restartNumberingAfterBreak="0">
     <w:nsid w:val="45080D54"/>
     <w:multiLevelType w:val="hybridMultilevel"/>
     <w:tmpl w:val="8E1C6494"/>
@@ -5382,7 +5952,7 @@
       </w:rPr>
     </w:lvl>
   </w:abstractNum>
-  <w:abstractNum w:abstractNumId="19" w15:restartNumberingAfterBreak="0">
+  <w:abstractNum w:abstractNumId="23" w15:restartNumberingAfterBreak="0">
     <w:nsid w:val="4F954287"/>
     <w:multiLevelType w:val="multilevel"/>
     <w:tmpl w:val="CAD4B820"/>
@@ -5531,7 +6101,7 @@
       </w:rPr>
     </w:lvl>
   </w:abstractNum>
-  <w:abstractNum w:abstractNumId="20" w15:restartNumberingAfterBreak="0">
+  <w:abstractNum w:abstractNumId="24" w15:restartNumberingAfterBreak="0">
     <w:nsid w:val="5A94397A"/>
     <w:multiLevelType w:val="multilevel"/>
     <w:tmpl w:val="683882F8"/>
@@ -5680,7 +6250,7 @@
       </w:rPr>
     </w:lvl>
   </w:abstractNum>
-  <w:abstractNum w:abstractNumId="21" w15:restartNumberingAfterBreak="0">
+  <w:abstractNum w:abstractNumId="25" w15:restartNumberingAfterBreak="0">
     <w:nsid w:val="5BD721F0"/>
     <w:multiLevelType w:val="multilevel"/>
     <w:tmpl w:val="33F809F0"/>
@@ -5829,7 +6399,7 @@
       </w:rPr>
     </w:lvl>
   </w:abstractNum>
-  <w:abstractNum w:abstractNumId="22" w15:restartNumberingAfterBreak="0">
+  <w:abstractNum w:abstractNumId="26" w15:restartNumberingAfterBreak="0">
     <w:nsid w:val="5E4B3584"/>
     <w:multiLevelType w:val="hybridMultilevel"/>
     <w:tmpl w:val="B25CFA1C"/>
@@ -5942,7 +6512,7 @@
       </w:rPr>
     </w:lvl>
   </w:abstractNum>
-  <w:abstractNum w:abstractNumId="23" w15:restartNumberingAfterBreak="0">
+  <w:abstractNum w:abstractNumId="27" w15:restartNumberingAfterBreak="0">
     <w:nsid w:val="5F2E2D37"/>
     <w:multiLevelType w:val="multilevel"/>
     <w:tmpl w:val="889E9256"/>
@@ -6091,7 +6661,7 @@
       </w:rPr>
     </w:lvl>
   </w:abstractNum>
-  <w:abstractNum w:abstractNumId="24" w15:restartNumberingAfterBreak="0">
+  <w:abstractNum w:abstractNumId="28" w15:restartNumberingAfterBreak="0">
     <w:nsid w:val="604B5C22"/>
     <w:multiLevelType w:val="hybridMultilevel"/>
     <w:tmpl w:val="7AB6367C"/>
@@ -6204,7 +6774,7 @@
       </w:rPr>
     </w:lvl>
   </w:abstractNum>
-  <w:abstractNum w:abstractNumId="25" w15:restartNumberingAfterBreak="0">
+  <w:abstractNum w:abstractNumId="29" w15:restartNumberingAfterBreak="0">
     <w:nsid w:val="60586D04"/>
     <w:multiLevelType w:val="multilevel"/>
     <w:tmpl w:val="EB40BB90"/>
@@ -6353,7 +6923,7 @@
       </w:rPr>
     </w:lvl>
   </w:abstractNum>
-  <w:abstractNum w:abstractNumId="26" w15:restartNumberingAfterBreak="0">
+  <w:abstractNum w:abstractNumId="30" w15:restartNumberingAfterBreak="0">
     <w:nsid w:val="6611690C"/>
     <w:multiLevelType w:val="hybridMultilevel"/>
     <w:tmpl w:val="69D44F0A"/>
@@ -6466,7 +7036,7 @@
       </w:rPr>
     </w:lvl>
   </w:abstractNum>
-  <w:abstractNum w:abstractNumId="27" w15:restartNumberingAfterBreak="0">
+  <w:abstractNum w:abstractNumId="31" w15:restartNumberingAfterBreak="0">
     <w:nsid w:val="68280189"/>
     <w:multiLevelType w:val="hybridMultilevel"/>
     <w:tmpl w:val="16729304"/>
@@ -6579,7 +7149,7 @@
       </w:rPr>
     </w:lvl>
   </w:abstractNum>
-  <w:abstractNum w:abstractNumId="28" w15:restartNumberingAfterBreak="0">
+  <w:abstractNum w:abstractNumId="32" w15:restartNumberingAfterBreak="0">
     <w:nsid w:val="6BF2715A"/>
     <w:multiLevelType w:val="multilevel"/>
     <w:tmpl w:val="AEC42A86"/>
@@ -6692,7 +7262,7 @@
       </w:pPr>
     </w:lvl>
   </w:abstractNum>
-  <w:abstractNum w:abstractNumId="29" w15:restartNumberingAfterBreak="0">
+  <w:abstractNum w:abstractNumId="33" w15:restartNumberingAfterBreak="0">
     <w:nsid w:val="6C57047E"/>
     <w:multiLevelType w:val="multilevel"/>
     <w:tmpl w:val="19CAB288"/>
@@ -6841,7 +7411,7 @@
       </w:rPr>
     </w:lvl>
   </w:abstractNum>
-  <w:abstractNum w:abstractNumId="30" w15:restartNumberingAfterBreak="0">
+  <w:abstractNum w:abstractNumId="34" w15:restartNumberingAfterBreak="0">
     <w:nsid w:val="6C5828B1"/>
     <w:multiLevelType w:val="hybridMultilevel"/>
     <w:tmpl w:val="9BACA330"/>
@@ -6954,7 +7524,7 @@
       </w:rPr>
     </w:lvl>
   </w:abstractNum>
-  <w:abstractNum w:abstractNumId="31" w15:restartNumberingAfterBreak="0">
+  <w:abstractNum w:abstractNumId="35" w15:restartNumberingAfterBreak="0">
     <w:nsid w:val="78232C45"/>
     <w:multiLevelType w:val="multilevel"/>
     <w:tmpl w:val="2D767BA6"/>
@@ -7103,108 +7673,120 @@
       </w:rPr>
     </w:lvl>
   </w:abstractNum>
-  <w:num w:numId="1">
+  <w:num w:numId="1" w16cid:durableId="1321736607">
+    <w:abstractNumId w:val="27"/>
+  </w:num>
+  <w:num w:numId="2" w16cid:durableId="625114394">
+    <w:abstractNumId w:val="32"/>
+  </w:num>
+  <w:num w:numId="3" w16cid:durableId="1381630724">
+    <w:abstractNumId w:val="16"/>
+  </w:num>
+  <w:num w:numId="4" w16cid:durableId="2059165517">
+    <w:abstractNumId w:val="6"/>
+  </w:num>
+  <w:num w:numId="5" w16cid:durableId="1633635425">
+    <w:abstractNumId w:val="24"/>
+  </w:num>
+  <w:num w:numId="6" w16cid:durableId="599290019">
+    <w:abstractNumId w:val="19"/>
+  </w:num>
+  <w:num w:numId="7" w16cid:durableId="1796830026">
+    <w:abstractNumId w:val="20"/>
+  </w:num>
+  <w:num w:numId="8" w16cid:durableId="1326741634">
+    <w:abstractNumId w:val="4"/>
+  </w:num>
+  <w:num w:numId="9" w16cid:durableId="1363166206">
+    <w:abstractNumId w:val="18"/>
+  </w:num>
+  <w:num w:numId="10" w16cid:durableId="1937401181">
+    <w:abstractNumId w:val="12"/>
+  </w:num>
+  <w:num w:numId="11" w16cid:durableId="749353172">
+    <w:abstractNumId w:val="8"/>
+  </w:num>
+  <w:num w:numId="12" w16cid:durableId="1185050786">
+    <w:abstractNumId w:val="17"/>
+  </w:num>
+  <w:num w:numId="13" w16cid:durableId="1052778474">
+    <w:abstractNumId w:val="33"/>
+  </w:num>
+  <w:num w:numId="14" w16cid:durableId="1444610805">
+    <w:abstractNumId w:val="21"/>
+  </w:num>
+  <w:num w:numId="15" w16cid:durableId="2022274900">
+    <w:abstractNumId w:val="2"/>
+  </w:num>
+  <w:num w:numId="16" w16cid:durableId="477117351">
+    <w:abstractNumId w:val="35"/>
+  </w:num>
+  <w:num w:numId="17" w16cid:durableId="774133789">
+    <w:abstractNumId w:val="34"/>
+  </w:num>
+  <w:num w:numId="18" w16cid:durableId="863710042">
+    <w:abstractNumId w:val="29"/>
+  </w:num>
+  <w:num w:numId="19" w16cid:durableId="848759498">
+    <w:abstractNumId w:val="22"/>
+  </w:num>
+  <w:num w:numId="20" w16cid:durableId="256136027">
+    <w:abstractNumId w:val="30"/>
+  </w:num>
+  <w:num w:numId="21" w16cid:durableId="1321152853">
+    <w:abstractNumId w:val="5"/>
+  </w:num>
+  <w:num w:numId="22" w16cid:durableId="1606688578">
     <w:abstractNumId w:val="23"/>
   </w:num>
-  <w:num w:numId="2">
+  <w:num w:numId="23" w16cid:durableId="825363275">
+    <w:abstractNumId w:val="31"/>
+  </w:num>
+  <w:num w:numId="24" w16cid:durableId="102507273">
+    <w:abstractNumId w:val="26"/>
+  </w:num>
+  <w:num w:numId="25" w16cid:durableId="492448751">
+    <w:abstractNumId w:val="9"/>
+  </w:num>
+  <w:num w:numId="26" w16cid:durableId="589781610">
+    <w:abstractNumId w:val="10"/>
+  </w:num>
+  <w:num w:numId="27" w16cid:durableId="1498766288">
+    <w:abstractNumId w:val="25"/>
+  </w:num>
+  <w:num w:numId="28" w16cid:durableId="1993949154">
     <w:abstractNumId w:val="28"/>
   </w:num>
-  <w:num w:numId="3">
-    <w:abstractNumId w:val="12"/>
+  <w:num w:numId="29" w16cid:durableId="223876754">
+    <w:abstractNumId w:val="13"/>
   </w:num>
-  <w:num w:numId="4">
-    <w:abstractNumId w:val="4"/>
+  <w:num w:numId="30" w16cid:durableId="2143112037">
+    <w:abstractNumId w:val="1"/>
   </w:num>
-  <w:num w:numId="5">
-    <w:abstractNumId w:val="20"/>
-  </w:num>
-  <w:num w:numId="6">
+  <w:num w:numId="31" w16cid:durableId="10571087">
     <w:abstractNumId w:val="15"/>
   </w:num>
-  <w:num w:numId="7">
-    <w:abstractNumId w:val="16"/>
+  <w:num w:numId="32" w16cid:durableId="9377709">
+    <w:abstractNumId w:val="7"/>
   </w:num>
-  <w:num w:numId="8">
-    <w:abstractNumId w:val="2"/>
-  </w:num>
-  <w:num w:numId="9">
+  <w:num w:numId="33" w16cid:durableId="646671560">
     <w:abstractNumId w:val="14"/>
   </w:num>
-  <w:num w:numId="10">
-    <w:abstractNumId w:val="9"/>
-  </w:num>
-  <w:num w:numId="11">
-    <w:abstractNumId w:val="6"/>
-  </w:num>
-  <w:num w:numId="12">
-    <w:abstractNumId w:val="13"/>
-  </w:num>
-  <w:num w:numId="13">
-    <w:abstractNumId w:val="29"/>
-  </w:num>
-  <w:num w:numId="14">
-    <w:abstractNumId w:val="17"/>
-  </w:num>
-  <w:num w:numId="15">
-    <w:abstractNumId w:val="1"/>
-  </w:num>
-  <w:num w:numId="16">
-    <w:abstractNumId w:val="31"/>
-  </w:num>
-  <w:num w:numId="17">
-    <w:abstractNumId w:val="30"/>
-  </w:num>
-  <w:num w:numId="18">
-    <w:abstractNumId w:val="25"/>
-  </w:num>
-  <w:num w:numId="19">
-    <w:abstractNumId w:val="18"/>
-  </w:num>
-  <w:num w:numId="20">
-    <w:abstractNumId w:val="26"/>
-  </w:num>
-  <w:num w:numId="21">
+  <w:num w:numId="34" w16cid:durableId="1414274697">
     <w:abstractNumId w:val="3"/>
   </w:num>
-  <w:num w:numId="22">
-    <w:abstractNumId w:val="19"/>
-  </w:num>
-  <w:num w:numId="23">
-    <w:abstractNumId w:val="27"/>
-  </w:num>
-  <w:num w:numId="24">
-    <w:abstractNumId w:val="22"/>
-  </w:num>
-  <w:num w:numId="25">
-    <w:abstractNumId w:val="7"/>
-  </w:num>
-  <w:num w:numId="26">
-    <w:abstractNumId w:val="8"/>
-  </w:num>
-  <w:num w:numId="27">
-    <w:abstractNumId w:val="21"/>
-  </w:num>
-  <w:num w:numId="28">
-    <w:abstractNumId w:val="24"/>
-  </w:num>
-  <w:num w:numId="29">
-    <w:abstractNumId w:val="10"/>
-  </w:num>
-  <w:num w:numId="30">
+  <w:num w:numId="35" w16cid:durableId="513808684">
     <w:abstractNumId w:val="0"/>
   </w:num>
-  <w:num w:numId="31">
+  <w:num w:numId="36" w16cid:durableId="1545633091">
     <w:abstractNumId w:val="11"/>
-  </w:num>
-  <w:num w:numId="32">
-    <w:abstractNumId w:val="5"/>
   </w:num>
   <w:numIdMacAtCleanup w:val="16"/>
 </w:numbering>
 </file>
 
 <file path=word/styles.xml><?xml version="1.0" encoding="utf-8"?>
-<w:styles xmlns:mc="http://schemas.openxmlformats.org/markup-compatibility/2006" xmlns:r="http://schemas.openxmlformats.org/officeDocument/2006/relationships" xmlns:w="http://schemas.openxmlformats.org/wordprocessingml/2006/main" xmlns:w14="http://schemas.microsoft.com/office/word/2010/wordml" xmlns:w15="http://schemas.microsoft.com/office/word/2012/wordml" mc:Ignorable="w14 w15">
+<w:styles xmlns:mc="http://schemas.openxmlformats.org/markup-compatibility/2006" xmlns:r="http://schemas.openxmlformats.org/officeDocument/2006/relationships" xmlns:w="http://schemas.openxmlformats.org/wordprocessingml/2006/main" xmlns:w14="http://schemas.microsoft.com/office/word/2010/wordml" xmlns:w15="http://schemas.microsoft.com/office/word/2012/wordml" xmlns:w16cex="http://schemas.microsoft.com/office/word/2018/wordml/cex" xmlns:w16cid="http://schemas.microsoft.com/office/word/2016/wordml/cid" xmlns:w16="http://schemas.microsoft.com/office/word/2018/wordml" xmlns:w16du="http://schemas.microsoft.com/office/word/2023/wordml/word16du" xmlns:w16sdtdh="http://schemas.microsoft.com/office/word/2020/wordml/sdtdatahash" xmlns:w16sdtfl="http://schemas.microsoft.com/office/word/2024/wordml/sdtformatlock" xmlns:w16se="http://schemas.microsoft.com/office/word/2015/wordml/symex" mc:Ignorable="w14 w15 w16se w16cid w16 w16cex w16sdtdh w16sdtfl w16du">
   <w:docDefaults>
     <w:rPrDefault>
       <w:rPr>
@@ -7216,7 +7798,7 @@
     </w:rPrDefault>
     <w:pPrDefault/>
   </w:docDefaults>
-  <w:latentStyles w:defLockedState="0" w:defUIPriority="99" w:defSemiHidden="0" w:defUnhideWhenUsed="0" w:defQFormat="0" w:count="371">
+  <w:latentStyles w:defLockedState="0" w:defUIPriority="99" w:defSemiHidden="0" w:defUnhideWhenUsed="0" w:defQFormat="0" w:count="376">
     <w:lsdException w:name="Normal" w:uiPriority="0" w:qFormat="1"/>
     <w:lsdException w:name="heading 1" w:uiPriority="9" w:qFormat="1"/>
     <w:lsdException w:name="heading 2" w:semiHidden="1" w:uiPriority="9" w:unhideWhenUsed="1" w:qFormat="1"/>
@@ -7588,6 +8170,11 @@
     <w:lsdException w:name="List Table 5 Dark Accent 6" w:uiPriority="50"/>
     <w:lsdException w:name="List Table 6 Colorful Accent 6" w:uiPriority="51"/>
     <w:lsdException w:name="List Table 7 Colorful Accent 6" w:uiPriority="52"/>
+    <w:lsdException w:name="Mention" w:semiHidden="1" w:unhideWhenUsed="1"/>
+    <w:lsdException w:name="Smart Hyperlink" w:semiHidden="1" w:unhideWhenUsed="1"/>
+    <w:lsdException w:name="Hashtag" w:semiHidden="1" w:unhideWhenUsed="1"/>
+    <w:lsdException w:name="Unresolved Mention" w:semiHidden="1" w:unhideWhenUsed="1"/>
+    <w:lsdException w:name="Smart Link" w:semiHidden="1" w:unhideWhenUsed="1"/>
   </w:latentStyles>
   <w:style w:type="paragraph" w:default="1" w:styleId="Normal">
     <w:name w:val="Normal"/>
@@ -7679,7 +8266,6 @@
   <w:style w:type="character" w:default="1" w:styleId="Fuentedeprrafopredeter">
     <w:name w:val="Default Paragraph Font"/>
     <w:uiPriority w:val="1"/>
-    <w:semiHidden/>
     <w:unhideWhenUsed/>
   </w:style>
   <w:style w:type="table" w:default="1" w:styleId="Tablanormal">
@@ -7808,7 +8394,7 @@
       <w:lang w:eastAsia="es-CO"/>
     </w:rPr>
   </w:style>
-  <w:style w:type="character" w:styleId="Textoennegrita">
+  <w:style w:type="character" w:styleId="Fuerte">
     <w:name w:val="Strong"/>
     <w:basedOn w:val="Fuentedeprrafopredeter"/>
     <w:uiPriority w:val="22"/>

</xml_diff>

<commit_message>
Revert "Merge pull request #8 from yudyfuertes/Elizabeth"
This reverts commit cde0bf1fc2e9b6eed702f67e1c39a8bf92bace8b, reversing
changes made to 96b18690bbd6c394b807e48617bc75131b2682ea.
</commit_message>
<xml_diff>
--- a/Guía_actividad.docx
+++ b/Guía_actividad.docx
@@ -1167,12 +1167,16 @@
         </w:rPr>
         <w:t>Notificación al usuario el estado de su turno</w:t>
       </w:r>
-      <w:r>
-        <w:rPr>
-          <w:rFonts w:ascii="Arial" w:hAnsi="Arial" w:cs="Arial"/>
-        </w:rPr>
-        <w:br/>
-      </w:r>
+    </w:p>
+    <w:p>
+      <w:pPr>
+        <w:pStyle w:val="NormalWeb"/>
+        <w:ind w:left="1440"/>
+        <w:jc w:val="both"/>
+        <w:rPr>
+          <w:rFonts w:ascii="Arial" w:hAnsi="Arial" w:cs="Arial"/>
+        </w:rPr>
+      </w:pPr>
     </w:p>
     <w:p>
       <w:pPr>
@@ -1231,21 +1235,12 @@
     <w:p>
       <w:pPr>
         <w:pStyle w:val="NormalWeb"/>
-        <w:numPr>
-          <w:ilvl w:val="1"/>
-          <w:numId w:val="19"/>
-        </w:numPr>
-        <w:jc w:val="both"/>
-        <w:rPr>
-          <w:rFonts w:ascii="Arial" w:hAnsi="Arial" w:cs="Arial"/>
-        </w:rPr>
-      </w:pPr>
-      <w:r>
-        <w:rPr>
-          <w:rFonts w:ascii="Arial" w:hAnsi="Arial" w:cs="Arial"/>
-        </w:rPr>
-        <w:t>El registro de un cliente no depende de que una ventanilla este libre.</w:t>
-      </w:r>
+        <w:ind w:left="720"/>
+        <w:jc w:val="both"/>
+        <w:rPr>
+          <w:rFonts w:ascii="Arial" w:hAnsi="Arial" w:cs="Arial"/>
+        </w:rPr>
+      </w:pPr>
     </w:p>
     <w:p>
       <w:pPr>
@@ -1263,1248 +1258,26 @@
         <w:rPr>
           <w:rFonts w:ascii="Arial" w:hAnsi="Arial" w:cs="Arial"/>
         </w:rPr>
-        <w:t>Una notificación puede reintentarse sin afectar la asignación de turnos.</w:t>
-      </w:r>
-    </w:p>
-    <w:p>
-      <w:pPr>
-        <w:pStyle w:val="NormalWeb"/>
-        <w:jc w:val="both"/>
-        <w:rPr>
-          <w:rFonts w:ascii="Arial" w:hAnsi="Arial" w:cs="Arial"/>
-          <w:b/>
-          <w:bCs/>
-        </w:rPr>
-      </w:pPr>
-      <w:r>
-        <w:rPr>
-          <w:rFonts w:ascii="Arial" w:hAnsi="Arial" w:cs="Arial"/>
-          <w:b/>
-          <w:bCs/>
-        </w:rPr>
-        <w:t>PARTE 3 – ¿CÓMO SE COMUNICAN?</w:t>
-      </w:r>
-    </w:p>
-    <w:p>
-      <w:pPr>
-        <w:pStyle w:val="NormalWeb"/>
-        <w:jc w:val="both"/>
-        <w:rPr>
-          <w:rFonts w:ascii="Arial" w:hAnsi="Arial" w:cs="Arial"/>
-          <w:b/>
-          <w:bCs/>
-        </w:rPr>
-      </w:pPr>
-      <w:r>
-        <w:rPr>
-          <w:rFonts w:ascii="Arial" w:hAnsi="Arial" w:cs="Arial"/>
-          <w:b/>
-          <w:bCs/>
-        </w:rPr>
-        <w:t>Paso 3: Conexión entre servicios</w:t>
-      </w:r>
-    </w:p>
-    <w:p>
-      <w:pPr>
-        <w:pStyle w:val="NormalWeb"/>
-        <w:jc w:val="both"/>
-        <w:rPr>
-          <w:rFonts w:ascii="Arial" w:hAnsi="Arial" w:cs="Arial"/>
-          <w:b/>
-          <w:bCs/>
-        </w:rPr>
-      </w:pPr>
-      <w:r>
-        <w:rPr>
-          <w:rFonts w:ascii="Arial" w:hAnsi="Arial" w:cs="Arial"/>
-          <w:b/>
-          <w:bCs/>
-        </w:rPr>
-        <w:t>¿Qué servicio necesita información de otro?</w:t>
+        <w:t>El registro de un cliente no depende de que una ventanilla este libre.</w:t>
       </w:r>
     </w:p>
     <w:p>
       <w:pPr>
         <w:pStyle w:val="NormalWeb"/>
         <w:numPr>
-          <w:ilvl w:val="0"/>
-          <w:numId w:val="37"/>
+          <w:ilvl w:val="1"/>
+          <w:numId w:val="19"/>
         </w:numPr>
-        <w:rPr>
-          <w:rFonts w:ascii="Arial" w:hAnsi="Arial" w:cs="Arial"/>
-          <w:b/>
-          <w:bCs/>
-        </w:rPr>
-      </w:pPr>
-      <w:r>
-        <w:rPr>
-          <w:rFonts w:ascii="Arial" w:hAnsi="Arial" w:cs="Arial"/>
-          <w:b/>
-          <w:bCs/>
-        </w:rPr>
-        <w:t xml:space="preserve">Turnos </w:t>
-      </w:r>
-      <w:r>
-        <w:rPr>
-          <w:rFonts w:ascii="Arial" w:hAnsi="Arial" w:cs="Arial"/>
-        </w:rPr>
-        <w:t xml:space="preserve">necesita información de </w:t>
-      </w:r>
-      <w:r>
-        <w:rPr>
-          <w:rFonts w:ascii="Arial" w:hAnsi="Arial" w:cs="Arial"/>
-          <w:b/>
-          <w:bCs/>
-        </w:rPr>
-        <w:t>Clientes</w:t>
-      </w:r>
-      <w:r>
-        <w:rPr>
-          <w:rFonts w:ascii="Arial" w:hAnsi="Arial" w:cs="Arial"/>
-        </w:rPr>
-        <w:t xml:space="preserve"> para identificar al cliente y registrar sus datos.</w:t>
-      </w:r>
-    </w:p>
-    <w:p>
-      <w:pPr>
-        <w:pStyle w:val="NormalWeb"/>
-        <w:numPr>
-          <w:ilvl w:val="0"/>
-          <w:numId w:val="37"/>
-        </w:numPr>
-        <w:rPr>
-          <w:rFonts w:ascii="Arial" w:hAnsi="Arial" w:cs="Arial"/>
-          <w:b/>
-          <w:bCs/>
-        </w:rPr>
-      </w:pPr>
-      <w:r>
-        <w:rPr>
-          <w:rFonts w:ascii="Arial" w:hAnsi="Arial" w:cs="Arial"/>
-          <w:b/>
-          <w:bCs/>
-        </w:rPr>
-        <w:t xml:space="preserve">Turnos </w:t>
-      </w:r>
-      <w:r>
-        <w:rPr>
-          <w:rFonts w:ascii="Arial" w:hAnsi="Arial" w:cs="Arial"/>
-        </w:rPr>
-        <w:t xml:space="preserve">necesita información de </w:t>
-      </w:r>
-      <w:r>
-        <w:rPr>
-          <w:rFonts w:ascii="Arial" w:hAnsi="Arial" w:cs="Arial"/>
-          <w:b/>
-          <w:bCs/>
-        </w:rPr>
-        <w:t>Cajas</w:t>
-      </w:r>
-      <w:r>
-        <w:rPr>
-          <w:rFonts w:ascii="Arial" w:hAnsi="Arial" w:cs="Arial"/>
-        </w:rPr>
-        <w:t xml:space="preserve"> para saber qué caja está disponible.</w:t>
-      </w:r>
-    </w:p>
-    <w:p>
-      <w:pPr>
-        <w:pStyle w:val="NormalWeb"/>
-        <w:numPr>
-          <w:ilvl w:val="0"/>
-          <w:numId w:val="37"/>
-        </w:numPr>
-        <w:rPr>
-          <w:rFonts w:ascii="Arial" w:hAnsi="Arial" w:cs="Arial"/>
-          <w:b/>
-          <w:bCs/>
-        </w:rPr>
-      </w:pPr>
-      <w:r>
-        <w:rPr>
-          <w:rFonts w:ascii="Arial" w:hAnsi="Arial" w:cs="Arial"/>
-          <w:b/>
-          <w:bCs/>
-        </w:rPr>
-        <w:t xml:space="preserve">Turnos </w:t>
-      </w:r>
-      <w:r>
-        <w:rPr>
-          <w:rFonts w:ascii="Arial" w:hAnsi="Arial" w:cs="Arial"/>
-        </w:rPr>
-        <w:t xml:space="preserve">necesita información de </w:t>
-      </w:r>
-      <w:r>
-        <w:rPr>
-          <w:rFonts w:ascii="Arial" w:hAnsi="Arial" w:cs="Arial"/>
-          <w:b/>
-          <w:bCs/>
-        </w:rPr>
-        <w:t xml:space="preserve">Asesores </w:t>
-      </w:r>
-      <w:r>
-        <w:rPr>
-          <w:rFonts w:ascii="Arial" w:hAnsi="Arial" w:cs="Arial"/>
-        </w:rPr>
-        <w:t>cuando el cliente requiere atención personalizada.</w:t>
-      </w:r>
-    </w:p>
-    <w:p>
-      <w:pPr>
-        <w:pStyle w:val="NormalWeb"/>
-        <w:numPr>
-          <w:ilvl w:val="0"/>
-          <w:numId w:val="37"/>
-        </w:numPr>
-        <w:rPr>
-          <w:rFonts w:ascii="Arial" w:hAnsi="Arial" w:cs="Arial"/>
-          <w:b/>
-          <w:bCs/>
-        </w:rPr>
-      </w:pPr>
-      <w:r>
-        <w:rPr>
-          <w:rFonts w:ascii="Arial" w:hAnsi="Arial" w:cs="Arial"/>
-          <w:b/>
-          <w:bCs/>
-        </w:rPr>
-        <w:t xml:space="preserve">Atención </w:t>
-      </w:r>
-      <w:r>
-        <w:rPr>
-          <w:rFonts w:ascii="Arial" w:hAnsi="Arial" w:cs="Arial"/>
-        </w:rPr>
-        <w:t xml:space="preserve">necesita información de </w:t>
-      </w:r>
-      <w:r>
-        <w:rPr>
-          <w:rFonts w:ascii="Arial" w:hAnsi="Arial" w:cs="Arial"/>
-          <w:b/>
-          <w:bCs/>
-        </w:rPr>
-        <w:t xml:space="preserve">Turnos </w:t>
-      </w:r>
-      <w:r>
-        <w:rPr>
-          <w:rFonts w:ascii="Arial" w:hAnsi="Arial" w:cs="Arial"/>
-        </w:rPr>
-        <w:t>para saber qué cliente debe atender y qué trámite realizará.</w:t>
-      </w:r>
-    </w:p>
-    <w:p>
-      <w:pPr>
-        <w:pStyle w:val="NormalWeb"/>
-        <w:numPr>
-          <w:ilvl w:val="0"/>
-          <w:numId w:val="37"/>
-        </w:numPr>
-        <w:rPr>
-          <w:rFonts w:ascii="Arial" w:hAnsi="Arial" w:cs="Arial"/>
-          <w:b/>
-          <w:bCs/>
-        </w:rPr>
-      </w:pPr>
-      <w:r>
-        <w:rPr>
-          <w:rFonts w:ascii="Arial" w:hAnsi="Arial" w:cs="Arial"/>
-          <w:b/>
-          <w:bCs/>
-        </w:rPr>
-        <w:t xml:space="preserve">Notificaciones </w:t>
-      </w:r>
-      <w:r>
-        <w:rPr>
-          <w:rFonts w:ascii="Arial" w:hAnsi="Arial" w:cs="Arial"/>
-        </w:rPr>
-        <w:t xml:space="preserve">necesita información de </w:t>
-      </w:r>
-      <w:r>
-        <w:rPr>
-          <w:rFonts w:ascii="Arial" w:hAnsi="Arial" w:cs="Arial"/>
-          <w:b/>
-          <w:bCs/>
-        </w:rPr>
-        <w:t>Turnos</w:t>
-      </w:r>
-      <w:r>
-        <w:rPr>
-          <w:rFonts w:ascii="Arial" w:hAnsi="Arial" w:cs="Arial"/>
-        </w:rPr>
-        <w:t xml:space="preserve"> para saber qué turno debe notificar y cuándo.</w:t>
-      </w:r>
-    </w:p>
-    <w:p>
-      <w:pPr>
-        <w:pStyle w:val="NormalWeb"/>
-        <w:jc w:val="both"/>
-        <w:rPr>
-          <w:rFonts w:ascii="Arial" w:hAnsi="Arial" w:cs="Arial"/>
-          <w:b/>
-          <w:bCs/>
-        </w:rPr>
-      </w:pPr>
-      <w:r>
-        <w:rPr>
-          <w:rFonts w:ascii="Arial" w:hAnsi="Arial" w:cs="Arial"/>
-          <w:b/>
-          <w:bCs/>
-        </w:rPr>
-        <w:t>¿Quién solicita datos?</w:t>
-      </w:r>
-    </w:p>
-    <w:p>
-      <w:pPr>
-        <w:pStyle w:val="NormalWeb"/>
-        <w:jc w:val="both"/>
-        <w:rPr>
-          <w:rFonts w:ascii="Arial" w:hAnsi="Arial" w:cs="Arial"/>
-        </w:rPr>
-      </w:pPr>
-      <w:r>
-        <w:rPr>
-          <w:rFonts w:ascii="Arial" w:hAnsi="Arial" w:cs="Arial"/>
-        </w:rPr>
-        <w:t>El servicio que necesita la información es el que realiza la solicitud.</w:t>
-      </w:r>
-    </w:p>
-    <w:p>
-      <w:pPr>
-        <w:pStyle w:val="NormalWeb"/>
-        <w:numPr>
-          <w:ilvl w:val="0"/>
-          <w:numId w:val="38"/>
-        </w:numPr>
-        <w:jc w:val="both"/>
-        <w:rPr>
-          <w:rFonts w:ascii="Arial" w:hAnsi="Arial" w:cs="Arial"/>
-          <w:b/>
-          <w:bCs/>
-        </w:rPr>
-      </w:pPr>
-      <w:r>
-        <w:rPr>
-          <w:rFonts w:ascii="Arial" w:hAnsi="Arial" w:cs="Arial"/>
-          <w:b/>
-          <w:bCs/>
-        </w:rPr>
-        <w:t>Turnos</w:t>
-      </w:r>
-      <w:r>
-        <w:rPr>
-          <w:rFonts w:ascii="Arial" w:hAnsi="Arial" w:cs="Arial"/>
-        </w:rPr>
-        <w:t xml:space="preserve"> solicita</w:t>
-      </w:r>
-      <w:r>
-        <w:rPr>
-          <w:rFonts w:ascii="Arial" w:hAnsi="Arial" w:cs="Arial"/>
-          <w:b/>
-          <w:bCs/>
-        </w:rPr>
-        <w:t xml:space="preserve"> → Clientes</w:t>
-      </w:r>
-    </w:p>
-    <w:p>
-      <w:pPr>
-        <w:pStyle w:val="NormalWeb"/>
-        <w:numPr>
-          <w:ilvl w:val="0"/>
-          <w:numId w:val="38"/>
-        </w:numPr>
-        <w:jc w:val="both"/>
-        <w:rPr>
-          <w:rFonts w:ascii="Arial" w:hAnsi="Arial" w:cs="Arial"/>
-          <w:b/>
-          <w:bCs/>
-        </w:rPr>
-      </w:pPr>
-      <w:r>
-        <w:rPr>
-          <w:rFonts w:ascii="Arial" w:hAnsi="Arial" w:cs="Arial"/>
-          <w:b/>
-          <w:bCs/>
-        </w:rPr>
-        <w:t xml:space="preserve">Turnos </w:t>
-      </w:r>
-      <w:r>
-        <w:rPr>
-          <w:rFonts w:ascii="Arial" w:hAnsi="Arial" w:cs="Arial"/>
-        </w:rPr>
-        <w:t xml:space="preserve">solicita </w:t>
-      </w:r>
-      <w:r>
-        <w:rPr>
-          <w:rFonts w:ascii="Arial" w:hAnsi="Arial" w:cs="Arial"/>
-          <w:b/>
-          <w:bCs/>
-        </w:rPr>
-        <w:t>→ Cajas</w:t>
-      </w:r>
-    </w:p>
-    <w:p>
-      <w:pPr>
-        <w:pStyle w:val="NormalWeb"/>
-        <w:numPr>
-          <w:ilvl w:val="0"/>
-          <w:numId w:val="38"/>
-        </w:numPr>
-        <w:jc w:val="both"/>
-        <w:rPr>
-          <w:rFonts w:ascii="Arial" w:hAnsi="Arial" w:cs="Arial"/>
-          <w:b/>
-          <w:bCs/>
-        </w:rPr>
-      </w:pPr>
-      <w:r>
-        <w:rPr>
-          <w:rFonts w:ascii="Arial" w:hAnsi="Arial" w:cs="Arial"/>
-          <w:b/>
-          <w:bCs/>
-        </w:rPr>
-        <w:t xml:space="preserve">Turnos </w:t>
-      </w:r>
-      <w:r>
-        <w:rPr>
-          <w:rFonts w:ascii="Arial" w:hAnsi="Arial" w:cs="Arial"/>
-        </w:rPr>
-        <w:t xml:space="preserve">solicita </w:t>
-      </w:r>
-      <w:r>
-        <w:rPr>
-          <w:rFonts w:ascii="Arial" w:hAnsi="Arial" w:cs="Arial"/>
-          <w:b/>
-          <w:bCs/>
-        </w:rPr>
-        <w:t>→ Asesores</w:t>
-      </w:r>
-    </w:p>
-    <w:p>
-      <w:pPr>
-        <w:pStyle w:val="NormalWeb"/>
-        <w:numPr>
-          <w:ilvl w:val="0"/>
-          <w:numId w:val="38"/>
-        </w:numPr>
-        <w:jc w:val="both"/>
-        <w:rPr>
-          <w:rFonts w:ascii="Arial" w:hAnsi="Arial" w:cs="Arial"/>
-          <w:b/>
-          <w:bCs/>
-        </w:rPr>
-      </w:pPr>
-      <w:r>
-        <w:rPr>
-          <w:rFonts w:ascii="Arial" w:hAnsi="Arial" w:cs="Arial"/>
-          <w:b/>
-          <w:bCs/>
-        </w:rPr>
-        <w:t xml:space="preserve">Atención </w:t>
-      </w:r>
-      <w:r>
-        <w:rPr>
-          <w:rFonts w:ascii="Arial" w:hAnsi="Arial" w:cs="Arial"/>
-        </w:rPr>
-        <w:t>solicita</w:t>
-      </w:r>
-      <w:r>
-        <w:rPr>
-          <w:rFonts w:ascii="Arial" w:hAnsi="Arial" w:cs="Arial"/>
-          <w:b/>
-          <w:bCs/>
-        </w:rPr>
-        <w:t xml:space="preserve"> → Turnos</w:t>
-      </w:r>
-    </w:p>
-    <w:p>
-      <w:pPr>
-        <w:pStyle w:val="NormalWeb"/>
-        <w:numPr>
-          <w:ilvl w:val="0"/>
-          <w:numId w:val="38"/>
-        </w:numPr>
-        <w:jc w:val="both"/>
-        <w:rPr>
-          <w:rFonts w:ascii="Arial" w:hAnsi="Arial" w:cs="Arial"/>
-          <w:b/>
-          <w:bCs/>
-        </w:rPr>
-      </w:pPr>
-      <w:r>
-        <w:rPr>
-          <w:rFonts w:ascii="Arial" w:hAnsi="Arial" w:cs="Arial"/>
-          <w:b/>
-          <w:bCs/>
-        </w:rPr>
-        <w:t xml:space="preserve">Notificaciones </w:t>
-      </w:r>
-      <w:r>
-        <w:rPr>
-          <w:rFonts w:ascii="Arial" w:hAnsi="Arial" w:cs="Arial"/>
-        </w:rPr>
-        <w:t>solicita</w:t>
-      </w:r>
-      <w:r>
-        <w:rPr>
-          <w:rFonts w:ascii="Arial" w:hAnsi="Arial" w:cs="Arial"/>
-          <w:b/>
-          <w:bCs/>
-        </w:rPr>
-        <w:t xml:space="preserve"> → Turnos</w:t>
-      </w:r>
-    </w:p>
-    <w:p>
-      <w:pPr>
-        <w:pStyle w:val="NormalWeb"/>
-        <w:jc w:val="both"/>
-        <w:rPr>
-          <w:rFonts w:ascii="Arial" w:hAnsi="Arial" w:cs="Arial"/>
-          <w:b/>
-          <w:bCs/>
-        </w:rPr>
-      </w:pPr>
-      <w:r>
-        <w:rPr>
-          <w:rFonts w:ascii="Arial" w:hAnsi="Arial" w:cs="Arial"/>
-          <w:b/>
-          <w:bCs/>
-        </w:rPr>
-        <w:t>¿Quién responde?</w:t>
-      </w:r>
-    </w:p>
-    <w:p>
-      <w:pPr>
-        <w:pStyle w:val="NormalWeb"/>
-        <w:numPr>
-          <w:ilvl w:val="0"/>
-          <w:numId w:val="39"/>
-        </w:numPr>
-        <w:jc w:val="both"/>
-        <w:rPr>
-          <w:rFonts w:ascii="Arial" w:hAnsi="Arial" w:cs="Arial"/>
-          <w:b/>
-          <w:bCs/>
-        </w:rPr>
-      </w:pPr>
-      <w:r>
-        <w:rPr>
-          <w:rFonts w:ascii="Arial" w:hAnsi="Arial" w:cs="Arial"/>
-          <w:b/>
-          <w:bCs/>
-        </w:rPr>
-        <w:t xml:space="preserve">Turnos → </w:t>
-      </w:r>
-      <w:r>
-        <w:rPr>
-          <w:rFonts w:ascii="Arial" w:hAnsi="Arial" w:cs="Arial"/>
-        </w:rPr>
-        <w:t xml:space="preserve">solicita </w:t>
-      </w:r>
-      <w:r>
-        <w:rPr>
-          <w:rFonts w:ascii="Arial" w:hAnsi="Arial" w:cs="Arial"/>
-          <w:b/>
-          <w:bCs/>
-        </w:rPr>
-        <w:t>→ Clientes</w:t>
-      </w:r>
-    </w:p>
-    <w:p>
-      <w:pPr>
-        <w:pStyle w:val="NormalWeb"/>
-        <w:numPr>
-          <w:ilvl w:val="0"/>
-          <w:numId w:val="39"/>
-        </w:numPr>
-        <w:jc w:val="both"/>
-        <w:rPr>
-          <w:rFonts w:ascii="Arial" w:hAnsi="Arial" w:cs="Arial"/>
-          <w:b/>
-          <w:bCs/>
-        </w:rPr>
-      </w:pPr>
-      <w:r>
-        <w:rPr>
-          <w:rFonts w:ascii="Arial" w:hAnsi="Arial" w:cs="Arial"/>
-          <w:b/>
-          <w:bCs/>
-        </w:rPr>
-        <w:t>Clientes →</w:t>
-      </w:r>
-      <w:r>
-        <w:rPr>
-          <w:rFonts w:ascii="Arial" w:hAnsi="Arial" w:cs="Arial"/>
-        </w:rPr>
-        <w:t xml:space="preserve"> responde</w:t>
-      </w:r>
-      <w:r>
-        <w:rPr>
-          <w:rFonts w:ascii="Arial" w:hAnsi="Arial" w:cs="Arial"/>
-          <w:b/>
-          <w:bCs/>
-        </w:rPr>
-        <w:t xml:space="preserve"> → Turnos</w:t>
-      </w:r>
-    </w:p>
-    <w:p>
-      <w:pPr>
-        <w:pStyle w:val="NormalWeb"/>
-        <w:numPr>
-          <w:ilvl w:val="0"/>
-          <w:numId w:val="39"/>
-        </w:numPr>
-        <w:jc w:val="both"/>
-        <w:rPr>
-          <w:rFonts w:ascii="Arial" w:hAnsi="Arial" w:cs="Arial"/>
-          <w:b/>
-          <w:bCs/>
-        </w:rPr>
-      </w:pPr>
-      <w:r>
-        <w:rPr>
-          <w:rFonts w:ascii="Arial" w:hAnsi="Arial" w:cs="Arial"/>
-          <w:b/>
-          <w:bCs/>
-        </w:rPr>
-        <w:lastRenderedPageBreak/>
-        <w:t xml:space="preserve">Turnos → </w:t>
-      </w:r>
-      <w:r>
-        <w:rPr>
-          <w:rFonts w:ascii="Arial" w:hAnsi="Arial" w:cs="Arial"/>
-        </w:rPr>
-        <w:t>solicita</w:t>
-      </w:r>
-      <w:r>
-        <w:rPr>
-          <w:rFonts w:ascii="Arial" w:hAnsi="Arial" w:cs="Arial"/>
-          <w:b/>
-          <w:bCs/>
-        </w:rPr>
-        <w:t xml:space="preserve"> → Cajas</w:t>
-      </w:r>
-    </w:p>
-    <w:p>
-      <w:pPr>
-        <w:pStyle w:val="NormalWeb"/>
-        <w:numPr>
-          <w:ilvl w:val="0"/>
-          <w:numId w:val="39"/>
-        </w:numPr>
-        <w:jc w:val="both"/>
-        <w:rPr>
-          <w:rFonts w:ascii="Arial" w:hAnsi="Arial" w:cs="Arial"/>
-          <w:b/>
-          <w:bCs/>
-        </w:rPr>
-      </w:pPr>
-      <w:r>
-        <w:rPr>
-          <w:rFonts w:ascii="Arial" w:hAnsi="Arial" w:cs="Arial"/>
-          <w:b/>
-          <w:bCs/>
-        </w:rPr>
-        <w:t>Cajas →</w:t>
-      </w:r>
-      <w:r>
-        <w:rPr>
-          <w:rFonts w:ascii="Arial" w:hAnsi="Arial" w:cs="Arial"/>
-        </w:rPr>
-        <w:t xml:space="preserve"> responde</w:t>
-      </w:r>
-      <w:r>
-        <w:rPr>
-          <w:rFonts w:ascii="Arial" w:hAnsi="Arial" w:cs="Arial"/>
-          <w:b/>
-          <w:bCs/>
-        </w:rPr>
-        <w:t xml:space="preserve"> → Turnos</w:t>
-      </w:r>
-    </w:p>
-    <w:p>
-      <w:pPr>
-        <w:pStyle w:val="NormalWeb"/>
-        <w:numPr>
-          <w:ilvl w:val="0"/>
-          <w:numId w:val="39"/>
-        </w:numPr>
-        <w:jc w:val="both"/>
-        <w:rPr>
-          <w:rFonts w:ascii="Arial" w:hAnsi="Arial" w:cs="Arial"/>
-          <w:b/>
-          <w:bCs/>
-        </w:rPr>
-      </w:pPr>
-      <w:r>
-        <w:rPr>
-          <w:rFonts w:ascii="Arial" w:hAnsi="Arial" w:cs="Arial"/>
-          <w:b/>
-          <w:bCs/>
-        </w:rPr>
-        <w:t xml:space="preserve">Turnos → </w:t>
-      </w:r>
-      <w:r>
-        <w:rPr>
-          <w:rFonts w:ascii="Arial" w:hAnsi="Arial" w:cs="Arial"/>
-        </w:rPr>
-        <w:t>solicita</w:t>
-      </w:r>
-      <w:r>
-        <w:rPr>
-          <w:rFonts w:ascii="Arial" w:hAnsi="Arial" w:cs="Arial"/>
-          <w:b/>
-          <w:bCs/>
-        </w:rPr>
-        <w:t xml:space="preserve"> → Asesores</w:t>
-      </w:r>
-    </w:p>
-    <w:p>
-      <w:pPr>
-        <w:pStyle w:val="NormalWeb"/>
-        <w:numPr>
-          <w:ilvl w:val="0"/>
-          <w:numId w:val="39"/>
-        </w:numPr>
-        <w:jc w:val="both"/>
-        <w:rPr>
-          <w:rFonts w:ascii="Arial" w:hAnsi="Arial" w:cs="Arial"/>
-          <w:b/>
-          <w:bCs/>
-        </w:rPr>
-      </w:pPr>
-      <w:r>
-        <w:rPr>
-          <w:rFonts w:ascii="Arial" w:hAnsi="Arial" w:cs="Arial"/>
-          <w:b/>
-          <w:bCs/>
-        </w:rPr>
-        <w:t xml:space="preserve">Asesores → </w:t>
-      </w:r>
-      <w:r>
-        <w:rPr>
-          <w:rFonts w:ascii="Arial" w:hAnsi="Arial" w:cs="Arial"/>
-        </w:rPr>
-        <w:t>responde</w:t>
-      </w:r>
-      <w:r>
-        <w:rPr>
-          <w:rFonts w:ascii="Arial" w:hAnsi="Arial" w:cs="Arial"/>
-          <w:b/>
-          <w:bCs/>
-        </w:rPr>
-        <w:t xml:space="preserve"> → Turnos</w:t>
-      </w:r>
-    </w:p>
-    <w:p>
-      <w:pPr>
-        <w:pStyle w:val="NormalWeb"/>
-        <w:numPr>
-          <w:ilvl w:val="0"/>
-          <w:numId w:val="39"/>
-        </w:numPr>
-        <w:jc w:val="both"/>
-        <w:rPr>
-          <w:rFonts w:ascii="Arial" w:hAnsi="Arial" w:cs="Arial"/>
-          <w:b/>
-          <w:bCs/>
-        </w:rPr>
-      </w:pPr>
-      <w:r>
-        <w:rPr>
-          <w:rFonts w:ascii="Arial" w:hAnsi="Arial" w:cs="Arial"/>
-          <w:b/>
-          <w:bCs/>
-        </w:rPr>
-        <w:t xml:space="preserve">Atención → </w:t>
-      </w:r>
-      <w:r>
-        <w:rPr>
-          <w:rFonts w:ascii="Arial" w:hAnsi="Arial" w:cs="Arial"/>
-        </w:rPr>
-        <w:t>solicita</w:t>
-      </w:r>
-      <w:r>
-        <w:rPr>
-          <w:rFonts w:ascii="Arial" w:hAnsi="Arial" w:cs="Arial"/>
-          <w:b/>
-          <w:bCs/>
-        </w:rPr>
-        <w:t xml:space="preserve"> → Turnos</w:t>
-      </w:r>
-    </w:p>
-    <w:p>
-      <w:pPr>
-        <w:pStyle w:val="NormalWeb"/>
-        <w:numPr>
-          <w:ilvl w:val="0"/>
-          <w:numId w:val="39"/>
-        </w:numPr>
-        <w:jc w:val="both"/>
-        <w:rPr>
-          <w:rFonts w:ascii="Arial" w:hAnsi="Arial" w:cs="Arial"/>
-          <w:b/>
-          <w:bCs/>
-        </w:rPr>
-      </w:pPr>
-      <w:r>
-        <w:rPr>
-          <w:rFonts w:ascii="Arial" w:hAnsi="Arial" w:cs="Arial"/>
-          <w:b/>
-          <w:bCs/>
-        </w:rPr>
-        <w:t xml:space="preserve">Turnos → </w:t>
-      </w:r>
-      <w:r>
-        <w:rPr>
-          <w:rFonts w:ascii="Arial" w:hAnsi="Arial" w:cs="Arial"/>
-        </w:rPr>
-        <w:t>responde</w:t>
-      </w:r>
-      <w:r>
-        <w:rPr>
-          <w:rFonts w:ascii="Arial" w:hAnsi="Arial" w:cs="Arial"/>
-          <w:b/>
-          <w:bCs/>
-        </w:rPr>
-        <w:t xml:space="preserve"> → Atención</w:t>
-      </w:r>
-    </w:p>
-    <w:p>
-      <w:pPr>
-        <w:pStyle w:val="NormalWeb"/>
-        <w:numPr>
-          <w:ilvl w:val="0"/>
-          <w:numId w:val="39"/>
-        </w:numPr>
-        <w:jc w:val="both"/>
-        <w:rPr>
-          <w:rFonts w:ascii="Arial" w:hAnsi="Arial" w:cs="Arial"/>
-          <w:b/>
-          <w:bCs/>
-        </w:rPr>
-      </w:pPr>
-      <w:r>
-        <w:rPr>
-          <w:rFonts w:ascii="Arial" w:hAnsi="Arial" w:cs="Arial"/>
-          <w:b/>
-          <w:bCs/>
-        </w:rPr>
-        <w:t xml:space="preserve">Notificaciones → </w:t>
-      </w:r>
-      <w:r>
-        <w:rPr>
-          <w:rFonts w:ascii="Arial" w:hAnsi="Arial" w:cs="Arial"/>
-        </w:rPr>
-        <w:t xml:space="preserve">solicita </w:t>
-      </w:r>
-      <w:r>
-        <w:rPr>
-          <w:rFonts w:ascii="Arial" w:hAnsi="Arial" w:cs="Arial"/>
-          <w:b/>
-          <w:bCs/>
-        </w:rPr>
-        <w:t>→ Turnos</w:t>
-      </w:r>
-    </w:p>
-    <w:p>
-      <w:pPr>
-        <w:pStyle w:val="NormalWeb"/>
-        <w:numPr>
-          <w:ilvl w:val="0"/>
-          <w:numId w:val="39"/>
-        </w:numPr>
-        <w:jc w:val="both"/>
-        <w:rPr>
-          <w:rFonts w:ascii="Arial" w:hAnsi="Arial" w:cs="Arial"/>
-          <w:b/>
-          <w:bCs/>
-        </w:rPr>
-      </w:pPr>
-      <w:r>
-        <w:rPr>
-          <w:rFonts w:ascii="Arial" w:hAnsi="Arial" w:cs="Arial"/>
-          <w:b/>
-          <w:bCs/>
-        </w:rPr>
-        <w:t xml:space="preserve">Turnos → </w:t>
-      </w:r>
-      <w:r>
-        <w:rPr>
-          <w:rFonts w:ascii="Arial" w:hAnsi="Arial" w:cs="Arial"/>
-        </w:rPr>
-        <w:t>responde</w:t>
-      </w:r>
-      <w:r>
-        <w:rPr>
-          <w:rFonts w:ascii="Arial" w:hAnsi="Arial" w:cs="Arial"/>
-          <w:b/>
-          <w:bCs/>
-        </w:rPr>
-        <w:t xml:space="preserve"> → Notificaciones</w:t>
-      </w:r>
-    </w:p>
-    <w:p>
-      <w:pPr>
-        <w:pStyle w:val="NormalWeb"/>
-        <w:jc w:val="both"/>
-        <w:rPr>
-          <w:rFonts w:ascii="Arial" w:hAnsi="Arial" w:cs="Arial"/>
-        </w:rPr>
-      </w:pPr>
-      <w:r>
-        <w:rPr>
-          <w:rFonts w:ascii="Arial" w:hAnsi="Arial" w:cs="Arial"/>
-          <w:b/>
-          <w:bCs/>
-        </w:rPr>
-        <w:t>Además</w:t>
-      </w:r>
-      <w:r>
-        <w:rPr>
-          <w:rFonts w:ascii="Arial" w:hAnsi="Arial" w:cs="Arial"/>
-        </w:rPr>
-        <w:t>, cuando la atención termina:</w:t>
-      </w:r>
-    </w:p>
-    <w:p>
-      <w:pPr>
-        <w:pStyle w:val="NormalWeb"/>
-        <w:numPr>
-          <w:ilvl w:val="0"/>
-          <w:numId w:val="40"/>
-        </w:numPr>
-        <w:jc w:val="both"/>
-        <w:rPr>
-          <w:rFonts w:ascii="Arial" w:hAnsi="Arial" w:cs="Arial"/>
-        </w:rPr>
-      </w:pPr>
-      <w:r>
-        <w:rPr>
-          <w:rFonts w:ascii="Arial" w:hAnsi="Arial" w:cs="Arial"/>
-          <w:b/>
-          <w:bCs/>
-        </w:rPr>
-        <w:t xml:space="preserve">Atención → </w:t>
-      </w:r>
-      <w:r>
-        <w:rPr>
-          <w:rFonts w:ascii="Arial" w:hAnsi="Arial" w:cs="Arial"/>
-        </w:rPr>
-        <w:t>informa</w:t>
-      </w:r>
-      <w:r>
-        <w:rPr>
-          <w:rFonts w:ascii="Arial" w:hAnsi="Arial" w:cs="Arial"/>
-          <w:b/>
-          <w:bCs/>
-        </w:rPr>
-        <w:t xml:space="preserve"> → Turnos</w:t>
-      </w:r>
-    </w:p>
-    <w:p>
-      <w:pPr>
-        <w:pStyle w:val="NormalWeb"/>
-        <w:numPr>
-          <w:ilvl w:val="0"/>
-          <w:numId w:val="40"/>
-        </w:numPr>
-        <w:jc w:val="both"/>
-        <w:rPr>
-          <w:rFonts w:ascii="Arial" w:hAnsi="Arial" w:cs="Arial"/>
-        </w:rPr>
-      </w:pPr>
-      <w:r>
-        <w:rPr>
-          <w:rFonts w:ascii="Arial" w:hAnsi="Arial" w:cs="Arial"/>
-          <w:b/>
-          <w:bCs/>
-        </w:rPr>
-        <w:t xml:space="preserve">Turnos → </w:t>
-      </w:r>
-      <w:r>
-        <w:rPr>
-          <w:rFonts w:ascii="Arial" w:hAnsi="Arial" w:cs="Arial"/>
-        </w:rPr>
-        <w:t>actualiza</w:t>
-      </w:r>
-      <w:r>
-        <w:rPr>
-          <w:rFonts w:ascii="Arial" w:hAnsi="Arial" w:cs="Arial"/>
-          <w:b/>
-          <w:bCs/>
-        </w:rPr>
-        <w:t xml:space="preserve"> → estado del turno</w:t>
-      </w:r>
-    </w:p>
-    <w:p>
-      <w:pPr>
-        <w:pStyle w:val="NormalWeb"/>
-        <w:jc w:val="both"/>
-        <w:rPr>
-          <w:rFonts w:ascii="Arial" w:hAnsi="Arial" w:cs="Arial"/>
-          <w:b/>
-          <w:bCs/>
-        </w:rPr>
-      </w:pPr>
-      <w:r>
-        <w:rPr>
-          <w:rFonts w:ascii="Arial" w:hAnsi="Arial" w:cs="Arial"/>
-          <w:b/>
-          <w:bCs/>
-        </w:rPr>
-        <w:t>PARTE 4 – ELEGIR LA ARQUITECTURA</w:t>
-      </w:r>
-    </w:p>
-    <w:p>
-      <w:pPr>
-        <w:pStyle w:val="NormalWeb"/>
-        <w:rPr>
-          <w:rFonts w:ascii="Arial" w:hAnsi="Arial" w:cs="Arial"/>
-          <w:b/>
-          <w:bCs/>
-        </w:rPr>
-      </w:pPr>
-      <w:r>
-        <w:rPr>
-          <w:rFonts w:ascii="Arial" w:hAnsi="Arial" w:cs="Arial"/>
-          <w:b/>
-          <w:bCs/>
-        </w:rPr>
-        <w:t>Paso 4: Tipo de arquitectura</w:t>
-      </w:r>
-    </w:p>
-    <w:p>
-      <w:pPr>
-        <w:pStyle w:val="NormalWeb"/>
-        <w:rPr>
-          <w:rFonts w:ascii="Arial" w:hAnsi="Arial" w:cs="Arial"/>
-          <w:b/>
-          <w:bCs/>
-        </w:rPr>
-      </w:pPr>
-      <w:r>
-        <w:rPr>
-          <w:rFonts w:ascii="Arial" w:hAnsi="Arial" w:cs="Arial"/>
-        </w:rPr>
-        <w:t xml:space="preserve">Arquitectura: </w:t>
-      </w:r>
-      <w:r>
-        <w:rPr>
-          <w:rFonts w:ascii="Arial" w:hAnsi="Arial" w:cs="Arial"/>
-          <w:b/>
-          <w:bCs/>
-        </w:rPr>
-        <w:t>Microservicios</w:t>
-      </w:r>
-      <w:r>
-        <w:rPr>
-          <w:rFonts w:ascii="Arial" w:hAnsi="Arial" w:cs="Arial"/>
-        </w:rPr>
-        <w:t> </w:t>
-      </w:r>
-    </w:p>
-    <w:p>
-      <w:pPr>
-        <w:pStyle w:val="NormalWeb"/>
-        <w:rPr>
-          <w:rFonts w:ascii="Arial" w:hAnsi="Arial" w:cs="Arial"/>
-          <w:b/>
-          <w:bCs/>
-        </w:rPr>
-      </w:pPr>
-      <w:r>
-        <w:rPr>
-          <w:rFonts w:ascii="Arial" w:hAnsi="Arial" w:cs="Arial"/>
-          <w:b/>
-          <w:bCs/>
-        </w:rPr>
-        <w:t>Preguntas guía:</w:t>
-      </w:r>
-    </w:p>
-    <w:p>
-      <w:pPr>
-        <w:pStyle w:val="NormalWeb"/>
-        <w:numPr>
-          <w:ilvl w:val="0"/>
-          <w:numId w:val="41"/>
-        </w:numPr>
-        <w:rPr>
-          <w:rFonts w:ascii="Arial" w:hAnsi="Arial" w:cs="Arial"/>
-          <w:b/>
-          <w:bCs/>
-        </w:rPr>
-      </w:pPr>
-      <w:r>
-        <w:rPr>
-          <w:rFonts w:ascii="Arial" w:hAnsi="Arial" w:cs="Arial"/>
-          <w:b/>
-          <w:bCs/>
-        </w:rPr>
-        <w:t>¿Cuántos usuarios tendrá el sistema?</w:t>
-      </w:r>
-    </w:p>
-    <w:p>
-      <w:pPr>
-        <w:pStyle w:val="NormalWeb"/>
-        <w:rPr>
-          <w:rFonts w:ascii="Arial" w:hAnsi="Arial" w:cs="Arial"/>
-          <w:b/>
-          <w:bCs/>
-        </w:rPr>
-      </w:pPr>
-      <w:r>
-        <w:rPr>
-          <w:rFonts w:ascii="Arial" w:hAnsi="Arial" w:cs="Arial"/>
-        </w:rPr>
-        <w:t xml:space="preserve">Tendrá una </w:t>
-      </w:r>
-      <w:r>
-        <w:rPr>
-          <w:rFonts w:ascii="Arial" w:hAnsi="Arial" w:cs="Arial"/>
-          <w:b/>
-          <w:bCs/>
-        </w:rPr>
-        <w:t>cantidad limitada de usuarios</w:t>
-      </w:r>
-      <w:r>
-        <w:rPr>
-          <w:rFonts w:ascii="Arial" w:hAnsi="Arial" w:cs="Arial"/>
-        </w:rPr>
-        <w:t>, principalmente clientes y empleados que utilizarán el sistema para gestionar y atender los turnos.</w:t>
-      </w:r>
-    </w:p>
-    <w:p>
-      <w:pPr>
-        <w:pStyle w:val="NormalWeb"/>
-        <w:numPr>
-          <w:ilvl w:val="0"/>
-          <w:numId w:val="42"/>
-        </w:numPr>
-        <w:rPr>
-          <w:rFonts w:ascii="Arial" w:hAnsi="Arial" w:cs="Arial"/>
-          <w:b/>
-          <w:bCs/>
-        </w:rPr>
-      </w:pPr>
-      <w:r>
-        <w:rPr>
-          <w:rFonts w:ascii="Arial" w:hAnsi="Arial" w:cs="Arial"/>
-          <w:b/>
-          <w:bCs/>
-        </w:rPr>
-        <w:t>¿Necesita escalar?</w:t>
-      </w:r>
-    </w:p>
-    <w:p>
-      <w:pPr>
-        <w:pStyle w:val="NormalWeb"/>
-        <w:rPr>
-          <w:rFonts w:ascii="Arial" w:hAnsi="Arial" w:cs="Arial"/>
-          <w:b/>
-          <w:bCs/>
-        </w:rPr>
-      </w:pPr>
-      <w:r>
-        <w:rPr>
-          <w:rFonts w:ascii="Arial" w:hAnsi="Arial" w:cs="Arial"/>
-          <w:b/>
-          <w:bCs/>
-        </w:rPr>
-        <w:t>Por ahora no necesita una gran escalabilidad</w:t>
-      </w:r>
-      <w:r>
-        <w:rPr>
-          <w:rFonts w:ascii="Arial" w:hAnsi="Arial" w:cs="Arial"/>
-        </w:rPr>
-        <w:t>, pero en el futuro podría ampliarse para soportar más usuarios, sucursales y servicios.</w:t>
-      </w:r>
-    </w:p>
-    <w:p>
-      <w:pPr>
-        <w:pStyle w:val="NormalWeb"/>
-        <w:numPr>
-          <w:ilvl w:val="0"/>
-          <w:numId w:val="43"/>
-        </w:numPr>
-        <w:rPr>
-          <w:rFonts w:ascii="Arial" w:hAnsi="Arial" w:cs="Arial"/>
-          <w:b/>
-          <w:bCs/>
-        </w:rPr>
-      </w:pPr>
-      <w:r>
-        <w:rPr>
-          <w:rFonts w:ascii="Arial" w:hAnsi="Arial" w:cs="Arial"/>
-          <w:b/>
-          <w:bCs/>
-        </w:rPr>
-        <w:t>¿Es un sistema pequeño o grande?</w:t>
-      </w:r>
-    </w:p>
-    <w:p>
-      <w:pPr>
-        <w:pStyle w:val="NormalWeb"/>
-        <w:rPr>
-          <w:rFonts w:ascii="Arial" w:hAnsi="Arial" w:cs="Arial"/>
-          <w:b/>
-          <w:bCs/>
-        </w:rPr>
-      </w:pPr>
-      <w:r>
-        <w:rPr>
-          <w:rFonts w:ascii="Arial" w:hAnsi="Arial" w:cs="Arial"/>
-        </w:rPr>
-        <w:t xml:space="preserve">Actualmente es un </w:t>
-      </w:r>
-      <w:r>
-        <w:rPr>
-          <w:rFonts w:ascii="Arial" w:hAnsi="Arial" w:cs="Arial"/>
-          <w:b/>
-          <w:bCs/>
-        </w:rPr>
-        <w:t>sistema pequeño</w:t>
-      </w:r>
-      <w:r>
-        <w:rPr>
-          <w:rFonts w:ascii="Arial" w:hAnsi="Arial" w:cs="Arial"/>
-        </w:rPr>
-        <w:t>, ya que cuenta con seis servicios principales: Clientes, Turnos, Cajas, Asesores, Notificaciones y Atención. Sin embargo, puede crecer en el futuro agregando nuevas funcionalidades.</w:t>
-      </w:r>
-    </w:p>
-    <w:p>
-      <w:pPr>
-        <w:pStyle w:val="NormalWeb"/>
-        <w:rPr>
-          <w:rFonts w:ascii="Arial" w:hAnsi="Arial" w:cs="Arial"/>
-        </w:rPr>
-      </w:pPr>
-      <w:r>
-        <w:rPr>
-          <w:rFonts w:ascii="Arial" w:hAnsi="Arial" w:cs="Arial"/>
-          <w:b/>
-          <w:bCs/>
-        </w:rPr>
-        <w:t>Justifiquen su elección:</w:t>
-      </w:r>
-    </w:p>
-    <w:p>
-      <w:pPr>
-        <w:pStyle w:val="NormalWeb"/>
-        <w:rPr>
-          <w:rFonts w:ascii="Arial" w:hAnsi="Arial" w:cs="Arial"/>
-        </w:rPr>
-      </w:pPr>
-      <w:r>
-        <w:rPr>
-          <w:rFonts w:ascii="Arial" w:hAnsi="Arial" w:cs="Arial"/>
-        </w:rPr>
-        <w:t xml:space="preserve">Elegimos la arquitectura de microservicios porque el sistema está dividido en servicios independientes, donde cada uno cumple una función específica. Esto permite que los servicios se comuniquen entre sí y facilita la organización del </w:t>
-      </w:r>
-      <w:r>
-        <w:rPr>
-          <w:rFonts w:ascii="Arial" w:hAnsi="Arial" w:cs="Arial"/>
-        </w:rPr>
-        <w:lastRenderedPageBreak/>
-        <w:t xml:space="preserve">sistema. Además, si en el futuro aumenta la cantidad de usuarios o se necesitan nuevas funcionalidades, se pueden ampliar o agregar servicios sin tener que modificar todo el sistema. </w:t>
+        <w:jc w:val="both"/>
+        <w:rPr>
+          <w:rFonts w:ascii="Arial" w:hAnsi="Arial" w:cs="Arial"/>
+        </w:rPr>
+      </w:pPr>
+      <w:r>
+        <w:rPr>
+          <w:rFonts w:ascii="Arial" w:hAnsi="Arial" w:cs="Arial"/>
+        </w:rPr>
+        <w:t>Una notificación puede reintentarse sin afectar la asignación de turnos.</w:t>
       </w:r>
     </w:p>
     <w:p>
@@ -2529,7 +1302,7 @@
           <w:sz w:val="24"/>
           <w:szCs w:val="24"/>
         </w:rPr>
-        <w:t xml:space="preserve">PARTE 5 – </w:t>
+        <w:t xml:space="preserve">PARTE 3 – </w:t>
       </w:r>
       <w:r>
         <w:rPr>
@@ -2540,6 +1313,461 @@
           <w:sz w:val="24"/>
           <w:szCs w:val="24"/>
         </w:rPr>
+        <w:t>¿CÓMO SE COMUNICAN?</w:t>
+      </w:r>
+    </w:p>
+    <w:p>
+      <w:pPr>
+        <w:pStyle w:val="Ttulo2"/>
+        <w:jc w:val="both"/>
+        <w:rPr>
+          <w:rFonts w:ascii="Arial" w:hAnsi="Arial" w:cs="Arial"/>
+          <w:sz w:val="24"/>
+          <w:szCs w:val="24"/>
+        </w:rPr>
+      </w:pPr>
+      <w:r>
+        <w:rPr>
+          <w:rFonts w:ascii="Arial" w:hAnsi="Arial" w:cs="Arial"/>
+          <w:sz w:val="24"/>
+          <w:szCs w:val="24"/>
+        </w:rPr>
+        <w:t>Paso 3: Conexión entre servicios</w:t>
+      </w:r>
+    </w:p>
+    <w:p>
+      <w:pPr>
+        <w:pStyle w:val="NormalWeb"/>
+        <w:jc w:val="both"/>
+        <w:rPr>
+          <w:rFonts w:ascii="Arial" w:hAnsi="Arial" w:cs="Arial"/>
+        </w:rPr>
+      </w:pPr>
+      <w:r>
+        <w:rPr>
+          <w:rFonts w:ascii="Arial" w:hAnsi="Arial" w:cs="Arial"/>
+        </w:rPr>
+        <w:t>Respondan:</w:t>
+      </w:r>
+    </w:p>
+    <w:p>
+      <w:pPr>
+        <w:pStyle w:val="NormalWeb"/>
+        <w:numPr>
+          <w:ilvl w:val="0"/>
+          <w:numId w:val="20"/>
+        </w:numPr>
+        <w:jc w:val="both"/>
+        <w:rPr>
+          <w:rFonts w:ascii="Arial" w:hAnsi="Arial" w:cs="Arial"/>
+        </w:rPr>
+      </w:pPr>
+      <w:r>
+        <w:rPr>
+          <w:rFonts w:ascii="Arial" w:hAnsi="Arial" w:cs="Arial"/>
+        </w:rPr>
+        <w:t>¿Qué servicio necesita información de otro?</w:t>
+      </w:r>
+    </w:p>
+    <w:p>
+      <w:pPr>
+        <w:pStyle w:val="NormalWeb"/>
+        <w:numPr>
+          <w:ilvl w:val="0"/>
+          <w:numId w:val="20"/>
+        </w:numPr>
+        <w:jc w:val="both"/>
+        <w:rPr>
+          <w:rFonts w:ascii="Arial" w:hAnsi="Arial" w:cs="Arial"/>
+        </w:rPr>
+      </w:pPr>
+      <w:r>
+        <w:rPr>
+          <w:rFonts w:ascii="Arial" w:hAnsi="Arial" w:cs="Arial"/>
+        </w:rPr>
+        <w:t>¿Quién solicita datos?</w:t>
+      </w:r>
+    </w:p>
+    <w:p>
+      <w:pPr>
+        <w:pStyle w:val="NormalWeb"/>
+        <w:numPr>
+          <w:ilvl w:val="0"/>
+          <w:numId w:val="20"/>
+        </w:numPr>
+        <w:jc w:val="both"/>
+        <w:rPr>
+          <w:rFonts w:ascii="Arial" w:hAnsi="Arial" w:cs="Arial"/>
+        </w:rPr>
+      </w:pPr>
+      <w:r>
+        <w:rPr>
+          <w:rFonts w:ascii="Arial" w:hAnsi="Arial" w:cs="Arial"/>
+        </w:rPr>
+        <w:t>¿Quién responde?</w:t>
+      </w:r>
+    </w:p>
+    <w:p>
+      <w:pPr>
+        <w:pStyle w:val="NormalWeb"/>
+        <w:jc w:val="both"/>
+        <w:rPr>
+          <w:rFonts w:ascii="Arial" w:hAnsi="Arial" w:cs="Arial"/>
+        </w:rPr>
+      </w:pPr>
+      <w:r>
+        <w:rPr>
+          <w:rFonts w:ascii="Arial" w:hAnsi="Arial" w:cs="Arial"/>
+        </w:rPr>
+        <w:t>Ejemplo:</w:t>
+      </w:r>
+    </w:p>
+    <w:p>
+      <w:pPr>
+        <w:pStyle w:val="NormalWeb"/>
+        <w:rPr>
+          <w:rFonts w:ascii="Arial" w:hAnsi="Arial" w:cs="Arial"/>
+        </w:rPr>
+      </w:pPr>
+      <w:r>
+        <w:rPr>
+          <w:rFonts w:ascii="Arial" w:hAnsi="Arial" w:cs="Arial"/>
+        </w:rPr>
+        <w:t>Pedidos → solicita → Inventario</w:t>
+      </w:r>
+      <w:r>
+        <w:rPr>
+          <w:rFonts w:ascii="Arial" w:hAnsi="Arial" w:cs="Arial"/>
+        </w:rPr>
+        <w:br/>
+        <w:t>Pagos → confirma → Pedidos</w:t>
+      </w:r>
+    </w:p>
+    <w:p>
+      <w:pPr>
+        <w:pStyle w:val="NormalWeb"/>
+        <w:jc w:val="both"/>
+        <w:rPr>
+          <w:rFonts w:ascii="Arial" w:hAnsi="Arial" w:cs="Arial"/>
+        </w:rPr>
+      </w:pPr>
+    </w:p>
+    <w:p>
+      <w:pPr>
+        <w:pStyle w:val="Ttulo1"/>
+        <w:jc w:val="both"/>
+        <w:rPr>
+          <w:rFonts w:ascii="Arial" w:hAnsi="Arial" w:cs="Arial"/>
+          <w:b/>
+          <w:bCs/>
+          <w:color w:val="auto"/>
+          <w:sz w:val="24"/>
+          <w:szCs w:val="24"/>
+        </w:rPr>
+      </w:pPr>
+      <w:r>
+        <w:rPr>
+          <w:rFonts w:ascii="Arial" w:hAnsi="Arial" w:cs="Arial"/>
+          <w:b/>
+          <w:bCs/>
+          <w:color w:val="auto"/>
+          <w:sz w:val="24"/>
+          <w:szCs w:val="24"/>
+        </w:rPr>
+        <w:t xml:space="preserve">PARTE 4 – </w:t>
+      </w:r>
+      <w:r>
+        <w:rPr>
+          <w:rFonts w:ascii="Arial" w:hAnsi="Arial" w:cs="Arial"/>
+          <w:b/>
+          <w:bCs/>
+          <w:color w:val="auto"/>
+          <w:sz w:val="24"/>
+          <w:szCs w:val="24"/>
+        </w:rPr>
+        <w:t>ELEGIR LA ARQUITECTURA</w:t>
+      </w:r>
+    </w:p>
+    <w:p>
+      <w:pPr>
+        <w:pStyle w:val="Ttulo2"/>
+        <w:jc w:val="both"/>
+        <w:rPr>
+          <w:rFonts w:ascii="Arial" w:hAnsi="Arial" w:cs="Arial"/>
+          <w:sz w:val="24"/>
+          <w:szCs w:val="24"/>
+        </w:rPr>
+      </w:pPr>
+      <w:r>
+        <w:rPr>
+          <w:rFonts w:ascii="Arial" w:hAnsi="Arial" w:cs="Arial"/>
+          <w:sz w:val="24"/>
+          <w:szCs w:val="24"/>
+        </w:rPr>
+        <w:t>Paso 4: Tipo de arquitectura</w:t>
+      </w:r>
+    </w:p>
+    <w:p>
+      <w:pPr>
+        <w:pStyle w:val="NormalWeb"/>
+        <w:jc w:val="both"/>
+        <w:rPr>
+          <w:rFonts w:ascii="Arial" w:hAnsi="Arial" w:cs="Arial"/>
+        </w:rPr>
+      </w:pPr>
+      <w:r>
+        <w:rPr>
+          <w:rFonts w:ascii="Arial" w:hAnsi="Arial" w:cs="Arial"/>
+        </w:rPr>
+        <w:t>Decidan cuál usarán:</w:t>
+      </w:r>
+    </w:p>
+    <w:p>
+      <w:pPr>
+        <w:pStyle w:val="NormalWeb"/>
+        <w:rPr>
+          <w:rFonts w:ascii="Arial" w:hAnsi="Arial" w:cs="Arial"/>
+        </w:rPr>
+      </w:pPr>
+      <w:r>
+        <w:rPr>
+          <w:rFonts w:ascii="Segoe UI Symbol" w:hAnsi="Segoe UI Symbol" w:cs="Segoe UI Symbol"/>
+        </w:rPr>
+        <w:t>☐</w:t>
+      </w:r>
+      <w:r>
+        <w:rPr>
+          <w:rFonts w:ascii="Arial" w:hAnsi="Arial" w:cs="Arial"/>
+        </w:rPr>
+        <w:t xml:space="preserve"> Cliente–Servidor</w:t>
+      </w:r>
+      <w:r>
+        <w:rPr>
+          <w:rFonts w:ascii="Arial" w:hAnsi="Arial" w:cs="Arial"/>
+        </w:rPr>
+        <w:br/>
+      </w:r>
+      <w:r>
+        <w:rPr>
+          <w:rFonts w:ascii="Segoe UI Symbol" w:hAnsi="Segoe UI Symbol" w:cs="Segoe UI Symbol"/>
+        </w:rPr>
+        <w:t>☐</w:t>
+      </w:r>
+      <w:r>
+        <w:rPr>
+          <w:rFonts w:ascii="Arial" w:hAnsi="Arial" w:cs="Arial"/>
+        </w:rPr>
+        <w:t xml:space="preserve"> Arquitectura en capas</w:t>
+      </w:r>
+      <w:r>
+        <w:rPr>
+          <w:rFonts w:ascii="Arial" w:hAnsi="Arial" w:cs="Arial"/>
+        </w:rPr>
+        <w:br/>
+      </w:r>
+      <w:r>
+        <w:rPr>
+          <w:rFonts w:ascii="Segoe UI Symbol" w:hAnsi="Segoe UI Symbol" w:cs="Segoe UI Symbol"/>
+        </w:rPr>
+        <w:lastRenderedPageBreak/>
+        <w:t>☐</w:t>
+      </w:r>
+      <w:r>
+        <w:rPr>
+          <w:rFonts w:ascii="Arial" w:hAnsi="Arial" w:cs="Arial"/>
+        </w:rPr>
+        <w:t xml:space="preserve"> Microservicios</w:t>
+      </w:r>
+      <w:r>
+        <w:rPr>
+          <w:rFonts w:ascii="Arial" w:hAnsi="Arial" w:cs="Arial"/>
+        </w:rPr>
+        <w:br/>
+      </w:r>
+      <w:r>
+        <w:rPr>
+          <w:rFonts w:ascii="Segoe UI Symbol" w:hAnsi="Segoe UI Symbol" w:cs="Segoe UI Symbol"/>
+        </w:rPr>
+        <w:t>☐</w:t>
+      </w:r>
+      <w:r>
+        <w:rPr>
+          <w:rFonts w:ascii="Arial" w:hAnsi="Arial" w:cs="Arial"/>
+        </w:rPr>
+        <w:t xml:space="preserve"> Basados en eventos</w:t>
+      </w:r>
+      <w:r>
+        <w:rPr>
+          <w:rFonts w:ascii="Arial" w:hAnsi="Arial" w:cs="Arial"/>
+        </w:rPr>
+        <w:br/>
+      </w:r>
+      <w:r>
+        <w:rPr>
+          <w:rFonts w:ascii="Segoe UI Symbol" w:hAnsi="Segoe UI Symbol" w:cs="Segoe UI Symbol"/>
+        </w:rPr>
+        <w:t>☐</w:t>
+      </w:r>
+      <w:r>
+        <w:rPr>
+          <w:rFonts w:ascii="Arial" w:hAnsi="Arial" w:cs="Arial"/>
+        </w:rPr>
+        <w:t xml:space="preserve"> Híbrida</w:t>
+      </w:r>
+    </w:p>
+    <w:p>
+      <w:pPr>
+        <w:pStyle w:val="Ttulo2"/>
+        <w:jc w:val="both"/>
+        <w:rPr>
+          <w:rFonts w:ascii="Arial" w:hAnsi="Arial" w:cs="Arial"/>
+          <w:sz w:val="24"/>
+          <w:szCs w:val="24"/>
+        </w:rPr>
+      </w:pPr>
+      <w:r>
+        <w:rPr>
+          <w:rFonts w:ascii="Arial" w:hAnsi="Arial" w:cs="Arial"/>
+          <w:sz w:val="24"/>
+          <w:szCs w:val="24"/>
+        </w:rPr>
+        <w:t>Preguntas guía:</w:t>
+      </w:r>
+    </w:p>
+    <w:p>
+      <w:pPr>
+        <w:pStyle w:val="NormalWeb"/>
+        <w:numPr>
+          <w:ilvl w:val="0"/>
+          <w:numId w:val="21"/>
+        </w:numPr>
+        <w:jc w:val="both"/>
+        <w:rPr>
+          <w:rFonts w:ascii="Arial" w:hAnsi="Arial" w:cs="Arial"/>
+        </w:rPr>
+      </w:pPr>
+      <w:r>
+        <w:rPr>
+          <w:rFonts w:ascii="Arial" w:hAnsi="Arial" w:cs="Arial"/>
+        </w:rPr>
+        <w:t>¿Cuántos usuarios tendrá el sistema?</w:t>
+      </w:r>
+    </w:p>
+    <w:p>
+      <w:pPr>
+        <w:pStyle w:val="NormalWeb"/>
+        <w:numPr>
+          <w:ilvl w:val="0"/>
+          <w:numId w:val="21"/>
+        </w:numPr>
+        <w:jc w:val="both"/>
+        <w:rPr>
+          <w:rFonts w:ascii="Arial" w:hAnsi="Arial" w:cs="Arial"/>
+        </w:rPr>
+      </w:pPr>
+      <w:r>
+        <w:rPr>
+          <w:rFonts w:ascii="Arial" w:hAnsi="Arial" w:cs="Arial"/>
+        </w:rPr>
+        <w:t>¿Necesita escalar?</w:t>
+      </w:r>
+    </w:p>
+    <w:p>
+      <w:pPr>
+        <w:pStyle w:val="NormalWeb"/>
+        <w:numPr>
+          <w:ilvl w:val="0"/>
+          <w:numId w:val="21"/>
+        </w:numPr>
+        <w:jc w:val="both"/>
+        <w:rPr>
+          <w:rFonts w:ascii="Arial" w:hAnsi="Arial" w:cs="Arial"/>
+        </w:rPr>
+      </w:pPr>
+      <w:r>
+        <w:rPr>
+          <w:rFonts w:ascii="Arial" w:hAnsi="Arial" w:cs="Arial"/>
+        </w:rPr>
+        <w:t>¿Es un sistema pequeño o grande?</w:t>
+      </w:r>
+    </w:p>
+    <w:p>
+      <w:pPr>
+        <w:pStyle w:val="NormalWeb"/>
+        <w:jc w:val="both"/>
+        <w:rPr>
+          <w:rFonts w:ascii="Arial" w:hAnsi="Arial" w:cs="Arial"/>
+        </w:rPr>
+      </w:pPr>
+      <w:r>
+        <w:rPr>
+          <w:rFonts w:ascii="Arial" w:hAnsi="Arial" w:cs="Arial"/>
+        </w:rPr>
+        <w:t>Justifiquen su elección:</w:t>
+      </w:r>
+    </w:p>
+    <w:p>
+      <w:pPr>
+        <w:pStyle w:val="NormalWeb"/>
+        <w:jc w:val="both"/>
+        <w:rPr>
+          <w:rFonts w:ascii="Arial" w:hAnsi="Arial" w:cs="Arial"/>
+        </w:rPr>
+      </w:pPr>
+      <w:r>
+        <w:rPr>
+          <w:rFonts w:ascii="Arial" w:hAnsi="Arial" w:cs="Arial"/>
+        </w:rPr>
+        <w:t>Elegimos esta arquitectura porque…</w:t>
+      </w:r>
+    </w:p>
+    <w:p>
+      <w:pPr>
+        <w:pStyle w:val="Ttulo1"/>
+        <w:jc w:val="both"/>
+        <w:rPr>
+          <w:rFonts w:ascii="Arial" w:hAnsi="Arial" w:cs="Arial"/>
+          <w:b/>
+          <w:bCs/>
+          <w:color w:val="auto"/>
+          <w:sz w:val="24"/>
+          <w:szCs w:val="24"/>
+        </w:rPr>
+      </w:pPr>
+    </w:p>
+    <w:p>
+      <w:pPr>
+        <w:pStyle w:val="Ttulo1"/>
+        <w:jc w:val="both"/>
+        <w:rPr>
+          <w:rFonts w:ascii="Arial" w:hAnsi="Arial" w:cs="Arial"/>
+          <w:b/>
+          <w:bCs/>
+          <w:color w:val="auto"/>
+          <w:sz w:val="24"/>
+          <w:szCs w:val="24"/>
+        </w:rPr>
+      </w:pPr>
+      <w:r>
+        <w:rPr>
+          <w:rFonts w:ascii="Arial" w:hAnsi="Arial" w:cs="Arial"/>
+          <w:b/>
+          <w:bCs/>
+          <w:color w:val="auto"/>
+          <w:sz w:val="24"/>
+          <w:szCs w:val="24"/>
+        </w:rPr>
+        <w:t xml:space="preserve">PARTE 5 – </w:t>
+      </w:r>
+      <w:r>
+        <w:rPr>
+          <w:rFonts w:ascii="Arial" w:hAnsi="Arial" w:cs="Arial"/>
+          <w:b/>
+          <w:bCs/>
+          <w:color w:val="auto"/>
+          <w:sz w:val="24"/>
+          <w:szCs w:val="24"/>
+        </w:rPr>
         <w:t>BASE DE DATOS</w:t>
       </w:r>
     </w:p>
@@ -2724,7 +1952,21 @@
         <w:rPr>
           <w:rFonts w:ascii="Arial" w:hAnsi="Arial" w:cs="Arial"/>
         </w:rPr>
-        <w:t xml:space="preserve"> Se perdería la trazabilidad de quién debía ser atendido y en qué orden, generando reclamos y posible pérdida de confianza del cliente; por eso se recomienda respaldo periódico (backup) y replicación de la base de datos de Turnos</w:t>
+        <w:t xml:space="preserve"> Se perdería la trazabilidad de quién debía ser atendido y en qué orden, generando reclamos y posible pérdida de confianza del cliente; por eso se recomienda respaldo periódico (</w:t>
+      </w:r>
+      <w:proofErr w:type="spellStart"/>
+      <w:r>
+        <w:rPr>
+          <w:rFonts w:ascii="Arial" w:hAnsi="Arial" w:cs="Arial"/>
+        </w:rPr>
+        <w:t>backup</w:t>
+      </w:r>
+      <w:proofErr w:type="spellEnd"/>
+      <w:r>
+        <w:rPr>
+          <w:rFonts w:ascii="Arial" w:hAnsi="Arial" w:cs="Arial"/>
+        </w:rPr>
+        <w:t>) y replicación de la base de datos de Turnos</w:t>
       </w:r>
     </w:p>
     <w:p>
@@ -2749,7 +1991,70 @@
         <w:rPr>
           <w:rFonts w:ascii="Arial" w:hAnsi="Arial" w:cs="Arial"/>
         </w:rPr>
-        <w:t>Cada microservicio tendrá su propia base de datos (bd_turnos, bd_clientes, bd_ventanillas, bd_notificaciones), evitando el acoplamiento que se genera cuando varios servicios comparten una sola base de datos y permitiendo que cada uno evolucione su esquema de forma independiente. La comunicación entre servicios se hace exclusivamente a través de sus APIS REST, nunca accediendo directamente a la base de datos de otro servicio.</w:t>
+        <w:t>Cada microservicio tendrá su propia base de datos (</w:t>
+      </w:r>
+      <w:proofErr w:type="spellStart"/>
+      <w:r>
+        <w:rPr>
+          <w:rFonts w:ascii="Arial" w:hAnsi="Arial" w:cs="Arial"/>
+        </w:rPr>
+        <w:t>bd_turnos</w:t>
+      </w:r>
+      <w:proofErr w:type="spellEnd"/>
+      <w:r>
+        <w:rPr>
+          <w:rFonts w:ascii="Arial" w:hAnsi="Arial" w:cs="Arial"/>
+        </w:rPr>
+        <w:t xml:space="preserve">, </w:t>
+      </w:r>
+      <w:proofErr w:type="spellStart"/>
+      <w:r>
+        <w:rPr>
+          <w:rFonts w:ascii="Arial" w:hAnsi="Arial" w:cs="Arial"/>
+        </w:rPr>
+        <w:t>bd_clientes</w:t>
+      </w:r>
+      <w:proofErr w:type="spellEnd"/>
+      <w:r>
+        <w:rPr>
+          <w:rFonts w:ascii="Arial" w:hAnsi="Arial" w:cs="Arial"/>
+        </w:rPr>
+        <w:t xml:space="preserve">, </w:t>
+      </w:r>
+      <w:proofErr w:type="spellStart"/>
+      <w:r>
+        <w:rPr>
+          <w:rFonts w:ascii="Arial" w:hAnsi="Arial" w:cs="Arial"/>
+        </w:rPr>
+        <w:t>bd_ventanillas</w:t>
+      </w:r>
+      <w:proofErr w:type="spellEnd"/>
+      <w:r>
+        <w:rPr>
+          <w:rFonts w:ascii="Arial" w:hAnsi="Arial" w:cs="Arial"/>
+        </w:rPr>
+        <w:t xml:space="preserve">, </w:t>
+      </w:r>
+      <w:proofErr w:type="spellStart"/>
+      <w:r>
+        <w:rPr>
+          <w:rFonts w:ascii="Arial" w:hAnsi="Arial" w:cs="Arial"/>
+        </w:rPr>
+        <w:t>bd_notificaciones</w:t>
+      </w:r>
+      <w:proofErr w:type="spellEnd"/>
+      <w:r>
+        <w:rPr>
+          <w:rFonts w:ascii="Arial" w:hAnsi="Arial" w:cs="Arial"/>
+        </w:rPr>
+        <w:t xml:space="preserve">), evitando el acoplamiento que se genera cuando varios servicios comparten una sola base de datos y permitiendo que cada uno </w:t>
+      </w:r>
+      <w:r>
+        <w:rPr>
+          <w:rFonts w:ascii="Arial" w:hAnsi="Arial" w:cs="Arial"/>
+        </w:rPr>
+        <w:lastRenderedPageBreak/>
+        <w:t>evolucione su esquema de forma independiente. La comunicación entre servicios se hace exclusivamente a través de sus APIS REST, nunca accediendo directamente a la base de datos de otro servicio.</w:t>
       </w:r>
     </w:p>
     <w:p>
@@ -2847,7 +2152,6 @@
         <w:rPr>
           <w:rFonts w:ascii="Arial" w:hAnsi="Arial" w:cs="Arial"/>
         </w:rPr>
-        <w:lastRenderedPageBreak/>
         <w:t xml:space="preserve">Cliente: </w:t>
       </w:r>
       <w:r>
@@ -3178,6 +2482,15 @@
     </w:p>
     <w:p>
       <w:pPr>
+        <w:pStyle w:val="NormalWeb"/>
+        <w:jc w:val="both"/>
+        <w:rPr>
+          <w:rFonts w:ascii="Arial" w:hAnsi="Arial" w:cs="Arial"/>
+        </w:rPr>
+      </w:pPr>
+    </w:p>
+    <w:p>
+      <w:pPr>
         <w:pStyle w:val="Ttulo1"/>
         <w:jc w:val="both"/>
         <w:rPr>
@@ -3230,7 +2543,6 @@
           <w:noProof/>
           <w:lang w:val="es-ES" w:eastAsia="es-ES"/>
         </w:rPr>
-        <w:lastRenderedPageBreak/>
         <w:drawing>
           <wp:inline distT="0" distB="0" distL="0" distR="0" wp14:anchorId="3A3C42B8" wp14:editId="5585BEB2">
             <wp:extent cx="5612130" cy="6024245"/>
@@ -3295,6 +2607,7 @@
           <w:sz w:val="24"/>
           <w:szCs w:val="24"/>
         </w:rPr>
+        <w:lastRenderedPageBreak/>
         <w:t>PARTE 9 — COMMIT Y PULL REQUEST</w:t>
       </w:r>
     </w:p>
@@ -3325,11 +2638,19 @@
           <w:rFonts w:ascii="Arial" w:hAnsi="Arial" w:cs="Arial"/>
         </w:rPr>
       </w:pPr>
-      <w:r>
-        <w:rPr>
-          <w:rFonts w:ascii="Arial" w:hAnsi="Arial" w:cs="Arial"/>
-        </w:rPr>
-        <w:t>Commit por sección:</w:t>
+      <w:proofErr w:type="spellStart"/>
+      <w:r>
+        <w:rPr>
+          <w:rFonts w:ascii="Arial" w:hAnsi="Arial" w:cs="Arial"/>
+        </w:rPr>
+        <w:t>Commit</w:t>
+      </w:r>
+      <w:proofErr w:type="spellEnd"/>
+      <w:r>
+        <w:rPr>
+          <w:rFonts w:ascii="Arial" w:hAnsi="Arial" w:cs="Arial"/>
+        </w:rPr>
+        <w:t xml:space="preserve"> por sección:</w:t>
       </w:r>
     </w:p>
     <w:p>
@@ -3339,21 +2660,21 @@
           <w:lang w:eastAsia="es-CO"/>
         </w:rPr>
       </w:pPr>
+      <w:proofErr w:type="spellStart"/>
       <w:r>
         <w:rPr>
           <w:rFonts w:ascii="Arial" w:eastAsia="Times New Roman" w:hAnsi="Arial" w:cs="Arial"/>
           <w:lang w:eastAsia="es-CO"/>
         </w:rPr>
-        <w:lastRenderedPageBreak/>
-        <w:t>doc: definición de servicios</w:t>
-      </w:r>
+        <w:t>doc</w:t>
+      </w:r>
+      <w:proofErr w:type="spellEnd"/>
       <w:r>
         <w:rPr>
           <w:rFonts w:ascii="Arial" w:eastAsia="Times New Roman" w:hAnsi="Arial" w:cs="Arial"/>
           <w:lang w:eastAsia="es-CO"/>
         </w:rPr>
-        <w:br/>
-        <w:t>doc: comunicación entre servicios</w:t>
+        <w:t>: definición de servicios</w:t>
       </w:r>
       <w:r>
         <w:rPr>
@@ -3361,15 +2682,68 @@
           <w:lang w:eastAsia="es-CO"/>
         </w:rPr>
         <w:br/>
-        <w:t>doc: arquitectura seleccionada</w:t>
-      </w:r>
+      </w:r>
+      <w:proofErr w:type="spellStart"/>
       <w:r>
         <w:rPr>
           <w:rFonts w:ascii="Arial" w:eastAsia="Times New Roman" w:hAnsi="Arial" w:cs="Arial"/>
           <w:lang w:eastAsia="es-CO"/>
         </w:rPr>
+        <w:t>doc</w:t>
+      </w:r>
+      <w:proofErr w:type="spellEnd"/>
+      <w:r>
+        <w:rPr>
+          <w:rFonts w:ascii="Arial" w:eastAsia="Times New Roman" w:hAnsi="Arial" w:cs="Arial"/>
+          <w:lang w:eastAsia="es-CO"/>
+        </w:rPr>
+        <w:t>: comunicación entre servicios</w:t>
+      </w:r>
+      <w:r>
+        <w:rPr>
+          <w:rFonts w:ascii="Arial" w:eastAsia="Times New Roman" w:hAnsi="Arial" w:cs="Arial"/>
+          <w:lang w:eastAsia="es-CO"/>
+        </w:rPr>
         <w:br/>
-        <w:t>doc: usuarios del sistema</w:t>
+      </w:r>
+      <w:proofErr w:type="spellStart"/>
+      <w:r>
+        <w:rPr>
+          <w:rFonts w:ascii="Arial" w:eastAsia="Times New Roman" w:hAnsi="Arial" w:cs="Arial"/>
+          <w:lang w:eastAsia="es-CO"/>
+        </w:rPr>
+        <w:t>doc</w:t>
+      </w:r>
+      <w:proofErr w:type="spellEnd"/>
+      <w:r>
+        <w:rPr>
+          <w:rFonts w:ascii="Arial" w:eastAsia="Times New Roman" w:hAnsi="Arial" w:cs="Arial"/>
+          <w:lang w:eastAsia="es-CO"/>
+        </w:rPr>
+        <w:t>: arquitectura seleccionada</w:t>
+      </w:r>
+      <w:r>
+        <w:rPr>
+          <w:rFonts w:ascii="Arial" w:eastAsia="Times New Roman" w:hAnsi="Arial" w:cs="Arial"/>
+          <w:lang w:eastAsia="es-CO"/>
+        </w:rPr>
+        <w:br/>
+      </w:r>
+      <w:proofErr w:type="spellStart"/>
+      <w:r>
+        <w:rPr>
+          <w:rFonts w:ascii="Arial" w:eastAsia="Times New Roman" w:hAnsi="Arial" w:cs="Arial"/>
+          <w:lang w:eastAsia="es-CO"/>
+        </w:rPr>
+        <w:t>doc</w:t>
+      </w:r>
+      <w:proofErr w:type="spellEnd"/>
+      <w:r>
+        <w:rPr>
+          <w:rFonts w:ascii="Arial" w:eastAsia="Times New Roman" w:hAnsi="Arial" w:cs="Arial"/>
+          <w:lang w:eastAsia="es-CO"/>
+        </w:rPr>
+        <w:t>: usuarios del sistema</w:t>
       </w:r>
     </w:p>
     <w:p>
@@ -3384,7 +2758,21 @@
         <w:rPr>
           <w:rFonts w:ascii="Arial" w:hAnsi="Arial" w:cs="Arial"/>
         </w:rPr>
-        <w:t>Luego crear Pull Request:</w:t>
+        <w:t xml:space="preserve">Luego crear Pull </w:t>
+      </w:r>
+      <w:proofErr w:type="spellStart"/>
+      <w:r>
+        <w:rPr>
+          <w:rFonts w:ascii="Arial" w:hAnsi="Arial" w:cs="Arial"/>
+        </w:rPr>
+        <w:t>Request</w:t>
+      </w:r>
+      <w:proofErr w:type="spellEnd"/>
+      <w:r>
+        <w:rPr>
+          <w:rFonts w:ascii="Arial" w:hAnsi="Arial" w:cs="Arial"/>
+        </w:rPr>
+        <w:t>:</w:t>
       </w:r>
     </w:p>
     <w:p>
@@ -3876,155 +3264,6 @@
     </w:lvl>
   </w:abstractNum>
   <w:abstractNum w:abstractNumId="1" w15:restartNumberingAfterBreak="0">
-    <w:nsid w:val="0772588D"/>
-    <w:multiLevelType w:val="multilevel"/>
-    <w:tmpl w:val="E124C2B8"/>
-    <w:lvl w:ilvl="0">
-      <w:start w:val="1"/>
-      <w:numFmt w:val="bullet"/>
-      <w:lvlText w:val=""/>
-      <w:lvlJc w:val="left"/>
-      <w:pPr>
-        <w:tabs>
-          <w:tab w:val="num" w:pos="720"/>
-        </w:tabs>
-        <w:ind w:left="720" w:hanging="360"/>
-      </w:pPr>
-      <w:rPr>
-        <w:rFonts w:ascii="Symbol" w:hAnsi="Symbol" w:hint="default"/>
-        <w:sz w:val="20"/>
-      </w:rPr>
-    </w:lvl>
-    <w:lvl w:ilvl="1" w:tentative="1">
-      <w:start w:val="1"/>
-      <w:numFmt w:val="bullet"/>
-      <w:lvlText w:val="o"/>
-      <w:lvlJc w:val="left"/>
-      <w:pPr>
-        <w:tabs>
-          <w:tab w:val="num" w:pos="1440"/>
-        </w:tabs>
-        <w:ind w:left="1440" w:hanging="360"/>
-      </w:pPr>
-      <w:rPr>
-        <w:rFonts w:ascii="Courier New" w:hAnsi="Courier New" w:hint="default"/>
-        <w:sz w:val="20"/>
-      </w:rPr>
-    </w:lvl>
-    <w:lvl w:ilvl="2" w:tentative="1">
-      <w:start w:val="1"/>
-      <w:numFmt w:val="bullet"/>
-      <w:lvlText w:val=""/>
-      <w:lvlJc w:val="left"/>
-      <w:pPr>
-        <w:tabs>
-          <w:tab w:val="num" w:pos="2160"/>
-        </w:tabs>
-        <w:ind w:left="2160" w:hanging="360"/>
-      </w:pPr>
-      <w:rPr>
-        <w:rFonts w:ascii="Wingdings" w:hAnsi="Wingdings" w:hint="default"/>
-        <w:sz w:val="20"/>
-      </w:rPr>
-    </w:lvl>
-    <w:lvl w:ilvl="3" w:tentative="1">
-      <w:start w:val="1"/>
-      <w:numFmt w:val="bullet"/>
-      <w:lvlText w:val=""/>
-      <w:lvlJc w:val="left"/>
-      <w:pPr>
-        <w:tabs>
-          <w:tab w:val="num" w:pos="2880"/>
-        </w:tabs>
-        <w:ind w:left="2880" w:hanging="360"/>
-      </w:pPr>
-      <w:rPr>
-        <w:rFonts w:ascii="Wingdings" w:hAnsi="Wingdings" w:hint="default"/>
-        <w:sz w:val="20"/>
-      </w:rPr>
-    </w:lvl>
-    <w:lvl w:ilvl="4" w:tentative="1">
-      <w:start w:val="1"/>
-      <w:numFmt w:val="bullet"/>
-      <w:lvlText w:val=""/>
-      <w:lvlJc w:val="left"/>
-      <w:pPr>
-        <w:tabs>
-          <w:tab w:val="num" w:pos="3600"/>
-        </w:tabs>
-        <w:ind w:left="3600" w:hanging="360"/>
-      </w:pPr>
-      <w:rPr>
-        <w:rFonts w:ascii="Wingdings" w:hAnsi="Wingdings" w:hint="default"/>
-        <w:sz w:val="20"/>
-      </w:rPr>
-    </w:lvl>
-    <w:lvl w:ilvl="5" w:tentative="1">
-      <w:start w:val="1"/>
-      <w:numFmt w:val="bullet"/>
-      <w:lvlText w:val=""/>
-      <w:lvlJc w:val="left"/>
-      <w:pPr>
-        <w:tabs>
-          <w:tab w:val="num" w:pos="4320"/>
-        </w:tabs>
-        <w:ind w:left="4320" w:hanging="360"/>
-      </w:pPr>
-      <w:rPr>
-        <w:rFonts w:ascii="Wingdings" w:hAnsi="Wingdings" w:hint="default"/>
-        <w:sz w:val="20"/>
-      </w:rPr>
-    </w:lvl>
-    <w:lvl w:ilvl="6" w:tentative="1">
-      <w:start w:val="1"/>
-      <w:numFmt w:val="bullet"/>
-      <w:lvlText w:val=""/>
-      <w:lvlJc w:val="left"/>
-      <w:pPr>
-        <w:tabs>
-          <w:tab w:val="num" w:pos="5040"/>
-        </w:tabs>
-        <w:ind w:left="5040" w:hanging="360"/>
-      </w:pPr>
-      <w:rPr>
-        <w:rFonts w:ascii="Wingdings" w:hAnsi="Wingdings" w:hint="default"/>
-        <w:sz w:val="20"/>
-      </w:rPr>
-    </w:lvl>
-    <w:lvl w:ilvl="7" w:tentative="1">
-      <w:start w:val="1"/>
-      <w:numFmt w:val="bullet"/>
-      <w:lvlText w:val=""/>
-      <w:lvlJc w:val="left"/>
-      <w:pPr>
-        <w:tabs>
-          <w:tab w:val="num" w:pos="5760"/>
-        </w:tabs>
-        <w:ind w:left="5760" w:hanging="360"/>
-      </w:pPr>
-      <w:rPr>
-        <w:rFonts w:ascii="Wingdings" w:hAnsi="Wingdings" w:hint="default"/>
-        <w:sz w:val="20"/>
-      </w:rPr>
-    </w:lvl>
-    <w:lvl w:ilvl="8" w:tentative="1">
-      <w:start w:val="1"/>
-      <w:numFmt w:val="bullet"/>
-      <w:lvlText w:val=""/>
-      <w:lvlJc w:val="left"/>
-      <w:pPr>
-        <w:tabs>
-          <w:tab w:val="num" w:pos="6480"/>
-        </w:tabs>
-        <w:ind w:left="6480" w:hanging="360"/>
-      </w:pPr>
-      <w:rPr>
-        <w:rFonts w:ascii="Wingdings" w:hAnsi="Wingdings" w:hint="default"/>
-        <w:sz w:val="20"/>
-      </w:rPr>
-    </w:lvl>
-  </w:abstractNum>
-  <w:abstractNum w:abstractNumId="2" w15:restartNumberingAfterBreak="0">
     <w:nsid w:val="098E43C6"/>
     <w:multiLevelType w:val="hybridMultilevel"/>
     <w:tmpl w:val="67E2CEF0"/>
@@ -4113,7 +3352,7 @@
       </w:pPr>
     </w:lvl>
   </w:abstractNum>
-  <w:abstractNum w:abstractNumId="3" w15:restartNumberingAfterBreak="0">
+  <w:abstractNum w:abstractNumId="2" w15:restartNumberingAfterBreak="0">
     <w:nsid w:val="0ED77C8B"/>
     <w:multiLevelType w:val="multilevel"/>
     <w:tmpl w:val="75C48196"/>
@@ -4226,156 +3465,7 @@
       </w:pPr>
     </w:lvl>
   </w:abstractNum>
-  <w:abstractNum w:abstractNumId="4" w15:restartNumberingAfterBreak="0">
-    <w:nsid w:val="0F9C7ED2"/>
-    <w:multiLevelType w:val="multilevel"/>
-    <w:tmpl w:val="3C1449E2"/>
-    <w:lvl w:ilvl="0">
-      <w:start w:val="1"/>
-      <w:numFmt w:val="bullet"/>
-      <w:lvlText w:val=""/>
-      <w:lvlJc w:val="left"/>
-      <w:pPr>
-        <w:tabs>
-          <w:tab w:val="num" w:pos="720"/>
-        </w:tabs>
-        <w:ind w:left="720" w:hanging="360"/>
-      </w:pPr>
-      <w:rPr>
-        <w:rFonts w:ascii="Symbol" w:hAnsi="Symbol" w:hint="default"/>
-        <w:sz w:val="20"/>
-      </w:rPr>
-    </w:lvl>
-    <w:lvl w:ilvl="1" w:tentative="1">
-      <w:start w:val="1"/>
-      <w:numFmt w:val="bullet"/>
-      <w:lvlText w:val="o"/>
-      <w:lvlJc w:val="left"/>
-      <w:pPr>
-        <w:tabs>
-          <w:tab w:val="num" w:pos="1440"/>
-        </w:tabs>
-        <w:ind w:left="1440" w:hanging="360"/>
-      </w:pPr>
-      <w:rPr>
-        <w:rFonts w:ascii="Courier New" w:hAnsi="Courier New" w:hint="default"/>
-        <w:sz w:val="20"/>
-      </w:rPr>
-    </w:lvl>
-    <w:lvl w:ilvl="2" w:tentative="1">
-      <w:start w:val="1"/>
-      <w:numFmt w:val="bullet"/>
-      <w:lvlText w:val=""/>
-      <w:lvlJc w:val="left"/>
-      <w:pPr>
-        <w:tabs>
-          <w:tab w:val="num" w:pos="2160"/>
-        </w:tabs>
-        <w:ind w:left="2160" w:hanging="360"/>
-      </w:pPr>
-      <w:rPr>
-        <w:rFonts w:ascii="Wingdings" w:hAnsi="Wingdings" w:hint="default"/>
-        <w:sz w:val="20"/>
-      </w:rPr>
-    </w:lvl>
-    <w:lvl w:ilvl="3" w:tentative="1">
-      <w:start w:val="1"/>
-      <w:numFmt w:val="bullet"/>
-      <w:lvlText w:val=""/>
-      <w:lvlJc w:val="left"/>
-      <w:pPr>
-        <w:tabs>
-          <w:tab w:val="num" w:pos="2880"/>
-        </w:tabs>
-        <w:ind w:left="2880" w:hanging="360"/>
-      </w:pPr>
-      <w:rPr>
-        <w:rFonts w:ascii="Wingdings" w:hAnsi="Wingdings" w:hint="default"/>
-        <w:sz w:val="20"/>
-      </w:rPr>
-    </w:lvl>
-    <w:lvl w:ilvl="4" w:tentative="1">
-      <w:start w:val="1"/>
-      <w:numFmt w:val="bullet"/>
-      <w:lvlText w:val=""/>
-      <w:lvlJc w:val="left"/>
-      <w:pPr>
-        <w:tabs>
-          <w:tab w:val="num" w:pos="3600"/>
-        </w:tabs>
-        <w:ind w:left="3600" w:hanging="360"/>
-      </w:pPr>
-      <w:rPr>
-        <w:rFonts w:ascii="Wingdings" w:hAnsi="Wingdings" w:hint="default"/>
-        <w:sz w:val="20"/>
-      </w:rPr>
-    </w:lvl>
-    <w:lvl w:ilvl="5" w:tentative="1">
-      <w:start w:val="1"/>
-      <w:numFmt w:val="bullet"/>
-      <w:lvlText w:val=""/>
-      <w:lvlJc w:val="left"/>
-      <w:pPr>
-        <w:tabs>
-          <w:tab w:val="num" w:pos="4320"/>
-        </w:tabs>
-        <w:ind w:left="4320" w:hanging="360"/>
-      </w:pPr>
-      <w:rPr>
-        <w:rFonts w:ascii="Wingdings" w:hAnsi="Wingdings" w:hint="default"/>
-        <w:sz w:val="20"/>
-      </w:rPr>
-    </w:lvl>
-    <w:lvl w:ilvl="6" w:tentative="1">
-      <w:start w:val="1"/>
-      <w:numFmt w:val="bullet"/>
-      <w:lvlText w:val=""/>
-      <w:lvlJc w:val="left"/>
-      <w:pPr>
-        <w:tabs>
-          <w:tab w:val="num" w:pos="5040"/>
-        </w:tabs>
-        <w:ind w:left="5040" w:hanging="360"/>
-      </w:pPr>
-      <w:rPr>
-        <w:rFonts w:ascii="Wingdings" w:hAnsi="Wingdings" w:hint="default"/>
-        <w:sz w:val="20"/>
-      </w:rPr>
-    </w:lvl>
-    <w:lvl w:ilvl="7" w:tentative="1">
-      <w:start w:val="1"/>
-      <w:numFmt w:val="bullet"/>
-      <w:lvlText w:val=""/>
-      <w:lvlJc w:val="left"/>
-      <w:pPr>
-        <w:tabs>
-          <w:tab w:val="num" w:pos="5760"/>
-        </w:tabs>
-        <w:ind w:left="5760" w:hanging="360"/>
-      </w:pPr>
-      <w:rPr>
-        <w:rFonts w:ascii="Wingdings" w:hAnsi="Wingdings" w:hint="default"/>
-        <w:sz w:val="20"/>
-      </w:rPr>
-    </w:lvl>
-    <w:lvl w:ilvl="8" w:tentative="1">
-      <w:start w:val="1"/>
-      <w:numFmt w:val="bullet"/>
-      <w:lvlText w:val=""/>
-      <w:lvlJc w:val="left"/>
-      <w:pPr>
-        <w:tabs>
-          <w:tab w:val="num" w:pos="6480"/>
-        </w:tabs>
-        <w:ind w:left="6480" w:hanging="360"/>
-      </w:pPr>
-      <w:rPr>
-        <w:rFonts w:ascii="Wingdings" w:hAnsi="Wingdings" w:hint="default"/>
-        <w:sz w:val="20"/>
-      </w:rPr>
-    </w:lvl>
-  </w:abstractNum>
-  <w:abstractNum w:abstractNumId="5" w15:restartNumberingAfterBreak="0">
+  <w:abstractNum w:abstractNumId="3" w15:restartNumberingAfterBreak="0">
     <w:nsid w:val="10D575F9"/>
     <w:multiLevelType w:val="multilevel"/>
     <w:tmpl w:val="446C2F2A"/>
@@ -4524,7 +3614,7 @@
       </w:rPr>
     </w:lvl>
   </w:abstractNum>
-  <w:abstractNum w:abstractNumId="6" w15:restartNumberingAfterBreak="0">
+  <w:abstractNum w:abstractNumId="4" w15:restartNumberingAfterBreak="0">
     <w:nsid w:val="11ED5ECB"/>
     <w:multiLevelType w:val="multilevel"/>
     <w:tmpl w:val="A6545128"/>
@@ -4673,7 +3763,7 @@
       </w:rPr>
     </w:lvl>
   </w:abstractNum>
-  <w:abstractNum w:abstractNumId="7" w15:restartNumberingAfterBreak="0">
+  <w:abstractNum w:abstractNumId="5" w15:restartNumberingAfterBreak="0">
     <w:nsid w:val="11EE02DD"/>
     <w:multiLevelType w:val="hybridMultilevel"/>
     <w:tmpl w:val="1F28CA28"/>
@@ -4786,156 +3876,7 @@
       </w:rPr>
     </w:lvl>
   </w:abstractNum>
-  <w:abstractNum w:abstractNumId="8" w15:restartNumberingAfterBreak="0">
-    <w:nsid w:val="14F701BB"/>
-    <w:multiLevelType w:val="multilevel"/>
-    <w:tmpl w:val="24BA50CC"/>
-    <w:lvl w:ilvl="0">
-      <w:start w:val="1"/>
-      <w:numFmt w:val="bullet"/>
-      <w:lvlText w:val=""/>
-      <w:lvlJc w:val="left"/>
-      <w:pPr>
-        <w:tabs>
-          <w:tab w:val="num" w:pos="720"/>
-        </w:tabs>
-        <w:ind w:left="720" w:hanging="360"/>
-      </w:pPr>
-      <w:rPr>
-        <w:rFonts w:ascii="Symbol" w:hAnsi="Symbol" w:hint="default"/>
-        <w:sz w:val="20"/>
-      </w:rPr>
-    </w:lvl>
-    <w:lvl w:ilvl="1" w:tentative="1">
-      <w:start w:val="1"/>
-      <w:numFmt w:val="bullet"/>
-      <w:lvlText w:val="o"/>
-      <w:lvlJc w:val="left"/>
-      <w:pPr>
-        <w:tabs>
-          <w:tab w:val="num" w:pos="1440"/>
-        </w:tabs>
-        <w:ind w:left="1440" w:hanging="360"/>
-      </w:pPr>
-      <w:rPr>
-        <w:rFonts w:ascii="Courier New" w:hAnsi="Courier New" w:hint="default"/>
-        <w:sz w:val="20"/>
-      </w:rPr>
-    </w:lvl>
-    <w:lvl w:ilvl="2" w:tentative="1">
-      <w:start w:val="1"/>
-      <w:numFmt w:val="bullet"/>
-      <w:lvlText w:val=""/>
-      <w:lvlJc w:val="left"/>
-      <w:pPr>
-        <w:tabs>
-          <w:tab w:val="num" w:pos="2160"/>
-        </w:tabs>
-        <w:ind w:left="2160" w:hanging="360"/>
-      </w:pPr>
-      <w:rPr>
-        <w:rFonts w:ascii="Wingdings" w:hAnsi="Wingdings" w:hint="default"/>
-        <w:sz w:val="20"/>
-      </w:rPr>
-    </w:lvl>
-    <w:lvl w:ilvl="3" w:tentative="1">
-      <w:start w:val="1"/>
-      <w:numFmt w:val="bullet"/>
-      <w:lvlText w:val=""/>
-      <w:lvlJc w:val="left"/>
-      <w:pPr>
-        <w:tabs>
-          <w:tab w:val="num" w:pos="2880"/>
-        </w:tabs>
-        <w:ind w:left="2880" w:hanging="360"/>
-      </w:pPr>
-      <w:rPr>
-        <w:rFonts w:ascii="Wingdings" w:hAnsi="Wingdings" w:hint="default"/>
-        <w:sz w:val="20"/>
-      </w:rPr>
-    </w:lvl>
-    <w:lvl w:ilvl="4" w:tentative="1">
-      <w:start w:val="1"/>
-      <w:numFmt w:val="bullet"/>
-      <w:lvlText w:val=""/>
-      <w:lvlJc w:val="left"/>
-      <w:pPr>
-        <w:tabs>
-          <w:tab w:val="num" w:pos="3600"/>
-        </w:tabs>
-        <w:ind w:left="3600" w:hanging="360"/>
-      </w:pPr>
-      <w:rPr>
-        <w:rFonts w:ascii="Wingdings" w:hAnsi="Wingdings" w:hint="default"/>
-        <w:sz w:val="20"/>
-      </w:rPr>
-    </w:lvl>
-    <w:lvl w:ilvl="5" w:tentative="1">
-      <w:start w:val="1"/>
-      <w:numFmt w:val="bullet"/>
-      <w:lvlText w:val=""/>
-      <w:lvlJc w:val="left"/>
-      <w:pPr>
-        <w:tabs>
-          <w:tab w:val="num" w:pos="4320"/>
-        </w:tabs>
-        <w:ind w:left="4320" w:hanging="360"/>
-      </w:pPr>
-      <w:rPr>
-        <w:rFonts w:ascii="Wingdings" w:hAnsi="Wingdings" w:hint="default"/>
-        <w:sz w:val="20"/>
-      </w:rPr>
-    </w:lvl>
-    <w:lvl w:ilvl="6" w:tentative="1">
-      <w:start w:val="1"/>
-      <w:numFmt w:val="bullet"/>
-      <w:lvlText w:val=""/>
-      <w:lvlJc w:val="left"/>
-      <w:pPr>
-        <w:tabs>
-          <w:tab w:val="num" w:pos="5040"/>
-        </w:tabs>
-        <w:ind w:left="5040" w:hanging="360"/>
-      </w:pPr>
-      <w:rPr>
-        <w:rFonts w:ascii="Wingdings" w:hAnsi="Wingdings" w:hint="default"/>
-        <w:sz w:val="20"/>
-      </w:rPr>
-    </w:lvl>
-    <w:lvl w:ilvl="7" w:tentative="1">
-      <w:start w:val="1"/>
-      <w:numFmt w:val="bullet"/>
-      <w:lvlText w:val=""/>
-      <w:lvlJc w:val="left"/>
-      <w:pPr>
-        <w:tabs>
-          <w:tab w:val="num" w:pos="5760"/>
-        </w:tabs>
-        <w:ind w:left="5760" w:hanging="360"/>
-      </w:pPr>
-      <w:rPr>
-        <w:rFonts w:ascii="Wingdings" w:hAnsi="Wingdings" w:hint="default"/>
-        <w:sz w:val="20"/>
-      </w:rPr>
-    </w:lvl>
-    <w:lvl w:ilvl="8" w:tentative="1">
-      <w:start w:val="1"/>
-      <w:numFmt w:val="bullet"/>
-      <w:lvlText w:val=""/>
-      <w:lvlJc w:val="left"/>
-      <w:pPr>
-        <w:tabs>
-          <w:tab w:val="num" w:pos="6480"/>
-        </w:tabs>
-        <w:ind w:left="6480" w:hanging="360"/>
-      </w:pPr>
-      <w:rPr>
-        <w:rFonts w:ascii="Wingdings" w:hAnsi="Wingdings" w:hint="default"/>
-        <w:sz w:val="20"/>
-      </w:rPr>
-    </w:lvl>
-  </w:abstractNum>
-  <w:abstractNum w:abstractNumId="9" w15:restartNumberingAfterBreak="0">
+  <w:abstractNum w:abstractNumId="6" w15:restartNumberingAfterBreak="0">
     <w:nsid w:val="1500540A"/>
     <w:multiLevelType w:val="multilevel"/>
     <w:tmpl w:val="9A88DA6C"/>
@@ -5048,7 +3989,7 @@
       </w:pPr>
     </w:lvl>
   </w:abstractNum>
-  <w:abstractNum w:abstractNumId="10" w15:restartNumberingAfterBreak="0">
+  <w:abstractNum w:abstractNumId="7" w15:restartNumberingAfterBreak="0">
     <w:nsid w:val="181B0935"/>
     <w:multiLevelType w:val="multilevel"/>
     <w:tmpl w:val="A7E0AE34"/>
@@ -5164,7 +4105,7 @@
       </w:pPr>
     </w:lvl>
   </w:abstractNum>
-  <w:abstractNum w:abstractNumId="11" w15:restartNumberingAfterBreak="0">
+  <w:abstractNum w:abstractNumId="8" w15:restartNumberingAfterBreak="0">
     <w:nsid w:val="201A32AF"/>
     <w:multiLevelType w:val="multilevel"/>
     <w:tmpl w:val="5606B116"/>
@@ -5280,156 +4221,7 @@
       </w:pPr>
     </w:lvl>
   </w:abstractNum>
-  <w:abstractNum w:abstractNumId="12" w15:restartNumberingAfterBreak="0">
-    <w:nsid w:val="24D3779B"/>
-    <w:multiLevelType w:val="multilevel"/>
-    <w:tmpl w:val="B4DAA764"/>
-    <w:lvl w:ilvl="0">
-      <w:start w:val="1"/>
-      <w:numFmt w:val="bullet"/>
-      <w:lvlText w:val=""/>
-      <w:lvlJc w:val="left"/>
-      <w:pPr>
-        <w:tabs>
-          <w:tab w:val="num" w:pos="720"/>
-        </w:tabs>
-        <w:ind w:left="720" w:hanging="360"/>
-      </w:pPr>
-      <w:rPr>
-        <w:rFonts w:ascii="Symbol" w:hAnsi="Symbol" w:hint="default"/>
-        <w:sz w:val="20"/>
-      </w:rPr>
-    </w:lvl>
-    <w:lvl w:ilvl="1" w:tentative="1">
-      <w:start w:val="1"/>
-      <w:numFmt w:val="bullet"/>
-      <w:lvlText w:val="o"/>
-      <w:lvlJc w:val="left"/>
-      <w:pPr>
-        <w:tabs>
-          <w:tab w:val="num" w:pos="1440"/>
-        </w:tabs>
-        <w:ind w:left="1440" w:hanging="360"/>
-      </w:pPr>
-      <w:rPr>
-        <w:rFonts w:ascii="Courier New" w:hAnsi="Courier New" w:hint="default"/>
-        <w:sz w:val="20"/>
-      </w:rPr>
-    </w:lvl>
-    <w:lvl w:ilvl="2" w:tentative="1">
-      <w:start w:val="1"/>
-      <w:numFmt w:val="bullet"/>
-      <w:lvlText w:val=""/>
-      <w:lvlJc w:val="left"/>
-      <w:pPr>
-        <w:tabs>
-          <w:tab w:val="num" w:pos="2160"/>
-        </w:tabs>
-        <w:ind w:left="2160" w:hanging="360"/>
-      </w:pPr>
-      <w:rPr>
-        <w:rFonts w:ascii="Wingdings" w:hAnsi="Wingdings" w:hint="default"/>
-        <w:sz w:val="20"/>
-      </w:rPr>
-    </w:lvl>
-    <w:lvl w:ilvl="3" w:tentative="1">
-      <w:start w:val="1"/>
-      <w:numFmt w:val="bullet"/>
-      <w:lvlText w:val=""/>
-      <w:lvlJc w:val="left"/>
-      <w:pPr>
-        <w:tabs>
-          <w:tab w:val="num" w:pos="2880"/>
-        </w:tabs>
-        <w:ind w:left="2880" w:hanging="360"/>
-      </w:pPr>
-      <w:rPr>
-        <w:rFonts w:ascii="Wingdings" w:hAnsi="Wingdings" w:hint="default"/>
-        <w:sz w:val="20"/>
-      </w:rPr>
-    </w:lvl>
-    <w:lvl w:ilvl="4" w:tentative="1">
-      <w:start w:val="1"/>
-      <w:numFmt w:val="bullet"/>
-      <w:lvlText w:val=""/>
-      <w:lvlJc w:val="left"/>
-      <w:pPr>
-        <w:tabs>
-          <w:tab w:val="num" w:pos="3600"/>
-        </w:tabs>
-        <w:ind w:left="3600" w:hanging="360"/>
-      </w:pPr>
-      <w:rPr>
-        <w:rFonts w:ascii="Wingdings" w:hAnsi="Wingdings" w:hint="default"/>
-        <w:sz w:val="20"/>
-      </w:rPr>
-    </w:lvl>
-    <w:lvl w:ilvl="5" w:tentative="1">
-      <w:start w:val="1"/>
-      <w:numFmt w:val="bullet"/>
-      <w:lvlText w:val=""/>
-      <w:lvlJc w:val="left"/>
-      <w:pPr>
-        <w:tabs>
-          <w:tab w:val="num" w:pos="4320"/>
-        </w:tabs>
-        <w:ind w:left="4320" w:hanging="360"/>
-      </w:pPr>
-      <w:rPr>
-        <w:rFonts w:ascii="Wingdings" w:hAnsi="Wingdings" w:hint="default"/>
-        <w:sz w:val="20"/>
-      </w:rPr>
-    </w:lvl>
-    <w:lvl w:ilvl="6" w:tentative="1">
-      <w:start w:val="1"/>
-      <w:numFmt w:val="bullet"/>
-      <w:lvlText w:val=""/>
-      <w:lvlJc w:val="left"/>
-      <w:pPr>
-        <w:tabs>
-          <w:tab w:val="num" w:pos="5040"/>
-        </w:tabs>
-        <w:ind w:left="5040" w:hanging="360"/>
-      </w:pPr>
-      <w:rPr>
-        <w:rFonts w:ascii="Wingdings" w:hAnsi="Wingdings" w:hint="default"/>
-        <w:sz w:val="20"/>
-      </w:rPr>
-    </w:lvl>
-    <w:lvl w:ilvl="7" w:tentative="1">
-      <w:start w:val="1"/>
-      <w:numFmt w:val="bullet"/>
-      <w:lvlText w:val=""/>
-      <w:lvlJc w:val="left"/>
-      <w:pPr>
-        <w:tabs>
-          <w:tab w:val="num" w:pos="5760"/>
-        </w:tabs>
-        <w:ind w:left="5760" w:hanging="360"/>
-      </w:pPr>
-      <w:rPr>
-        <w:rFonts w:ascii="Wingdings" w:hAnsi="Wingdings" w:hint="default"/>
-        <w:sz w:val="20"/>
-      </w:rPr>
-    </w:lvl>
-    <w:lvl w:ilvl="8" w:tentative="1">
-      <w:start w:val="1"/>
-      <w:numFmt w:val="bullet"/>
-      <w:lvlText w:val=""/>
-      <w:lvlJc w:val="left"/>
-      <w:pPr>
-        <w:tabs>
-          <w:tab w:val="num" w:pos="6480"/>
-        </w:tabs>
-        <w:ind w:left="6480" w:hanging="360"/>
-      </w:pPr>
-      <w:rPr>
-        <w:rFonts w:ascii="Wingdings" w:hAnsi="Wingdings" w:hint="default"/>
-        <w:sz w:val="20"/>
-      </w:rPr>
-    </w:lvl>
-  </w:abstractNum>
-  <w:abstractNum w:abstractNumId="13" w15:restartNumberingAfterBreak="0">
+  <w:abstractNum w:abstractNumId="9" w15:restartNumberingAfterBreak="0">
     <w:nsid w:val="28016436"/>
     <w:multiLevelType w:val="hybridMultilevel"/>
     <w:tmpl w:val="87D0CED6"/>
@@ -5542,7 +4334,7 @@
       </w:rPr>
     </w:lvl>
   </w:abstractNum>
-  <w:abstractNum w:abstractNumId="14" w15:restartNumberingAfterBreak="0">
+  <w:abstractNum w:abstractNumId="10" w15:restartNumberingAfterBreak="0">
     <w:nsid w:val="319D15EA"/>
     <w:multiLevelType w:val="hybridMultilevel"/>
     <w:tmpl w:val="BE78A338"/>
@@ -5655,7 +4447,7 @@
       </w:rPr>
     </w:lvl>
   </w:abstractNum>
-  <w:abstractNum w:abstractNumId="15" w15:restartNumberingAfterBreak="0">
+  <w:abstractNum w:abstractNumId="11" w15:restartNumberingAfterBreak="0">
     <w:nsid w:val="34E60CD4"/>
     <w:multiLevelType w:val="hybridMultilevel"/>
     <w:tmpl w:val="BB64676E"/>
@@ -5768,7 +4560,7 @@
       </w:rPr>
     </w:lvl>
   </w:abstractNum>
-  <w:abstractNum w:abstractNumId="16" w15:restartNumberingAfterBreak="0">
+  <w:abstractNum w:abstractNumId="12" w15:restartNumberingAfterBreak="0">
     <w:nsid w:val="365E72FC"/>
     <w:multiLevelType w:val="multilevel"/>
     <w:tmpl w:val="1542E52E"/>
@@ -5881,156 +4673,7 @@
       </w:pPr>
     </w:lvl>
   </w:abstractNum>
-  <w:abstractNum w:abstractNumId="17" w15:restartNumberingAfterBreak="0">
-    <w:nsid w:val="37BD1C99"/>
-    <w:multiLevelType w:val="multilevel"/>
-    <w:tmpl w:val="90F8EF64"/>
-    <w:lvl w:ilvl="0">
-      <w:start w:val="1"/>
-      <w:numFmt w:val="bullet"/>
-      <w:lvlText w:val=""/>
-      <w:lvlJc w:val="left"/>
-      <w:pPr>
-        <w:tabs>
-          <w:tab w:val="num" w:pos="720"/>
-        </w:tabs>
-        <w:ind w:left="720" w:hanging="360"/>
-      </w:pPr>
-      <w:rPr>
-        <w:rFonts w:ascii="Symbol" w:hAnsi="Symbol" w:hint="default"/>
-        <w:sz w:val="20"/>
-      </w:rPr>
-    </w:lvl>
-    <w:lvl w:ilvl="1" w:tentative="1">
-      <w:start w:val="1"/>
-      <w:numFmt w:val="bullet"/>
-      <w:lvlText w:val="o"/>
-      <w:lvlJc w:val="left"/>
-      <w:pPr>
-        <w:tabs>
-          <w:tab w:val="num" w:pos="1440"/>
-        </w:tabs>
-        <w:ind w:left="1440" w:hanging="360"/>
-      </w:pPr>
-      <w:rPr>
-        <w:rFonts w:ascii="Courier New" w:hAnsi="Courier New" w:hint="default"/>
-        <w:sz w:val="20"/>
-      </w:rPr>
-    </w:lvl>
-    <w:lvl w:ilvl="2" w:tentative="1">
-      <w:start w:val="1"/>
-      <w:numFmt w:val="bullet"/>
-      <w:lvlText w:val=""/>
-      <w:lvlJc w:val="left"/>
-      <w:pPr>
-        <w:tabs>
-          <w:tab w:val="num" w:pos="2160"/>
-        </w:tabs>
-        <w:ind w:left="2160" w:hanging="360"/>
-      </w:pPr>
-      <w:rPr>
-        <w:rFonts w:ascii="Wingdings" w:hAnsi="Wingdings" w:hint="default"/>
-        <w:sz w:val="20"/>
-      </w:rPr>
-    </w:lvl>
-    <w:lvl w:ilvl="3" w:tentative="1">
-      <w:start w:val="1"/>
-      <w:numFmt w:val="bullet"/>
-      <w:lvlText w:val=""/>
-      <w:lvlJc w:val="left"/>
-      <w:pPr>
-        <w:tabs>
-          <w:tab w:val="num" w:pos="2880"/>
-        </w:tabs>
-        <w:ind w:left="2880" w:hanging="360"/>
-      </w:pPr>
-      <w:rPr>
-        <w:rFonts w:ascii="Wingdings" w:hAnsi="Wingdings" w:hint="default"/>
-        <w:sz w:val="20"/>
-      </w:rPr>
-    </w:lvl>
-    <w:lvl w:ilvl="4" w:tentative="1">
-      <w:start w:val="1"/>
-      <w:numFmt w:val="bullet"/>
-      <w:lvlText w:val=""/>
-      <w:lvlJc w:val="left"/>
-      <w:pPr>
-        <w:tabs>
-          <w:tab w:val="num" w:pos="3600"/>
-        </w:tabs>
-        <w:ind w:left="3600" w:hanging="360"/>
-      </w:pPr>
-      <w:rPr>
-        <w:rFonts w:ascii="Wingdings" w:hAnsi="Wingdings" w:hint="default"/>
-        <w:sz w:val="20"/>
-      </w:rPr>
-    </w:lvl>
-    <w:lvl w:ilvl="5" w:tentative="1">
-      <w:start w:val="1"/>
-      <w:numFmt w:val="bullet"/>
-      <w:lvlText w:val=""/>
-      <w:lvlJc w:val="left"/>
-      <w:pPr>
-        <w:tabs>
-          <w:tab w:val="num" w:pos="4320"/>
-        </w:tabs>
-        <w:ind w:left="4320" w:hanging="360"/>
-      </w:pPr>
-      <w:rPr>
-        <w:rFonts w:ascii="Wingdings" w:hAnsi="Wingdings" w:hint="default"/>
-        <w:sz w:val="20"/>
-      </w:rPr>
-    </w:lvl>
-    <w:lvl w:ilvl="6" w:tentative="1">
-      <w:start w:val="1"/>
-      <w:numFmt w:val="bullet"/>
-      <w:lvlText w:val=""/>
-      <w:lvlJc w:val="left"/>
-      <w:pPr>
-        <w:tabs>
-          <w:tab w:val="num" w:pos="5040"/>
-        </w:tabs>
-        <w:ind w:left="5040" w:hanging="360"/>
-      </w:pPr>
-      <w:rPr>
-        <w:rFonts w:ascii="Wingdings" w:hAnsi="Wingdings" w:hint="default"/>
-        <w:sz w:val="20"/>
-      </w:rPr>
-    </w:lvl>
-    <w:lvl w:ilvl="7" w:tentative="1">
-      <w:start w:val="1"/>
-      <w:numFmt w:val="bullet"/>
-      <w:lvlText w:val=""/>
-      <w:lvlJc w:val="left"/>
-      <w:pPr>
-        <w:tabs>
-          <w:tab w:val="num" w:pos="5760"/>
-        </w:tabs>
-        <w:ind w:left="5760" w:hanging="360"/>
-      </w:pPr>
-      <w:rPr>
-        <w:rFonts w:ascii="Wingdings" w:hAnsi="Wingdings" w:hint="default"/>
-        <w:sz w:val="20"/>
-      </w:rPr>
-    </w:lvl>
-    <w:lvl w:ilvl="8" w:tentative="1">
-      <w:start w:val="1"/>
-      <w:numFmt w:val="bullet"/>
-      <w:lvlText w:val=""/>
-      <w:lvlJc w:val="left"/>
-      <w:pPr>
-        <w:tabs>
-          <w:tab w:val="num" w:pos="6480"/>
-        </w:tabs>
-        <w:ind w:left="6480" w:hanging="360"/>
-      </w:pPr>
-      <w:rPr>
-        <w:rFonts w:ascii="Wingdings" w:hAnsi="Wingdings" w:hint="default"/>
-        <w:sz w:val="20"/>
-      </w:rPr>
-    </w:lvl>
-  </w:abstractNum>
-  <w:abstractNum w:abstractNumId="18" w15:restartNumberingAfterBreak="0">
+  <w:abstractNum w:abstractNumId="13" w15:restartNumberingAfterBreak="0">
     <w:nsid w:val="37BF4FAA"/>
     <w:multiLevelType w:val="hybridMultilevel"/>
     <w:tmpl w:val="F71C8916"/>
@@ -6116,7 +4759,7 @@
       </w:pPr>
     </w:lvl>
   </w:abstractNum>
-  <w:abstractNum w:abstractNumId="19" w15:restartNumberingAfterBreak="0">
+  <w:abstractNum w:abstractNumId="14" w15:restartNumberingAfterBreak="0">
     <w:nsid w:val="3B4207A2"/>
     <w:multiLevelType w:val="multilevel"/>
     <w:tmpl w:val="04521ACC"/>
@@ -6265,7 +4908,7 @@
       </w:rPr>
     </w:lvl>
   </w:abstractNum>
-  <w:abstractNum w:abstractNumId="20" w15:restartNumberingAfterBreak="0">
+  <w:abstractNum w:abstractNumId="15" w15:restartNumberingAfterBreak="0">
     <w:nsid w:val="3CF834AF"/>
     <w:multiLevelType w:val="multilevel"/>
     <w:tmpl w:val="A7E0AE34"/>
@@ -6381,7 +5024,7 @@
       </w:pPr>
     </w:lvl>
   </w:abstractNum>
-  <w:abstractNum w:abstractNumId="21" w15:restartNumberingAfterBreak="0">
+  <w:abstractNum w:abstractNumId="16" w15:restartNumberingAfterBreak="0">
     <w:nsid w:val="3CFD72A3"/>
     <w:multiLevelType w:val="multilevel"/>
     <w:tmpl w:val="75EAFADE"/>
@@ -6494,7 +5137,7 @@
       </w:pPr>
     </w:lvl>
   </w:abstractNum>
-  <w:abstractNum w:abstractNumId="22" w15:restartNumberingAfterBreak="0">
+  <w:abstractNum w:abstractNumId="17" w15:restartNumberingAfterBreak="0">
     <w:nsid w:val="403F0003"/>
     <w:multiLevelType w:val="multilevel"/>
     <w:tmpl w:val="42668D3C"/>
@@ -6607,7 +5250,7 @@
       </w:pPr>
     </w:lvl>
   </w:abstractNum>
-  <w:abstractNum w:abstractNumId="23" w15:restartNumberingAfterBreak="0">
+  <w:abstractNum w:abstractNumId="18" w15:restartNumberingAfterBreak="0">
     <w:nsid w:val="425C02AD"/>
     <w:multiLevelType w:val="multilevel"/>
     <w:tmpl w:val="C38410E2"/>
@@ -6756,7 +5399,7 @@
       </w:rPr>
     </w:lvl>
   </w:abstractNum>
-  <w:abstractNum w:abstractNumId="24" w15:restartNumberingAfterBreak="0">
+  <w:abstractNum w:abstractNumId="19" w15:restartNumberingAfterBreak="0">
     <w:nsid w:val="427A018E"/>
     <w:multiLevelType w:val="multilevel"/>
     <w:tmpl w:val="9E3A91FA"/>
@@ -6905,7 +5548,7 @@
       </w:rPr>
     </w:lvl>
   </w:abstractNum>
-  <w:abstractNum w:abstractNumId="25" w15:restartNumberingAfterBreak="0">
+  <w:abstractNum w:abstractNumId="20" w15:restartNumberingAfterBreak="0">
     <w:nsid w:val="446525E2"/>
     <w:multiLevelType w:val="multilevel"/>
     <w:tmpl w:val="0DB42DFE"/>
@@ -7054,7 +5697,7 @@
       </w:rPr>
     </w:lvl>
   </w:abstractNum>
-  <w:abstractNum w:abstractNumId="26" w15:restartNumberingAfterBreak="0">
+  <w:abstractNum w:abstractNumId="21" w15:restartNumberingAfterBreak="0">
     <w:nsid w:val="45010147"/>
     <w:multiLevelType w:val="multilevel"/>
     <w:tmpl w:val="6E8C85EC"/>
@@ -7203,7 +5846,7 @@
       </w:rPr>
     </w:lvl>
   </w:abstractNum>
-  <w:abstractNum w:abstractNumId="27" w15:restartNumberingAfterBreak="0">
+  <w:abstractNum w:abstractNumId="22" w15:restartNumberingAfterBreak="0">
     <w:nsid w:val="45080D54"/>
     <w:multiLevelType w:val="hybridMultilevel"/>
     <w:tmpl w:val="8E1C6494"/>
@@ -7315,7 +5958,7 @@
       </w:rPr>
     </w:lvl>
   </w:abstractNum>
-  <w:abstractNum w:abstractNumId="28" w15:restartNumberingAfterBreak="0">
+  <w:abstractNum w:abstractNumId="23" w15:restartNumberingAfterBreak="0">
     <w:nsid w:val="4F954287"/>
     <w:multiLevelType w:val="multilevel"/>
     <w:tmpl w:val="CAD4B820"/>
@@ -7464,7 +6107,7 @@
       </w:rPr>
     </w:lvl>
   </w:abstractNum>
-  <w:abstractNum w:abstractNumId="29" w15:restartNumberingAfterBreak="0">
+  <w:abstractNum w:abstractNumId="24" w15:restartNumberingAfterBreak="0">
     <w:nsid w:val="5A94397A"/>
     <w:multiLevelType w:val="multilevel"/>
     <w:tmpl w:val="683882F8"/>
@@ -7613,7 +6256,7 @@
       </w:rPr>
     </w:lvl>
   </w:abstractNum>
-  <w:abstractNum w:abstractNumId="30" w15:restartNumberingAfterBreak="0">
+  <w:abstractNum w:abstractNumId="25" w15:restartNumberingAfterBreak="0">
     <w:nsid w:val="5BD721F0"/>
     <w:multiLevelType w:val="multilevel"/>
     <w:tmpl w:val="33F809F0"/>
@@ -7762,156 +6405,7 @@
       </w:rPr>
     </w:lvl>
   </w:abstractNum>
-  <w:abstractNum w:abstractNumId="31" w15:restartNumberingAfterBreak="0">
-    <w:nsid w:val="5BE36AB3"/>
-    <w:multiLevelType w:val="multilevel"/>
-    <w:tmpl w:val="309E84D2"/>
-    <w:lvl w:ilvl="0">
-      <w:start w:val="1"/>
-      <w:numFmt w:val="bullet"/>
-      <w:lvlText w:val=""/>
-      <w:lvlJc w:val="left"/>
-      <w:pPr>
-        <w:tabs>
-          <w:tab w:val="num" w:pos="720"/>
-        </w:tabs>
-        <w:ind w:left="720" w:hanging="360"/>
-      </w:pPr>
-      <w:rPr>
-        <w:rFonts w:ascii="Symbol" w:hAnsi="Symbol" w:hint="default"/>
-        <w:sz w:val="20"/>
-      </w:rPr>
-    </w:lvl>
-    <w:lvl w:ilvl="1" w:tentative="1">
-      <w:start w:val="1"/>
-      <w:numFmt w:val="bullet"/>
-      <w:lvlText w:val="o"/>
-      <w:lvlJc w:val="left"/>
-      <w:pPr>
-        <w:tabs>
-          <w:tab w:val="num" w:pos="1440"/>
-        </w:tabs>
-        <w:ind w:left="1440" w:hanging="360"/>
-      </w:pPr>
-      <w:rPr>
-        <w:rFonts w:ascii="Courier New" w:hAnsi="Courier New" w:hint="default"/>
-        <w:sz w:val="20"/>
-      </w:rPr>
-    </w:lvl>
-    <w:lvl w:ilvl="2" w:tentative="1">
-      <w:start w:val="1"/>
-      <w:numFmt w:val="bullet"/>
-      <w:lvlText w:val=""/>
-      <w:lvlJc w:val="left"/>
-      <w:pPr>
-        <w:tabs>
-          <w:tab w:val="num" w:pos="2160"/>
-        </w:tabs>
-        <w:ind w:left="2160" w:hanging="360"/>
-      </w:pPr>
-      <w:rPr>
-        <w:rFonts w:ascii="Wingdings" w:hAnsi="Wingdings" w:hint="default"/>
-        <w:sz w:val="20"/>
-      </w:rPr>
-    </w:lvl>
-    <w:lvl w:ilvl="3" w:tentative="1">
-      <w:start w:val="1"/>
-      <w:numFmt w:val="bullet"/>
-      <w:lvlText w:val=""/>
-      <w:lvlJc w:val="left"/>
-      <w:pPr>
-        <w:tabs>
-          <w:tab w:val="num" w:pos="2880"/>
-        </w:tabs>
-        <w:ind w:left="2880" w:hanging="360"/>
-      </w:pPr>
-      <w:rPr>
-        <w:rFonts w:ascii="Wingdings" w:hAnsi="Wingdings" w:hint="default"/>
-        <w:sz w:val="20"/>
-      </w:rPr>
-    </w:lvl>
-    <w:lvl w:ilvl="4" w:tentative="1">
-      <w:start w:val="1"/>
-      <w:numFmt w:val="bullet"/>
-      <w:lvlText w:val=""/>
-      <w:lvlJc w:val="left"/>
-      <w:pPr>
-        <w:tabs>
-          <w:tab w:val="num" w:pos="3600"/>
-        </w:tabs>
-        <w:ind w:left="3600" w:hanging="360"/>
-      </w:pPr>
-      <w:rPr>
-        <w:rFonts w:ascii="Wingdings" w:hAnsi="Wingdings" w:hint="default"/>
-        <w:sz w:val="20"/>
-      </w:rPr>
-    </w:lvl>
-    <w:lvl w:ilvl="5" w:tentative="1">
-      <w:start w:val="1"/>
-      <w:numFmt w:val="bullet"/>
-      <w:lvlText w:val=""/>
-      <w:lvlJc w:val="left"/>
-      <w:pPr>
-        <w:tabs>
-          <w:tab w:val="num" w:pos="4320"/>
-        </w:tabs>
-        <w:ind w:left="4320" w:hanging="360"/>
-      </w:pPr>
-      <w:rPr>
-        <w:rFonts w:ascii="Wingdings" w:hAnsi="Wingdings" w:hint="default"/>
-        <w:sz w:val="20"/>
-      </w:rPr>
-    </w:lvl>
-    <w:lvl w:ilvl="6" w:tentative="1">
-      <w:start w:val="1"/>
-      <w:numFmt w:val="bullet"/>
-      <w:lvlText w:val=""/>
-      <w:lvlJc w:val="left"/>
-      <w:pPr>
-        <w:tabs>
-          <w:tab w:val="num" w:pos="5040"/>
-        </w:tabs>
-        <w:ind w:left="5040" w:hanging="360"/>
-      </w:pPr>
-      <w:rPr>
-        <w:rFonts w:ascii="Wingdings" w:hAnsi="Wingdings" w:hint="default"/>
-        <w:sz w:val="20"/>
-      </w:rPr>
-    </w:lvl>
-    <w:lvl w:ilvl="7" w:tentative="1">
-      <w:start w:val="1"/>
-      <w:numFmt w:val="bullet"/>
-      <w:lvlText w:val=""/>
-      <w:lvlJc w:val="left"/>
-      <w:pPr>
-        <w:tabs>
-          <w:tab w:val="num" w:pos="5760"/>
-        </w:tabs>
-        <w:ind w:left="5760" w:hanging="360"/>
-      </w:pPr>
-      <w:rPr>
-        <w:rFonts w:ascii="Wingdings" w:hAnsi="Wingdings" w:hint="default"/>
-        <w:sz w:val="20"/>
-      </w:rPr>
-    </w:lvl>
-    <w:lvl w:ilvl="8" w:tentative="1">
-      <w:start w:val="1"/>
-      <w:numFmt w:val="bullet"/>
-      <w:lvlText w:val=""/>
-      <w:lvlJc w:val="left"/>
-      <w:pPr>
-        <w:tabs>
-          <w:tab w:val="num" w:pos="6480"/>
-        </w:tabs>
-        <w:ind w:left="6480" w:hanging="360"/>
-      </w:pPr>
-      <w:rPr>
-        <w:rFonts w:ascii="Wingdings" w:hAnsi="Wingdings" w:hint="default"/>
-        <w:sz w:val="20"/>
-      </w:rPr>
-    </w:lvl>
-  </w:abstractNum>
-  <w:abstractNum w:abstractNumId="32" w15:restartNumberingAfterBreak="0">
+  <w:abstractNum w:abstractNumId="26" w15:restartNumberingAfterBreak="0">
     <w:nsid w:val="5E4B3584"/>
     <w:multiLevelType w:val="hybridMultilevel"/>
     <w:tmpl w:val="B25CFA1C"/>
@@ -8024,7 +6518,7 @@
       </w:rPr>
     </w:lvl>
   </w:abstractNum>
-  <w:abstractNum w:abstractNumId="33" w15:restartNumberingAfterBreak="0">
+  <w:abstractNum w:abstractNumId="27" w15:restartNumberingAfterBreak="0">
     <w:nsid w:val="5F2E2D37"/>
     <w:multiLevelType w:val="multilevel"/>
     <w:tmpl w:val="889E9256"/>
@@ -8173,7 +6667,7 @@
       </w:rPr>
     </w:lvl>
   </w:abstractNum>
-  <w:abstractNum w:abstractNumId="34" w15:restartNumberingAfterBreak="0">
+  <w:abstractNum w:abstractNumId="28" w15:restartNumberingAfterBreak="0">
     <w:nsid w:val="604B5C22"/>
     <w:multiLevelType w:val="hybridMultilevel"/>
     <w:tmpl w:val="7AB6367C"/>
@@ -8286,7 +6780,7 @@
       </w:rPr>
     </w:lvl>
   </w:abstractNum>
-  <w:abstractNum w:abstractNumId="35" w15:restartNumberingAfterBreak="0">
+  <w:abstractNum w:abstractNumId="29" w15:restartNumberingAfterBreak="0">
     <w:nsid w:val="60586D04"/>
     <w:multiLevelType w:val="multilevel"/>
     <w:tmpl w:val="EB40BB90"/>
@@ -8435,7 +6929,7 @@
       </w:rPr>
     </w:lvl>
   </w:abstractNum>
-  <w:abstractNum w:abstractNumId="36" w15:restartNumberingAfterBreak="0">
+  <w:abstractNum w:abstractNumId="30" w15:restartNumberingAfterBreak="0">
     <w:nsid w:val="6611690C"/>
     <w:multiLevelType w:val="hybridMultilevel"/>
     <w:tmpl w:val="69D44F0A"/>
@@ -8548,7 +7042,7 @@
       </w:rPr>
     </w:lvl>
   </w:abstractNum>
-  <w:abstractNum w:abstractNumId="37" w15:restartNumberingAfterBreak="0">
+  <w:abstractNum w:abstractNumId="31" w15:restartNumberingAfterBreak="0">
     <w:nsid w:val="68280189"/>
     <w:multiLevelType w:val="hybridMultilevel"/>
     <w:tmpl w:val="16729304"/>
@@ -8661,7 +7155,7 @@
       </w:rPr>
     </w:lvl>
   </w:abstractNum>
-  <w:abstractNum w:abstractNumId="38" w15:restartNumberingAfterBreak="0">
+  <w:abstractNum w:abstractNumId="32" w15:restartNumberingAfterBreak="0">
     <w:nsid w:val="6BF2715A"/>
     <w:multiLevelType w:val="multilevel"/>
     <w:tmpl w:val="AEC42A86"/>
@@ -8774,7 +7268,7 @@
       </w:pPr>
     </w:lvl>
   </w:abstractNum>
-  <w:abstractNum w:abstractNumId="39" w15:restartNumberingAfterBreak="0">
+  <w:abstractNum w:abstractNumId="33" w15:restartNumberingAfterBreak="0">
     <w:nsid w:val="6C57047E"/>
     <w:multiLevelType w:val="multilevel"/>
     <w:tmpl w:val="19CAB288"/>
@@ -8923,7 +7417,7 @@
       </w:rPr>
     </w:lvl>
   </w:abstractNum>
-  <w:abstractNum w:abstractNumId="40" w15:restartNumberingAfterBreak="0">
+  <w:abstractNum w:abstractNumId="34" w15:restartNumberingAfterBreak="0">
     <w:nsid w:val="6C5828B1"/>
     <w:multiLevelType w:val="hybridMultilevel"/>
     <w:tmpl w:val="9BACA330"/>
@@ -9036,156 +7530,7 @@
       </w:rPr>
     </w:lvl>
   </w:abstractNum>
-  <w:abstractNum w:abstractNumId="41" w15:restartNumberingAfterBreak="0">
-    <w:nsid w:val="6EEB7D62"/>
-    <w:multiLevelType w:val="multilevel"/>
-    <w:tmpl w:val="FBF0E09E"/>
-    <w:lvl w:ilvl="0">
-      <w:start w:val="1"/>
-      <w:numFmt w:val="bullet"/>
-      <w:lvlText w:val=""/>
-      <w:lvlJc w:val="left"/>
-      <w:pPr>
-        <w:tabs>
-          <w:tab w:val="num" w:pos="720"/>
-        </w:tabs>
-        <w:ind w:left="720" w:hanging="360"/>
-      </w:pPr>
-      <w:rPr>
-        <w:rFonts w:ascii="Symbol" w:hAnsi="Symbol" w:hint="default"/>
-        <w:sz w:val="20"/>
-      </w:rPr>
-    </w:lvl>
-    <w:lvl w:ilvl="1" w:tentative="1">
-      <w:start w:val="1"/>
-      <w:numFmt w:val="bullet"/>
-      <w:lvlText w:val="o"/>
-      <w:lvlJc w:val="left"/>
-      <w:pPr>
-        <w:tabs>
-          <w:tab w:val="num" w:pos="1440"/>
-        </w:tabs>
-        <w:ind w:left="1440" w:hanging="360"/>
-      </w:pPr>
-      <w:rPr>
-        <w:rFonts w:ascii="Courier New" w:hAnsi="Courier New" w:hint="default"/>
-        <w:sz w:val="20"/>
-      </w:rPr>
-    </w:lvl>
-    <w:lvl w:ilvl="2" w:tentative="1">
-      <w:start w:val="1"/>
-      <w:numFmt w:val="bullet"/>
-      <w:lvlText w:val=""/>
-      <w:lvlJc w:val="left"/>
-      <w:pPr>
-        <w:tabs>
-          <w:tab w:val="num" w:pos="2160"/>
-        </w:tabs>
-        <w:ind w:left="2160" w:hanging="360"/>
-      </w:pPr>
-      <w:rPr>
-        <w:rFonts w:ascii="Wingdings" w:hAnsi="Wingdings" w:hint="default"/>
-        <w:sz w:val="20"/>
-      </w:rPr>
-    </w:lvl>
-    <w:lvl w:ilvl="3" w:tentative="1">
-      <w:start w:val="1"/>
-      <w:numFmt w:val="bullet"/>
-      <w:lvlText w:val=""/>
-      <w:lvlJc w:val="left"/>
-      <w:pPr>
-        <w:tabs>
-          <w:tab w:val="num" w:pos="2880"/>
-        </w:tabs>
-        <w:ind w:left="2880" w:hanging="360"/>
-      </w:pPr>
-      <w:rPr>
-        <w:rFonts w:ascii="Wingdings" w:hAnsi="Wingdings" w:hint="default"/>
-        <w:sz w:val="20"/>
-      </w:rPr>
-    </w:lvl>
-    <w:lvl w:ilvl="4" w:tentative="1">
-      <w:start w:val="1"/>
-      <w:numFmt w:val="bullet"/>
-      <w:lvlText w:val=""/>
-      <w:lvlJc w:val="left"/>
-      <w:pPr>
-        <w:tabs>
-          <w:tab w:val="num" w:pos="3600"/>
-        </w:tabs>
-        <w:ind w:left="3600" w:hanging="360"/>
-      </w:pPr>
-      <w:rPr>
-        <w:rFonts w:ascii="Wingdings" w:hAnsi="Wingdings" w:hint="default"/>
-        <w:sz w:val="20"/>
-      </w:rPr>
-    </w:lvl>
-    <w:lvl w:ilvl="5" w:tentative="1">
-      <w:start w:val="1"/>
-      <w:numFmt w:val="bullet"/>
-      <w:lvlText w:val=""/>
-      <w:lvlJc w:val="left"/>
-      <w:pPr>
-        <w:tabs>
-          <w:tab w:val="num" w:pos="4320"/>
-        </w:tabs>
-        <w:ind w:left="4320" w:hanging="360"/>
-      </w:pPr>
-      <w:rPr>
-        <w:rFonts w:ascii="Wingdings" w:hAnsi="Wingdings" w:hint="default"/>
-        <w:sz w:val="20"/>
-      </w:rPr>
-    </w:lvl>
-    <w:lvl w:ilvl="6" w:tentative="1">
-      <w:start w:val="1"/>
-      <w:numFmt w:val="bullet"/>
-      <w:lvlText w:val=""/>
-      <w:lvlJc w:val="left"/>
-      <w:pPr>
-        <w:tabs>
-          <w:tab w:val="num" w:pos="5040"/>
-        </w:tabs>
-        <w:ind w:left="5040" w:hanging="360"/>
-      </w:pPr>
-      <w:rPr>
-        <w:rFonts w:ascii="Wingdings" w:hAnsi="Wingdings" w:hint="default"/>
-        <w:sz w:val="20"/>
-      </w:rPr>
-    </w:lvl>
-    <w:lvl w:ilvl="7" w:tentative="1">
-      <w:start w:val="1"/>
-      <w:numFmt w:val="bullet"/>
-      <w:lvlText w:val=""/>
-      <w:lvlJc w:val="left"/>
-      <w:pPr>
-        <w:tabs>
-          <w:tab w:val="num" w:pos="5760"/>
-        </w:tabs>
-        <w:ind w:left="5760" w:hanging="360"/>
-      </w:pPr>
-      <w:rPr>
-        <w:rFonts w:ascii="Wingdings" w:hAnsi="Wingdings" w:hint="default"/>
-        <w:sz w:val="20"/>
-      </w:rPr>
-    </w:lvl>
-    <w:lvl w:ilvl="8" w:tentative="1">
-      <w:start w:val="1"/>
-      <w:numFmt w:val="bullet"/>
-      <w:lvlText w:val=""/>
-      <w:lvlJc w:val="left"/>
-      <w:pPr>
-        <w:tabs>
-          <w:tab w:val="num" w:pos="6480"/>
-        </w:tabs>
-        <w:ind w:left="6480" w:hanging="360"/>
-      </w:pPr>
-      <w:rPr>
-        <w:rFonts w:ascii="Wingdings" w:hAnsi="Wingdings" w:hint="default"/>
-        <w:sz w:val="20"/>
-      </w:rPr>
-    </w:lvl>
-  </w:abstractNum>
-  <w:abstractNum w:abstractNumId="42" w15:restartNumberingAfterBreak="0">
+  <w:abstractNum w:abstractNumId="35" w15:restartNumberingAfterBreak="0">
     <w:nsid w:val="78232C45"/>
     <w:multiLevelType w:val="multilevel"/>
     <w:tmpl w:val="2D767BA6"/>
@@ -9335,133 +7680,112 @@
     </w:lvl>
   </w:abstractNum>
   <w:num w:numId="1" w16cid:durableId="1321736607">
+    <w:abstractNumId w:val="27"/>
+  </w:num>
+  <w:num w:numId="2" w16cid:durableId="625114394">
+    <w:abstractNumId w:val="32"/>
+  </w:num>
+  <w:num w:numId="3" w16cid:durableId="1381630724">
+    <w:abstractNumId w:val="16"/>
+  </w:num>
+  <w:num w:numId="4" w16cid:durableId="2059165517">
+    <w:abstractNumId w:val="6"/>
+  </w:num>
+  <w:num w:numId="5" w16cid:durableId="1633635425">
+    <w:abstractNumId w:val="24"/>
+  </w:num>
+  <w:num w:numId="6" w16cid:durableId="599290019">
+    <w:abstractNumId w:val="19"/>
+  </w:num>
+  <w:num w:numId="7" w16cid:durableId="1796830026">
+    <w:abstractNumId w:val="20"/>
+  </w:num>
+  <w:num w:numId="8" w16cid:durableId="1326741634">
+    <w:abstractNumId w:val="4"/>
+  </w:num>
+  <w:num w:numId="9" w16cid:durableId="1363166206">
+    <w:abstractNumId w:val="18"/>
+  </w:num>
+  <w:num w:numId="10" w16cid:durableId="1937401181">
+    <w:abstractNumId w:val="12"/>
+  </w:num>
+  <w:num w:numId="11" w16cid:durableId="749353172">
+    <w:abstractNumId w:val="8"/>
+  </w:num>
+  <w:num w:numId="12" w16cid:durableId="1185050786">
+    <w:abstractNumId w:val="17"/>
+  </w:num>
+  <w:num w:numId="13" w16cid:durableId="1052778474">
     <w:abstractNumId w:val="33"/>
   </w:num>
-  <w:num w:numId="2" w16cid:durableId="625114394">
-    <w:abstractNumId w:val="38"/>
-  </w:num>
-  <w:num w:numId="3" w16cid:durableId="1381630724">
+  <w:num w:numId="14" w16cid:durableId="1444610805">
     <w:abstractNumId w:val="21"/>
   </w:num>
-  <w:num w:numId="4" w16cid:durableId="2059165517">
+  <w:num w:numId="15" w16cid:durableId="2022274900">
+    <w:abstractNumId w:val="2"/>
+  </w:num>
+  <w:num w:numId="16" w16cid:durableId="477117351">
+    <w:abstractNumId w:val="35"/>
+  </w:num>
+  <w:num w:numId="17" w16cid:durableId="774133789">
+    <w:abstractNumId w:val="34"/>
+  </w:num>
+  <w:num w:numId="18" w16cid:durableId="863710042">
+    <w:abstractNumId w:val="29"/>
+  </w:num>
+  <w:num w:numId="19" w16cid:durableId="848759498">
+    <w:abstractNumId w:val="22"/>
+  </w:num>
+  <w:num w:numId="20" w16cid:durableId="256136027">
+    <w:abstractNumId w:val="30"/>
+  </w:num>
+  <w:num w:numId="21" w16cid:durableId="1321152853">
+    <w:abstractNumId w:val="5"/>
+  </w:num>
+  <w:num w:numId="22" w16cid:durableId="1606688578">
+    <w:abstractNumId w:val="23"/>
+  </w:num>
+  <w:num w:numId="23" w16cid:durableId="825363275">
+    <w:abstractNumId w:val="31"/>
+  </w:num>
+  <w:num w:numId="24" w16cid:durableId="102507273">
+    <w:abstractNumId w:val="26"/>
+  </w:num>
+  <w:num w:numId="25" w16cid:durableId="492448751">
     <w:abstractNumId w:val="9"/>
   </w:num>
-  <w:num w:numId="5" w16cid:durableId="1633635425">
-    <w:abstractNumId w:val="29"/>
+  <w:num w:numId="26" w16cid:durableId="589781610">
+    <w:abstractNumId w:val="10"/>
   </w:num>
-  <w:num w:numId="6" w16cid:durableId="599290019">
-    <w:abstractNumId w:val="24"/>
-  </w:num>
-  <w:num w:numId="7" w16cid:durableId="1796830026">
+  <w:num w:numId="27" w16cid:durableId="1498766288">
     <w:abstractNumId w:val="25"/>
   </w:num>
-  <w:num w:numId="8" w16cid:durableId="1326741634">
-    <w:abstractNumId w:val="6"/>
+  <w:num w:numId="28" w16cid:durableId="1993949154">
+    <w:abstractNumId w:val="28"/>
   </w:num>
-  <w:num w:numId="9" w16cid:durableId="1363166206">
-    <w:abstractNumId w:val="23"/>
+  <w:num w:numId="29" w16cid:durableId="223876754">
+    <w:abstractNumId w:val="13"/>
   </w:num>
-  <w:num w:numId="10" w16cid:durableId="1937401181">
-    <w:abstractNumId w:val="16"/>
+  <w:num w:numId="30" w16cid:durableId="2143112037">
+    <w:abstractNumId w:val="1"/>
   </w:num>
-  <w:num w:numId="11" w16cid:durableId="749353172">
-    <w:abstractNumId w:val="11"/>
+  <w:num w:numId="31" w16cid:durableId="10571087">
+    <w:abstractNumId w:val="15"/>
   </w:num>
-  <w:num w:numId="12" w16cid:durableId="1185050786">
-    <w:abstractNumId w:val="22"/>
-  </w:num>
-  <w:num w:numId="13" w16cid:durableId="1052778474">
-    <w:abstractNumId w:val="39"/>
-  </w:num>
-  <w:num w:numId="14" w16cid:durableId="1444610805">
-    <w:abstractNumId w:val="26"/>
-  </w:num>
-  <w:num w:numId="15" w16cid:durableId="2022274900">
-    <w:abstractNumId w:val="3"/>
-  </w:num>
-  <w:num w:numId="16" w16cid:durableId="477117351">
-    <w:abstractNumId w:val="42"/>
-  </w:num>
-  <w:num w:numId="17" w16cid:durableId="774133789">
-    <w:abstractNumId w:val="40"/>
-  </w:num>
-  <w:num w:numId="18" w16cid:durableId="863710042">
-    <w:abstractNumId w:val="35"/>
-  </w:num>
-  <w:num w:numId="19" w16cid:durableId="848759498">
-    <w:abstractNumId w:val="27"/>
-  </w:num>
-  <w:num w:numId="20" w16cid:durableId="256136027">
-    <w:abstractNumId w:val="36"/>
-  </w:num>
-  <w:num w:numId="21" w16cid:durableId="1321152853">
+  <w:num w:numId="32" w16cid:durableId="9377709">
     <w:abstractNumId w:val="7"/>
   </w:num>
-  <w:num w:numId="22" w16cid:durableId="1606688578">
-    <w:abstractNumId w:val="28"/>
-  </w:num>
-  <w:num w:numId="23" w16cid:durableId="825363275">
-    <w:abstractNumId w:val="37"/>
-  </w:num>
-  <w:num w:numId="24" w16cid:durableId="102507273">
-    <w:abstractNumId w:val="32"/>
-  </w:num>
-  <w:num w:numId="25" w16cid:durableId="492448751">
-    <w:abstractNumId w:val="13"/>
-  </w:num>
-  <w:num w:numId="26" w16cid:durableId="589781610">
+  <w:num w:numId="33" w16cid:durableId="646671560">
     <w:abstractNumId w:val="14"/>
   </w:num>
-  <w:num w:numId="27" w16cid:durableId="1498766288">
-    <w:abstractNumId w:val="30"/>
-  </w:num>
-  <w:num w:numId="28" w16cid:durableId="1993949154">
-    <w:abstractNumId w:val="34"/>
-  </w:num>
-  <w:num w:numId="29" w16cid:durableId="223876754">
-    <w:abstractNumId w:val="18"/>
-  </w:num>
-  <w:num w:numId="30" w16cid:durableId="2143112037">
-    <w:abstractNumId w:val="2"/>
-  </w:num>
-  <w:num w:numId="31" w16cid:durableId="10571087">
-    <w:abstractNumId w:val="20"/>
-  </w:num>
-  <w:num w:numId="32" w16cid:durableId="9377709">
-    <w:abstractNumId w:val="10"/>
-  </w:num>
-  <w:num w:numId="33" w16cid:durableId="646671560">
-    <w:abstractNumId w:val="19"/>
-  </w:num>
   <w:num w:numId="34" w16cid:durableId="1414274697">
-    <w:abstractNumId w:val="5"/>
+    <w:abstractNumId w:val="3"/>
   </w:num>
   <w:num w:numId="35" w16cid:durableId="513808684">
     <w:abstractNumId w:val="0"/>
   </w:num>
   <w:num w:numId="36" w16cid:durableId="1545633091">
-    <w:abstractNumId w:val="15"/>
-  </w:num>
-  <w:num w:numId="37" w16cid:durableId="85224961">
-    <w:abstractNumId w:val="31"/>
-  </w:num>
-  <w:num w:numId="38" w16cid:durableId="1580021860">
-    <w:abstractNumId w:val="41"/>
-  </w:num>
-  <w:num w:numId="39" w16cid:durableId="1608852785">
-    <w:abstractNumId w:val="1"/>
-  </w:num>
-  <w:num w:numId="40" w16cid:durableId="448203429">
-    <w:abstractNumId w:val="8"/>
-  </w:num>
-  <w:num w:numId="41" w16cid:durableId="1785078490">
-    <w:abstractNumId w:val="4"/>
-  </w:num>
-  <w:num w:numId="42" w16cid:durableId="1209030045">
-    <w:abstractNumId w:val="17"/>
-  </w:num>
-  <w:num w:numId="43" w16cid:durableId="471943976">
-    <w:abstractNumId w:val="12"/>
+    <w:abstractNumId w:val="11"/>
   </w:num>
   <w:numIdMacAtCleanup w:val="16"/>
 </w:numbering>
@@ -9948,6 +8272,7 @@
   <w:style w:type="character" w:default="1" w:styleId="Fuentedeprrafopredeter">
     <w:name w:val="Default Paragraph Font"/>
     <w:uiPriority w:val="1"/>
+    <w:semiHidden/>
     <w:unhideWhenUsed/>
   </w:style>
   <w:style w:type="table" w:default="1" w:styleId="Tablanormal">

</xml_diff>

<commit_message>
Restaurar proyecto Elizabeth cde0bf1
</commit_message>
<xml_diff>
--- a/Guía_actividad.docx
+++ b/Guía_actividad.docx
@@ -1,6 +1,6 @@
 
 <file path=word/document.xml><?xml version="1.0" encoding="utf-8"?>
-<w:document xmlns:wpc="http://schemas.microsoft.com/office/word/2010/wordprocessingCanvas" xmlns:cx="http://schemas.microsoft.com/office/drawing/2014/chartex" xmlns:mc="http://schemas.openxmlformats.org/markup-compatibility/2006" xmlns:o="urn:schemas-microsoft-com:office:office" xmlns:r="http://schemas.openxmlformats.org/officeDocument/2006/relationships" xmlns:m="http://schemas.openxmlformats.org/officeDocument/2006/math" xmlns:v="urn:schemas-microsoft-com:vml" xmlns:wp14="http://schemas.microsoft.com/office/word/2010/wordprocessingDrawing" xmlns:wp="http://schemas.openxmlformats.org/drawingml/2006/wordprocessingDrawing" xmlns:w10="urn:schemas-microsoft-com:office:word" xmlns:w="http://schemas.openxmlformats.org/wordprocessingml/2006/main" xmlns:w14="http://schemas.microsoft.com/office/word/2010/wordml" xmlns:w15="http://schemas.microsoft.com/office/word/2012/wordml" xmlns:w16se="http://schemas.microsoft.com/office/word/2015/wordml/symex" xmlns:wpg="http://schemas.microsoft.com/office/word/2010/wordprocessingGroup" xmlns:wpi="http://schemas.microsoft.com/office/word/2010/wordprocessingInk" xmlns:wne="http://schemas.microsoft.com/office/word/2006/wordml" xmlns:wps="http://schemas.microsoft.com/office/word/2010/wordprocessingShape" mc:Ignorable="w14 w15 w16se wp14">
+<w:document xmlns:wpc="http://schemas.microsoft.com/office/word/2010/wordprocessingCanvas" xmlns:cx="http://schemas.microsoft.com/office/drawing/2014/chartex" xmlns:cx1="http://schemas.microsoft.com/office/drawing/2015/9/8/chartex" xmlns:cx2="http://schemas.microsoft.com/office/drawing/2015/10/21/chartex" xmlns:cx3="http://schemas.microsoft.com/office/drawing/2016/5/9/chartex" xmlns:cx4="http://schemas.microsoft.com/office/drawing/2016/5/10/chartex" xmlns:cx5="http://schemas.microsoft.com/office/drawing/2016/5/11/chartex" xmlns:cx6="http://schemas.microsoft.com/office/drawing/2016/5/12/chartex" xmlns:cx7="http://schemas.microsoft.com/office/drawing/2016/5/13/chartex" xmlns:cx8="http://schemas.microsoft.com/office/drawing/2016/5/14/chartex" xmlns:mc="http://schemas.openxmlformats.org/markup-compatibility/2006" xmlns:aink="http://schemas.microsoft.com/office/drawing/2016/ink" xmlns:am3d="http://schemas.microsoft.com/office/drawing/2017/model3d" xmlns:o="urn:schemas-microsoft-com:office:office" xmlns:oel="http://schemas.microsoft.com/office/2019/extlst" xmlns:r="http://schemas.openxmlformats.org/officeDocument/2006/relationships" xmlns:m="http://schemas.openxmlformats.org/officeDocument/2006/math" xmlns:v="urn:schemas-microsoft-com:vml" xmlns:wp14="http://schemas.microsoft.com/office/word/2010/wordprocessingDrawing" xmlns:wp="http://schemas.openxmlformats.org/drawingml/2006/wordprocessingDrawing" xmlns:w10="urn:schemas-microsoft-com:office:word" xmlns:w="http://schemas.openxmlformats.org/wordprocessingml/2006/main" xmlns:w14="http://schemas.microsoft.com/office/word/2010/wordml" xmlns:w15="http://schemas.microsoft.com/office/word/2012/wordml" xmlns:w16cex="http://schemas.microsoft.com/office/word/2018/wordml/cex" xmlns:w16cid="http://schemas.microsoft.com/office/word/2016/wordml/cid" xmlns:w16="http://schemas.microsoft.com/office/word/2018/wordml" xmlns:w16du="http://schemas.microsoft.com/office/word/2023/wordml/word16du" xmlns:w16sdtdh="http://schemas.microsoft.com/office/word/2020/wordml/sdtdatahash" xmlns:w16sdtfl="http://schemas.microsoft.com/office/word/2024/wordml/sdtformatlock" xmlns:w16se="http://schemas.microsoft.com/office/word/2015/wordml/symex" xmlns:wpg="http://schemas.microsoft.com/office/word/2010/wordprocessingGroup" xmlns:wpi="http://schemas.microsoft.com/office/word/2010/wordprocessingInk" xmlns:wne="http://schemas.microsoft.com/office/word/2006/wordml" xmlns:wps="http://schemas.microsoft.com/office/word/2010/wordprocessingShape" mc:Ignorable="w14 w15 w16se w16cid w16 w16cex w16sdtdh w16sdtfl w16du wp14">
   <w:body>
     <w:p>
       <w:pPr>
@@ -1167,16 +1167,12 @@
         </w:rPr>
         <w:t>Notificación al usuario el estado de su turno</w:t>
       </w:r>
-    </w:p>
-    <w:p>
-      <w:pPr>
-        <w:pStyle w:val="NormalWeb"/>
-        <w:ind w:left="1440"/>
-        <w:jc w:val="both"/>
-        <w:rPr>
-          <w:rFonts w:ascii="Arial" w:hAnsi="Arial" w:cs="Arial"/>
-        </w:rPr>
-      </w:pPr>
+      <w:r>
+        <w:rPr>
+          <w:rFonts w:ascii="Arial" w:hAnsi="Arial" w:cs="Arial"/>
+        </w:rPr>
+        <w:br/>
+      </w:r>
     </w:p>
     <w:p>
       <w:pPr>
@@ -1235,12 +1231,21 @@
     <w:p>
       <w:pPr>
         <w:pStyle w:val="NormalWeb"/>
-        <w:ind w:left="720"/>
-        <w:jc w:val="both"/>
-        <w:rPr>
-          <w:rFonts w:ascii="Arial" w:hAnsi="Arial" w:cs="Arial"/>
-        </w:rPr>
-      </w:pPr>
+        <w:numPr>
+          <w:ilvl w:val="1"/>
+          <w:numId w:val="19"/>
+        </w:numPr>
+        <w:jc w:val="both"/>
+        <w:rPr>
+          <w:rFonts w:ascii="Arial" w:hAnsi="Arial" w:cs="Arial"/>
+        </w:rPr>
+      </w:pPr>
+      <w:r>
+        <w:rPr>
+          <w:rFonts w:ascii="Arial" w:hAnsi="Arial" w:cs="Arial"/>
+        </w:rPr>
+        <w:t>El registro de un cliente no depende de que una ventanilla este libre.</w:t>
+      </w:r>
     </w:p>
     <w:p>
       <w:pPr>
@@ -1258,79 +1263,43 @@
         <w:rPr>
           <w:rFonts w:ascii="Arial" w:hAnsi="Arial" w:cs="Arial"/>
         </w:rPr>
-        <w:t>El registro de un cliente no depende de que una ventanilla este libre.</w:t>
+        <w:t>Una notificación puede reintentarse sin afectar la asignación de turnos.</w:t>
       </w:r>
     </w:p>
     <w:p>
       <w:pPr>
         <w:pStyle w:val="NormalWeb"/>
-        <w:numPr>
-          <w:ilvl w:val="1"/>
-          <w:numId w:val="19"/>
-        </w:numPr>
-        <w:jc w:val="both"/>
-        <w:rPr>
-          <w:rFonts w:ascii="Arial" w:hAnsi="Arial" w:cs="Arial"/>
-        </w:rPr>
-      </w:pPr>
-      <w:r>
-        <w:rPr>
-          <w:rFonts w:ascii="Arial" w:hAnsi="Arial" w:cs="Arial"/>
-        </w:rPr>
-        <w:t>Una notificación puede reintentarse sin afectar la asignación de turnos.</w:t>
-      </w:r>
-    </w:p>
-    <w:p>
-      <w:pPr>
-        <w:pStyle w:val="Ttulo1"/>
-        <w:jc w:val="both"/>
-        <w:rPr>
-          <w:rFonts w:ascii="Arial" w:hAnsi="Arial" w:cs="Arial"/>
-          <w:b/>
-          <w:bCs/>
-          <w:color w:val="auto"/>
-          <w:sz w:val="24"/>
-          <w:szCs w:val="24"/>
-        </w:rPr>
-      </w:pPr>
-      <w:r>
-        <w:rPr>
-          <w:rFonts w:ascii="Arial" w:hAnsi="Arial" w:cs="Arial"/>
-          <w:b/>
-          <w:bCs/>
-          <w:color w:val="auto"/>
-          <w:sz w:val="24"/>
-          <w:szCs w:val="24"/>
-        </w:rPr>
-        <w:t xml:space="preserve">PARTE 3 – </w:t>
-      </w:r>
-      <w:r>
-        <w:rPr>
-          <w:rFonts w:ascii="Arial" w:hAnsi="Arial" w:cs="Arial"/>
-          <w:b/>
-          <w:bCs/>
-          <w:color w:val="auto"/>
-          <w:sz w:val="24"/>
-          <w:szCs w:val="24"/>
-        </w:rPr>
-        <w:t>¿CÓMO SE COMUNICAN?</w:t>
-      </w:r>
-    </w:p>
-    <w:p>
-      <w:pPr>
-        <w:pStyle w:val="Ttulo2"/>
-        <w:jc w:val="both"/>
-        <w:rPr>
-          <w:rFonts w:ascii="Arial" w:hAnsi="Arial" w:cs="Arial"/>
-          <w:sz w:val="24"/>
-          <w:szCs w:val="24"/>
-        </w:rPr>
-      </w:pPr>
-      <w:r>
-        <w:rPr>
-          <w:rFonts w:ascii="Arial" w:hAnsi="Arial" w:cs="Arial"/>
-          <w:sz w:val="24"/>
-          <w:szCs w:val="24"/>
+        <w:jc w:val="both"/>
+        <w:rPr>
+          <w:rFonts w:ascii="Arial" w:hAnsi="Arial" w:cs="Arial"/>
+          <w:b/>
+          <w:bCs/>
+        </w:rPr>
+      </w:pPr>
+      <w:r>
+        <w:rPr>
+          <w:rFonts w:ascii="Arial" w:hAnsi="Arial" w:cs="Arial"/>
+          <w:b/>
+          <w:bCs/>
+        </w:rPr>
+        <w:t>PARTE 3 – ¿CÓMO SE COMUNICAN?</w:t>
+      </w:r>
+    </w:p>
+    <w:p>
+      <w:pPr>
+        <w:pStyle w:val="NormalWeb"/>
+        <w:jc w:val="both"/>
+        <w:rPr>
+          <w:rFonts w:ascii="Arial" w:hAnsi="Arial" w:cs="Arial"/>
+          <w:b/>
+          <w:bCs/>
+        </w:rPr>
+      </w:pPr>
+      <w:r>
+        <w:rPr>
+          <w:rFonts w:ascii="Arial" w:hAnsi="Arial" w:cs="Arial"/>
+          <w:b/>
+          <w:bCs/>
         </w:rPr>
         <w:t>Paso 3: Conexión entre servicios</w:t>
       </w:r>
@@ -1341,13 +1310,17 @@
         <w:jc w:val="both"/>
         <w:rPr>
           <w:rFonts w:ascii="Arial" w:hAnsi="Arial" w:cs="Arial"/>
-        </w:rPr>
-      </w:pPr>
-      <w:r>
-        <w:rPr>
-          <w:rFonts w:ascii="Arial" w:hAnsi="Arial" w:cs="Arial"/>
-        </w:rPr>
-        <w:t>Respondan:</w:t>
+          <w:b/>
+          <w:bCs/>
+        </w:rPr>
+      </w:pPr>
+      <w:r>
+        <w:rPr>
+          <w:rFonts w:ascii="Arial" w:hAnsi="Arial" w:cs="Arial"/>
+          <w:b/>
+          <w:bCs/>
+        </w:rPr>
+        <w:t>¿Qué servicio necesita información de otro?</w:t>
       </w:r>
     </w:p>
     <w:p>
@@ -1355,18 +1328,41 @@
         <w:pStyle w:val="NormalWeb"/>
         <w:numPr>
           <w:ilvl w:val="0"/>
-          <w:numId w:val="20"/>
+          <w:numId w:val="37"/>
         </w:numPr>
-        <w:jc w:val="both"/>
-        <w:rPr>
-          <w:rFonts w:ascii="Arial" w:hAnsi="Arial" w:cs="Arial"/>
-        </w:rPr>
-      </w:pPr>
-      <w:r>
-        <w:rPr>
-          <w:rFonts w:ascii="Arial" w:hAnsi="Arial" w:cs="Arial"/>
-        </w:rPr>
-        <w:t>¿Qué servicio necesita información de otro?</w:t>
+        <w:rPr>
+          <w:rFonts w:ascii="Arial" w:hAnsi="Arial" w:cs="Arial"/>
+          <w:b/>
+          <w:bCs/>
+        </w:rPr>
+      </w:pPr>
+      <w:r>
+        <w:rPr>
+          <w:rFonts w:ascii="Arial" w:hAnsi="Arial" w:cs="Arial"/>
+          <w:b/>
+          <w:bCs/>
+        </w:rPr>
+        <w:t xml:space="preserve">Turnos </w:t>
+      </w:r>
+      <w:r>
+        <w:rPr>
+          <w:rFonts w:ascii="Arial" w:hAnsi="Arial" w:cs="Arial"/>
+        </w:rPr>
+        <w:t xml:space="preserve">necesita información de </w:t>
+      </w:r>
+      <w:r>
+        <w:rPr>
+          <w:rFonts w:ascii="Arial" w:hAnsi="Arial" w:cs="Arial"/>
+          <w:b/>
+          <w:bCs/>
+        </w:rPr>
+        <w:t>Clientes</w:t>
+      </w:r>
+      <w:r>
+        <w:rPr>
+          <w:rFonts w:ascii="Arial" w:hAnsi="Arial" w:cs="Arial"/>
+        </w:rPr>
+        <w:t xml:space="preserve"> para identificar al cliente y registrar sus datos.</w:t>
       </w:r>
     </w:p>
     <w:p>
@@ -1374,18 +1370,41 @@
         <w:pStyle w:val="NormalWeb"/>
         <w:numPr>
           <w:ilvl w:val="0"/>
-          <w:numId w:val="20"/>
+          <w:numId w:val="37"/>
         </w:numPr>
-        <w:jc w:val="both"/>
-        <w:rPr>
-          <w:rFonts w:ascii="Arial" w:hAnsi="Arial" w:cs="Arial"/>
-        </w:rPr>
-      </w:pPr>
-      <w:r>
-        <w:rPr>
-          <w:rFonts w:ascii="Arial" w:hAnsi="Arial" w:cs="Arial"/>
-        </w:rPr>
-        <w:t>¿Quién solicita datos?</w:t>
+        <w:rPr>
+          <w:rFonts w:ascii="Arial" w:hAnsi="Arial" w:cs="Arial"/>
+          <w:b/>
+          <w:bCs/>
+        </w:rPr>
+      </w:pPr>
+      <w:r>
+        <w:rPr>
+          <w:rFonts w:ascii="Arial" w:hAnsi="Arial" w:cs="Arial"/>
+          <w:b/>
+          <w:bCs/>
+        </w:rPr>
+        <w:t xml:space="preserve">Turnos </w:t>
+      </w:r>
+      <w:r>
+        <w:rPr>
+          <w:rFonts w:ascii="Arial" w:hAnsi="Arial" w:cs="Arial"/>
+        </w:rPr>
+        <w:t xml:space="preserve">necesita información de </w:t>
+      </w:r>
+      <w:r>
+        <w:rPr>
+          <w:rFonts w:ascii="Arial" w:hAnsi="Arial" w:cs="Arial"/>
+          <w:b/>
+          <w:bCs/>
+        </w:rPr>
+        <w:t>Cajas</w:t>
+      </w:r>
+      <w:r>
+        <w:rPr>
+          <w:rFonts w:ascii="Arial" w:hAnsi="Arial" w:cs="Arial"/>
+        </w:rPr>
+        <w:t xml:space="preserve"> para saber qué caja está disponible.</w:t>
       </w:r>
     </w:p>
     <w:p>
@@ -1393,245 +1412,41 @@
         <w:pStyle w:val="NormalWeb"/>
         <w:numPr>
           <w:ilvl w:val="0"/>
-          <w:numId w:val="20"/>
+          <w:numId w:val="37"/>
         </w:numPr>
-        <w:jc w:val="both"/>
-        <w:rPr>
-          <w:rFonts w:ascii="Arial" w:hAnsi="Arial" w:cs="Arial"/>
-        </w:rPr>
-      </w:pPr>
-      <w:r>
-        <w:rPr>
-          <w:rFonts w:ascii="Arial" w:hAnsi="Arial" w:cs="Arial"/>
-        </w:rPr>
-        <w:t>¿Quién responde?</w:t>
-      </w:r>
-    </w:p>
-    <w:p>
-      <w:pPr>
-        <w:pStyle w:val="NormalWeb"/>
-        <w:jc w:val="both"/>
-        <w:rPr>
-          <w:rFonts w:ascii="Arial" w:hAnsi="Arial" w:cs="Arial"/>
-        </w:rPr>
-      </w:pPr>
-      <w:r>
-        <w:rPr>
-          <w:rFonts w:ascii="Arial" w:hAnsi="Arial" w:cs="Arial"/>
-        </w:rPr>
-        <w:t>Ejemplo:</w:t>
-      </w:r>
-    </w:p>
-    <w:p>
-      <w:pPr>
-        <w:pStyle w:val="NormalWeb"/>
-        <w:rPr>
-          <w:rFonts w:ascii="Arial" w:hAnsi="Arial" w:cs="Arial"/>
-        </w:rPr>
-      </w:pPr>
-      <w:r>
-        <w:rPr>
-          <w:rFonts w:ascii="Arial" w:hAnsi="Arial" w:cs="Arial"/>
-        </w:rPr>
-        <w:t>Pedidos → solicita → Inventario</w:t>
-      </w:r>
-      <w:r>
-        <w:rPr>
-          <w:rFonts w:ascii="Arial" w:hAnsi="Arial" w:cs="Arial"/>
-        </w:rPr>
-        <w:br/>
-        <w:t>Pagos → confirma → Pedidos</w:t>
-      </w:r>
-    </w:p>
-    <w:p>
-      <w:pPr>
-        <w:pStyle w:val="NormalWeb"/>
-        <w:jc w:val="both"/>
-        <w:rPr>
-          <w:rFonts w:ascii="Arial" w:hAnsi="Arial" w:cs="Arial"/>
-        </w:rPr>
-      </w:pPr>
-    </w:p>
-    <w:p>
-      <w:pPr>
-        <w:pStyle w:val="Ttulo1"/>
-        <w:jc w:val="both"/>
-        <w:rPr>
-          <w:rFonts w:ascii="Arial" w:hAnsi="Arial" w:cs="Arial"/>
-          <w:b/>
-          <w:bCs/>
-          <w:color w:val="auto"/>
-          <w:sz w:val="24"/>
-          <w:szCs w:val="24"/>
-        </w:rPr>
-      </w:pPr>
-      <w:r>
-        <w:rPr>
-          <w:rFonts w:ascii="Arial" w:hAnsi="Arial" w:cs="Arial"/>
-          <w:b/>
-          <w:bCs/>
-          <w:color w:val="auto"/>
-          <w:sz w:val="24"/>
-          <w:szCs w:val="24"/>
-        </w:rPr>
-        <w:t xml:space="preserve">PARTE 4 – </w:t>
-      </w:r>
-      <w:r>
-        <w:rPr>
-          <w:rFonts w:ascii="Arial" w:hAnsi="Arial" w:cs="Arial"/>
-          <w:b/>
-          <w:bCs/>
-          <w:color w:val="auto"/>
-          <w:sz w:val="24"/>
-          <w:szCs w:val="24"/>
-        </w:rPr>
-        <w:t>ELEGIR LA ARQUITECTURA</w:t>
-      </w:r>
-    </w:p>
-    <w:p>
-      <w:pPr>
-        <w:pStyle w:val="Ttulo2"/>
-        <w:jc w:val="both"/>
-        <w:rPr>
-          <w:rFonts w:ascii="Arial" w:hAnsi="Arial" w:cs="Arial"/>
-          <w:sz w:val="24"/>
-          <w:szCs w:val="24"/>
-        </w:rPr>
-      </w:pPr>
-      <w:r>
-        <w:rPr>
-          <w:rFonts w:ascii="Arial" w:hAnsi="Arial" w:cs="Arial"/>
-          <w:sz w:val="24"/>
-          <w:szCs w:val="24"/>
-        </w:rPr>
-        <w:t>Paso 4: Tipo de arquitectura</w:t>
-      </w:r>
-    </w:p>
-    <w:p>
-      <w:pPr>
-        <w:pStyle w:val="NormalWeb"/>
-        <w:jc w:val="both"/>
-        <w:rPr>
-          <w:rFonts w:ascii="Arial" w:hAnsi="Arial" w:cs="Arial"/>
-        </w:rPr>
-      </w:pPr>
-      <w:r>
-        <w:rPr>
-          <w:rFonts w:ascii="Arial" w:hAnsi="Arial" w:cs="Arial"/>
-        </w:rPr>
-        <w:t>Decidan cuál usarán:</w:t>
-      </w:r>
-    </w:p>
-    <w:p>
-      <w:pPr>
-        <w:pStyle w:val="NormalWeb"/>
-        <w:rPr>
-          <w:rFonts w:ascii="Arial" w:hAnsi="Arial" w:cs="Arial"/>
-        </w:rPr>
-      </w:pPr>
-      <w:r>
-        <w:rPr>
-          <w:rFonts w:ascii="Segoe UI Symbol" w:hAnsi="Segoe UI Symbol" w:cs="Segoe UI Symbol"/>
-        </w:rPr>
-        <w:t>☐</w:t>
-      </w:r>
-      <w:r>
-        <w:rPr>
-          <w:rFonts w:ascii="Arial" w:hAnsi="Arial" w:cs="Arial"/>
-        </w:rPr>
-        <w:t xml:space="preserve"> Cliente–Servidor</w:t>
-      </w:r>
-      <w:r>
-        <w:rPr>
-          <w:rFonts w:ascii="Arial" w:hAnsi="Arial" w:cs="Arial"/>
-        </w:rPr>
-        <w:br/>
-      </w:r>
-      <w:r>
-        <w:rPr>
-          <w:rFonts w:ascii="Segoe UI Symbol" w:hAnsi="Segoe UI Symbol" w:cs="Segoe UI Symbol"/>
-        </w:rPr>
-        <w:t>☐</w:t>
-      </w:r>
-      <w:r>
-        <w:rPr>
-          <w:rFonts w:ascii="Arial" w:hAnsi="Arial" w:cs="Arial"/>
-        </w:rPr>
-        <w:t xml:space="preserve"> Arquitectura en capas</w:t>
-      </w:r>
-      <w:r>
-        <w:rPr>
-          <w:rFonts w:ascii="Arial" w:hAnsi="Arial" w:cs="Arial"/>
-        </w:rPr>
-        <w:br/>
-      </w:r>
-      <w:r>
-        <w:rPr>
-          <w:rFonts w:ascii="Segoe UI Symbol" w:hAnsi="Segoe UI Symbol" w:cs="Segoe UI Symbol"/>
-        </w:rPr>
-        <w:lastRenderedPageBreak/>
-        <w:t>☐</w:t>
-      </w:r>
-      <w:r>
-        <w:rPr>
-          <w:rFonts w:ascii="Arial" w:hAnsi="Arial" w:cs="Arial"/>
-        </w:rPr>
-        <w:t xml:space="preserve"> Microservicios</w:t>
-      </w:r>
-      <w:r>
-        <w:rPr>
-          <w:rFonts w:ascii="Arial" w:hAnsi="Arial" w:cs="Arial"/>
-        </w:rPr>
-        <w:br/>
-      </w:r>
-      <w:r>
-        <w:rPr>
-          <w:rFonts w:ascii="Segoe UI Symbol" w:hAnsi="Segoe UI Symbol" w:cs="Segoe UI Symbol"/>
-        </w:rPr>
-        <w:t>☐</w:t>
-      </w:r>
-      <w:r>
-        <w:rPr>
-          <w:rFonts w:ascii="Arial" w:hAnsi="Arial" w:cs="Arial"/>
-        </w:rPr>
-        <w:t xml:space="preserve"> Basados en eventos</w:t>
-      </w:r>
-      <w:r>
-        <w:rPr>
-          <w:rFonts w:ascii="Arial" w:hAnsi="Arial" w:cs="Arial"/>
-        </w:rPr>
-        <w:br/>
-      </w:r>
-      <w:r>
-        <w:rPr>
-          <w:rFonts w:ascii="Segoe UI Symbol" w:hAnsi="Segoe UI Symbol" w:cs="Segoe UI Symbol"/>
-        </w:rPr>
-        <w:t>☐</w:t>
-      </w:r>
-      <w:r>
-        <w:rPr>
-          <w:rFonts w:ascii="Arial" w:hAnsi="Arial" w:cs="Arial"/>
-        </w:rPr>
-        <w:t xml:space="preserve"> Híbrida</w:t>
-      </w:r>
-    </w:p>
-    <w:p>
-      <w:pPr>
-        <w:pStyle w:val="Ttulo2"/>
-        <w:jc w:val="both"/>
-        <w:rPr>
-          <w:rFonts w:ascii="Arial" w:hAnsi="Arial" w:cs="Arial"/>
-          <w:sz w:val="24"/>
-          <w:szCs w:val="24"/>
-        </w:rPr>
-      </w:pPr>
-      <w:r>
-        <w:rPr>
-          <w:rFonts w:ascii="Arial" w:hAnsi="Arial" w:cs="Arial"/>
-          <w:sz w:val="24"/>
-          <w:szCs w:val="24"/>
-        </w:rPr>
-        <w:t>Preguntas guía:</w:t>
+        <w:rPr>
+          <w:rFonts w:ascii="Arial" w:hAnsi="Arial" w:cs="Arial"/>
+          <w:b/>
+          <w:bCs/>
+        </w:rPr>
+      </w:pPr>
+      <w:r>
+        <w:rPr>
+          <w:rFonts w:ascii="Arial" w:hAnsi="Arial" w:cs="Arial"/>
+          <w:b/>
+          <w:bCs/>
+        </w:rPr>
+        <w:t xml:space="preserve">Turnos </w:t>
+      </w:r>
+      <w:r>
+        <w:rPr>
+          <w:rFonts w:ascii="Arial" w:hAnsi="Arial" w:cs="Arial"/>
+        </w:rPr>
+        <w:t xml:space="preserve">necesita información de </w:t>
+      </w:r>
+      <w:r>
+        <w:rPr>
+          <w:rFonts w:ascii="Arial" w:hAnsi="Arial" w:cs="Arial"/>
+          <w:b/>
+          <w:bCs/>
+        </w:rPr>
+        <w:t xml:space="preserve">Asesores </w:t>
+      </w:r>
+      <w:r>
+        <w:rPr>
+          <w:rFonts w:ascii="Arial" w:hAnsi="Arial" w:cs="Arial"/>
+        </w:rPr>
+        <w:t>cuando el cliente requiere atención personalizada.</w:t>
       </w:r>
     </w:p>
     <w:p>
@@ -1639,18 +1454,41 @@
         <w:pStyle w:val="NormalWeb"/>
         <w:numPr>
           <w:ilvl w:val="0"/>
-          <w:numId w:val="21"/>
+          <w:numId w:val="37"/>
         </w:numPr>
-        <w:jc w:val="both"/>
-        <w:rPr>
-          <w:rFonts w:ascii="Arial" w:hAnsi="Arial" w:cs="Arial"/>
-        </w:rPr>
-      </w:pPr>
-      <w:r>
-        <w:rPr>
-          <w:rFonts w:ascii="Arial" w:hAnsi="Arial" w:cs="Arial"/>
-        </w:rPr>
-        <w:t>¿Cuántos usuarios tendrá el sistema?</w:t>
+        <w:rPr>
+          <w:rFonts w:ascii="Arial" w:hAnsi="Arial" w:cs="Arial"/>
+          <w:b/>
+          <w:bCs/>
+        </w:rPr>
+      </w:pPr>
+      <w:r>
+        <w:rPr>
+          <w:rFonts w:ascii="Arial" w:hAnsi="Arial" w:cs="Arial"/>
+          <w:b/>
+          <w:bCs/>
+        </w:rPr>
+        <w:t xml:space="preserve">Atención </w:t>
+      </w:r>
+      <w:r>
+        <w:rPr>
+          <w:rFonts w:ascii="Arial" w:hAnsi="Arial" w:cs="Arial"/>
+        </w:rPr>
+        <w:t xml:space="preserve">necesita información de </w:t>
+      </w:r>
+      <w:r>
+        <w:rPr>
+          <w:rFonts w:ascii="Arial" w:hAnsi="Arial" w:cs="Arial"/>
+          <w:b/>
+          <w:bCs/>
+        </w:rPr>
+        <w:t xml:space="preserve">Turnos </w:t>
+      </w:r>
+      <w:r>
+        <w:rPr>
+          <w:rFonts w:ascii="Arial" w:hAnsi="Arial" w:cs="Arial"/>
+        </w:rPr>
+        <w:t>para saber qué cliente debe atender y qué trámite realizará.</w:t>
       </w:r>
     </w:p>
     <w:p>
@@ -1658,18 +1496,75 @@
         <w:pStyle w:val="NormalWeb"/>
         <w:numPr>
           <w:ilvl w:val="0"/>
-          <w:numId w:val="21"/>
+          <w:numId w:val="37"/>
         </w:numPr>
-        <w:jc w:val="both"/>
-        <w:rPr>
-          <w:rFonts w:ascii="Arial" w:hAnsi="Arial" w:cs="Arial"/>
-        </w:rPr>
-      </w:pPr>
-      <w:r>
-        <w:rPr>
-          <w:rFonts w:ascii="Arial" w:hAnsi="Arial" w:cs="Arial"/>
-        </w:rPr>
-        <w:t>¿Necesita escalar?</w:t>
+        <w:rPr>
+          <w:rFonts w:ascii="Arial" w:hAnsi="Arial" w:cs="Arial"/>
+          <w:b/>
+          <w:bCs/>
+        </w:rPr>
+      </w:pPr>
+      <w:r>
+        <w:rPr>
+          <w:rFonts w:ascii="Arial" w:hAnsi="Arial" w:cs="Arial"/>
+          <w:b/>
+          <w:bCs/>
+        </w:rPr>
+        <w:t xml:space="preserve">Notificaciones </w:t>
+      </w:r>
+      <w:r>
+        <w:rPr>
+          <w:rFonts w:ascii="Arial" w:hAnsi="Arial" w:cs="Arial"/>
+        </w:rPr>
+        <w:t xml:space="preserve">necesita información de </w:t>
+      </w:r>
+      <w:r>
+        <w:rPr>
+          <w:rFonts w:ascii="Arial" w:hAnsi="Arial" w:cs="Arial"/>
+          <w:b/>
+          <w:bCs/>
+        </w:rPr>
+        <w:t>Turnos</w:t>
+      </w:r>
+      <w:r>
+        <w:rPr>
+          <w:rFonts w:ascii="Arial" w:hAnsi="Arial" w:cs="Arial"/>
+        </w:rPr>
+        <w:t xml:space="preserve"> para saber qué turno debe notificar y cuándo.</w:t>
+      </w:r>
+    </w:p>
+    <w:p>
+      <w:pPr>
+        <w:pStyle w:val="NormalWeb"/>
+        <w:jc w:val="both"/>
+        <w:rPr>
+          <w:rFonts w:ascii="Arial" w:hAnsi="Arial" w:cs="Arial"/>
+          <w:b/>
+          <w:bCs/>
+        </w:rPr>
+      </w:pPr>
+      <w:r>
+        <w:rPr>
+          <w:rFonts w:ascii="Arial" w:hAnsi="Arial" w:cs="Arial"/>
+          <w:b/>
+          <w:bCs/>
+        </w:rPr>
+        <w:t>¿Quién solicita datos?</w:t>
+      </w:r>
+    </w:p>
+    <w:p>
+      <w:pPr>
+        <w:pStyle w:val="NormalWeb"/>
+        <w:jc w:val="both"/>
+        <w:rPr>
+          <w:rFonts w:ascii="Arial" w:hAnsi="Arial" w:cs="Arial"/>
+        </w:rPr>
+      </w:pPr>
+      <w:r>
+        <w:rPr>
+          <w:rFonts w:ascii="Arial" w:hAnsi="Arial" w:cs="Arial"/>
+        </w:rPr>
+        <w:t>El servicio que necesita la información es el que realiza la solicitud.</w:t>
       </w:r>
     </w:p>
     <w:p>
@@ -1677,16 +1572,870 @@
         <w:pStyle w:val="NormalWeb"/>
         <w:numPr>
           <w:ilvl w:val="0"/>
-          <w:numId w:val="21"/>
+          <w:numId w:val="38"/>
         </w:numPr>
         <w:jc w:val="both"/>
         <w:rPr>
           <w:rFonts w:ascii="Arial" w:hAnsi="Arial" w:cs="Arial"/>
-        </w:rPr>
-      </w:pPr>
-      <w:r>
-        <w:rPr>
-          <w:rFonts w:ascii="Arial" w:hAnsi="Arial" w:cs="Arial"/>
+          <w:b/>
+          <w:bCs/>
+        </w:rPr>
+      </w:pPr>
+      <w:r>
+        <w:rPr>
+          <w:rFonts w:ascii="Arial" w:hAnsi="Arial" w:cs="Arial"/>
+          <w:b/>
+          <w:bCs/>
+        </w:rPr>
+        <w:t>Turnos</w:t>
+      </w:r>
+      <w:r>
+        <w:rPr>
+          <w:rFonts w:ascii="Arial" w:hAnsi="Arial" w:cs="Arial"/>
+        </w:rPr>
+        <w:t xml:space="preserve"> solicita</w:t>
+      </w:r>
+      <w:r>
+        <w:rPr>
+          <w:rFonts w:ascii="Arial" w:hAnsi="Arial" w:cs="Arial"/>
+          <w:b/>
+          <w:bCs/>
+        </w:rPr>
+        <w:t xml:space="preserve"> → Clientes</w:t>
+      </w:r>
+    </w:p>
+    <w:p>
+      <w:pPr>
+        <w:pStyle w:val="NormalWeb"/>
+        <w:numPr>
+          <w:ilvl w:val="0"/>
+          <w:numId w:val="38"/>
+        </w:numPr>
+        <w:jc w:val="both"/>
+        <w:rPr>
+          <w:rFonts w:ascii="Arial" w:hAnsi="Arial" w:cs="Arial"/>
+          <w:b/>
+          <w:bCs/>
+        </w:rPr>
+      </w:pPr>
+      <w:r>
+        <w:rPr>
+          <w:rFonts w:ascii="Arial" w:hAnsi="Arial" w:cs="Arial"/>
+          <w:b/>
+          <w:bCs/>
+        </w:rPr>
+        <w:t xml:space="preserve">Turnos </w:t>
+      </w:r>
+      <w:r>
+        <w:rPr>
+          <w:rFonts w:ascii="Arial" w:hAnsi="Arial" w:cs="Arial"/>
+        </w:rPr>
+        <w:t xml:space="preserve">solicita </w:t>
+      </w:r>
+      <w:r>
+        <w:rPr>
+          <w:rFonts w:ascii="Arial" w:hAnsi="Arial" w:cs="Arial"/>
+          <w:b/>
+          <w:bCs/>
+        </w:rPr>
+        <w:t>→ Cajas</w:t>
+      </w:r>
+    </w:p>
+    <w:p>
+      <w:pPr>
+        <w:pStyle w:val="NormalWeb"/>
+        <w:numPr>
+          <w:ilvl w:val="0"/>
+          <w:numId w:val="38"/>
+        </w:numPr>
+        <w:jc w:val="both"/>
+        <w:rPr>
+          <w:rFonts w:ascii="Arial" w:hAnsi="Arial" w:cs="Arial"/>
+          <w:b/>
+          <w:bCs/>
+        </w:rPr>
+      </w:pPr>
+      <w:r>
+        <w:rPr>
+          <w:rFonts w:ascii="Arial" w:hAnsi="Arial" w:cs="Arial"/>
+          <w:b/>
+          <w:bCs/>
+        </w:rPr>
+        <w:t xml:space="preserve">Turnos </w:t>
+      </w:r>
+      <w:r>
+        <w:rPr>
+          <w:rFonts w:ascii="Arial" w:hAnsi="Arial" w:cs="Arial"/>
+        </w:rPr>
+        <w:t xml:space="preserve">solicita </w:t>
+      </w:r>
+      <w:r>
+        <w:rPr>
+          <w:rFonts w:ascii="Arial" w:hAnsi="Arial" w:cs="Arial"/>
+          <w:b/>
+          <w:bCs/>
+        </w:rPr>
+        <w:t>→ Asesores</w:t>
+      </w:r>
+    </w:p>
+    <w:p>
+      <w:pPr>
+        <w:pStyle w:val="NormalWeb"/>
+        <w:numPr>
+          <w:ilvl w:val="0"/>
+          <w:numId w:val="38"/>
+        </w:numPr>
+        <w:jc w:val="both"/>
+        <w:rPr>
+          <w:rFonts w:ascii="Arial" w:hAnsi="Arial" w:cs="Arial"/>
+          <w:b/>
+          <w:bCs/>
+        </w:rPr>
+      </w:pPr>
+      <w:r>
+        <w:rPr>
+          <w:rFonts w:ascii="Arial" w:hAnsi="Arial" w:cs="Arial"/>
+          <w:b/>
+          <w:bCs/>
+        </w:rPr>
+        <w:t xml:space="preserve">Atención </w:t>
+      </w:r>
+      <w:r>
+        <w:rPr>
+          <w:rFonts w:ascii="Arial" w:hAnsi="Arial" w:cs="Arial"/>
+        </w:rPr>
+        <w:t>solicita</w:t>
+      </w:r>
+      <w:r>
+        <w:rPr>
+          <w:rFonts w:ascii="Arial" w:hAnsi="Arial" w:cs="Arial"/>
+          <w:b/>
+          <w:bCs/>
+        </w:rPr>
+        <w:t xml:space="preserve"> → Turnos</w:t>
+      </w:r>
+    </w:p>
+    <w:p>
+      <w:pPr>
+        <w:pStyle w:val="NormalWeb"/>
+        <w:numPr>
+          <w:ilvl w:val="0"/>
+          <w:numId w:val="38"/>
+        </w:numPr>
+        <w:jc w:val="both"/>
+        <w:rPr>
+          <w:rFonts w:ascii="Arial" w:hAnsi="Arial" w:cs="Arial"/>
+          <w:b/>
+          <w:bCs/>
+        </w:rPr>
+      </w:pPr>
+      <w:r>
+        <w:rPr>
+          <w:rFonts w:ascii="Arial" w:hAnsi="Arial" w:cs="Arial"/>
+          <w:b/>
+          <w:bCs/>
+        </w:rPr>
+        <w:t xml:space="preserve">Notificaciones </w:t>
+      </w:r>
+      <w:r>
+        <w:rPr>
+          <w:rFonts w:ascii="Arial" w:hAnsi="Arial" w:cs="Arial"/>
+        </w:rPr>
+        <w:t>solicita</w:t>
+      </w:r>
+      <w:r>
+        <w:rPr>
+          <w:rFonts w:ascii="Arial" w:hAnsi="Arial" w:cs="Arial"/>
+          <w:b/>
+          <w:bCs/>
+        </w:rPr>
+        <w:t xml:space="preserve"> → Turnos</w:t>
+      </w:r>
+    </w:p>
+    <w:p>
+      <w:pPr>
+        <w:pStyle w:val="NormalWeb"/>
+        <w:jc w:val="both"/>
+        <w:rPr>
+          <w:rFonts w:ascii="Arial" w:hAnsi="Arial" w:cs="Arial"/>
+          <w:b/>
+          <w:bCs/>
+        </w:rPr>
+      </w:pPr>
+      <w:r>
+        <w:rPr>
+          <w:rFonts w:ascii="Arial" w:hAnsi="Arial" w:cs="Arial"/>
+          <w:b/>
+          <w:bCs/>
+        </w:rPr>
+        <w:t>¿Quién responde?</w:t>
+      </w:r>
+    </w:p>
+    <w:p>
+      <w:pPr>
+        <w:pStyle w:val="NormalWeb"/>
+        <w:numPr>
+          <w:ilvl w:val="0"/>
+          <w:numId w:val="39"/>
+        </w:numPr>
+        <w:jc w:val="both"/>
+        <w:rPr>
+          <w:rFonts w:ascii="Arial" w:hAnsi="Arial" w:cs="Arial"/>
+          <w:b/>
+          <w:bCs/>
+        </w:rPr>
+      </w:pPr>
+      <w:r>
+        <w:rPr>
+          <w:rFonts w:ascii="Arial" w:hAnsi="Arial" w:cs="Arial"/>
+          <w:b/>
+          <w:bCs/>
+        </w:rPr>
+        <w:t xml:space="preserve">Turnos → </w:t>
+      </w:r>
+      <w:r>
+        <w:rPr>
+          <w:rFonts w:ascii="Arial" w:hAnsi="Arial" w:cs="Arial"/>
+        </w:rPr>
+        <w:t xml:space="preserve">solicita </w:t>
+      </w:r>
+      <w:r>
+        <w:rPr>
+          <w:rFonts w:ascii="Arial" w:hAnsi="Arial" w:cs="Arial"/>
+          <w:b/>
+          <w:bCs/>
+        </w:rPr>
+        <w:t>→ Clientes</w:t>
+      </w:r>
+    </w:p>
+    <w:p>
+      <w:pPr>
+        <w:pStyle w:val="NormalWeb"/>
+        <w:numPr>
+          <w:ilvl w:val="0"/>
+          <w:numId w:val="39"/>
+        </w:numPr>
+        <w:jc w:val="both"/>
+        <w:rPr>
+          <w:rFonts w:ascii="Arial" w:hAnsi="Arial" w:cs="Arial"/>
+          <w:b/>
+          <w:bCs/>
+        </w:rPr>
+      </w:pPr>
+      <w:r>
+        <w:rPr>
+          <w:rFonts w:ascii="Arial" w:hAnsi="Arial" w:cs="Arial"/>
+          <w:b/>
+          <w:bCs/>
+        </w:rPr>
+        <w:t>Clientes →</w:t>
+      </w:r>
+      <w:r>
+        <w:rPr>
+          <w:rFonts w:ascii="Arial" w:hAnsi="Arial" w:cs="Arial"/>
+        </w:rPr>
+        <w:t xml:space="preserve"> responde</w:t>
+      </w:r>
+      <w:r>
+        <w:rPr>
+          <w:rFonts w:ascii="Arial" w:hAnsi="Arial" w:cs="Arial"/>
+          <w:b/>
+          <w:bCs/>
+        </w:rPr>
+        <w:t xml:space="preserve"> → Turnos</w:t>
+      </w:r>
+    </w:p>
+    <w:p>
+      <w:pPr>
+        <w:pStyle w:val="NormalWeb"/>
+        <w:numPr>
+          <w:ilvl w:val="0"/>
+          <w:numId w:val="39"/>
+        </w:numPr>
+        <w:jc w:val="both"/>
+        <w:rPr>
+          <w:rFonts w:ascii="Arial" w:hAnsi="Arial" w:cs="Arial"/>
+          <w:b/>
+          <w:bCs/>
+        </w:rPr>
+      </w:pPr>
+      <w:r>
+        <w:rPr>
+          <w:rFonts w:ascii="Arial" w:hAnsi="Arial" w:cs="Arial"/>
+          <w:b/>
+          <w:bCs/>
+        </w:rPr>
+        <w:lastRenderedPageBreak/>
+        <w:t xml:space="preserve">Turnos → </w:t>
+      </w:r>
+      <w:r>
+        <w:rPr>
+          <w:rFonts w:ascii="Arial" w:hAnsi="Arial" w:cs="Arial"/>
+        </w:rPr>
+        <w:t>solicita</w:t>
+      </w:r>
+      <w:r>
+        <w:rPr>
+          <w:rFonts w:ascii="Arial" w:hAnsi="Arial" w:cs="Arial"/>
+          <w:b/>
+          <w:bCs/>
+        </w:rPr>
+        <w:t xml:space="preserve"> → Cajas</w:t>
+      </w:r>
+    </w:p>
+    <w:p>
+      <w:pPr>
+        <w:pStyle w:val="NormalWeb"/>
+        <w:numPr>
+          <w:ilvl w:val="0"/>
+          <w:numId w:val="39"/>
+        </w:numPr>
+        <w:jc w:val="both"/>
+        <w:rPr>
+          <w:rFonts w:ascii="Arial" w:hAnsi="Arial" w:cs="Arial"/>
+          <w:b/>
+          <w:bCs/>
+        </w:rPr>
+      </w:pPr>
+      <w:r>
+        <w:rPr>
+          <w:rFonts w:ascii="Arial" w:hAnsi="Arial" w:cs="Arial"/>
+          <w:b/>
+          <w:bCs/>
+        </w:rPr>
+        <w:t>Cajas →</w:t>
+      </w:r>
+      <w:r>
+        <w:rPr>
+          <w:rFonts w:ascii="Arial" w:hAnsi="Arial" w:cs="Arial"/>
+        </w:rPr>
+        <w:t xml:space="preserve"> responde</w:t>
+      </w:r>
+      <w:r>
+        <w:rPr>
+          <w:rFonts w:ascii="Arial" w:hAnsi="Arial" w:cs="Arial"/>
+          <w:b/>
+          <w:bCs/>
+        </w:rPr>
+        <w:t xml:space="preserve"> → Turnos</w:t>
+      </w:r>
+    </w:p>
+    <w:p>
+      <w:pPr>
+        <w:pStyle w:val="NormalWeb"/>
+        <w:numPr>
+          <w:ilvl w:val="0"/>
+          <w:numId w:val="39"/>
+        </w:numPr>
+        <w:jc w:val="both"/>
+        <w:rPr>
+          <w:rFonts w:ascii="Arial" w:hAnsi="Arial" w:cs="Arial"/>
+          <w:b/>
+          <w:bCs/>
+        </w:rPr>
+      </w:pPr>
+      <w:r>
+        <w:rPr>
+          <w:rFonts w:ascii="Arial" w:hAnsi="Arial" w:cs="Arial"/>
+          <w:b/>
+          <w:bCs/>
+        </w:rPr>
+        <w:t xml:space="preserve">Turnos → </w:t>
+      </w:r>
+      <w:r>
+        <w:rPr>
+          <w:rFonts w:ascii="Arial" w:hAnsi="Arial" w:cs="Arial"/>
+        </w:rPr>
+        <w:t>solicita</w:t>
+      </w:r>
+      <w:r>
+        <w:rPr>
+          <w:rFonts w:ascii="Arial" w:hAnsi="Arial" w:cs="Arial"/>
+          <w:b/>
+          <w:bCs/>
+        </w:rPr>
+        <w:t xml:space="preserve"> → Asesores</w:t>
+      </w:r>
+    </w:p>
+    <w:p>
+      <w:pPr>
+        <w:pStyle w:val="NormalWeb"/>
+        <w:numPr>
+          <w:ilvl w:val="0"/>
+          <w:numId w:val="39"/>
+        </w:numPr>
+        <w:jc w:val="both"/>
+        <w:rPr>
+          <w:rFonts w:ascii="Arial" w:hAnsi="Arial" w:cs="Arial"/>
+          <w:b/>
+          <w:bCs/>
+        </w:rPr>
+      </w:pPr>
+      <w:r>
+        <w:rPr>
+          <w:rFonts w:ascii="Arial" w:hAnsi="Arial" w:cs="Arial"/>
+          <w:b/>
+          <w:bCs/>
+        </w:rPr>
+        <w:t xml:space="preserve">Asesores → </w:t>
+      </w:r>
+      <w:r>
+        <w:rPr>
+          <w:rFonts w:ascii="Arial" w:hAnsi="Arial" w:cs="Arial"/>
+        </w:rPr>
+        <w:t>responde</w:t>
+      </w:r>
+      <w:r>
+        <w:rPr>
+          <w:rFonts w:ascii="Arial" w:hAnsi="Arial" w:cs="Arial"/>
+          <w:b/>
+          <w:bCs/>
+        </w:rPr>
+        <w:t xml:space="preserve"> → Turnos</w:t>
+      </w:r>
+    </w:p>
+    <w:p>
+      <w:pPr>
+        <w:pStyle w:val="NormalWeb"/>
+        <w:numPr>
+          <w:ilvl w:val="0"/>
+          <w:numId w:val="39"/>
+        </w:numPr>
+        <w:jc w:val="both"/>
+        <w:rPr>
+          <w:rFonts w:ascii="Arial" w:hAnsi="Arial" w:cs="Arial"/>
+          <w:b/>
+          <w:bCs/>
+        </w:rPr>
+      </w:pPr>
+      <w:r>
+        <w:rPr>
+          <w:rFonts w:ascii="Arial" w:hAnsi="Arial" w:cs="Arial"/>
+          <w:b/>
+          <w:bCs/>
+        </w:rPr>
+        <w:t xml:space="preserve">Atención → </w:t>
+      </w:r>
+      <w:r>
+        <w:rPr>
+          <w:rFonts w:ascii="Arial" w:hAnsi="Arial" w:cs="Arial"/>
+        </w:rPr>
+        <w:t>solicita</w:t>
+      </w:r>
+      <w:r>
+        <w:rPr>
+          <w:rFonts w:ascii="Arial" w:hAnsi="Arial" w:cs="Arial"/>
+          <w:b/>
+          <w:bCs/>
+        </w:rPr>
+        <w:t xml:space="preserve"> → Turnos</w:t>
+      </w:r>
+    </w:p>
+    <w:p>
+      <w:pPr>
+        <w:pStyle w:val="NormalWeb"/>
+        <w:numPr>
+          <w:ilvl w:val="0"/>
+          <w:numId w:val="39"/>
+        </w:numPr>
+        <w:jc w:val="both"/>
+        <w:rPr>
+          <w:rFonts w:ascii="Arial" w:hAnsi="Arial" w:cs="Arial"/>
+          <w:b/>
+          <w:bCs/>
+        </w:rPr>
+      </w:pPr>
+      <w:r>
+        <w:rPr>
+          <w:rFonts w:ascii="Arial" w:hAnsi="Arial" w:cs="Arial"/>
+          <w:b/>
+          <w:bCs/>
+        </w:rPr>
+        <w:t xml:space="preserve">Turnos → </w:t>
+      </w:r>
+      <w:r>
+        <w:rPr>
+          <w:rFonts w:ascii="Arial" w:hAnsi="Arial" w:cs="Arial"/>
+        </w:rPr>
+        <w:t>responde</w:t>
+      </w:r>
+      <w:r>
+        <w:rPr>
+          <w:rFonts w:ascii="Arial" w:hAnsi="Arial" w:cs="Arial"/>
+          <w:b/>
+          <w:bCs/>
+        </w:rPr>
+        <w:t xml:space="preserve"> → Atención</w:t>
+      </w:r>
+    </w:p>
+    <w:p>
+      <w:pPr>
+        <w:pStyle w:val="NormalWeb"/>
+        <w:numPr>
+          <w:ilvl w:val="0"/>
+          <w:numId w:val="39"/>
+        </w:numPr>
+        <w:jc w:val="both"/>
+        <w:rPr>
+          <w:rFonts w:ascii="Arial" w:hAnsi="Arial" w:cs="Arial"/>
+          <w:b/>
+          <w:bCs/>
+        </w:rPr>
+      </w:pPr>
+      <w:r>
+        <w:rPr>
+          <w:rFonts w:ascii="Arial" w:hAnsi="Arial" w:cs="Arial"/>
+          <w:b/>
+          <w:bCs/>
+        </w:rPr>
+        <w:t xml:space="preserve">Notificaciones → </w:t>
+      </w:r>
+      <w:r>
+        <w:rPr>
+          <w:rFonts w:ascii="Arial" w:hAnsi="Arial" w:cs="Arial"/>
+        </w:rPr>
+        <w:t xml:space="preserve">solicita </w:t>
+      </w:r>
+      <w:r>
+        <w:rPr>
+          <w:rFonts w:ascii="Arial" w:hAnsi="Arial" w:cs="Arial"/>
+          <w:b/>
+          <w:bCs/>
+        </w:rPr>
+        <w:t>→ Turnos</w:t>
+      </w:r>
+    </w:p>
+    <w:p>
+      <w:pPr>
+        <w:pStyle w:val="NormalWeb"/>
+        <w:numPr>
+          <w:ilvl w:val="0"/>
+          <w:numId w:val="39"/>
+        </w:numPr>
+        <w:jc w:val="both"/>
+        <w:rPr>
+          <w:rFonts w:ascii="Arial" w:hAnsi="Arial" w:cs="Arial"/>
+          <w:b/>
+          <w:bCs/>
+        </w:rPr>
+      </w:pPr>
+      <w:r>
+        <w:rPr>
+          <w:rFonts w:ascii="Arial" w:hAnsi="Arial" w:cs="Arial"/>
+          <w:b/>
+          <w:bCs/>
+        </w:rPr>
+        <w:t xml:space="preserve">Turnos → </w:t>
+      </w:r>
+      <w:r>
+        <w:rPr>
+          <w:rFonts w:ascii="Arial" w:hAnsi="Arial" w:cs="Arial"/>
+        </w:rPr>
+        <w:t>responde</w:t>
+      </w:r>
+      <w:r>
+        <w:rPr>
+          <w:rFonts w:ascii="Arial" w:hAnsi="Arial" w:cs="Arial"/>
+          <w:b/>
+          <w:bCs/>
+        </w:rPr>
+        <w:t xml:space="preserve"> → Notificaciones</w:t>
+      </w:r>
+    </w:p>
+    <w:p>
+      <w:pPr>
+        <w:pStyle w:val="NormalWeb"/>
+        <w:jc w:val="both"/>
+        <w:rPr>
+          <w:rFonts w:ascii="Arial" w:hAnsi="Arial" w:cs="Arial"/>
+        </w:rPr>
+      </w:pPr>
+      <w:r>
+        <w:rPr>
+          <w:rFonts w:ascii="Arial" w:hAnsi="Arial" w:cs="Arial"/>
+          <w:b/>
+          <w:bCs/>
+        </w:rPr>
+        <w:t>Además</w:t>
+      </w:r>
+      <w:r>
+        <w:rPr>
+          <w:rFonts w:ascii="Arial" w:hAnsi="Arial" w:cs="Arial"/>
+        </w:rPr>
+        <w:t>, cuando la atención termina:</w:t>
+      </w:r>
+    </w:p>
+    <w:p>
+      <w:pPr>
+        <w:pStyle w:val="NormalWeb"/>
+        <w:numPr>
+          <w:ilvl w:val="0"/>
+          <w:numId w:val="40"/>
+        </w:numPr>
+        <w:jc w:val="both"/>
+        <w:rPr>
+          <w:rFonts w:ascii="Arial" w:hAnsi="Arial" w:cs="Arial"/>
+        </w:rPr>
+      </w:pPr>
+      <w:r>
+        <w:rPr>
+          <w:rFonts w:ascii="Arial" w:hAnsi="Arial" w:cs="Arial"/>
+          <w:b/>
+          <w:bCs/>
+        </w:rPr>
+        <w:t xml:space="preserve">Atención → </w:t>
+      </w:r>
+      <w:r>
+        <w:rPr>
+          <w:rFonts w:ascii="Arial" w:hAnsi="Arial" w:cs="Arial"/>
+        </w:rPr>
+        <w:t>informa</w:t>
+      </w:r>
+      <w:r>
+        <w:rPr>
+          <w:rFonts w:ascii="Arial" w:hAnsi="Arial" w:cs="Arial"/>
+          <w:b/>
+          <w:bCs/>
+        </w:rPr>
+        <w:t xml:space="preserve"> → Turnos</w:t>
+      </w:r>
+    </w:p>
+    <w:p>
+      <w:pPr>
+        <w:pStyle w:val="NormalWeb"/>
+        <w:numPr>
+          <w:ilvl w:val="0"/>
+          <w:numId w:val="40"/>
+        </w:numPr>
+        <w:jc w:val="both"/>
+        <w:rPr>
+          <w:rFonts w:ascii="Arial" w:hAnsi="Arial" w:cs="Arial"/>
+        </w:rPr>
+      </w:pPr>
+      <w:r>
+        <w:rPr>
+          <w:rFonts w:ascii="Arial" w:hAnsi="Arial" w:cs="Arial"/>
+          <w:b/>
+          <w:bCs/>
+        </w:rPr>
+        <w:t xml:space="preserve">Turnos → </w:t>
+      </w:r>
+      <w:r>
+        <w:rPr>
+          <w:rFonts w:ascii="Arial" w:hAnsi="Arial" w:cs="Arial"/>
+        </w:rPr>
+        <w:t>actualiza</w:t>
+      </w:r>
+      <w:r>
+        <w:rPr>
+          <w:rFonts w:ascii="Arial" w:hAnsi="Arial" w:cs="Arial"/>
+          <w:b/>
+          <w:bCs/>
+        </w:rPr>
+        <w:t xml:space="preserve"> → estado del turno</w:t>
+      </w:r>
+    </w:p>
+    <w:p>
+      <w:pPr>
+        <w:pStyle w:val="NormalWeb"/>
+        <w:jc w:val="both"/>
+        <w:rPr>
+          <w:rFonts w:ascii="Arial" w:hAnsi="Arial" w:cs="Arial"/>
+          <w:b/>
+          <w:bCs/>
+        </w:rPr>
+      </w:pPr>
+      <w:r>
+        <w:rPr>
+          <w:rFonts w:ascii="Arial" w:hAnsi="Arial" w:cs="Arial"/>
+          <w:b/>
+          <w:bCs/>
+        </w:rPr>
+        <w:t>PARTE 4 – ELEGIR LA ARQUITECTURA</w:t>
+      </w:r>
+    </w:p>
+    <w:p>
+      <w:pPr>
+        <w:pStyle w:val="NormalWeb"/>
+        <w:rPr>
+          <w:rFonts w:ascii="Arial" w:hAnsi="Arial" w:cs="Arial"/>
+          <w:b/>
+          <w:bCs/>
+        </w:rPr>
+      </w:pPr>
+      <w:r>
+        <w:rPr>
+          <w:rFonts w:ascii="Arial" w:hAnsi="Arial" w:cs="Arial"/>
+          <w:b/>
+          <w:bCs/>
+        </w:rPr>
+        <w:t>Paso 4: Tipo de arquitectura</w:t>
+      </w:r>
+    </w:p>
+    <w:p>
+      <w:pPr>
+        <w:pStyle w:val="NormalWeb"/>
+        <w:rPr>
+          <w:rFonts w:ascii="Arial" w:hAnsi="Arial" w:cs="Arial"/>
+          <w:b/>
+          <w:bCs/>
+        </w:rPr>
+      </w:pPr>
+      <w:r>
+        <w:rPr>
+          <w:rFonts w:ascii="Arial" w:hAnsi="Arial" w:cs="Arial"/>
+        </w:rPr>
+        <w:t xml:space="preserve">Arquitectura: </w:t>
+      </w:r>
+      <w:r>
+        <w:rPr>
+          <w:rFonts w:ascii="Arial" w:hAnsi="Arial" w:cs="Arial"/>
+          <w:b/>
+          <w:bCs/>
+        </w:rPr>
+        <w:t>Microservicios</w:t>
+      </w:r>
+      <w:r>
+        <w:rPr>
+          <w:rFonts w:ascii="Arial" w:hAnsi="Arial" w:cs="Arial"/>
+        </w:rPr>
+        <w:t> </w:t>
+      </w:r>
+    </w:p>
+    <w:p>
+      <w:pPr>
+        <w:pStyle w:val="NormalWeb"/>
+        <w:rPr>
+          <w:rFonts w:ascii="Arial" w:hAnsi="Arial" w:cs="Arial"/>
+          <w:b/>
+          <w:bCs/>
+        </w:rPr>
+      </w:pPr>
+      <w:r>
+        <w:rPr>
+          <w:rFonts w:ascii="Arial" w:hAnsi="Arial" w:cs="Arial"/>
+          <w:b/>
+          <w:bCs/>
+        </w:rPr>
+        <w:t>Preguntas guía:</w:t>
+      </w:r>
+    </w:p>
+    <w:p>
+      <w:pPr>
+        <w:pStyle w:val="NormalWeb"/>
+        <w:numPr>
+          <w:ilvl w:val="0"/>
+          <w:numId w:val="41"/>
+        </w:numPr>
+        <w:rPr>
+          <w:rFonts w:ascii="Arial" w:hAnsi="Arial" w:cs="Arial"/>
+          <w:b/>
+          <w:bCs/>
+        </w:rPr>
+      </w:pPr>
+      <w:r>
+        <w:rPr>
+          <w:rFonts w:ascii="Arial" w:hAnsi="Arial" w:cs="Arial"/>
+          <w:b/>
+          <w:bCs/>
+        </w:rPr>
+        <w:t>¿Cuántos usuarios tendrá el sistema?</w:t>
+      </w:r>
+    </w:p>
+    <w:p>
+      <w:pPr>
+        <w:pStyle w:val="NormalWeb"/>
+        <w:rPr>
+          <w:rFonts w:ascii="Arial" w:hAnsi="Arial" w:cs="Arial"/>
+          <w:b/>
+          <w:bCs/>
+        </w:rPr>
+      </w:pPr>
+      <w:r>
+        <w:rPr>
+          <w:rFonts w:ascii="Arial" w:hAnsi="Arial" w:cs="Arial"/>
+        </w:rPr>
+        <w:t xml:space="preserve">Tendrá una </w:t>
+      </w:r>
+      <w:r>
+        <w:rPr>
+          <w:rFonts w:ascii="Arial" w:hAnsi="Arial" w:cs="Arial"/>
+          <w:b/>
+          <w:bCs/>
+        </w:rPr>
+        <w:t>cantidad limitada de usuarios</w:t>
+      </w:r>
+      <w:r>
+        <w:rPr>
+          <w:rFonts w:ascii="Arial" w:hAnsi="Arial" w:cs="Arial"/>
+        </w:rPr>
+        <w:t>, principalmente clientes y empleados que utilizarán el sistema para gestionar y atender los turnos.</w:t>
+      </w:r>
+    </w:p>
+    <w:p>
+      <w:pPr>
+        <w:pStyle w:val="NormalWeb"/>
+        <w:numPr>
+          <w:ilvl w:val="0"/>
+          <w:numId w:val="42"/>
+        </w:numPr>
+        <w:rPr>
+          <w:rFonts w:ascii="Arial" w:hAnsi="Arial" w:cs="Arial"/>
+          <w:b/>
+          <w:bCs/>
+        </w:rPr>
+      </w:pPr>
+      <w:r>
+        <w:rPr>
+          <w:rFonts w:ascii="Arial" w:hAnsi="Arial" w:cs="Arial"/>
+          <w:b/>
+          <w:bCs/>
+        </w:rPr>
+        <w:t>¿Necesita escalar?</w:t>
+      </w:r>
+    </w:p>
+    <w:p>
+      <w:pPr>
+        <w:pStyle w:val="NormalWeb"/>
+        <w:rPr>
+          <w:rFonts w:ascii="Arial" w:hAnsi="Arial" w:cs="Arial"/>
+          <w:b/>
+          <w:bCs/>
+        </w:rPr>
+      </w:pPr>
+      <w:r>
+        <w:rPr>
+          <w:rFonts w:ascii="Arial" w:hAnsi="Arial" w:cs="Arial"/>
+          <w:b/>
+          <w:bCs/>
+        </w:rPr>
+        <w:t>Por ahora no necesita una gran escalabilidad</w:t>
+      </w:r>
+      <w:r>
+        <w:rPr>
+          <w:rFonts w:ascii="Arial" w:hAnsi="Arial" w:cs="Arial"/>
+        </w:rPr>
+        <w:t>, pero en el futuro podría ampliarse para soportar más usuarios, sucursales y servicios.</w:t>
+      </w:r>
+    </w:p>
+    <w:p>
+      <w:pPr>
+        <w:pStyle w:val="NormalWeb"/>
+        <w:numPr>
+          <w:ilvl w:val="0"/>
+          <w:numId w:val="43"/>
+        </w:numPr>
+        <w:rPr>
+          <w:rFonts w:ascii="Arial" w:hAnsi="Arial" w:cs="Arial"/>
+          <w:b/>
+          <w:bCs/>
+        </w:rPr>
+      </w:pPr>
+      <w:r>
+        <w:rPr>
+          <w:rFonts w:ascii="Arial" w:hAnsi="Arial" w:cs="Arial"/>
+          <w:b/>
+          <w:bCs/>
         </w:rPr>
         <w:t>¿Es un sistema pequeño o grande?</w:t>
       </w:r>
@@ -1694,14 +2443,45 @@
     <w:p>
       <w:pPr>
         <w:pStyle w:val="NormalWeb"/>
-        <w:jc w:val="both"/>
-        <w:rPr>
-          <w:rFonts w:ascii="Arial" w:hAnsi="Arial" w:cs="Arial"/>
-        </w:rPr>
-      </w:pPr>
-      <w:r>
-        <w:rPr>
-          <w:rFonts w:ascii="Arial" w:hAnsi="Arial" w:cs="Arial"/>
+        <w:rPr>
+          <w:rFonts w:ascii="Arial" w:hAnsi="Arial" w:cs="Arial"/>
+          <w:b/>
+          <w:bCs/>
+        </w:rPr>
+      </w:pPr>
+      <w:r>
+        <w:rPr>
+          <w:rFonts w:ascii="Arial" w:hAnsi="Arial" w:cs="Arial"/>
+        </w:rPr>
+        <w:t xml:space="preserve">Actualmente es un </w:t>
+      </w:r>
+      <w:r>
+        <w:rPr>
+          <w:rFonts w:ascii="Arial" w:hAnsi="Arial" w:cs="Arial"/>
+          <w:b/>
+          <w:bCs/>
+        </w:rPr>
+        <w:t>sistema pequeño</w:t>
+      </w:r>
+      <w:r>
+        <w:rPr>
+          <w:rFonts w:ascii="Arial" w:hAnsi="Arial" w:cs="Arial"/>
+        </w:rPr>
+        <w:t>, ya que cuenta con seis servicios principales: Clientes, Turnos, Cajas, Asesores, Notificaciones y Atención. Sin embargo, puede crecer en el futuro agregando nuevas funcionalidades.</w:t>
+      </w:r>
+    </w:p>
+    <w:p>
+      <w:pPr>
+        <w:pStyle w:val="NormalWeb"/>
+        <w:rPr>
+          <w:rFonts w:ascii="Arial" w:hAnsi="Arial" w:cs="Arial"/>
+        </w:rPr>
+      </w:pPr>
+      <w:r>
+        <w:rPr>
+          <w:rFonts w:ascii="Arial" w:hAnsi="Arial" w:cs="Arial"/>
+          <w:b/>
+          <w:bCs/>
         </w:rPr>
         <w:t>Justifiquen su elección:</w:t>
       </w:r>
@@ -1709,31 +2489,23 @@
     <w:p>
       <w:pPr>
         <w:pStyle w:val="NormalWeb"/>
-        <w:jc w:val="both"/>
-        <w:rPr>
-          <w:rFonts w:ascii="Arial" w:hAnsi="Arial" w:cs="Arial"/>
-        </w:rPr>
-      </w:pPr>
-      <w:r>
-        <w:rPr>
-          <w:rFonts w:ascii="Arial" w:hAnsi="Arial" w:cs="Arial"/>
-        </w:rPr>
-        <w:t>Elegimos esta arquitectura porque…</w:t>
-      </w:r>
-    </w:p>
-    <w:p>
-      <w:pPr>
-        <w:pStyle w:val="Ttulo1"/>
-        <w:jc w:val="both"/>
-        <w:rPr>
-          <w:rFonts w:ascii="Arial" w:hAnsi="Arial" w:cs="Arial"/>
-          <w:b/>
-          <w:bCs/>
-          <w:color w:val="auto"/>
-          <w:sz w:val="24"/>
-          <w:szCs w:val="24"/>
-        </w:rPr>
-      </w:pPr>
+        <w:rPr>
+          <w:rFonts w:ascii="Arial" w:hAnsi="Arial" w:cs="Arial"/>
+        </w:rPr>
+      </w:pPr>
+      <w:r>
+        <w:rPr>
+          <w:rFonts w:ascii="Arial" w:hAnsi="Arial" w:cs="Arial"/>
+        </w:rPr>
+        <w:t xml:space="preserve">Elegimos la arquitectura de microservicios porque el sistema está dividido en servicios independientes, donde cada uno cumple una función específica. Esto permite que los servicios se comuniquen entre sí y facilita la organización del </w:t>
+      </w:r>
+      <w:r>
+        <w:rPr>
+          <w:rFonts w:ascii="Arial" w:hAnsi="Arial" w:cs="Arial"/>
+        </w:rPr>
+        <w:lastRenderedPageBreak/>
+        <w:t xml:space="preserve">sistema. Además, si en el futuro aumenta la cantidad de usuarios o se necesitan nuevas funcionalidades, se pueden ampliar o agregar servicios sin tener que modificar todo el sistema. </w:t>
+      </w:r>
     </w:p>
     <w:p>
       <w:pPr>
@@ -1952,21 +2724,7 @@
         <w:rPr>
           <w:rFonts w:ascii="Arial" w:hAnsi="Arial" w:cs="Arial"/>
         </w:rPr>
-        <w:t xml:space="preserve"> Se perdería la trazabilidad de quién debía ser atendido y en qué orden, generando reclamos y posible pérdida de confianza del cliente; por eso se recomienda respaldo periódico (</w:t>
-      </w:r>
-      <w:proofErr w:type="spellStart"/>
-      <w:r>
-        <w:rPr>
-          <w:rFonts w:ascii="Arial" w:hAnsi="Arial" w:cs="Arial"/>
-        </w:rPr>
-        <w:t>backup</w:t>
-      </w:r>
-      <w:proofErr w:type="spellEnd"/>
-      <w:r>
-        <w:rPr>
-          <w:rFonts w:ascii="Arial" w:hAnsi="Arial" w:cs="Arial"/>
-        </w:rPr>
-        <w:t>) y replicación de la base de datos de Turnos</w:t>
+        <w:t xml:space="preserve"> Se perdería la trazabilidad de quién debía ser atendido y en qué orden, generando reclamos y posible pérdida de confianza del cliente; por eso se recomienda respaldo periódico (backup) y replicación de la base de datos de Turnos</w:t>
       </w:r>
     </w:p>
     <w:p>
@@ -1991,70 +2749,7 @@
         <w:rPr>
           <w:rFonts w:ascii="Arial" w:hAnsi="Arial" w:cs="Arial"/>
         </w:rPr>
-        <w:t>Cada microservicio tendrá su propia base de datos (</w:t>
-      </w:r>
-      <w:proofErr w:type="spellStart"/>
-      <w:r>
-        <w:rPr>
-          <w:rFonts w:ascii="Arial" w:hAnsi="Arial" w:cs="Arial"/>
-        </w:rPr>
-        <w:t>bd_turnos</w:t>
-      </w:r>
-      <w:proofErr w:type="spellEnd"/>
-      <w:r>
-        <w:rPr>
-          <w:rFonts w:ascii="Arial" w:hAnsi="Arial" w:cs="Arial"/>
-        </w:rPr>
-        <w:t xml:space="preserve">, </w:t>
-      </w:r>
-      <w:proofErr w:type="spellStart"/>
-      <w:r>
-        <w:rPr>
-          <w:rFonts w:ascii="Arial" w:hAnsi="Arial" w:cs="Arial"/>
-        </w:rPr>
-        <w:t>bd_clientes</w:t>
-      </w:r>
-      <w:proofErr w:type="spellEnd"/>
-      <w:r>
-        <w:rPr>
-          <w:rFonts w:ascii="Arial" w:hAnsi="Arial" w:cs="Arial"/>
-        </w:rPr>
-        <w:t xml:space="preserve">, </w:t>
-      </w:r>
-      <w:proofErr w:type="spellStart"/>
-      <w:r>
-        <w:rPr>
-          <w:rFonts w:ascii="Arial" w:hAnsi="Arial" w:cs="Arial"/>
-        </w:rPr>
-        <w:t>bd_ventanillas</w:t>
-      </w:r>
-      <w:proofErr w:type="spellEnd"/>
-      <w:r>
-        <w:rPr>
-          <w:rFonts w:ascii="Arial" w:hAnsi="Arial" w:cs="Arial"/>
-        </w:rPr>
-        <w:t xml:space="preserve">, </w:t>
-      </w:r>
-      <w:proofErr w:type="spellStart"/>
-      <w:r>
-        <w:rPr>
-          <w:rFonts w:ascii="Arial" w:hAnsi="Arial" w:cs="Arial"/>
-        </w:rPr>
-        <w:t>bd_notificaciones</w:t>
-      </w:r>
-      <w:proofErr w:type="spellEnd"/>
-      <w:r>
-        <w:rPr>
-          <w:rFonts w:ascii="Arial" w:hAnsi="Arial" w:cs="Arial"/>
-        </w:rPr>
-        <w:t xml:space="preserve">), evitando el acoplamiento que se genera cuando varios servicios comparten una sola base de datos y permitiendo que cada uno </w:t>
-      </w:r>
-      <w:r>
-        <w:rPr>
-          <w:rFonts w:ascii="Arial" w:hAnsi="Arial" w:cs="Arial"/>
-        </w:rPr>
-        <w:lastRenderedPageBreak/>
-        <w:t>evolucione su esquema de forma independiente. La comunicación entre servicios se hace exclusivamente a través de sus APIS REST, nunca accediendo directamente a la base de datos de otro servicio.</w:t>
+        <w:t>Cada microservicio tendrá su propia base de datos (bd_turnos, bd_clientes, bd_ventanillas, bd_notificaciones), evitando el acoplamiento que se genera cuando varios servicios comparten una sola base de datos y permitiendo que cada uno evolucione su esquema de forma independiente. La comunicación entre servicios se hace exclusivamente a través de sus APIS REST, nunca accediendo directamente a la base de datos de otro servicio.</w:t>
       </w:r>
     </w:p>
     <w:p>
@@ -2152,6 +2847,7 @@
         <w:rPr>
           <w:rFonts w:ascii="Arial" w:hAnsi="Arial" w:cs="Arial"/>
         </w:rPr>
+        <w:lastRenderedPageBreak/>
         <w:t xml:space="preserve">Cliente: </w:t>
       </w:r>
       <w:r>
@@ -2482,24 +3178,6 @@
     </w:p>
     <w:p>
       <w:pPr>
-        <w:pStyle w:val="NormalWeb"/>
-        <w:jc w:val="both"/>
-        <w:rPr>
-          <w:rFonts w:ascii="Arial" w:hAnsi="Arial" w:cs="Arial"/>
-        </w:rPr>
-      </w:pPr>
-      <w:r>
-        <w:rPr>
-          <w:rFonts w:ascii="Arial" w:hAnsi="Arial" w:cs="Arial"/>
-        </w:rPr>
-        <w:lastRenderedPageBreak/>
-        <w:t>jjjjjjj</w:t>
-      </w:r>
-      <w:bookmarkStart w:id="0" w:name="_GoBack"/>
-      <w:bookmarkEnd w:id="0"/>
-    </w:p>
-    <w:p>
-      <w:pPr>
         <w:pStyle w:val="Ttulo1"/>
         <w:jc w:val="both"/>
         <w:rPr>
@@ -2550,7 +3228,9 @@
         <w:rPr>
           <w:rFonts w:ascii="Arial" w:hAnsi="Arial" w:cs="Arial"/>
           <w:noProof/>
-        </w:rPr>
+          <w:lang w:val="es-ES" w:eastAsia="es-ES"/>
+        </w:rPr>
+        <w:lastRenderedPageBreak/>
         <w:drawing>
           <wp:inline distT="0" distB="0" distL="0" distR="0" wp14:anchorId="3A3C42B8" wp14:editId="5585BEB2">
             <wp:extent cx="5612130" cy="6024245"/>
@@ -2615,7 +3295,6 @@
           <w:sz w:val="24"/>
           <w:szCs w:val="24"/>
         </w:rPr>
-        <w:lastRenderedPageBreak/>
         <w:t>PARTE 9 — COMMIT Y PULL REQUEST</w:t>
       </w:r>
     </w:p>
@@ -2646,19 +3325,11 @@
           <w:rFonts w:ascii="Arial" w:hAnsi="Arial" w:cs="Arial"/>
         </w:rPr>
       </w:pPr>
-      <w:proofErr w:type="spellStart"/>
-      <w:r>
-        <w:rPr>
-          <w:rFonts w:ascii="Arial" w:hAnsi="Arial" w:cs="Arial"/>
-        </w:rPr>
-        <w:t>Commit</w:t>
-      </w:r>
-      <w:proofErr w:type="spellEnd"/>
-      <w:r>
-        <w:rPr>
-          <w:rFonts w:ascii="Arial" w:hAnsi="Arial" w:cs="Arial"/>
-        </w:rPr>
-        <w:t xml:space="preserve"> por sección:</w:t>
+      <w:r>
+        <w:rPr>
+          <w:rFonts w:ascii="Arial" w:hAnsi="Arial" w:cs="Arial"/>
+        </w:rPr>
+        <w:t>Commit por sección:</w:t>
       </w:r>
     </w:p>
     <w:p>
@@ -2668,21 +3339,21 @@
           <w:lang w:eastAsia="es-CO"/>
         </w:rPr>
       </w:pPr>
-      <w:proofErr w:type="spellStart"/>
       <w:r>
         <w:rPr>
           <w:rFonts w:ascii="Arial" w:eastAsia="Times New Roman" w:hAnsi="Arial" w:cs="Arial"/>
           <w:lang w:eastAsia="es-CO"/>
         </w:rPr>
-        <w:t>doc</w:t>
-      </w:r>
-      <w:proofErr w:type="spellEnd"/>
+        <w:lastRenderedPageBreak/>
+        <w:t>doc: definición de servicios</w:t>
+      </w:r>
       <w:r>
         <w:rPr>
           <w:rFonts w:ascii="Arial" w:eastAsia="Times New Roman" w:hAnsi="Arial" w:cs="Arial"/>
           <w:lang w:eastAsia="es-CO"/>
         </w:rPr>
-        <w:t>: definición de servicios</w:t>
+        <w:br/>
+        <w:t>doc: comunicación entre servicios</w:t>
       </w:r>
       <w:r>
         <w:rPr>
@@ -2690,68 +3361,15 @@
           <w:lang w:eastAsia="es-CO"/>
         </w:rPr>
         <w:br/>
-      </w:r>
-      <w:proofErr w:type="spellStart"/>
+        <w:t>doc: arquitectura seleccionada</w:t>
+      </w:r>
       <w:r>
         <w:rPr>
           <w:rFonts w:ascii="Arial" w:eastAsia="Times New Roman" w:hAnsi="Arial" w:cs="Arial"/>
           <w:lang w:eastAsia="es-CO"/>
         </w:rPr>
-        <w:t>doc</w:t>
-      </w:r>
-      <w:proofErr w:type="spellEnd"/>
-      <w:r>
-        <w:rPr>
-          <w:rFonts w:ascii="Arial" w:eastAsia="Times New Roman" w:hAnsi="Arial" w:cs="Arial"/>
-          <w:lang w:eastAsia="es-CO"/>
-        </w:rPr>
-        <w:t>: comunicación entre servicios</w:t>
-      </w:r>
-      <w:r>
-        <w:rPr>
-          <w:rFonts w:ascii="Arial" w:eastAsia="Times New Roman" w:hAnsi="Arial" w:cs="Arial"/>
-          <w:lang w:eastAsia="es-CO"/>
-        </w:rPr>
         <w:br/>
-      </w:r>
-      <w:proofErr w:type="spellStart"/>
-      <w:r>
-        <w:rPr>
-          <w:rFonts w:ascii="Arial" w:eastAsia="Times New Roman" w:hAnsi="Arial" w:cs="Arial"/>
-          <w:lang w:eastAsia="es-CO"/>
-        </w:rPr>
-        <w:t>doc</w:t>
-      </w:r>
-      <w:proofErr w:type="spellEnd"/>
-      <w:r>
-        <w:rPr>
-          <w:rFonts w:ascii="Arial" w:eastAsia="Times New Roman" w:hAnsi="Arial" w:cs="Arial"/>
-          <w:lang w:eastAsia="es-CO"/>
-        </w:rPr>
-        <w:t>: arquitectura seleccionada</w:t>
-      </w:r>
-      <w:r>
-        <w:rPr>
-          <w:rFonts w:ascii="Arial" w:eastAsia="Times New Roman" w:hAnsi="Arial" w:cs="Arial"/>
-          <w:lang w:eastAsia="es-CO"/>
-        </w:rPr>
-        <w:br/>
-      </w:r>
-      <w:proofErr w:type="spellStart"/>
-      <w:r>
-        <w:rPr>
-          <w:rFonts w:ascii="Arial" w:eastAsia="Times New Roman" w:hAnsi="Arial" w:cs="Arial"/>
-          <w:lang w:eastAsia="es-CO"/>
-        </w:rPr>
-        <w:t>doc</w:t>
-      </w:r>
-      <w:proofErr w:type="spellEnd"/>
-      <w:r>
-        <w:rPr>
-          <w:rFonts w:ascii="Arial" w:eastAsia="Times New Roman" w:hAnsi="Arial" w:cs="Arial"/>
-          <w:lang w:eastAsia="es-CO"/>
-        </w:rPr>
-        <w:t>: usuarios del sistema</w:t>
+        <w:t>doc: usuarios del sistema</w:t>
       </w:r>
     </w:p>
     <w:p>
@@ -2766,35 +3384,7 @@
         <w:rPr>
           <w:rFonts w:ascii="Arial" w:hAnsi="Arial" w:cs="Arial"/>
         </w:rPr>
-        <w:t xml:space="preserve">Luego crear </w:t>
-      </w:r>
-      <w:proofErr w:type="spellStart"/>
-      <w:r>
-        <w:rPr>
-          <w:rFonts w:ascii="Arial" w:hAnsi="Arial" w:cs="Arial"/>
-        </w:rPr>
-        <w:t>Pull</w:t>
-      </w:r>
-      <w:proofErr w:type="spellEnd"/>
-      <w:r>
-        <w:rPr>
-          <w:rFonts w:ascii="Arial" w:hAnsi="Arial" w:cs="Arial"/>
-        </w:rPr>
-        <w:t xml:space="preserve"> </w:t>
-      </w:r>
-      <w:proofErr w:type="spellStart"/>
-      <w:r>
-        <w:rPr>
-          <w:rFonts w:ascii="Arial" w:hAnsi="Arial" w:cs="Arial"/>
-        </w:rPr>
-        <w:t>Request</w:t>
-      </w:r>
-      <w:proofErr w:type="spellEnd"/>
-      <w:r>
-        <w:rPr>
-          <w:rFonts w:ascii="Arial" w:hAnsi="Arial" w:cs="Arial"/>
-        </w:rPr>
-        <w:t>:</w:t>
+        <w:t>Luego crear Pull Request:</w:t>
       </w:r>
     </w:p>
     <w:p>
@@ -2807,7 +3397,7 @@
       </w:pPr>
       <w:r>
         <w:rPr>
-          <w:rStyle w:val="Textoennegrita"/>
+          <w:rStyle w:val="Fuerte"/>
           <w:rFonts w:ascii="Arial" w:hAnsi="Arial" w:cs="Arial"/>
         </w:rPr>
         <w:t>Título:</w:t>
@@ -2830,7 +3420,7 @@
       </w:pPr>
       <w:r>
         <w:rPr>
-          <w:rStyle w:val="Textoennegrita"/>
+          <w:rStyle w:val="Fuerte"/>
           <w:rFonts w:ascii="Arial" w:hAnsi="Arial" w:cs="Arial"/>
         </w:rPr>
         <w:t>Descripción:</w:t>
@@ -3026,7 +3616,7 @@
 </file>
 
 <file path=word/endnotes.xml><?xml version="1.0" encoding="utf-8"?>
-<w:endnotes xmlns:wpc="http://schemas.microsoft.com/office/word/2010/wordprocessingCanvas" xmlns:cx="http://schemas.microsoft.com/office/drawing/2014/chartex" xmlns:mc="http://schemas.openxmlformats.org/markup-compatibility/2006" xmlns:o="urn:schemas-microsoft-com:office:office" xmlns:r="http://schemas.openxmlformats.org/officeDocument/2006/relationships" xmlns:m="http://schemas.openxmlformats.org/officeDocument/2006/math" xmlns:v="urn:schemas-microsoft-com:vml" xmlns:wp14="http://schemas.microsoft.com/office/word/2010/wordprocessingDrawing" xmlns:wp="http://schemas.openxmlformats.org/drawingml/2006/wordprocessingDrawing" xmlns:w10="urn:schemas-microsoft-com:office:word" xmlns:w="http://schemas.openxmlformats.org/wordprocessingml/2006/main" xmlns:w14="http://schemas.microsoft.com/office/word/2010/wordml" xmlns:w15="http://schemas.microsoft.com/office/word/2012/wordml" xmlns:w16se="http://schemas.microsoft.com/office/word/2015/wordml/symex" xmlns:wpg="http://schemas.microsoft.com/office/word/2010/wordprocessingGroup" xmlns:wpi="http://schemas.microsoft.com/office/word/2010/wordprocessingInk" xmlns:wne="http://schemas.microsoft.com/office/word/2006/wordml" xmlns:wps="http://schemas.microsoft.com/office/word/2010/wordprocessingShape" mc:Ignorable="w14 w15 w16se wp14">
+<w:endnotes xmlns:wpc="http://schemas.microsoft.com/office/word/2010/wordprocessingCanvas" xmlns:cx="http://schemas.microsoft.com/office/drawing/2014/chartex" xmlns:cx1="http://schemas.microsoft.com/office/drawing/2015/9/8/chartex" xmlns:cx2="http://schemas.microsoft.com/office/drawing/2015/10/21/chartex" xmlns:cx3="http://schemas.microsoft.com/office/drawing/2016/5/9/chartex" xmlns:cx4="http://schemas.microsoft.com/office/drawing/2016/5/10/chartex" xmlns:cx5="http://schemas.microsoft.com/office/drawing/2016/5/11/chartex" xmlns:cx6="http://schemas.microsoft.com/office/drawing/2016/5/12/chartex" xmlns:cx7="http://schemas.microsoft.com/office/drawing/2016/5/13/chartex" xmlns:cx8="http://schemas.microsoft.com/office/drawing/2016/5/14/chartex" xmlns:mc="http://schemas.openxmlformats.org/markup-compatibility/2006" xmlns:aink="http://schemas.microsoft.com/office/drawing/2016/ink" xmlns:am3d="http://schemas.microsoft.com/office/drawing/2017/model3d" xmlns:o="urn:schemas-microsoft-com:office:office" xmlns:oel="http://schemas.microsoft.com/office/2019/extlst" xmlns:r="http://schemas.openxmlformats.org/officeDocument/2006/relationships" xmlns:m="http://schemas.openxmlformats.org/officeDocument/2006/math" xmlns:v="urn:schemas-microsoft-com:vml" xmlns:wp14="http://schemas.microsoft.com/office/word/2010/wordprocessingDrawing" xmlns:wp="http://schemas.openxmlformats.org/drawingml/2006/wordprocessingDrawing" xmlns:w10="urn:schemas-microsoft-com:office:word" xmlns:w="http://schemas.openxmlformats.org/wordprocessingml/2006/main" xmlns:w14="http://schemas.microsoft.com/office/word/2010/wordml" xmlns:w15="http://schemas.microsoft.com/office/word/2012/wordml" xmlns:w16cex="http://schemas.microsoft.com/office/word/2018/wordml/cex" xmlns:w16cid="http://schemas.microsoft.com/office/word/2016/wordml/cid" xmlns:w16="http://schemas.microsoft.com/office/word/2018/wordml" xmlns:w16du="http://schemas.microsoft.com/office/word/2023/wordml/word16du" xmlns:w16sdtdh="http://schemas.microsoft.com/office/word/2020/wordml/sdtdatahash" xmlns:w16sdtfl="http://schemas.microsoft.com/office/word/2024/wordml/sdtformatlock" xmlns:w16se="http://schemas.microsoft.com/office/word/2015/wordml/symex" xmlns:wpg="http://schemas.microsoft.com/office/word/2010/wordprocessingGroup" xmlns:wpi="http://schemas.microsoft.com/office/word/2010/wordprocessingInk" xmlns:wne="http://schemas.microsoft.com/office/word/2006/wordml" xmlns:wps="http://schemas.microsoft.com/office/word/2010/wordprocessingShape" mc:Ignorable="w14 w15 w16se w16cid w16 w16cex w16sdtdh w16sdtfl w16du wp14">
   <w:endnote w:type="separator" w:id="-1">
     <w:p>
       <w:r>
@@ -3045,7 +3635,7 @@
 </file>
 
 <file path=word/footnotes.xml><?xml version="1.0" encoding="utf-8"?>
-<w:footnotes xmlns:wpc="http://schemas.microsoft.com/office/word/2010/wordprocessingCanvas" xmlns:cx="http://schemas.microsoft.com/office/drawing/2014/chartex" xmlns:mc="http://schemas.openxmlformats.org/markup-compatibility/2006" xmlns:o="urn:schemas-microsoft-com:office:office" xmlns:r="http://schemas.openxmlformats.org/officeDocument/2006/relationships" xmlns:m="http://schemas.openxmlformats.org/officeDocument/2006/math" xmlns:v="urn:schemas-microsoft-com:vml" xmlns:wp14="http://schemas.microsoft.com/office/word/2010/wordprocessingDrawing" xmlns:wp="http://schemas.openxmlformats.org/drawingml/2006/wordprocessingDrawing" xmlns:w10="urn:schemas-microsoft-com:office:word" xmlns:w="http://schemas.openxmlformats.org/wordprocessingml/2006/main" xmlns:w14="http://schemas.microsoft.com/office/word/2010/wordml" xmlns:w15="http://schemas.microsoft.com/office/word/2012/wordml" xmlns:w16se="http://schemas.microsoft.com/office/word/2015/wordml/symex" xmlns:wpg="http://schemas.microsoft.com/office/word/2010/wordprocessingGroup" xmlns:wpi="http://schemas.microsoft.com/office/word/2010/wordprocessingInk" xmlns:wne="http://schemas.microsoft.com/office/word/2006/wordml" xmlns:wps="http://schemas.microsoft.com/office/word/2010/wordprocessingShape" mc:Ignorable="w14 w15 w16se wp14">
+<w:footnotes xmlns:wpc="http://schemas.microsoft.com/office/word/2010/wordprocessingCanvas" xmlns:cx="http://schemas.microsoft.com/office/drawing/2014/chartex" xmlns:cx1="http://schemas.microsoft.com/office/drawing/2015/9/8/chartex" xmlns:cx2="http://schemas.microsoft.com/office/drawing/2015/10/21/chartex" xmlns:cx3="http://schemas.microsoft.com/office/drawing/2016/5/9/chartex" xmlns:cx4="http://schemas.microsoft.com/office/drawing/2016/5/10/chartex" xmlns:cx5="http://schemas.microsoft.com/office/drawing/2016/5/11/chartex" xmlns:cx6="http://schemas.microsoft.com/office/drawing/2016/5/12/chartex" xmlns:cx7="http://schemas.microsoft.com/office/drawing/2016/5/13/chartex" xmlns:cx8="http://schemas.microsoft.com/office/drawing/2016/5/14/chartex" xmlns:mc="http://schemas.openxmlformats.org/markup-compatibility/2006" xmlns:aink="http://schemas.microsoft.com/office/drawing/2016/ink" xmlns:am3d="http://schemas.microsoft.com/office/drawing/2017/model3d" xmlns:o="urn:schemas-microsoft-com:office:office" xmlns:oel="http://schemas.microsoft.com/office/2019/extlst" xmlns:r="http://schemas.openxmlformats.org/officeDocument/2006/relationships" xmlns:m="http://schemas.openxmlformats.org/officeDocument/2006/math" xmlns:v="urn:schemas-microsoft-com:vml" xmlns:wp14="http://schemas.microsoft.com/office/word/2010/wordprocessingDrawing" xmlns:wp="http://schemas.openxmlformats.org/drawingml/2006/wordprocessingDrawing" xmlns:w10="urn:schemas-microsoft-com:office:word" xmlns:w="http://schemas.openxmlformats.org/wordprocessingml/2006/main" xmlns:w14="http://schemas.microsoft.com/office/word/2010/wordml" xmlns:w15="http://schemas.microsoft.com/office/word/2012/wordml" xmlns:w16cex="http://schemas.microsoft.com/office/word/2018/wordml/cex" xmlns:w16cid="http://schemas.microsoft.com/office/word/2016/wordml/cid" xmlns:w16="http://schemas.microsoft.com/office/word/2018/wordml" xmlns:w16du="http://schemas.microsoft.com/office/word/2023/wordml/word16du" xmlns:w16sdtdh="http://schemas.microsoft.com/office/word/2020/wordml/sdtdatahash" xmlns:w16sdtfl="http://schemas.microsoft.com/office/word/2024/wordml/sdtformatlock" xmlns:w16se="http://schemas.microsoft.com/office/word/2015/wordml/symex" xmlns:wpg="http://schemas.microsoft.com/office/word/2010/wordprocessingGroup" xmlns:wpi="http://schemas.microsoft.com/office/word/2010/wordprocessingInk" xmlns:wne="http://schemas.microsoft.com/office/word/2006/wordml" xmlns:wps="http://schemas.microsoft.com/office/word/2010/wordprocessingShape" mc:Ignorable="w14 w15 w16se w16cid w16 w16cex w16sdtdh w16sdtfl w16du wp14">
   <w:footnote w:type="separator" w:id="-1">
     <w:p>
       <w:r>
@@ -3064,7 +3654,7 @@
 </file>
 
 <file path=word/header1.xml><?xml version="1.0" encoding="utf-8"?>
-<w:hdr xmlns:wpc="http://schemas.microsoft.com/office/word/2010/wordprocessingCanvas" xmlns:cx="http://schemas.microsoft.com/office/drawing/2014/chartex" xmlns:mc="http://schemas.openxmlformats.org/markup-compatibility/2006" xmlns:o="urn:schemas-microsoft-com:office:office" xmlns:r="http://schemas.openxmlformats.org/officeDocument/2006/relationships" xmlns:m="http://schemas.openxmlformats.org/officeDocument/2006/math" xmlns:v="urn:schemas-microsoft-com:vml" xmlns:wp14="http://schemas.microsoft.com/office/word/2010/wordprocessingDrawing" xmlns:wp="http://schemas.openxmlformats.org/drawingml/2006/wordprocessingDrawing" xmlns:w10="urn:schemas-microsoft-com:office:word" xmlns:w="http://schemas.openxmlformats.org/wordprocessingml/2006/main" xmlns:w14="http://schemas.microsoft.com/office/word/2010/wordml" xmlns:w15="http://schemas.microsoft.com/office/word/2012/wordml" xmlns:w16se="http://schemas.microsoft.com/office/word/2015/wordml/symex" xmlns:wpg="http://schemas.microsoft.com/office/word/2010/wordprocessingGroup" xmlns:wpi="http://schemas.microsoft.com/office/word/2010/wordprocessingInk" xmlns:wne="http://schemas.microsoft.com/office/word/2006/wordml" xmlns:wps="http://schemas.microsoft.com/office/word/2010/wordprocessingShape" mc:Ignorable="w14 w15 w16se wp14">
+<w:hdr xmlns:wpc="http://schemas.microsoft.com/office/word/2010/wordprocessingCanvas" xmlns:cx="http://schemas.microsoft.com/office/drawing/2014/chartex" xmlns:cx1="http://schemas.microsoft.com/office/drawing/2015/9/8/chartex" xmlns:cx2="http://schemas.microsoft.com/office/drawing/2015/10/21/chartex" xmlns:cx3="http://schemas.microsoft.com/office/drawing/2016/5/9/chartex" xmlns:cx4="http://schemas.microsoft.com/office/drawing/2016/5/10/chartex" xmlns:cx5="http://schemas.microsoft.com/office/drawing/2016/5/11/chartex" xmlns:cx6="http://schemas.microsoft.com/office/drawing/2016/5/12/chartex" xmlns:cx7="http://schemas.microsoft.com/office/drawing/2016/5/13/chartex" xmlns:cx8="http://schemas.microsoft.com/office/drawing/2016/5/14/chartex" xmlns:mc="http://schemas.openxmlformats.org/markup-compatibility/2006" xmlns:aink="http://schemas.microsoft.com/office/drawing/2016/ink" xmlns:am3d="http://schemas.microsoft.com/office/drawing/2017/model3d" xmlns:o="urn:schemas-microsoft-com:office:office" xmlns:oel="http://schemas.microsoft.com/office/2019/extlst" xmlns:r="http://schemas.openxmlformats.org/officeDocument/2006/relationships" xmlns:m="http://schemas.openxmlformats.org/officeDocument/2006/math" xmlns:v="urn:schemas-microsoft-com:vml" xmlns:wp14="http://schemas.microsoft.com/office/word/2010/wordprocessingDrawing" xmlns:wp="http://schemas.openxmlformats.org/drawingml/2006/wordprocessingDrawing" xmlns:w10="urn:schemas-microsoft-com:office:word" xmlns:w="http://schemas.openxmlformats.org/wordprocessingml/2006/main" xmlns:w14="http://schemas.microsoft.com/office/word/2010/wordml" xmlns:w15="http://schemas.microsoft.com/office/word/2012/wordml" xmlns:w16cex="http://schemas.microsoft.com/office/word/2018/wordml/cex" xmlns:w16cid="http://schemas.microsoft.com/office/word/2016/wordml/cid" xmlns:w16="http://schemas.microsoft.com/office/word/2018/wordml" xmlns:w16du="http://schemas.microsoft.com/office/word/2023/wordml/word16du" xmlns:w16sdtdh="http://schemas.microsoft.com/office/word/2020/wordml/sdtdatahash" xmlns:w16sdtfl="http://schemas.microsoft.com/office/word/2024/wordml/sdtformatlock" xmlns:w16se="http://schemas.microsoft.com/office/word/2015/wordml/symex" xmlns:wpg="http://schemas.microsoft.com/office/word/2010/wordprocessingGroup" xmlns:wpi="http://schemas.microsoft.com/office/word/2010/wordprocessingInk" xmlns:wne="http://schemas.microsoft.com/office/word/2006/wordml" xmlns:wps="http://schemas.microsoft.com/office/word/2010/wordprocessingShape" mc:Ignorable="w14 w15 w16se w16cid w16 w16cex w16sdtdh w16sdtfl w16du wp14">
   <w:p>
     <w:pPr>
       <w:pStyle w:val="Encabezado"/>
@@ -3072,7 +3662,7 @@
     <w:r>
       <w:rPr>
         <w:noProof/>
-        <w:lang w:eastAsia="es-CO"/>
+        <w:lang w:val="es-ES" w:eastAsia="es-ES"/>
       </w:rPr>
       <w:drawing>
         <wp:anchor distT="0" distB="0" distL="114300" distR="114300" simplePos="0" relativeHeight="251658240" behindDoc="1" locked="0" layoutInCell="1" allowOverlap="1" wp14:anchorId="57DE69A7" wp14:editId="0A881625">
@@ -3135,7 +3725,7 @@
 </file>
 
 <file path=word/numbering.xml><?xml version="1.0" encoding="utf-8"?>
-<w:numbering xmlns:wpc="http://schemas.microsoft.com/office/word/2010/wordprocessingCanvas" xmlns:cx="http://schemas.microsoft.com/office/drawing/2014/chartex" xmlns:mc="http://schemas.openxmlformats.org/markup-compatibility/2006" xmlns:o="urn:schemas-microsoft-com:office:office" xmlns:r="http://schemas.openxmlformats.org/officeDocument/2006/relationships" xmlns:m="http://schemas.openxmlformats.org/officeDocument/2006/math" xmlns:v="urn:schemas-microsoft-com:vml" xmlns:wp14="http://schemas.microsoft.com/office/word/2010/wordprocessingDrawing" xmlns:wp="http://schemas.openxmlformats.org/drawingml/2006/wordprocessingDrawing" xmlns:w10="urn:schemas-microsoft-com:office:word" xmlns:w="http://schemas.openxmlformats.org/wordprocessingml/2006/main" xmlns:w14="http://schemas.microsoft.com/office/word/2010/wordml" xmlns:w15="http://schemas.microsoft.com/office/word/2012/wordml" xmlns:w16se="http://schemas.microsoft.com/office/word/2015/wordml/symex" xmlns:wpg="http://schemas.microsoft.com/office/word/2010/wordprocessingGroup" xmlns:wpi="http://schemas.microsoft.com/office/word/2010/wordprocessingInk" xmlns:wne="http://schemas.microsoft.com/office/word/2006/wordml" xmlns:wps="http://schemas.microsoft.com/office/word/2010/wordprocessingShape" mc:Ignorable="w14 w15 w16se wp14">
+<w:numbering xmlns:wpc="http://schemas.microsoft.com/office/word/2010/wordprocessingCanvas" xmlns:cx="http://schemas.microsoft.com/office/drawing/2014/chartex" xmlns:cx1="http://schemas.microsoft.com/office/drawing/2015/9/8/chartex" xmlns:cx2="http://schemas.microsoft.com/office/drawing/2015/10/21/chartex" xmlns:cx3="http://schemas.microsoft.com/office/drawing/2016/5/9/chartex" xmlns:cx4="http://schemas.microsoft.com/office/drawing/2016/5/10/chartex" xmlns:cx5="http://schemas.microsoft.com/office/drawing/2016/5/11/chartex" xmlns:cx6="http://schemas.microsoft.com/office/drawing/2016/5/12/chartex" xmlns:cx7="http://schemas.microsoft.com/office/drawing/2016/5/13/chartex" xmlns:cx8="http://schemas.microsoft.com/office/drawing/2016/5/14/chartex" xmlns:mc="http://schemas.openxmlformats.org/markup-compatibility/2006" xmlns:aink="http://schemas.microsoft.com/office/drawing/2016/ink" xmlns:am3d="http://schemas.microsoft.com/office/drawing/2017/model3d" xmlns:o="urn:schemas-microsoft-com:office:office" xmlns:oel="http://schemas.microsoft.com/office/2019/extlst" xmlns:r="http://schemas.openxmlformats.org/officeDocument/2006/relationships" xmlns:m="http://schemas.openxmlformats.org/officeDocument/2006/math" xmlns:v="urn:schemas-microsoft-com:vml" xmlns:wp14="http://schemas.microsoft.com/office/word/2010/wordprocessingDrawing" xmlns:wp="http://schemas.openxmlformats.org/drawingml/2006/wordprocessingDrawing" xmlns:w10="urn:schemas-microsoft-com:office:word" xmlns:w="http://schemas.openxmlformats.org/wordprocessingml/2006/main" xmlns:w14="http://schemas.microsoft.com/office/word/2010/wordml" xmlns:w15="http://schemas.microsoft.com/office/word/2012/wordml" xmlns:w16cex="http://schemas.microsoft.com/office/word/2018/wordml/cex" xmlns:w16cid="http://schemas.microsoft.com/office/word/2016/wordml/cid" xmlns:w16="http://schemas.microsoft.com/office/word/2018/wordml" xmlns:w16du="http://schemas.microsoft.com/office/word/2023/wordml/word16du" xmlns:w16sdtdh="http://schemas.microsoft.com/office/word/2020/wordml/sdtdatahash" xmlns:w16sdtfl="http://schemas.microsoft.com/office/word/2024/wordml/sdtformatlock" xmlns:w16se="http://schemas.microsoft.com/office/word/2015/wordml/symex" xmlns:wpg="http://schemas.microsoft.com/office/word/2010/wordprocessingGroup" xmlns:wpi="http://schemas.microsoft.com/office/word/2010/wordprocessingInk" xmlns:wne="http://schemas.microsoft.com/office/word/2006/wordml" xmlns:wps="http://schemas.microsoft.com/office/word/2010/wordprocessingShape" mc:Ignorable="w14 w15 w16se w16cid w16 w16cex w16sdtdh w16sdtfl w16du wp14">
   <w:abstractNum w:abstractNumId="0" w15:restartNumberingAfterBreak="0">
     <w:nsid w:val="06051E9F"/>
     <w:multiLevelType w:val="multilevel"/>
@@ -3286,6 +3876,155 @@
     </w:lvl>
   </w:abstractNum>
   <w:abstractNum w:abstractNumId="1" w15:restartNumberingAfterBreak="0">
+    <w:nsid w:val="0772588D"/>
+    <w:multiLevelType w:val="multilevel"/>
+    <w:tmpl w:val="E124C2B8"/>
+    <w:lvl w:ilvl="0">
+      <w:start w:val="1"/>
+      <w:numFmt w:val="bullet"/>
+      <w:lvlText w:val=""/>
+      <w:lvlJc w:val="left"/>
+      <w:pPr>
+        <w:tabs>
+          <w:tab w:val="num" w:pos="720"/>
+        </w:tabs>
+        <w:ind w:left="720" w:hanging="360"/>
+      </w:pPr>
+      <w:rPr>
+        <w:rFonts w:ascii="Symbol" w:hAnsi="Symbol" w:hint="default"/>
+        <w:sz w:val="20"/>
+      </w:rPr>
+    </w:lvl>
+    <w:lvl w:ilvl="1" w:tentative="1">
+      <w:start w:val="1"/>
+      <w:numFmt w:val="bullet"/>
+      <w:lvlText w:val="o"/>
+      <w:lvlJc w:val="left"/>
+      <w:pPr>
+        <w:tabs>
+          <w:tab w:val="num" w:pos="1440"/>
+        </w:tabs>
+        <w:ind w:left="1440" w:hanging="360"/>
+      </w:pPr>
+      <w:rPr>
+        <w:rFonts w:ascii="Courier New" w:hAnsi="Courier New" w:hint="default"/>
+        <w:sz w:val="20"/>
+      </w:rPr>
+    </w:lvl>
+    <w:lvl w:ilvl="2" w:tentative="1">
+      <w:start w:val="1"/>
+      <w:numFmt w:val="bullet"/>
+      <w:lvlText w:val=""/>
+      <w:lvlJc w:val="left"/>
+      <w:pPr>
+        <w:tabs>
+          <w:tab w:val="num" w:pos="2160"/>
+        </w:tabs>
+        <w:ind w:left="2160" w:hanging="360"/>
+      </w:pPr>
+      <w:rPr>
+        <w:rFonts w:ascii="Wingdings" w:hAnsi="Wingdings" w:hint="default"/>
+        <w:sz w:val="20"/>
+      </w:rPr>
+    </w:lvl>
+    <w:lvl w:ilvl="3" w:tentative="1">
+      <w:start w:val="1"/>
+      <w:numFmt w:val="bullet"/>
+      <w:lvlText w:val=""/>
+      <w:lvlJc w:val="left"/>
+      <w:pPr>
+        <w:tabs>
+          <w:tab w:val="num" w:pos="2880"/>
+        </w:tabs>
+        <w:ind w:left="2880" w:hanging="360"/>
+      </w:pPr>
+      <w:rPr>
+        <w:rFonts w:ascii="Wingdings" w:hAnsi="Wingdings" w:hint="default"/>
+        <w:sz w:val="20"/>
+      </w:rPr>
+    </w:lvl>
+    <w:lvl w:ilvl="4" w:tentative="1">
+      <w:start w:val="1"/>
+      <w:numFmt w:val="bullet"/>
+      <w:lvlText w:val=""/>
+      <w:lvlJc w:val="left"/>
+      <w:pPr>
+        <w:tabs>
+          <w:tab w:val="num" w:pos="3600"/>
+        </w:tabs>
+        <w:ind w:left="3600" w:hanging="360"/>
+      </w:pPr>
+      <w:rPr>
+        <w:rFonts w:ascii="Wingdings" w:hAnsi="Wingdings" w:hint="default"/>
+        <w:sz w:val="20"/>
+      </w:rPr>
+    </w:lvl>
+    <w:lvl w:ilvl="5" w:tentative="1">
+      <w:start w:val="1"/>
+      <w:numFmt w:val="bullet"/>
+      <w:lvlText w:val=""/>
+      <w:lvlJc w:val="left"/>
+      <w:pPr>
+        <w:tabs>
+          <w:tab w:val="num" w:pos="4320"/>
+        </w:tabs>
+        <w:ind w:left="4320" w:hanging="360"/>
+      </w:pPr>
+      <w:rPr>
+        <w:rFonts w:ascii="Wingdings" w:hAnsi="Wingdings" w:hint="default"/>
+        <w:sz w:val="20"/>
+      </w:rPr>
+    </w:lvl>
+    <w:lvl w:ilvl="6" w:tentative="1">
+      <w:start w:val="1"/>
+      <w:numFmt w:val="bullet"/>
+      <w:lvlText w:val=""/>
+      <w:lvlJc w:val="left"/>
+      <w:pPr>
+        <w:tabs>
+          <w:tab w:val="num" w:pos="5040"/>
+        </w:tabs>
+        <w:ind w:left="5040" w:hanging="360"/>
+      </w:pPr>
+      <w:rPr>
+        <w:rFonts w:ascii="Wingdings" w:hAnsi="Wingdings" w:hint="default"/>
+        <w:sz w:val="20"/>
+      </w:rPr>
+    </w:lvl>
+    <w:lvl w:ilvl="7" w:tentative="1">
+      <w:start w:val="1"/>
+      <w:numFmt w:val="bullet"/>
+      <w:lvlText w:val=""/>
+      <w:lvlJc w:val="left"/>
+      <w:pPr>
+        <w:tabs>
+          <w:tab w:val="num" w:pos="5760"/>
+        </w:tabs>
+        <w:ind w:left="5760" w:hanging="360"/>
+      </w:pPr>
+      <w:rPr>
+        <w:rFonts w:ascii="Wingdings" w:hAnsi="Wingdings" w:hint="default"/>
+        <w:sz w:val="20"/>
+      </w:rPr>
+    </w:lvl>
+    <w:lvl w:ilvl="8" w:tentative="1">
+      <w:start w:val="1"/>
+      <w:numFmt w:val="bullet"/>
+      <w:lvlText w:val=""/>
+      <w:lvlJc w:val="left"/>
+      <w:pPr>
+        <w:tabs>
+          <w:tab w:val="num" w:pos="6480"/>
+        </w:tabs>
+        <w:ind w:left="6480" w:hanging="360"/>
+      </w:pPr>
+      <w:rPr>
+        <w:rFonts w:ascii="Wingdings" w:hAnsi="Wingdings" w:hint="default"/>
+        <w:sz w:val="20"/>
+      </w:rPr>
+    </w:lvl>
+  </w:abstractNum>
+  <w:abstractNum w:abstractNumId="2" w15:restartNumberingAfterBreak="0">
     <w:nsid w:val="098E43C6"/>
     <w:multiLevelType w:val="hybridMultilevel"/>
     <w:tmpl w:val="67E2CEF0"/>
@@ -3374,7 +4113,7 @@
       </w:pPr>
     </w:lvl>
   </w:abstractNum>
-  <w:abstractNum w:abstractNumId="2" w15:restartNumberingAfterBreak="0">
+  <w:abstractNum w:abstractNumId="3" w15:restartNumberingAfterBreak="0">
     <w:nsid w:val="0ED77C8B"/>
     <w:multiLevelType w:val="multilevel"/>
     <w:tmpl w:val="75C48196"/>
@@ -3487,7 +4226,156 @@
       </w:pPr>
     </w:lvl>
   </w:abstractNum>
-  <w:abstractNum w:abstractNumId="3" w15:restartNumberingAfterBreak="0">
+  <w:abstractNum w:abstractNumId="4" w15:restartNumberingAfterBreak="0">
+    <w:nsid w:val="0F9C7ED2"/>
+    <w:multiLevelType w:val="multilevel"/>
+    <w:tmpl w:val="3C1449E2"/>
+    <w:lvl w:ilvl="0">
+      <w:start w:val="1"/>
+      <w:numFmt w:val="bullet"/>
+      <w:lvlText w:val=""/>
+      <w:lvlJc w:val="left"/>
+      <w:pPr>
+        <w:tabs>
+          <w:tab w:val="num" w:pos="720"/>
+        </w:tabs>
+        <w:ind w:left="720" w:hanging="360"/>
+      </w:pPr>
+      <w:rPr>
+        <w:rFonts w:ascii="Symbol" w:hAnsi="Symbol" w:hint="default"/>
+        <w:sz w:val="20"/>
+      </w:rPr>
+    </w:lvl>
+    <w:lvl w:ilvl="1" w:tentative="1">
+      <w:start w:val="1"/>
+      <w:numFmt w:val="bullet"/>
+      <w:lvlText w:val="o"/>
+      <w:lvlJc w:val="left"/>
+      <w:pPr>
+        <w:tabs>
+          <w:tab w:val="num" w:pos="1440"/>
+        </w:tabs>
+        <w:ind w:left="1440" w:hanging="360"/>
+      </w:pPr>
+      <w:rPr>
+        <w:rFonts w:ascii="Courier New" w:hAnsi="Courier New" w:hint="default"/>
+        <w:sz w:val="20"/>
+      </w:rPr>
+    </w:lvl>
+    <w:lvl w:ilvl="2" w:tentative="1">
+      <w:start w:val="1"/>
+      <w:numFmt w:val="bullet"/>
+      <w:lvlText w:val=""/>
+      <w:lvlJc w:val="left"/>
+      <w:pPr>
+        <w:tabs>
+          <w:tab w:val="num" w:pos="2160"/>
+        </w:tabs>
+        <w:ind w:left="2160" w:hanging="360"/>
+      </w:pPr>
+      <w:rPr>
+        <w:rFonts w:ascii="Wingdings" w:hAnsi="Wingdings" w:hint="default"/>
+        <w:sz w:val="20"/>
+      </w:rPr>
+    </w:lvl>
+    <w:lvl w:ilvl="3" w:tentative="1">
+      <w:start w:val="1"/>
+      <w:numFmt w:val="bullet"/>
+      <w:lvlText w:val=""/>
+      <w:lvlJc w:val="left"/>
+      <w:pPr>
+        <w:tabs>
+          <w:tab w:val="num" w:pos="2880"/>
+        </w:tabs>
+        <w:ind w:left="2880" w:hanging="360"/>
+      </w:pPr>
+      <w:rPr>
+        <w:rFonts w:ascii="Wingdings" w:hAnsi="Wingdings" w:hint="default"/>
+        <w:sz w:val="20"/>
+      </w:rPr>
+    </w:lvl>
+    <w:lvl w:ilvl="4" w:tentative="1">
+      <w:start w:val="1"/>
+      <w:numFmt w:val="bullet"/>
+      <w:lvlText w:val=""/>
+      <w:lvlJc w:val="left"/>
+      <w:pPr>
+        <w:tabs>
+          <w:tab w:val="num" w:pos="3600"/>
+        </w:tabs>
+        <w:ind w:left="3600" w:hanging="360"/>
+      </w:pPr>
+      <w:rPr>
+        <w:rFonts w:ascii="Wingdings" w:hAnsi="Wingdings" w:hint="default"/>
+        <w:sz w:val="20"/>
+      </w:rPr>
+    </w:lvl>
+    <w:lvl w:ilvl="5" w:tentative="1">
+      <w:start w:val="1"/>
+      <w:numFmt w:val="bullet"/>
+      <w:lvlText w:val=""/>
+      <w:lvlJc w:val="left"/>
+      <w:pPr>
+        <w:tabs>
+          <w:tab w:val="num" w:pos="4320"/>
+        </w:tabs>
+        <w:ind w:left="4320" w:hanging="360"/>
+      </w:pPr>
+      <w:rPr>
+        <w:rFonts w:ascii="Wingdings" w:hAnsi="Wingdings" w:hint="default"/>
+        <w:sz w:val="20"/>
+      </w:rPr>
+    </w:lvl>
+    <w:lvl w:ilvl="6" w:tentative="1">
+      <w:start w:val="1"/>
+      <w:numFmt w:val="bullet"/>
+      <w:lvlText w:val=""/>
+      <w:lvlJc w:val="left"/>
+      <w:pPr>
+        <w:tabs>
+          <w:tab w:val="num" w:pos="5040"/>
+        </w:tabs>
+        <w:ind w:left="5040" w:hanging="360"/>
+      </w:pPr>
+      <w:rPr>
+        <w:rFonts w:ascii="Wingdings" w:hAnsi="Wingdings" w:hint="default"/>
+        <w:sz w:val="20"/>
+      </w:rPr>
+    </w:lvl>
+    <w:lvl w:ilvl="7" w:tentative="1">
+      <w:start w:val="1"/>
+      <w:numFmt w:val="bullet"/>
+      <w:lvlText w:val=""/>
+      <w:lvlJc w:val="left"/>
+      <w:pPr>
+        <w:tabs>
+          <w:tab w:val="num" w:pos="5760"/>
+        </w:tabs>
+        <w:ind w:left="5760" w:hanging="360"/>
+      </w:pPr>
+      <w:rPr>
+        <w:rFonts w:ascii="Wingdings" w:hAnsi="Wingdings" w:hint="default"/>
+        <w:sz w:val="20"/>
+      </w:rPr>
+    </w:lvl>
+    <w:lvl w:ilvl="8" w:tentative="1">
+      <w:start w:val="1"/>
+      <w:numFmt w:val="bullet"/>
+      <w:lvlText w:val=""/>
+      <w:lvlJc w:val="left"/>
+      <w:pPr>
+        <w:tabs>
+          <w:tab w:val="num" w:pos="6480"/>
+        </w:tabs>
+        <w:ind w:left="6480" w:hanging="360"/>
+      </w:pPr>
+      <w:rPr>
+        <w:rFonts w:ascii="Wingdings" w:hAnsi="Wingdings" w:hint="default"/>
+        <w:sz w:val="20"/>
+      </w:rPr>
+    </w:lvl>
+  </w:abstractNum>
+  <w:abstractNum w:abstractNumId="5" w15:restartNumberingAfterBreak="0">
     <w:nsid w:val="10D575F9"/>
     <w:multiLevelType w:val="multilevel"/>
     <w:tmpl w:val="446C2F2A"/>
@@ -3636,7 +4524,7 @@
       </w:rPr>
     </w:lvl>
   </w:abstractNum>
-  <w:abstractNum w:abstractNumId="4" w15:restartNumberingAfterBreak="0">
+  <w:abstractNum w:abstractNumId="6" w15:restartNumberingAfterBreak="0">
     <w:nsid w:val="11ED5ECB"/>
     <w:multiLevelType w:val="multilevel"/>
     <w:tmpl w:val="A6545128"/>
@@ -3785,7 +4673,7 @@
       </w:rPr>
     </w:lvl>
   </w:abstractNum>
-  <w:abstractNum w:abstractNumId="5" w15:restartNumberingAfterBreak="0">
+  <w:abstractNum w:abstractNumId="7" w15:restartNumberingAfterBreak="0">
     <w:nsid w:val="11EE02DD"/>
     <w:multiLevelType w:val="hybridMultilevel"/>
     <w:tmpl w:val="1F28CA28"/>
@@ -3898,7 +4786,156 @@
       </w:rPr>
     </w:lvl>
   </w:abstractNum>
-  <w:abstractNum w:abstractNumId="6" w15:restartNumberingAfterBreak="0">
+  <w:abstractNum w:abstractNumId="8" w15:restartNumberingAfterBreak="0">
+    <w:nsid w:val="14F701BB"/>
+    <w:multiLevelType w:val="multilevel"/>
+    <w:tmpl w:val="24BA50CC"/>
+    <w:lvl w:ilvl="0">
+      <w:start w:val="1"/>
+      <w:numFmt w:val="bullet"/>
+      <w:lvlText w:val=""/>
+      <w:lvlJc w:val="left"/>
+      <w:pPr>
+        <w:tabs>
+          <w:tab w:val="num" w:pos="720"/>
+        </w:tabs>
+        <w:ind w:left="720" w:hanging="360"/>
+      </w:pPr>
+      <w:rPr>
+        <w:rFonts w:ascii="Symbol" w:hAnsi="Symbol" w:hint="default"/>
+        <w:sz w:val="20"/>
+      </w:rPr>
+    </w:lvl>
+    <w:lvl w:ilvl="1" w:tentative="1">
+      <w:start w:val="1"/>
+      <w:numFmt w:val="bullet"/>
+      <w:lvlText w:val="o"/>
+      <w:lvlJc w:val="left"/>
+      <w:pPr>
+        <w:tabs>
+          <w:tab w:val="num" w:pos="1440"/>
+        </w:tabs>
+        <w:ind w:left="1440" w:hanging="360"/>
+      </w:pPr>
+      <w:rPr>
+        <w:rFonts w:ascii="Courier New" w:hAnsi="Courier New" w:hint="default"/>
+        <w:sz w:val="20"/>
+      </w:rPr>
+    </w:lvl>
+    <w:lvl w:ilvl="2" w:tentative="1">
+      <w:start w:val="1"/>
+      <w:numFmt w:val="bullet"/>
+      <w:lvlText w:val=""/>
+      <w:lvlJc w:val="left"/>
+      <w:pPr>
+        <w:tabs>
+          <w:tab w:val="num" w:pos="2160"/>
+        </w:tabs>
+        <w:ind w:left="2160" w:hanging="360"/>
+      </w:pPr>
+      <w:rPr>
+        <w:rFonts w:ascii="Wingdings" w:hAnsi="Wingdings" w:hint="default"/>
+        <w:sz w:val="20"/>
+      </w:rPr>
+    </w:lvl>
+    <w:lvl w:ilvl="3" w:tentative="1">
+      <w:start w:val="1"/>
+      <w:numFmt w:val="bullet"/>
+      <w:lvlText w:val=""/>
+      <w:lvlJc w:val="left"/>
+      <w:pPr>
+        <w:tabs>
+          <w:tab w:val="num" w:pos="2880"/>
+        </w:tabs>
+        <w:ind w:left="2880" w:hanging="360"/>
+      </w:pPr>
+      <w:rPr>
+        <w:rFonts w:ascii="Wingdings" w:hAnsi="Wingdings" w:hint="default"/>
+        <w:sz w:val="20"/>
+      </w:rPr>
+    </w:lvl>
+    <w:lvl w:ilvl="4" w:tentative="1">
+      <w:start w:val="1"/>
+      <w:numFmt w:val="bullet"/>
+      <w:lvlText w:val=""/>
+      <w:lvlJc w:val="left"/>
+      <w:pPr>
+        <w:tabs>
+          <w:tab w:val="num" w:pos="3600"/>
+        </w:tabs>
+        <w:ind w:left="3600" w:hanging="360"/>
+      </w:pPr>
+      <w:rPr>
+        <w:rFonts w:ascii="Wingdings" w:hAnsi="Wingdings" w:hint="default"/>
+        <w:sz w:val="20"/>
+      </w:rPr>
+    </w:lvl>
+    <w:lvl w:ilvl="5" w:tentative="1">
+      <w:start w:val="1"/>
+      <w:numFmt w:val="bullet"/>
+      <w:lvlText w:val=""/>
+      <w:lvlJc w:val="left"/>
+      <w:pPr>
+        <w:tabs>
+          <w:tab w:val="num" w:pos="4320"/>
+        </w:tabs>
+        <w:ind w:left="4320" w:hanging="360"/>
+      </w:pPr>
+      <w:rPr>
+        <w:rFonts w:ascii="Wingdings" w:hAnsi="Wingdings" w:hint="default"/>
+        <w:sz w:val="20"/>
+      </w:rPr>
+    </w:lvl>
+    <w:lvl w:ilvl="6" w:tentative="1">
+      <w:start w:val="1"/>
+      <w:numFmt w:val="bullet"/>
+      <w:lvlText w:val=""/>
+      <w:lvlJc w:val="left"/>
+      <w:pPr>
+        <w:tabs>
+          <w:tab w:val="num" w:pos="5040"/>
+        </w:tabs>
+        <w:ind w:left="5040" w:hanging="360"/>
+      </w:pPr>
+      <w:rPr>
+        <w:rFonts w:ascii="Wingdings" w:hAnsi="Wingdings" w:hint="default"/>
+        <w:sz w:val="20"/>
+      </w:rPr>
+    </w:lvl>
+    <w:lvl w:ilvl="7" w:tentative="1">
+      <w:start w:val="1"/>
+      <w:numFmt w:val="bullet"/>
+      <w:lvlText w:val=""/>
+      <w:lvlJc w:val="left"/>
+      <w:pPr>
+        <w:tabs>
+          <w:tab w:val="num" w:pos="5760"/>
+        </w:tabs>
+        <w:ind w:left="5760" w:hanging="360"/>
+      </w:pPr>
+      <w:rPr>
+        <w:rFonts w:ascii="Wingdings" w:hAnsi="Wingdings" w:hint="default"/>
+        <w:sz w:val="20"/>
+      </w:rPr>
+    </w:lvl>
+    <w:lvl w:ilvl="8" w:tentative="1">
+      <w:start w:val="1"/>
+      <w:numFmt w:val="bullet"/>
+      <w:lvlText w:val=""/>
+      <w:lvlJc w:val="left"/>
+      <w:pPr>
+        <w:tabs>
+          <w:tab w:val="num" w:pos="6480"/>
+        </w:tabs>
+        <w:ind w:left="6480" w:hanging="360"/>
+      </w:pPr>
+      <w:rPr>
+        <w:rFonts w:ascii="Wingdings" w:hAnsi="Wingdings" w:hint="default"/>
+        <w:sz w:val="20"/>
+      </w:rPr>
+    </w:lvl>
+  </w:abstractNum>
+  <w:abstractNum w:abstractNumId="9" w15:restartNumberingAfterBreak="0">
     <w:nsid w:val="1500540A"/>
     <w:multiLevelType w:val="multilevel"/>
     <w:tmpl w:val="9A88DA6C"/>
@@ -4011,7 +5048,7 @@
       </w:pPr>
     </w:lvl>
   </w:abstractNum>
-  <w:abstractNum w:abstractNumId="7" w15:restartNumberingAfterBreak="0">
+  <w:abstractNum w:abstractNumId="10" w15:restartNumberingAfterBreak="0">
     <w:nsid w:val="181B0935"/>
     <w:multiLevelType w:val="multilevel"/>
     <w:tmpl w:val="A7E0AE34"/>
@@ -4127,7 +5164,7 @@
       </w:pPr>
     </w:lvl>
   </w:abstractNum>
-  <w:abstractNum w:abstractNumId="8" w15:restartNumberingAfterBreak="0">
+  <w:abstractNum w:abstractNumId="11" w15:restartNumberingAfterBreak="0">
     <w:nsid w:val="201A32AF"/>
     <w:multiLevelType w:val="multilevel"/>
     <w:tmpl w:val="5606B116"/>
@@ -4243,7 +5280,156 @@
       </w:pPr>
     </w:lvl>
   </w:abstractNum>
-  <w:abstractNum w:abstractNumId="9" w15:restartNumberingAfterBreak="0">
+  <w:abstractNum w:abstractNumId="12" w15:restartNumberingAfterBreak="0">
+    <w:nsid w:val="24D3779B"/>
+    <w:multiLevelType w:val="multilevel"/>
+    <w:tmpl w:val="B4DAA764"/>
+    <w:lvl w:ilvl="0">
+      <w:start w:val="1"/>
+      <w:numFmt w:val="bullet"/>
+      <w:lvlText w:val=""/>
+      <w:lvlJc w:val="left"/>
+      <w:pPr>
+        <w:tabs>
+          <w:tab w:val="num" w:pos="720"/>
+        </w:tabs>
+        <w:ind w:left="720" w:hanging="360"/>
+      </w:pPr>
+      <w:rPr>
+        <w:rFonts w:ascii="Symbol" w:hAnsi="Symbol" w:hint="default"/>
+        <w:sz w:val="20"/>
+      </w:rPr>
+    </w:lvl>
+    <w:lvl w:ilvl="1" w:tentative="1">
+      <w:start w:val="1"/>
+      <w:numFmt w:val="bullet"/>
+      <w:lvlText w:val="o"/>
+      <w:lvlJc w:val="left"/>
+      <w:pPr>
+        <w:tabs>
+          <w:tab w:val="num" w:pos="1440"/>
+        </w:tabs>
+        <w:ind w:left="1440" w:hanging="360"/>
+      </w:pPr>
+      <w:rPr>
+        <w:rFonts w:ascii="Courier New" w:hAnsi="Courier New" w:hint="default"/>
+        <w:sz w:val="20"/>
+      </w:rPr>
+    </w:lvl>
+    <w:lvl w:ilvl="2" w:tentative="1">
+      <w:start w:val="1"/>
+      <w:numFmt w:val="bullet"/>
+      <w:lvlText w:val=""/>
+      <w:lvlJc w:val="left"/>
+      <w:pPr>
+        <w:tabs>
+          <w:tab w:val="num" w:pos="2160"/>
+        </w:tabs>
+        <w:ind w:left="2160" w:hanging="360"/>
+      </w:pPr>
+      <w:rPr>
+        <w:rFonts w:ascii="Wingdings" w:hAnsi="Wingdings" w:hint="default"/>
+        <w:sz w:val="20"/>
+      </w:rPr>
+    </w:lvl>
+    <w:lvl w:ilvl="3" w:tentative="1">
+      <w:start w:val="1"/>
+      <w:numFmt w:val="bullet"/>
+      <w:lvlText w:val=""/>
+      <w:lvlJc w:val="left"/>
+      <w:pPr>
+        <w:tabs>
+          <w:tab w:val="num" w:pos="2880"/>
+        </w:tabs>
+        <w:ind w:left="2880" w:hanging="360"/>
+      </w:pPr>
+      <w:rPr>
+        <w:rFonts w:ascii="Wingdings" w:hAnsi="Wingdings" w:hint="default"/>
+        <w:sz w:val="20"/>
+      </w:rPr>
+    </w:lvl>
+    <w:lvl w:ilvl="4" w:tentative="1">
+      <w:start w:val="1"/>
+      <w:numFmt w:val="bullet"/>
+      <w:lvlText w:val=""/>
+      <w:lvlJc w:val="left"/>
+      <w:pPr>
+        <w:tabs>
+          <w:tab w:val="num" w:pos="3600"/>
+        </w:tabs>
+        <w:ind w:left="3600" w:hanging="360"/>
+      </w:pPr>
+      <w:rPr>
+        <w:rFonts w:ascii="Wingdings" w:hAnsi="Wingdings" w:hint="default"/>
+        <w:sz w:val="20"/>
+      </w:rPr>
+    </w:lvl>
+    <w:lvl w:ilvl="5" w:tentative="1">
+      <w:start w:val="1"/>
+      <w:numFmt w:val="bullet"/>
+      <w:lvlText w:val=""/>
+      <w:lvlJc w:val="left"/>
+      <w:pPr>
+        <w:tabs>
+          <w:tab w:val="num" w:pos="4320"/>
+        </w:tabs>
+        <w:ind w:left="4320" w:hanging="360"/>
+      </w:pPr>
+      <w:rPr>
+        <w:rFonts w:ascii="Wingdings" w:hAnsi="Wingdings" w:hint="default"/>
+        <w:sz w:val="20"/>
+      </w:rPr>
+    </w:lvl>
+    <w:lvl w:ilvl="6" w:tentative="1">
+      <w:start w:val="1"/>
+      <w:numFmt w:val="bullet"/>
+      <w:lvlText w:val=""/>
+      <w:lvlJc w:val="left"/>
+      <w:pPr>
+        <w:tabs>
+          <w:tab w:val="num" w:pos="5040"/>
+        </w:tabs>
+        <w:ind w:left="5040" w:hanging="360"/>
+      </w:pPr>
+      <w:rPr>
+        <w:rFonts w:ascii="Wingdings" w:hAnsi="Wingdings" w:hint="default"/>
+        <w:sz w:val="20"/>
+      </w:rPr>
+    </w:lvl>
+    <w:lvl w:ilvl="7" w:tentative="1">
+      <w:start w:val="1"/>
+      <w:numFmt w:val="bullet"/>
+      <w:lvlText w:val=""/>
+      <w:lvlJc w:val="left"/>
+      <w:pPr>
+        <w:tabs>
+          <w:tab w:val="num" w:pos="5760"/>
+        </w:tabs>
+        <w:ind w:left="5760" w:hanging="360"/>
+      </w:pPr>
+      <w:rPr>
+        <w:rFonts w:ascii="Wingdings" w:hAnsi="Wingdings" w:hint="default"/>
+        <w:sz w:val="20"/>
+      </w:rPr>
+    </w:lvl>
+    <w:lvl w:ilvl="8" w:tentative="1">
+      <w:start w:val="1"/>
+      <w:numFmt w:val="bullet"/>
+      <w:lvlText w:val=""/>
+      <w:lvlJc w:val="left"/>
+      <w:pPr>
+        <w:tabs>
+          <w:tab w:val="num" w:pos="6480"/>
+        </w:tabs>
+        <w:ind w:left="6480" w:hanging="360"/>
+      </w:pPr>
+      <w:rPr>
+        <w:rFonts w:ascii="Wingdings" w:hAnsi="Wingdings" w:hint="default"/>
+        <w:sz w:val="20"/>
+      </w:rPr>
+    </w:lvl>
+  </w:abstractNum>
+  <w:abstractNum w:abstractNumId="13" w15:restartNumberingAfterBreak="0">
     <w:nsid w:val="28016436"/>
     <w:multiLevelType w:val="hybridMultilevel"/>
     <w:tmpl w:val="87D0CED6"/>
@@ -4356,7 +5542,7 @@
       </w:rPr>
     </w:lvl>
   </w:abstractNum>
-  <w:abstractNum w:abstractNumId="10" w15:restartNumberingAfterBreak="0">
+  <w:abstractNum w:abstractNumId="14" w15:restartNumberingAfterBreak="0">
     <w:nsid w:val="319D15EA"/>
     <w:multiLevelType w:val="hybridMultilevel"/>
     <w:tmpl w:val="BE78A338"/>
@@ -4469,7 +5655,7 @@
       </w:rPr>
     </w:lvl>
   </w:abstractNum>
-  <w:abstractNum w:abstractNumId="11" w15:restartNumberingAfterBreak="0">
+  <w:abstractNum w:abstractNumId="15" w15:restartNumberingAfterBreak="0">
     <w:nsid w:val="34E60CD4"/>
     <w:multiLevelType w:val="hybridMultilevel"/>
     <w:tmpl w:val="BB64676E"/>
@@ -4582,7 +5768,7 @@
       </w:rPr>
     </w:lvl>
   </w:abstractNum>
-  <w:abstractNum w:abstractNumId="12" w15:restartNumberingAfterBreak="0">
+  <w:abstractNum w:abstractNumId="16" w15:restartNumberingAfterBreak="0">
     <w:nsid w:val="365E72FC"/>
     <w:multiLevelType w:val="multilevel"/>
     <w:tmpl w:val="1542E52E"/>
@@ -4695,7 +5881,156 @@
       </w:pPr>
     </w:lvl>
   </w:abstractNum>
-  <w:abstractNum w:abstractNumId="13" w15:restartNumberingAfterBreak="0">
+  <w:abstractNum w:abstractNumId="17" w15:restartNumberingAfterBreak="0">
+    <w:nsid w:val="37BD1C99"/>
+    <w:multiLevelType w:val="multilevel"/>
+    <w:tmpl w:val="90F8EF64"/>
+    <w:lvl w:ilvl="0">
+      <w:start w:val="1"/>
+      <w:numFmt w:val="bullet"/>
+      <w:lvlText w:val=""/>
+      <w:lvlJc w:val="left"/>
+      <w:pPr>
+        <w:tabs>
+          <w:tab w:val="num" w:pos="720"/>
+        </w:tabs>
+        <w:ind w:left="720" w:hanging="360"/>
+      </w:pPr>
+      <w:rPr>
+        <w:rFonts w:ascii="Symbol" w:hAnsi="Symbol" w:hint="default"/>
+        <w:sz w:val="20"/>
+      </w:rPr>
+    </w:lvl>
+    <w:lvl w:ilvl="1" w:tentative="1">
+      <w:start w:val="1"/>
+      <w:numFmt w:val="bullet"/>
+      <w:lvlText w:val="o"/>
+      <w:lvlJc w:val="left"/>
+      <w:pPr>
+        <w:tabs>
+          <w:tab w:val="num" w:pos="1440"/>
+        </w:tabs>
+        <w:ind w:left="1440" w:hanging="360"/>
+      </w:pPr>
+      <w:rPr>
+        <w:rFonts w:ascii="Courier New" w:hAnsi="Courier New" w:hint="default"/>
+        <w:sz w:val="20"/>
+      </w:rPr>
+    </w:lvl>
+    <w:lvl w:ilvl="2" w:tentative="1">
+      <w:start w:val="1"/>
+      <w:numFmt w:val="bullet"/>
+      <w:lvlText w:val=""/>
+      <w:lvlJc w:val="left"/>
+      <w:pPr>
+        <w:tabs>
+          <w:tab w:val="num" w:pos="2160"/>
+        </w:tabs>
+        <w:ind w:left="2160" w:hanging="360"/>
+      </w:pPr>
+      <w:rPr>
+        <w:rFonts w:ascii="Wingdings" w:hAnsi="Wingdings" w:hint="default"/>
+        <w:sz w:val="20"/>
+      </w:rPr>
+    </w:lvl>
+    <w:lvl w:ilvl="3" w:tentative="1">
+      <w:start w:val="1"/>
+      <w:numFmt w:val="bullet"/>
+      <w:lvlText w:val=""/>
+      <w:lvlJc w:val="left"/>
+      <w:pPr>
+        <w:tabs>
+          <w:tab w:val="num" w:pos="2880"/>
+        </w:tabs>
+        <w:ind w:left="2880" w:hanging="360"/>
+      </w:pPr>
+      <w:rPr>
+        <w:rFonts w:ascii="Wingdings" w:hAnsi="Wingdings" w:hint="default"/>
+        <w:sz w:val="20"/>
+      </w:rPr>
+    </w:lvl>
+    <w:lvl w:ilvl="4" w:tentative="1">
+      <w:start w:val="1"/>
+      <w:numFmt w:val="bullet"/>
+      <w:lvlText w:val=""/>
+      <w:lvlJc w:val="left"/>
+      <w:pPr>
+        <w:tabs>
+          <w:tab w:val="num" w:pos="3600"/>
+        </w:tabs>
+        <w:ind w:left="3600" w:hanging="360"/>
+      </w:pPr>
+      <w:rPr>
+        <w:rFonts w:ascii="Wingdings" w:hAnsi="Wingdings" w:hint="default"/>
+        <w:sz w:val="20"/>
+      </w:rPr>
+    </w:lvl>
+    <w:lvl w:ilvl="5" w:tentative="1">
+      <w:start w:val="1"/>
+      <w:numFmt w:val="bullet"/>
+      <w:lvlText w:val=""/>
+      <w:lvlJc w:val="left"/>
+      <w:pPr>
+        <w:tabs>
+          <w:tab w:val="num" w:pos="4320"/>
+        </w:tabs>
+        <w:ind w:left="4320" w:hanging="360"/>
+      </w:pPr>
+      <w:rPr>
+        <w:rFonts w:ascii="Wingdings" w:hAnsi="Wingdings" w:hint="default"/>
+        <w:sz w:val="20"/>
+      </w:rPr>
+    </w:lvl>
+    <w:lvl w:ilvl="6" w:tentative="1">
+      <w:start w:val="1"/>
+      <w:numFmt w:val="bullet"/>
+      <w:lvlText w:val=""/>
+      <w:lvlJc w:val="left"/>
+      <w:pPr>
+        <w:tabs>
+          <w:tab w:val="num" w:pos="5040"/>
+        </w:tabs>
+        <w:ind w:left="5040" w:hanging="360"/>
+      </w:pPr>
+      <w:rPr>
+        <w:rFonts w:ascii="Wingdings" w:hAnsi="Wingdings" w:hint="default"/>
+        <w:sz w:val="20"/>
+      </w:rPr>
+    </w:lvl>
+    <w:lvl w:ilvl="7" w:tentative="1">
+      <w:start w:val="1"/>
+      <w:numFmt w:val="bullet"/>
+      <w:lvlText w:val=""/>
+      <w:lvlJc w:val="left"/>
+      <w:pPr>
+        <w:tabs>
+          <w:tab w:val="num" w:pos="5760"/>
+        </w:tabs>
+        <w:ind w:left="5760" w:hanging="360"/>
+      </w:pPr>
+      <w:rPr>
+        <w:rFonts w:ascii="Wingdings" w:hAnsi="Wingdings" w:hint="default"/>
+        <w:sz w:val="20"/>
+      </w:rPr>
+    </w:lvl>
+    <w:lvl w:ilvl="8" w:tentative="1">
+      <w:start w:val="1"/>
+      <w:numFmt w:val="bullet"/>
+      <w:lvlText w:val=""/>
+      <w:lvlJc w:val="left"/>
+      <w:pPr>
+        <w:tabs>
+          <w:tab w:val="num" w:pos="6480"/>
+        </w:tabs>
+        <w:ind w:left="6480" w:hanging="360"/>
+      </w:pPr>
+      <w:rPr>
+        <w:rFonts w:ascii="Wingdings" w:hAnsi="Wingdings" w:hint="default"/>
+        <w:sz w:val="20"/>
+      </w:rPr>
+    </w:lvl>
+  </w:abstractNum>
+  <w:abstractNum w:abstractNumId="18" w15:restartNumberingAfterBreak="0">
     <w:nsid w:val="37BF4FAA"/>
     <w:multiLevelType w:val="hybridMultilevel"/>
     <w:tmpl w:val="F71C8916"/>
@@ -4781,7 +6116,7 @@
       </w:pPr>
     </w:lvl>
   </w:abstractNum>
-  <w:abstractNum w:abstractNumId="14" w15:restartNumberingAfterBreak="0">
+  <w:abstractNum w:abstractNumId="19" w15:restartNumberingAfterBreak="0">
     <w:nsid w:val="3B4207A2"/>
     <w:multiLevelType w:val="multilevel"/>
     <w:tmpl w:val="04521ACC"/>
@@ -4930,7 +6265,7 @@
       </w:rPr>
     </w:lvl>
   </w:abstractNum>
-  <w:abstractNum w:abstractNumId="15" w15:restartNumberingAfterBreak="0">
+  <w:abstractNum w:abstractNumId="20" w15:restartNumberingAfterBreak="0">
     <w:nsid w:val="3CF834AF"/>
     <w:multiLevelType w:val="multilevel"/>
     <w:tmpl w:val="A7E0AE34"/>
@@ -5046,7 +6381,7 @@
       </w:pPr>
     </w:lvl>
   </w:abstractNum>
-  <w:abstractNum w:abstractNumId="16" w15:restartNumberingAfterBreak="0">
+  <w:abstractNum w:abstractNumId="21" w15:restartNumberingAfterBreak="0">
     <w:nsid w:val="3CFD72A3"/>
     <w:multiLevelType w:val="multilevel"/>
     <w:tmpl w:val="75EAFADE"/>
@@ -5159,7 +6494,7 @@
       </w:pPr>
     </w:lvl>
   </w:abstractNum>
-  <w:abstractNum w:abstractNumId="17" w15:restartNumberingAfterBreak="0">
+  <w:abstractNum w:abstractNumId="22" w15:restartNumberingAfterBreak="0">
     <w:nsid w:val="403F0003"/>
     <w:multiLevelType w:val="multilevel"/>
     <w:tmpl w:val="42668D3C"/>
@@ -5272,7 +6607,7 @@
       </w:pPr>
     </w:lvl>
   </w:abstractNum>
-  <w:abstractNum w:abstractNumId="18" w15:restartNumberingAfterBreak="0">
+  <w:abstractNum w:abstractNumId="23" w15:restartNumberingAfterBreak="0">
     <w:nsid w:val="425C02AD"/>
     <w:multiLevelType w:val="multilevel"/>
     <w:tmpl w:val="C38410E2"/>
@@ -5421,7 +6756,7 @@
       </w:rPr>
     </w:lvl>
   </w:abstractNum>
-  <w:abstractNum w:abstractNumId="19" w15:restartNumberingAfterBreak="0">
+  <w:abstractNum w:abstractNumId="24" w15:restartNumberingAfterBreak="0">
     <w:nsid w:val="427A018E"/>
     <w:multiLevelType w:val="multilevel"/>
     <w:tmpl w:val="9E3A91FA"/>
@@ -5570,7 +6905,7 @@
       </w:rPr>
     </w:lvl>
   </w:abstractNum>
-  <w:abstractNum w:abstractNumId="20" w15:restartNumberingAfterBreak="0">
+  <w:abstractNum w:abstractNumId="25" w15:restartNumberingAfterBreak="0">
     <w:nsid w:val="446525E2"/>
     <w:multiLevelType w:val="multilevel"/>
     <w:tmpl w:val="0DB42DFE"/>
@@ -5719,7 +7054,7 @@
       </w:rPr>
     </w:lvl>
   </w:abstractNum>
-  <w:abstractNum w:abstractNumId="21" w15:restartNumberingAfterBreak="0">
+  <w:abstractNum w:abstractNumId="26" w15:restartNumberingAfterBreak="0">
     <w:nsid w:val="45010147"/>
     <w:multiLevelType w:val="multilevel"/>
     <w:tmpl w:val="6E8C85EC"/>
@@ -5868,7 +7203,7 @@
       </w:rPr>
     </w:lvl>
   </w:abstractNum>
-  <w:abstractNum w:abstractNumId="22" w15:restartNumberingAfterBreak="0">
+  <w:abstractNum w:abstractNumId="27" w15:restartNumberingAfterBreak="0">
     <w:nsid w:val="45080D54"/>
     <w:multiLevelType w:val="hybridMultilevel"/>
     <w:tmpl w:val="8E1C6494"/>
@@ -5980,7 +7315,7 @@
       </w:rPr>
     </w:lvl>
   </w:abstractNum>
-  <w:abstractNum w:abstractNumId="23" w15:restartNumberingAfterBreak="0">
+  <w:abstractNum w:abstractNumId="28" w15:restartNumberingAfterBreak="0">
     <w:nsid w:val="4F954287"/>
     <w:multiLevelType w:val="multilevel"/>
     <w:tmpl w:val="CAD4B820"/>
@@ -6129,7 +7464,7 @@
       </w:rPr>
     </w:lvl>
   </w:abstractNum>
-  <w:abstractNum w:abstractNumId="24" w15:restartNumberingAfterBreak="0">
+  <w:abstractNum w:abstractNumId="29" w15:restartNumberingAfterBreak="0">
     <w:nsid w:val="5A94397A"/>
     <w:multiLevelType w:val="multilevel"/>
     <w:tmpl w:val="683882F8"/>
@@ -6278,7 +7613,7 @@
       </w:rPr>
     </w:lvl>
   </w:abstractNum>
-  <w:abstractNum w:abstractNumId="25" w15:restartNumberingAfterBreak="0">
+  <w:abstractNum w:abstractNumId="30" w15:restartNumberingAfterBreak="0">
     <w:nsid w:val="5BD721F0"/>
     <w:multiLevelType w:val="multilevel"/>
     <w:tmpl w:val="33F809F0"/>
@@ -6427,7 +7762,156 @@
       </w:rPr>
     </w:lvl>
   </w:abstractNum>
-  <w:abstractNum w:abstractNumId="26" w15:restartNumberingAfterBreak="0">
+  <w:abstractNum w:abstractNumId="31" w15:restartNumberingAfterBreak="0">
+    <w:nsid w:val="5BE36AB3"/>
+    <w:multiLevelType w:val="multilevel"/>
+    <w:tmpl w:val="309E84D2"/>
+    <w:lvl w:ilvl="0">
+      <w:start w:val="1"/>
+      <w:numFmt w:val="bullet"/>
+      <w:lvlText w:val=""/>
+      <w:lvlJc w:val="left"/>
+      <w:pPr>
+        <w:tabs>
+          <w:tab w:val="num" w:pos="720"/>
+        </w:tabs>
+        <w:ind w:left="720" w:hanging="360"/>
+      </w:pPr>
+      <w:rPr>
+        <w:rFonts w:ascii="Symbol" w:hAnsi="Symbol" w:hint="default"/>
+        <w:sz w:val="20"/>
+      </w:rPr>
+    </w:lvl>
+    <w:lvl w:ilvl="1" w:tentative="1">
+      <w:start w:val="1"/>
+      <w:numFmt w:val="bullet"/>
+      <w:lvlText w:val="o"/>
+      <w:lvlJc w:val="left"/>
+      <w:pPr>
+        <w:tabs>
+          <w:tab w:val="num" w:pos="1440"/>
+        </w:tabs>
+        <w:ind w:left="1440" w:hanging="360"/>
+      </w:pPr>
+      <w:rPr>
+        <w:rFonts w:ascii="Courier New" w:hAnsi="Courier New" w:hint="default"/>
+        <w:sz w:val="20"/>
+      </w:rPr>
+    </w:lvl>
+    <w:lvl w:ilvl="2" w:tentative="1">
+      <w:start w:val="1"/>
+      <w:numFmt w:val="bullet"/>
+      <w:lvlText w:val=""/>
+      <w:lvlJc w:val="left"/>
+      <w:pPr>
+        <w:tabs>
+          <w:tab w:val="num" w:pos="2160"/>
+        </w:tabs>
+        <w:ind w:left="2160" w:hanging="360"/>
+      </w:pPr>
+      <w:rPr>
+        <w:rFonts w:ascii="Wingdings" w:hAnsi="Wingdings" w:hint="default"/>
+        <w:sz w:val="20"/>
+      </w:rPr>
+    </w:lvl>
+    <w:lvl w:ilvl="3" w:tentative="1">
+      <w:start w:val="1"/>
+      <w:numFmt w:val="bullet"/>
+      <w:lvlText w:val=""/>
+      <w:lvlJc w:val="left"/>
+      <w:pPr>
+        <w:tabs>
+          <w:tab w:val="num" w:pos="2880"/>
+        </w:tabs>
+        <w:ind w:left="2880" w:hanging="360"/>
+      </w:pPr>
+      <w:rPr>
+        <w:rFonts w:ascii="Wingdings" w:hAnsi="Wingdings" w:hint="default"/>
+        <w:sz w:val="20"/>
+      </w:rPr>
+    </w:lvl>
+    <w:lvl w:ilvl="4" w:tentative="1">
+      <w:start w:val="1"/>
+      <w:numFmt w:val="bullet"/>
+      <w:lvlText w:val=""/>
+      <w:lvlJc w:val="left"/>
+      <w:pPr>
+        <w:tabs>
+          <w:tab w:val="num" w:pos="3600"/>
+        </w:tabs>
+        <w:ind w:left="3600" w:hanging="360"/>
+      </w:pPr>
+      <w:rPr>
+        <w:rFonts w:ascii="Wingdings" w:hAnsi="Wingdings" w:hint="default"/>
+        <w:sz w:val="20"/>
+      </w:rPr>
+    </w:lvl>
+    <w:lvl w:ilvl="5" w:tentative="1">
+      <w:start w:val="1"/>
+      <w:numFmt w:val="bullet"/>
+      <w:lvlText w:val=""/>
+      <w:lvlJc w:val="left"/>
+      <w:pPr>
+        <w:tabs>
+          <w:tab w:val="num" w:pos="4320"/>
+        </w:tabs>
+        <w:ind w:left="4320" w:hanging="360"/>
+      </w:pPr>
+      <w:rPr>
+        <w:rFonts w:ascii="Wingdings" w:hAnsi="Wingdings" w:hint="default"/>
+        <w:sz w:val="20"/>
+      </w:rPr>
+    </w:lvl>
+    <w:lvl w:ilvl="6" w:tentative="1">
+      <w:start w:val="1"/>
+      <w:numFmt w:val="bullet"/>
+      <w:lvlText w:val=""/>
+      <w:lvlJc w:val="left"/>
+      <w:pPr>
+        <w:tabs>
+          <w:tab w:val="num" w:pos="5040"/>
+        </w:tabs>
+        <w:ind w:left="5040" w:hanging="360"/>
+      </w:pPr>
+      <w:rPr>
+        <w:rFonts w:ascii="Wingdings" w:hAnsi="Wingdings" w:hint="default"/>
+        <w:sz w:val="20"/>
+      </w:rPr>
+    </w:lvl>
+    <w:lvl w:ilvl="7" w:tentative="1">
+      <w:start w:val="1"/>
+      <w:numFmt w:val="bullet"/>
+      <w:lvlText w:val=""/>
+      <w:lvlJc w:val="left"/>
+      <w:pPr>
+        <w:tabs>
+          <w:tab w:val="num" w:pos="5760"/>
+        </w:tabs>
+        <w:ind w:left="5760" w:hanging="360"/>
+      </w:pPr>
+      <w:rPr>
+        <w:rFonts w:ascii="Wingdings" w:hAnsi="Wingdings" w:hint="default"/>
+        <w:sz w:val="20"/>
+      </w:rPr>
+    </w:lvl>
+    <w:lvl w:ilvl="8" w:tentative="1">
+      <w:start w:val="1"/>
+      <w:numFmt w:val="bullet"/>
+      <w:lvlText w:val=""/>
+      <w:lvlJc w:val="left"/>
+      <w:pPr>
+        <w:tabs>
+          <w:tab w:val="num" w:pos="6480"/>
+        </w:tabs>
+        <w:ind w:left="6480" w:hanging="360"/>
+      </w:pPr>
+      <w:rPr>
+        <w:rFonts w:ascii="Wingdings" w:hAnsi="Wingdings" w:hint="default"/>
+        <w:sz w:val="20"/>
+      </w:rPr>
+    </w:lvl>
+  </w:abstractNum>
+  <w:abstractNum w:abstractNumId="32" w15:restartNumberingAfterBreak="0">
     <w:nsid w:val="5E4B3584"/>
     <w:multiLevelType w:val="hybridMultilevel"/>
     <w:tmpl w:val="B25CFA1C"/>
@@ -6540,7 +8024,7 @@
       </w:rPr>
     </w:lvl>
   </w:abstractNum>
-  <w:abstractNum w:abstractNumId="27" w15:restartNumberingAfterBreak="0">
+  <w:abstractNum w:abstractNumId="33" w15:restartNumberingAfterBreak="0">
     <w:nsid w:val="5F2E2D37"/>
     <w:multiLevelType w:val="multilevel"/>
     <w:tmpl w:val="889E9256"/>
@@ -6689,7 +8173,7 @@
       </w:rPr>
     </w:lvl>
   </w:abstractNum>
-  <w:abstractNum w:abstractNumId="28" w15:restartNumberingAfterBreak="0">
+  <w:abstractNum w:abstractNumId="34" w15:restartNumberingAfterBreak="0">
     <w:nsid w:val="604B5C22"/>
     <w:multiLevelType w:val="hybridMultilevel"/>
     <w:tmpl w:val="7AB6367C"/>
@@ -6802,7 +8286,7 @@
       </w:rPr>
     </w:lvl>
   </w:abstractNum>
-  <w:abstractNum w:abstractNumId="29" w15:restartNumberingAfterBreak="0">
+  <w:abstractNum w:abstractNumId="35" w15:restartNumberingAfterBreak="0">
     <w:nsid w:val="60586D04"/>
     <w:multiLevelType w:val="multilevel"/>
     <w:tmpl w:val="EB40BB90"/>
@@ -6951,7 +8435,7 @@
       </w:rPr>
     </w:lvl>
   </w:abstractNum>
-  <w:abstractNum w:abstractNumId="30" w15:restartNumberingAfterBreak="0">
+  <w:abstractNum w:abstractNumId="36" w15:restartNumberingAfterBreak="0">
     <w:nsid w:val="6611690C"/>
     <w:multiLevelType w:val="hybridMultilevel"/>
     <w:tmpl w:val="69D44F0A"/>
@@ -7064,7 +8548,7 @@
       </w:rPr>
     </w:lvl>
   </w:abstractNum>
-  <w:abstractNum w:abstractNumId="31" w15:restartNumberingAfterBreak="0">
+  <w:abstractNum w:abstractNumId="37" w15:restartNumberingAfterBreak="0">
     <w:nsid w:val="68280189"/>
     <w:multiLevelType w:val="hybridMultilevel"/>
     <w:tmpl w:val="16729304"/>
@@ -7177,7 +8661,7 @@
       </w:rPr>
     </w:lvl>
   </w:abstractNum>
-  <w:abstractNum w:abstractNumId="32" w15:restartNumberingAfterBreak="0">
+  <w:abstractNum w:abstractNumId="38" w15:restartNumberingAfterBreak="0">
     <w:nsid w:val="6BF2715A"/>
     <w:multiLevelType w:val="multilevel"/>
     <w:tmpl w:val="AEC42A86"/>
@@ -7290,7 +8774,7 @@
       </w:pPr>
     </w:lvl>
   </w:abstractNum>
-  <w:abstractNum w:abstractNumId="33" w15:restartNumberingAfterBreak="0">
+  <w:abstractNum w:abstractNumId="39" w15:restartNumberingAfterBreak="0">
     <w:nsid w:val="6C57047E"/>
     <w:multiLevelType w:val="multilevel"/>
     <w:tmpl w:val="19CAB288"/>
@@ -7439,7 +8923,7 @@
       </w:rPr>
     </w:lvl>
   </w:abstractNum>
-  <w:abstractNum w:abstractNumId="34" w15:restartNumberingAfterBreak="0">
+  <w:abstractNum w:abstractNumId="40" w15:restartNumberingAfterBreak="0">
     <w:nsid w:val="6C5828B1"/>
     <w:multiLevelType w:val="hybridMultilevel"/>
     <w:tmpl w:val="9BACA330"/>
@@ -7552,7 +9036,156 @@
       </w:rPr>
     </w:lvl>
   </w:abstractNum>
-  <w:abstractNum w:abstractNumId="35" w15:restartNumberingAfterBreak="0">
+  <w:abstractNum w:abstractNumId="41" w15:restartNumberingAfterBreak="0">
+    <w:nsid w:val="6EEB7D62"/>
+    <w:multiLevelType w:val="multilevel"/>
+    <w:tmpl w:val="FBF0E09E"/>
+    <w:lvl w:ilvl="0">
+      <w:start w:val="1"/>
+      <w:numFmt w:val="bullet"/>
+      <w:lvlText w:val=""/>
+      <w:lvlJc w:val="left"/>
+      <w:pPr>
+        <w:tabs>
+          <w:tab w:val="num" w:pos="720"/>
+        </w:tabs>
+        <w:ind w:left="720" w:hanging="360"/>
+      </w:pPr>
+      <w:rPr>
+        <w:rFonts w:ascii="Symbol" w:hAnsi="Symbol" w:hint="default"/>
+        <w:sz w:val="20"/>
+      </w:rPr>
+    </w:lvl>
+    <w:lvl w:ilvl="1" w:tentative="1">
+      <w:start w:val="1"/>
+      <w:numFmt w:val="bullet"/>
+      <w:lvlText w:val="o"/>
+      <w:lvlJc w:val="left"/>
+      <w:pPr>
+        <w:tabs>
+          <w:tab w:val="num" w:pos="1440"/>
+        </w:tabs>
+        <w:ind w:left="1440" w:hanging="360"/>
+      </w:pPr>
+      <w:rPr>
+        <w:rFonts w:ascii="Courier New" w:hAnsi="Courier New" w:hint="default"/>
+        <w:sz w:val="20"/>
+      </w:rPr>
+    </w:lvl>
+    <w:lvl w:ilvl="2" w:tentative="1">
+      <w:start w:val="1"/>
+      <w:numFmt w:val="bullet"/>
+      <w:lvlText w:val=""/>
+      <w:lvlJc w:val="left"/>
+      <w:pPr>
+        <w:tabs>
+          <w:tab w:val="num" w:pos="2160"/>
+        </w:tabs>
+        <w:ind w:left="2160" w:hanging="360"/>
+      </w:pPr>
+      <w:rPr>
+        <w:rFonts w:ascii="Wingdings" w:hAnsi="Wingdings" w:hint="default"/>
+        <w:sz w:val="20"/>
+      </w:rPr>
+    </w:lvl>
+    <w:lvl w:ilvl="3" w:tentative="1">
+      <w:start w:val="1"/>
+      <w:numFmt w:val="bullet"/>
+      <w:lvlText w:val=""/>
+      <w:lvlJc w:val="left"/>
+      <w:pPr>
+        <w:tabs>
+          <w:tab w:val="num" w:pos="2880"/>
+        </w:tabs>
+        <w:ind w:left="2880" w:hanging="360"/>
+      </w:pPr>
+      <w:rPr>
+        <w:rFonts w:ascii="Wingdings" w:hAnsi="Wingdings" w:hint="default"/>
+        <w:sz w:val="20"/>
+      </w:rPr>
+    </w:lvl>
+    <w:lvl w:ilvl="4" w:tentative="1">
+      <w:start w:val="1"/>
+      <w:numFmt w:val="bullet"/>
+      <w:lvlText w:val=""/>
+      <w:lvlJc w:val="left"/>
+      <w:pPr>
+        <w:tabs>
+          <w:tab w:val="num" w:pos="3600"/>
+        </w:tabs>
+        <w:ind w:left="3600" w:hanging="360"/>
+      </w:pPr>
+      <w:rPr>
+        <w:rFonts w:ascii="Wingdings" w:hAnsi="Wingdings" w:hint="default"/>
+        <w:sz w:val="20"/>
+      </w:rPr>
+    </w:lvl>
+    <w:lvl w:ilvl="5" w:tentative="1">
+      <w:start w:val="1"/>
+      <w:numFmt w:val="bullet"/>
+      <w:lvlText w:val=""/>
+      <w:lvlJc w:val="left"/>
+      <w:pPr>
+        <w:tabs>
+          <w:tab w:val="num" w:pos="4320"/>
+        </w:tabs>
+        <w:ind w:left="4320" w:hanging="360"/>
+      </w:pPr>
+      <w:rPr>
+        <w:rFonts w:ascii="Wingdings" w:hAnsi="Wingdings" w:hint="default"/>
+        <w:sz w:val="20"/>
+      </w:rPr>
+    </w:lvl>
+    <w:lvl w:ilvl="6" w:tentative="1">
+      <w:start w:val="1"/>
+      <w:numFmt w:val="bullet"/>
+      <w:lvlText w:val=""/>
+      <w:lvlJc w:val="left"/>
+      <w:pPr>
+        <w:tabs>
+          <w:tab w:val="num" w:pos="5040"/>
+        </w:tabs>
+        <w:ind w:left="5040" w:hanging="360"/>
+      </w:pPr>
+      <w:rPr>
+        <w:rFonts w:ascii="Wingdings" w:hAnsi="Wingdings" w:hint="default"/>
+        <w:sz w:val="20"/>
+      </w:rPr>
+    </w:lvl>
+    <w:lvl w:ilvl="7" w:tentative="1">
+      <w:start w:val="1"/>
+      <w:numFmt w:val="bullet"/>
+      <w:lvlText w:val=""/>
+      <w:lvlJc w:val="left"/>
+      <w:pPr>
+        <w:tabs>
+          <w:tab w:val="num" w:pos="5760"/>
+        </w:tabs>
+        <w:ind w:left="5760" w:hanging="360"/>
+      </w:pPr>
+      <w:rPr>
+        <w:rFonts w:ascii="Wingdings" w:hAnsi="Wingdings" w:hint="default"/>
+        <w:sz w:val="20"/>
+      </w:rPr>
+    </w:lvl>
+    <w:lvl w:ilvl="8" w:tentative="1">
+      <w:start w:val="1"/>
+      <w:numFmt w:val="bullet"/>
+      <w:lvlText w:val=""/>
+      <w:lvlJc w:val="left"/>
+      <w:pPr>
+        <w:tabs>
+          <w:tab w:val="num" w:pos="6480"/>
+        </w:tabs>
+        <w:ind w:left="6480" w:hanging="360"/>
+      </w:pPr>
+      <w:rPr>
+        <w:rFonts w:ascii="Wingdings" w:hAnsi="Wingdings" w:hint="default"/>
+        <w:sz w:val="20"/>
+      </w:rPr>
+    </w:lvl>
+  </w:abstractNum>
+  <w:abstractNum w:abstractNumId="42" w15:restartNumberingAfterBreak="0">
     <w:nsid w:val="78232C45"/>
     <w:multiLevelType w:val="multilevel"/>
     <w:tmpl w:val="2D767BA6"/>
@@ -7701,120 +9334,141 @@
       </w:rPr>
     </w:lvl>
   </w:abstractNum>
-  <w:num w:numId="1">
+  <w:num w:numId="1" w16cid:durableId="1321736607">
+    <w:abstractNumId w:val="33"/>
+  </w:num>
+  <w:num w:numId="2" w16cid:durableId="625114394">
+    <w:abstractNumId w:val="38"/>
+  </w:num>
+  <w:num w:numId="3" w16cid:durableId="1381630724">
+    <w:abstractNumId w:val="21"/>
+  </w:num>
+  <w:num w:numId="4" w16cid:durableId="2059165517">
+    <w:abstractNumId w:val="9"/>
+  </w:num>
+  <w:num w:numId="5" w16cid:durableId="1633635425">
+    <w:abstractNumId w:val="29"/>
+  </w:num>
+  <w:num w:numId="6" w16cid:durableId="599290019">
+    <w:abstractNumId w:val="24"/>
+  </w:num>
+  <w:num w:numId="7" w16cid:durableId="1796830026">
+    <w:abstractNumId w:val="25"/>
+  </w:num>
+  <w:num w:numId="8" w16cid:durableId="1326741634">
+    <w:abstractNumId w:val="6"/>
+  </w:num>
+  <w:num w:numId="9" w16cid:durableId="1363166206">
+    <w:abstractNumId w:val="23"/>
+  </w:num>
+  <w:num w:numId="10" w16cid:durableId="1937401181">
+    <w:abstractNumId w:val="16"/>
+  </w:num>
+  <w:num w:numId="11" w16cid:durableId="749353172">
+    <w:abstractNumId w:val="11"/>
+  </w:num>
+  <w:num w:numId="12" w16cid:durableId="1185050786">
+    <w:abstractNumId w:val="22"/>
+  </w:num>
+  <w:num w:numId="13" w16cid:durableId="1052778474">
+    <w:abstractNumId w:val="39"/>
+  </w:num>
+  <w:num w:numId="14" w16cid:durableId="1444610805">
+    <w:abstractNumId w:val="26"/>
+  </w:num>
+  <w:num w:numId="15" w16cid:durableId="2022274900">
+    <w:abstractNumId w:val="3"/>
+  </w:num>
+  <w:num w:numId="16" w16cid:durableId="477117351">
+    <w:abstractNumId w:val="42"/>
+  </w:num>
+  <w:num w:numId="17" w16cid:durableId="774133789">
+    <w:abstractNumId w:val="40"/>
+  </w:num>
+  <w:num w:numId="18" w16cid:durableId="863710042">
+    <w:abstractNumId w:val="35"/>
+  </w:num>
+  <w:num w:numId="19" w16cid:durableId="848759498">
     <w:abstractNumId w:val="27"/>
   </w:num>
-  <w:num w:numId="2">
+  <w:num w:numId="20" w16cid:durableId="256136027">
+    <w:abstractNumId w:val="36"/>
+  </w:num>
+  <w:num w:numId="21" w16cid:durableId="1321152853">
+    <w:abstractNumId w:val="7"/>
+  </w:num>
+  <w:num w:numId="22" w16cid:durableId="1606688578">
+    <w:abstractNumId w:val="28"/>
+  </w:num>
+  <w:num w:numId="23" w16cid:durableId="825363275">
+    <w:abstractNumId w:val="37"/>
+  </w:num>
+  <w:num w:numId="24" w16cid:durableId="102507273">
     <w:abstractNumId w:val="32"/>
   </w:num>
-  <w:num w:numId="3">
-    <w:abstractNumId w:val="16"/>
+  <w:num w:numId="25" w16cid:durableId="492448751">
+    <w:abstractNumId w:val="13"/>
   </w:num>
-  <w:num w:numId="4">
-    <w:abstractNumId w:val="6"/>
+  <w:num w:numId="26" w16cid:durableId="589781610">
+    <w:abstractNumId w:val="14"/>
   </w:num>
-  <w:num w:numId="5">
-    <w:abstractNumId w:val="24"/>
+  <w:num w:numId="27" w16cid:durableId="1498766288">
+    <w:abstractNumId w:val="30"/>
   </w:num>
-  <w:num w:numId="6">
+  <w:num w:numId="28" w16cid:durableId="1993949154">
+    <w:abstractNumId w:val="34"/>
+  </w:num>
+  <w:num w:numId="29" w16cid:durableId="223876754">
+    <w:abstractNumId w:val="18"/>
+  </w:num>
+  <w:num w:numId="30" w16cid:durableId="2143112037">
+    <w:abstractNumId w:val="2"/>
+  </w:num>
+  <w:num w:numId="31" w16cid:durableId="10571087">
+    <w:abstractNumId w:val="20"/>
+  </w:num>
+  <w:num w:numId="32" w16cid:durableId="9377709">
+    <w:abstractNumId w:val="10"/>
+  </w:num>
+  <w:num w:numId="33" w16cid:durableId="646671560">
     <w:abstractNumId w:val="19"/>
   </w:num>
-  <w:num w:numId="7">
-    <w:abstractNumId w:val="20"/>
+  <w:num w:numId="34" w16cid:durableId="1414274697">
+    <w:abstractNumId w:val="5"/>
   </w:num>
-  <w:num w:numId="8">
+  <w:num w:numId="35" w16cid:durableId="513808684">
+    <w:abstractNumId w:val="0"/>
+  </w:num>
+  <w:num w:numId="36" w16cid:durableId="1545633091">
+    <w:abstractNumId w:val="15"/>
+  </w:num>
+  <w:num w:numId="37" w16cid:durableId="85224961">
+    <w:abstractNumId w:val="31"/>
+  </w:num>
+  <w:num w:numId="38" w16cid:durableId="1580021860">
+    <w:abstractNumId w:val="41"/>
+  </w:num>
+  <w:num w:numId="39" w16cid:durableId="1608852785">
+    <w:abstractNumId w:val="1"/>
+  </w:num>
+  <w:num w:numId="40" w16cid:durableId="448203429">
+    <w:abstractNumId w:val="8"/>
+  </w:num>
+  <w:num w:numId="41" w16cid:durableId="1785078490">
     <w:abstractNumId w:val="4"/>
   </w:num>
-  <w:num w:numId="9">
-    <w:abstractNumId w:val="18"/>
-  </w:num>
-  <w:num w:numId="10">
-    <w:abstractNumId w:val="12"/>
-  </w:num>
-  <w:num w:numId="11">
-    <w:abstractNumId w:val="8"/>
-  </w:num>
-  <w:num w:numId="12">
+  <w:num w:numId="42" w16cid:durableId="1209030045">
     <w:abstractNumId w:val="17"/>
   </w:num>
-  <w:num w:numId="13">
-    <w:abstractNumId w:val="33"/>
-  </w:num>
-  <w:num w:numId="14">
-    <w:abstractNumId w:val="21"/>
-  </w:num>
-  <w:num w:numId="15">
-    <w:abstractNumId w:val="2"/>
-  </w:num>
-  <w:num w:numId="16">
-    <w:abstractNumId w:val="35"/>
-  </w:num>
-  <w:num w:numId="17">
-    <w:abstractNumId w:val="34"/>
-  </w:num>
-  <w:num w:numId="18">
-    <w:abstractNumId w:val="29"/>
-  </w:num>
-  <w:num w:numId="19">
-    <w:abstractNumId w:val="22"/>
-  </w:num>
-  <w:num w:numId="20">
-    <w:abstractNumId w:val="30"/>
-  </w:num>
-  <w:num w:numId="21">
-    <w:abstractNumId w:val="5"/>
-  </w:num>
-  <w:num w:numId="22">
-    <w:abstractNumId w:val="23"/>
-  </w:num>
-  <w:num w:numId="23">
-    <w:abstractNumId w:val="31"/>
-  </w:num>
-  <w:num w:numId="24">
-    <w:abstractNumId w:val="26"/>
-  </w:num>
-  <w:num w:numId="25">
-    <w:abstractNumId w:val="9"/>
-  </w:num>
-  <w:num w:numId="26">
-    <w:abstractNumId w:val="10"/>
-  </w:num>
-  <w:num w:numId="27">
-    <w:abstractNumId w:val="25"/>
-  </w:num>
-  <w:num w:numId="28">
-    <w:abstractNumId w:val="28"/>
-  </w:num>
-  <w:num w:numId="29">
-    <w:abstractNumId w:val="13"/>
-  </w:num>
-  <w:num w:numId="30">
-    <w:abstractNumId w:val="1"/>
-  </w:num>
-  <w:num w:numId="31">
-    <w:abstractNumId w:val="15"/>
-  </w:num>
-  <w:num w:numId="32">
-    <w:abstractNumId w:val="7"/>
-  </w:num>
-  <w:num w:numId="33">
-    <w:abstractNumId w:val="14"/>
-  </w:num>
-  <w:num w:numId="34">
-    <w:abstractNumId w:val="3"/>
-  </w:num>
-  <w:num w:numId="35">
-    <w:abstractNumId w:val="0"/>
-  </w:num>
-  <w:num w:numId="36">
-    <w:abstractNumId w:val="11"/>
+  <w:num w:numId="43" w16cid:durableId="471943976">
+    <w:abstractNumId w:val="12"/>
   </w:num>
   <w:numIdMacAtCleanup w:val="16"/>
 </w:numbering>
 </file>
 
 <file path=word/styles.xml><?xml version="1.0" encoding="utf-8"?>
-<w:styles xmlns:mc="http://schemas.openxmlformats.org/markup-compatibility/2006" xmlns:r="http://schemas.openxmlformats.org/officeDocument/2006/relationships" xmlns:w="http://schemas.openxmlformats.org/wordprocessingml/2006/main" xmlns:w14="http://schemas.microsoft.com/office/word/2010/wordml" xmlns:w15="http://schemas.microsoft.com/office/word/2012/wordml" xmlns:w16se="http://schemas.microsoft.com/office/word/2015/wordml/symex" mc:Ignorable="w14 w15 w16se">
+<w:styles xmlns:mc="http://schemas.openxmlformats.org/markup-compatibility/2006" xmlns:r="http://schemas.openxmlformats.org/officeDocument/2006/relationships" xmlns:w="http://schemas.openxmlformats.org/wordprocessingml/2006/main" xmlns:w14="http://schemas.microsoft.com/office/word/2010/wordml" xmlns:w15="http://schemas.microsoft.com/office/word/2012/wordml" xmlns:w16cex="http://schemas.microsoft.com/office/word/2018/wordml/cex" xmlns:w16cid="http://schemas.microsoft.com/office/word/2016/wordml/cid" xmlns:w16="http://schemas.microsoft.com/office/word/2018/wordml" xmlns:w16du="http://schemas.microsoft.com/office/word/2023/wordml/word16du" xmlns:w16sdtdh="http://schemas.microsoft.com/office/word/2020/wordml/sdtdatahash" xmlns:w16sdtfl="http://schemas.microsoft.com/office/word/2024/wordml/sdtformatlock" xmlns:w16se="http://schemas.microsoft.com/office/word/2015/wordml/symex" mc:Ignorable="w14 w15 w16se w16cid w16 w16cex w16sdtdh w16sdtfl w16du">
   <w:docDefaults>
     <w:rPrDefault>
       <w:rPr>
@@ -7826,7 +9480,7 @@
     </w:rPrDefault>
     <w:pPrDefault/>
   </w:docDefaults>
-  <w:latentStyles w:defLockedState="0" w:defUIPriority="99" w:defSemiHidden="0" w:defUnhideWhenUsed="0" w:defQFormat="0" w:count="371">
+  <w:latentStyles w:defLockedState="0" w:defUIPriority="99" w:defSemiHidden="0" w:defUnhideWhenUsed="0" w:defQFormat="0" w:count="376">
     <w:lsdException w:name="Normal" w:uiPriority="0" w:qFormat="1"/>
     <w:lsdException w:name="heading 1" w:uiPriority="9" w:qFormat="1"/>
     <w:lsdException w:name="heading 2" w:semiHidden="1" w:uiPriority="9" w:unhideWhenUsed="1" w:qFormat="1"/>
@@ -8198,6 +9852,11 @@
     <w:lsdException w:name="List Table 5 Dark Accent 6" w:uiPriority="50"/>
     <w:lsdException w:name="List Table 6 Colorful Accent 6" w:uiPriority="51"/>
     <w:lsdException w:name="List Table 7 Colorful Accent 6" w:uiPriority="52"/>
+    <w:lsdException w:name="Mention" w:semiHidden="1" w:unhideWhenUsed="1"/>
+    <w:lsdException w:name="Smart Hyperlink" w:semiHidden="1" w:unhideWhenUsed="1"/>
+    <w:lsdException w:name="Hashtag" w:semiHidden="1" w:unhideWhenUsed="1"/>
+    <w:lsdException w:name="Unresolved Mention" w:semiHidden="1" w:unhideWhenUsed="1"/>
+    <w:lsdException w:name="Smart Link" w:semiHidden="1" w:unhideWhenUsed="1"/>
   </w:latentStyles>
   <w:style w:type="paragraph" w:default="1" w:styleId="Normal">
     <w:name w:val="Normal"/>
@@ -8289,7 +9948,6 @@
   <w:style w:type="character" w:default="1" w:styleId="Fuentedeprrafopredeter">
     <w:name w:val="Default Paragraph Font"/>
     <w:uiPriority w:val="1"/>
-    <w:semiHidden/>
     <w:unhideWhenUsed/>
   </w:style>
   <w:style w:type="table" w:default="1" w:styleId="Tablanormal">
@@ -8418,7 +10076,7 @@
       <w:lang w:eastAsia="es-CO"/>
     </w:rPr>
   </w:style>
-  <w:style w:type="character" w:styleId="Textoennegrita">
+  <w:style w:type="character" w:styleId="Fuerte">
     <w:name w:val="Strong"/>
     <w:basedOn w:val="Fuentedeprrafopredeter"/>
     <w:uiPriority w:val="22"/>
@@ -8860,7 +10518,7 @@
 </file>
 
 <file path=customXml/itemProps1.xml><?xml version="1.0" encoding="utf-8"?>
-<ds:datastoreItem xmlns:ds="http://schemas.openxmlformats.org/officeDocument/2006/customXml" ds:itemID="{A6CB30F6-201A-4171-BC8A-1DB005AF5FE2}">
+<ds:datastoreItem xmlns:ds="http://schemas.openxmlformats.org/officeDocument/2006/customXml" ds:itemID="{1088AC50-C290-4043-A014-B6888A6C17CA}">
   <ds:schemaRefs>
     <ds:schemaRef ds:uri="http://schemas.openxmlformats.org/officeDocument/2006/bibliography"/>
   </ds:schemaRefs>

</xml_diff>

<commit_message>
Actualización punto 7 y punto 10
</commit_message>
<xml_diff>
--- a/Guía_actividad.docx
+++ b/Guía_actividad.docx
@@ -1,11 +1,11 @@
 
 <file path=word/document.xml><?xml version="1.0" encoding="utf-8"?>
-<w:document xmlns:wpc="http://schemas.microsoft.com/office/word/2010/wordprocessingCanvas" xmlns:cx="http://schemas.microsoft.com/office/drawing/2014/chartex" xmlns:mc="http://schemas.openxmlformats.org/markup-compatibility/2006" xmlns:o="urn:schemas-microsoft-com:office:office" xmlns:r="http://schemas.openxmlformats.org/officeDocument/2006/relationships" xmlns:m="http://schemas.openxmlformats.org/officeDocument/2006/math" xmlns:v="urn:schemas-microsoft-com:vml" xmlns:wp14="http://schemas.microsoft.com/office/word/2010/wordprocessingDrawing" xmlns:wp="http://schemas.openxmlformats.org/drawingml/2006/wordprocessingDrawing" xmlns:w10="urn:schemas-microsoft-com:office:word" xmlns:w="http://schemas.openxmlformats.org/wordprocessingml/2006/main" xmlns:w14="http://schemas.microsoft.com/office/word/2010/wordml" xmlns:w15="http://schemas.microsoft.com/office/word/2012/wordml" xmlns:w16se="http://schemas.microsoft.com/office/word/2015/wordml/symex" xmlns:wpg="http://schemas.microsoft.com/office/word/2010/wordprocessingGroup" xmlns:wpi="http://schemas.microsoft.com/office/word/2010/wordprocessingInk" xmlns:wne="http://schemas.microsoft.com/office/word/2006/wordml" xmlns:wps="http://schemas.microsoft.com/office/word/2010/wordprocessingShape" mc:Ignorable="w14 w15 w16se wp14">
+<w:document xmlns:wpc="http://schemas.microsoft.com/office/word/2010/wordprocessingCanvas" xmlns:cx="http://schemas.microsoft.com/office/drawing/2014/chartex" xmlns:cx1="http://schemas.microsoft.com/office/drawing/2015/9/8/chartex" xmlns:cx2="http://schemas.microsoft.com/office/drawing/2015/10/21/chartex" xmlns:cx3="http://schemas.microsoft.com/office/drawing/2016/5/9/chartex" xmlns:cx4="http://schemas.microsoft.com/office/drawing/2016/5/10/chartex" xmlns:cx5="http://schemas.microsoft.com/office/drawing/2016/5/11/chartex" xmlns:cx6="http://schemas.microsoft.com/office/drawing/2016/5/12/chartex" xmlns:cx7="http://schemas.microsoft.com/office/drawing/2016/5/13/chartex" xmlns:cx8="http://schemas.microsoft.com/office/drawing/2016/5/14/chartex" xmlns:mc="http://schemas.openxmlformats.org/markup-compatibility/2006" xmlns:aink="http://schemas.microsoft.com/office/drawing/2016/ink" xmlns:am3d="http://schemas.microsoft.com/office/drawing/2017/model3d" xmlns:o="urn:schemas-microsoft-com:office:office" xmlns:r="http://schemas.openxmlformats.org/officeDocument/2006/relationships" xmlns:m="http://schemas.openxmlformats.org/officeDocument/2006/math" xmlns:v="urn:schemas-microsoft-com:vml" xmlns:wp14="http://schemas.microsoft.com/office/word/2010/wordprocessingDrawing" xmlns:wp="http://schemas.openxmlformats.org/drawingml/2006/wordprocessingDrawing" xmlns:w10="urn:schemas-microsoft-com:office:word" xmlns:w="http://schemas.openxmlformats.org/wordprocessingml/2006/main" xmlns:w14="http://schemas.microsoft.com/office/word/2010/wordml" xmlns:w15="http://schemas.microsoft.com/office/word/2012/wordml" xmlns:w16cex="http://schemas.microsoft.com/office/word/2018/wordml/cex" xmlns:w16cid="http://schemas.microsoft.com/office/word/2016/wordml/cid" xmlns:w16="http://schemas.microsoft.com/office/word/2018/wordml" xmlns:w16sdtdh="http://schemas.microsoft.com/office/word/2020/wordml/sdtdatahash" xmlns:w16se="http://schemas.microsoft.com/office/word/2015/wordml/symex" xmlns:wpg="http://schemas.microsoft.com/office/word/2010/wordprocessingGroup" xmlns:wpi="http://schemas.microsoft.com/office/word/2010/wordprocessingInk" xmlns:wne="http://schemas.microsoft.com/office/word/2006/wordml" xmlns:wps="http://schemas.microsoft.com/office/word/2010/wordprocessingShape" mc:Ignorable="w14 w15 w16se w16cid w16 w16cex w16sdtdh wp14">
   <w:body>
     <w:p>
       <w:pPr>
         <w:pStyle w:val="Ttulo3"/>
-        <w:jc w:val="center"/>
+        <w:jc w:val="both"/>
         <w:rPr>
           <w:rFonts w:ascii="Arial" w:hAnsi="Arial" w:cs="Arial"/>
           <w:sz w:val="24"/>
@@ -32,6 +32,7 @@
     <w:p>
       <w:pPr>
         <w:pStyle w:val="Ttulo4"/>
+        <w:jc w:val="both"/>
         <w:rPr>
           <w:rFonts w:ascii="Arial" w:hAnsi="Arial" w:cs="Arial"/>
           <w:i w:val="0"/>
@@ -52,6 +53,7 @@
     <w:p>
       <w:pPr>
         <w:pStyle w:val="Ttulo4"/>
+        <w:jc w:val="both"/>
         <w:rPr>
           <w:rFonts w:ascii="Arial" w:hAnsi="Arial" w:cs="Arial"/>
           <w:i w:val="0"/>
@@ -81,6 +83,7 @@
     <w:p>
       <w:pPr>
         <w:pStyle w:val="Ttulo4"/>
+        <w:jc w:val="both"/>
         <w:rPr>
           <w:rFonts w:ascii="Arial" w:hAnsi="Arial" w:cs="Arial"/>
           <w:i w:val="0"/>
@@ -1344,6 +1347,7 @@
           <w:ilvl w:val="0"/>
           <w:numId w:val="37"/>
         </w:numPr>
+        <w:jc w:val="both"/>
         <w:rPr>
           <w:rFonts w:ascii="Arial" w:hAnsi="Arial" w:cs="Arial"/>
           <w:b/>
@@ -1386,6 +1390,7 @@
           <w:ilvl w:val="0"/>
           <w:numId w:val="37"/>
         </w:numPr>
+        <w:jc w:val="both"/>
         <w:rPr>
           <w:rFonts w:ascii="Arial" w:hAnsi="Arial" w:cs="Arial"/>
           <w:b/>
@@ -1428,6 +1433,7 @@
           <w:ilvl w:val="0"/>
           <w:numId w:val="37"/>
         </w:numPr>
+        <w:jc w:val="both"/>
         <w:rPr>
           <w:rFonts w:ascii="Arial" w:hAnsi="Arial" w:cs="Arial"/>
           <w:b/>
@@ -1470,6 +1476,7 @@
           <w:ilvl w:val="0"/>
           <w:numId w:val="37"/>
         </w:numPr>
+        <w:jc w:val="both"/>
         <w:rPr>
           <w:rFonts w:ascii="Arial" w:hAnsi="Arial" w:cs="Arial"/>
           <w:b/>
@@ -1512,6 +1519,7 @@
           <w:ilvl w:val="0"/>
           <w:numId w:val="37"/>
         </w:numPr>
+        <w:jc w:val="both"/>
         <w:rPr>
           <w:rFonts w:ascii="Arial" w:hAnsi="Arial" w:cs="Arial"/>
           <w:b/>
@@ -2271,6 +2279,7 @@
     <w:p>
       <w:pPr>
         <w:pStyle w:val="NormalWeb"/>
+        <w:jc w:val="both"/>
         <w:rPr>
           <w:rFonts w:ascii="Arial" w:hAnsi="Arial" w:cs="Arial"/>
           <w:b/>
@@ -2289,6 +2298,7 @@
     <w:p>
       <w:pPr>
         <w:pStyle w:val="NormalWeb"/>
+        <w:jc w:val="both"/>
         <w:rPr>
           <w:rFonts w:ascii="Arial" w:hAnsi="Arial" w:cs="Arial"/>
           <w:b/>
@@ -2301,7 +2311,6 @@
         </w:rPr>
         <w:t xml:space="preserve">Arquitectura: </w:t>
       </w:r>
-      <w:proofErr w:type="spellStart"/>
       <w:r>
         <w:rPr>
           <w:rFonts w:ascii="Arial" w:hAnsi="Arial" w:cs="Arial"/>
@@ -2310,7 +2319,6 @@
         </w:rPr>
         <w:t>Microservicios</w:t>
       </w:r>
-      <w:proofErr w:type="spellEnd"/>
       <w:r>
         <w:rPr>
           <w:rFonts w:ascii="Arial" w:hAnsi="Arial" w:cs="Arial"/>
@@ -2321,6 +2329,7 @@
     <w:p>
       <w:pPr>
         <w:pStyle w:val="NormalWeb"/>
+        <w:jc w:val="both"/>
         <w:rPr>
           <w:rFonts w:ascii="Arial" w:hAnsi="Arial" w:cs="Arial"/>
           <w:b/>
@@ -2343,6 +2352,7 @@
           <w:ilvl w:val="0"/>
           <w:numId w:val="41"/>
         </w:numPr>
+        <w:jc w:val="both"/>
         <w:rPr>
           <w:rFonts w:ascii="Arial" w:hAnsi="Arial" w:cs="Arial"/>
           <w:b/>
@@ -2361,6 +2371,7 @@
     <w:p>
       <w:pPr>
         <w:pStyle w:val="NormalWeb"/>
+        <w:jc w:val="both"/>
         <w:rPr>
           <w:rFonts w:ascii="Arial" w:hAnsi="Arial" w:cs="Arial"/>
           <w:b/>
@@ -2395,6 +2406,7 @@
           <w:ilvl w:val="0"/>
           <w:numId w:val="42"/>
         </w:numPr>
+        <w:jc w:val="both"/>
         <w:rPr>
           <w:rFonts w:ascii="Arial" w:hAnsi="Arial" w:cs="Arial"/>
           <w:b/>
@@ -2413,6 +2425,7 @@
     <w:p>
       <w:pPr>
         <w:pStyle w:val="NormalWeb"/>
+        <w:jc w:val="both"/>
         <w:rPr>
           <w:rFonts w:ascii="Arial" w:hAnsi="Arial" w:cs="Arial"/>
           <w:b/>
@@ -2441,6 +2454,7 @@
           <w:ilvl w:val="0"/>
           <w:numId w:val="43"/>
         </w:numPr>
+        <w:jc w:val="both"/>
         <w:rPr>
           <w:rFonts w:ascii="Arial" w:hAnsi="Arial" w:cs="Arial"/>
           <w:b/>
@@ -2459,6 +2473,7 @@
     <w:p>
       <w:pPr>
         <w:pStyle w:val="NormalWeb"/>
+        <w:jc w:val="both"/>
         <w:rPr>
           <w:rFonts w:ascii="Arial" w:hAnsi="Arial" w:cs="Arial"/>
           <w:b/>
@@ -2489,6 +2504,7 @@
     <w:p>
       <w:pPr>
         <w:pStyle w:val="NormalWeb"/>
+        <w:jc w:val="both"/>
         <w:rPr>
           <w:rFonts w:ascii="Arial" w:hAnsi="Arial" w:cs="Arial"/>
         </w:rPr>
@@ -2505,29 +2521,16 @@
     <w:p>
       <w:pPr>
         <w:pStyle w:val="NormalWeb"/>
-        <w:rPr>
-          <w:rFonts w:ascii="Arial" w:hAnsi="Arial" w:cs="Arial"/>
-        </w:rPr>
-      </w:pPr>
-      <w:r>
-        <w:rPr>
-          <w:rFonts w:ascii="Arial" w:hAnsi="Arial" w:cs="Arial"/>
-        </w:rPr>
-        <w:t xml:space="preserve">Elegimos la arquitectura de </w:t>
-      </w:r>
-      <w:proofErr w:type="spellStart"/>
-      <w:r>
-        <w:rPr>
-          <w:rFonts w:ascii="Arial" w:hAnsi="Arial" w:cs="Arial"/>
-        </w:rPr>
-        <w:t>microservicios</w:t>
-      </w:r>
-      <w:proofErr w:type="spellEnd"/>
-      <w:r>
-        <w:rPr>
-          <w:rFonts w:ascii="Arial" w:hAnsi="Arial" w:cs="Arial"/>
-        </w:rPr>
-        <w:t xml:space="preserve"> porque el sistema está dividido en servicios independientes, donde cada uno cumple una función específica. Esto permite que los servicios se comuniquen entre sí y facilita la organización del </w:t>
+        <w:jc w:val="both"/>
+        <w:rPr>
+          <w:rFonts w:ascii="Arial" w:hAnsi="Arial" w:cs="Arial"/>
+        </w:rPr>
+      </w:pPr>
+      <w:r>
+        <w:rPr>
+          <w:rFonts w:ascii="Arial" w:hAnsi="Arial" w:cs="Arial"/>
+        </w:rPr>
+        <w:t xml:space="preserve">Elegimos la arquitectura de microservicios porque el sistema está dividido en servicios independientes, donde cada uno cumple una función específica. Esto permite que los servicios se comuniquen entre sí y facilita la organización del </w:t>
       </w:r>
       <w:r>
         <w:rPr>
@@ -2696,19 +2699,7 @@
         <w:rPr>
           <w:rFonts w:ascii="Arial" w:hAnsi="Arial" w:cs="Arial"/>
         </w:rPr>
-        <w:t xml:space="preserve">Notificaciones: </w:t>
-      </w:r>
-      <w:r>
-        <w:rPr>
-          <w:rFonts w:ascii="Arial" w:hAnsi="Arial" w:cs="Arial"/>
-        </w:rPr>
-        <w:t>H</w:t>
-      </w:r>
-      <w:r>
-        <w:rPr>
-          <w:rFonts w:ascii="Arial" w:hAnsi="Arial" w:cs="Arial"/>
-        </w:rPr>
-        <w:t>istorial de avisos enviados y su estado de entrega.</w:t>
+        <w:t>Notificaciones: Historial de avisos enviados y su estado de entrega.</w:t>
       </w:r>
     </w:p>
     <w:p>
@@ -2793,21 +2784,7 @@
         <w:rPr>
           <w:rFonts w:ascii="Arial" w:hAnsi="Arial" w:cs="Arial"/>
         </w:rPr>
-        <w:t xml:space="preserve">Cada </w:t>
-      </w:r>
-      <w:proofErr w:type="spellStart"/>
-      <w:r>
-        <w:rPr>
-          <w:rFonts w:ascii="Arial" w:hAnsi="Arial" w:cs="Arial"/>
-        </w:rPr>
-        <w:t>microservicio</w:t>
-      </w:r>
-      <w:proofErr w:type="spellEnd"/>
-      <w:r>
-        <w:rPr>
-          <w:rFonts w:ascii="Arial" w:hAnsi="Arial" w:cs="Arial"/>
-        </w:rPr>
-        <w:t xml:space="preserve"> tendrá su propia base de datos (</w:t>
+        <w:t>Cada microservicio tendrá su propia base de datos (</w:t>
       </w:r>
       <w:proofErr w:type="spellStart"/>
       <w:r>
@@ -2962,19 +2939,7 @@
           <w:rFonts w:ascii="Arial" w:hAnsi="Arial" w:cs="Arial"/>
         </w:rPr>
         <w:lastRenderedPageBreak/>
-        <w:t xml:space="preserve">Cliente: </w:t>
-      </w:r>
-      <w:r>
-        <w:rPr>
-          <w:rFonts w:ascii="Arial" w:hAnsi="Arial" w:cs="Arial"/>
-        </w:rPr>
-        <w:t>S</w:t>
-      </w:r>
-      <w:r>
-        <w:rPr>
-          <w:rFonts w:ascii="Arial" w:hAnsi="Arial" w:cs="Arial"/>
-        </w:rPr>
-        <w:t>olicita un turno y consulta su posición en la fila; no puede modificar el estado de otros turnos.</w:t>
+        <w:t>Cliente: Solicita un turno y consulta su posición en la fila; no puede modificar el estado de otros turnos.</w:t>
       </w:r>
     </w:p>
     <w:p>
@@ -2993,19 +2958,7 @@
         <w:rPr>
           <w:rFonts w:ascii="Arial" w:hAnsi="Arial" w:cs="Arial"/>
         </w:rPr>
-        <w:t xml:space="preserve">Cajero / Asesor (operador): </w:t>
-      </w:r>
-      <w:r>
-        <w:rPr>
-          <w:rFonts w:ascii="Arial" w:hAnsi="Arial" w:cs="Arial"/>
-        </w:rPr>
-        <w:t>L</w:t>
-      </w:r>
-      <w:r>
-        <w:rPr>
-          <w:rFonts w:ascii="Arial" w:hAnsi="Arial" w:cs="Arial"/>
-        </w:rPr>
-        <w:t>lama al siguiente turno, marca la atención como finalizada o cancelada.</w:t>
+        <w:t>Cajero / Asesor (operador): Llama al siguiente turno, marca la atención como finalizada o cancelada.</w:t>
       </w:r>
     </w:p>
     <w:p>
@@ -3024,19 +2977,7 @@
         <w:rPr>
           <w:rFonts w:ascii="Arial" w:hAnsi="Arial" w:cs="Arial"/>
         </w:rPr>
-        <w:t xml:space="preserve">Administrador de sucursal: </w:t>
-      </w:r>
-      <w:r>
-        <w:rPr>
-          <w:rFonts w:ascii="Arial" w:hAnsi="Arial" w:cs="Arial"/>
-        </w:rPr>
-        <w:t>C</w:t>
-      </w:r>
-      <w:r>
-        <w:rPr>
-          <w:rFonts w:ascii="Arial" w:hAnsi="Arial" w:cs="Arial"/>
-        </w:rPr>
-        <w:t>rea y edita ventanillas, consulta reportes de tiempos de espera, reasigna las prioridades.</w:t>
+        <w:t>Administrador de sucursal: Crea y edita ventanillas, consulta reportes de tiempos de espera, reasigna las prioridades.</w:t>
       </w:r>
     </w:p>
     <w:p>
@@ -3055,19 +2996,7 @@
         <w:rPr>
           <w:rFonts w:ascii="Arial" w:hAnsi="Arial" w:cs="Arial"/>
         </w:rPr>
-        <w:t xml:space="preserve">Sistema de autoservicio: </w:t>
-      </w:r>
-      <w:r>
-        <w:rPr>
-          <w:rFonts w:ascii="Arial" w:hAnsi="Arial" w:cs="Arial"/>
-        </w:rPr>
-        <w:t>A</w:t>
-      </w:r>
-      <w:r>
-        <w:rPr>
-          <w:rFonts w:ascii="Arial" w:hAnsi="Arial" w:cs="Arial"/>
-        </w:rPr>
-        <w:t>ctúa como cliente automatizado que genera turnos desde la sucursal física.</w:t>
+        <w:t>Sistema de autoservicio: Actúa como cliente automatizado que genera turnos desde la sucursal física.</w:t>
       </w:r>
     </w:p>
     <w:p>
@@ -3090,13 +3019,7 @@
         <w:rPr>
           <w:rFonts w:ascii="Arial" w:hAnsi="Arial" w:cs="Arial"/>
         </w:rPr>
-        <w:t>¿todos pueden hacer lo mismo?</w:t>
-      </w:r>
-      <w:r>
-        <w:rPr>
-          <w:rFonts w:ascii="Arial" w:hAnsi="Arial" w:cs="Arial"/>
-        </w:rPr>
-        <w:t xml:space="preserve"> No, se manejan permisos diferenciados por el rol, el cliente solo lee o crea su propio turno, el cajero solo gestiona los turnos asignados a su ventanilla y solo el administrador tiene permisos de configuración del sistema.</w:t>
+        <w:t>¿todos pueden hacer lo mismo? No, se manejan permisos diferenciados por el rol, el cliente solo lee o crea su propio turno, el cajero solo gestiona los turnos asignados a su ventanilla y solo el administrador tiene permisos de configuración del sistema.</w:t>
       </w:r>
     </w:p>
     <w:p>
@@ -3148,169 +3071,646 @@
     </w:p>
     <w:p>
       <w:pPr>
-        <w:pStyle w:val="NormalWeb"/>
-        <w:jc w:val="both"/>
-        <w:rPr>
-          <w:rFonts w:ascii="Arial" w:hAnsi="Arial" w:cs="Arial"/>
-        </w:rPr>
-      </w:pPr>
-      <w:r>
-        <w:rPr>
-          <w:rFonts w:ascii="Arial" w:hAnsi="Arial" w:cs="Arial"/>
-        </w:rPr>
-        <w:t>¿Qué pasaría si falla:</w:t>
-      </w:r>
-    </w:p>
-    <w:p>
-      <w:pPr>
-        <w:pStyle w:val="NormalWeb"/>
+        <w:pStyle w:val="Ttulo1"/>
+        <w:jc w:val="both"/>
+        <w:rPr>
+          <w:rFonts w:ascii="Arial" w:hAnsi="Arial" w:cs="Arial"/>
+          <w:b/>
+          <w:bCs/>
+          <w:color w:val="auto"/>
+          <w:sz w:val="24"/>
+          <w:szCs w:val="24"/>
+        </w:rPr>
+      </w:pPr>
+      <w:r>
+        <w:rPr>
+          <w:rFonts w:ascii="Arial" w:hAnsi="Arial" w:cs="Arial"/>
+          <w:b/>
+          <w:bCs/>
+          <w:color w:val="auto"/>
+          <w:sz w:val="24"/>
+          <w:szCs w:val="24"/>
+        </w:rPr>
+        <w:lastRenderedPageBreak/>
+        <w:t>¿Qué pasaría si falla?</w:t>
+      </w:r>
+    </w:p>
+    <w:p>
+      <w:pPr>
+        <w:pStyle w:val="Ttulo1"/>
         <w:numPr>
           <w:ilvl w:val="0"/>
-          <w:numId w:val="24"/>
+          <w:numId w:val="44"/>
         </w:numPr>
         <w:jc w:val="both"/>
         <w:rPr>
           <w:rFonts w:ascii="Arial" w:hAnsi="Arial" w:cs="Arial"/>
-        </w:rPr>
-      </w:pPr>
-      <w:r>
-        <w:rPr>
-          <w:rFonts w:ascii="Arial" w:hAnsi="Arial" w:cs="Arial"/>
-        </w:rPr>
-        <w:t>servicio de pagos</w:t>
-      </w:r>
-    </w:p>
-    <w:p>
-      <w:pPr>
-        <w:pStyle w:val="NormalWeb"/>
+          <w:b/>
+          <w:bCs/>
+          <w:color w:val="auto"/>
+          <w:sz w:val="24"/>
+          <w:szCs w:val="24"/>
+        </w:rPr>
+      </w:pPr>
+      <w:r>
+        <w:rPr>
+          <w:rFonts w:ascii="Arial" w:hAnsi="Arial" w:cs="Arial"/>
+          <w:color w:val="auto"/>
+          <w:sz w:val="24"/>
+          <w:szCs w:val="24"/>
+        </w:rPr>
+        <w:t>El servicio de turnos: ningún cliente podría sacar turno nuevo ni consultar</w:t>
+      </w:r>
+      <w:r>
+        <w:rPr>
+          <w:rFonts w:ascii="Arial" w:hAnsi="Arial" w:cs="Arial"/>
+          <w:b/>
+          <w:bCs/>
+          <w:color w:val="auto"/>
+          <w:sz w:val="24"/>
+          <w:szCs w:val="24"/>
+        </w:rPr>
+        <w:t xml:space="preserve"> </w:t>
+      </w:r>
+      <w:r>
+        <w:rPr>
+          <w:rFonts w:ascii="Arial" w:hAnsi="Arial" w:cs="Arial"/>
+          <w:color w:val="auto"/>
+          <w:sz w:val="24"/>
+          <w:szCs w:val="24"/>
+        </w:rPr>
+        <w:t>su posición en la fila; las sucursales tendrían que volver temporalmente a</w:t>
+      </w:r>
+      <w:r>
+        <w:rPr>
+          <w:rFonts w:ascii="Arial" w:hAnsi="Arial" w:cs="Arial"/>
+          <w:b/>
+          <w:bCs/>
+          <w:color w:val="auto"/>
+          <w:sz w:val="24"/>
+          <w:szCs w:val="24"/>
+        </w:rPr>
+        <w:t xml:space="preserve"> </w:t>
+      </w:r>
+      <w:r>
+        <w:rPr>
+          <w:rFonts w:ascii="Arial" w:hAnsi="Arial" w:cs="Arial"/>
+          <w:color w:val="auto"/>
+          <w:sz w:val="24"/>
+          <w:szCs w:val="24"/>
+        </w:rPr>
+        <w:t>atención por orden de llegada.</w:t>
+      </w:r>
+    </w:p>
+    <w:p>
+      <w:pPr>
+        <w:pStyle w:val="Ttulo1"/>
         <w:numPr>
           <w:ilvl w:val="0"/>
-          <w:numId w:val="24"/>
+          <w:numId w:val="44"/>
         </w:numPr>
         <w:jc w:val="both"/>
         <w:rPr>
           <w:rFonts w:ascii="Arial" w:hAnsi="Arial" w:cs="Arial"/>
-        </w:rPr>
-      </w:pPr>
-      <w:r>
-        <w:rPr>
-          <w:rFonts w:ascii="Arial" w:hAnsi="Arial" w:cs="Arial"/>
-        </w:rPr>
-        <w:t>base de datos</w:t>
-      </w:r>
-    </w:p>
-    <w:p>
-      <w:pPr>
-        <w:pStyle w:val="NormalWeb"/>
+          <w:color w:val="auto"/>
+          <w:sz w:val="24"/>
+          <w:szCs w:val="24"/>
+        </w:rPr>
+      </w:pPr>
+      <w:r>
+        <w:rPr>
+          <w:rFonts w:ascii="Arial" w:hAnsi="Arial" w:cs="Arial"/>
+          <w:color w:val="auto"/>
+          <w:sz w:val="24"/>
+          <w:szCs w:val="24"/>
+        </w:rPr>
+        <w:t>La base de datos: se perdería el registro de quién está en la fila y en qué</w:t>
+      </w:r>
+      <w:r>
+        <w:rPr>
+          <w:rFonts w:ascii="Arial" w:hAnsi="Arial" w:cs="Arial"/>
+          <w:color w:val="auto"/>
+          <w:sz w:val="24"/>
+          <w:szCs w:val="24"/>
+        </w:rPr>
+        <w:t xml:space="preserve"> </w:t>
+      </w:r>
+      <w:r>
+        <w:rPr>
+          <w:rFonts w:ascii="Arial" w:hAnsi="Arial" w:cs="Arial"/>
+          <w:color w:val="auto"/>
+          <w:sz w:val="24"/>
+          <w:szCs w:val="24"/>
+        </w:rPr>
+        <w:t>orden, lo que podría hacer que se atienda a alguien fuera de turno o que se</w:t>
+      </w:r>
+      <w:r>
+        <w:rPr>
+          <w:rFonts w:ascii="Arial" w:hAnsi="Arial" w:cs="Arial"/>
+          <w:color w:val="auto"/>
+          <w:sz w:val="24"/>
+          <w:szCs w:val="24"/>
+        </w:rPr>
+        <w:t xml:space="preserve"> </w:t>
+      </w:r>
+      <w:r>
+        <w:rPr>
+          <w:rFonts w:ascii="Arial" w:hAnsi="Arial" w:cs="Arial"/>
+          <w:color w:val="auto"/>
+          <w:sz w:val="24"/>
+          <w:szCs w:val="24"/>
+        </w:rPr>
+        <w:t>dupliquen turnos.</w:t>
+      </w:r>
+    </w:p>
+    <w:p>
+      <w:pPr>
+        <w:pStyle w:val="Ttulo1"/>
         <w:numPr>
           <w:ilvl w:val="0"/>
-          <w:numId w:val="24"/>
+          <w:numId w:val="44"/>
         </w:numPr>
         <w:jc w:val="both"/>
         <w:rPr>
           <w:rFonts w:ascii="Arial" w:hAnsi="Arial" w:cs="Arial"/>
-        </w:rPr>
-      </w:pPr>
-      <w:r>
-        <w:rPr>
-          <w:rFonts w:ascii="Arial" w:hAnsi="Arial" w:cs="Arial"/>
-        </w:rPr>
-        <w:t>servidor principal</w:t>
-      </w:r>
-    </w:p>
-    <w:p>
-      <w:pPr>
-        <w:pStyle w:val="NormalWeb"/>
+          <w:color w:val="auto"/>
+          <w:sz w:val="24"/>
+          <w:szCs w:val="24"/>
+        </w:rPr>
+      </w:pPr>
+      <w:r>
+        <w:rPr>
+          <w:rFonts w:ascii="Arial" w:hAnsi="Arial" w:cs="Arial"/>
+          <w:color w:val="auto"/>
+          <w:sz w:val="24"/>
+          <w:szCs w:val="24"/>
+        </w:rPr>
+        <w:t>El servidor principal: todo el sistema quedaría inaccesible (clientes, cajeros</w:t>
+      </w:r>
+      <w:r>
+        <w:rPr>
+          <w:rFonts w:ascii="Arial" w:hAnsi="Arial" w:cs="Arial"/>
+          <w:color w:val="auto"/>
+          <w:sz w:val="24"/>
+          <w:szCs w:val="24"/>
+        </w:rPr>
+        <w:t xml:space="preserve"> </w:t>
+      </w:r>
+      <w:r>
+        <w:rPr>
+          <w:rFonts w:ascii="Arial" w:hAnsi="Arial" w:cs="Arial"/>
+          <w:color w:val="auto"/>
+          <w:sz w:val="24"/>
+          <w:szCs w:val="24"/>
+        </w:rPr>
+        <w:t>y administradores), dejando las sucursales sin forma digital de operar.</w:t>
+      </w:r>
+    </w:p>
+    <w:p>
+      <w:pPr>
+        <w:pStyle w:val="Ttulo1"/>
         <w:numPr>
           <w:ilvl w:val="0"/>
-          <w:numId w:val="24"/>
+          <w:numId w:val="44"/>
         </w:numPr>
         <w:jc w:val="both"/>
         <w:rPr>
           <w:rFonts w:ascii="Arial" w:hAnsi="Arial" w:cs="Arial"/>
-        </w:rPr>
-      </w:pPr>
-      <w:proofErr w:type="spellStart"/>
-      <w:r>
-        <w:rPr>
-          <w:rFonts w:ascii="Arial" w:hAnsi="Arial" w:cs="Arial"/>
-        </w:rPr>
-        <w:t>fernandaaaaaaaaaaaaaaaaaaa</w:t>
-      </w:r>
-      <w:proofErr w:type="spellEnd"/>
-    </w:p>
-    <w:p>
-      <w:pPr>
-        <w:pStyle w:val="NormalWeb"/>
-        <w:jc w:val="both"/>
-        <w:rPr>
-          <w:rFonts w:ascii="Arial" w:hAnsi="Arial" w:cs="Arial"/>
-        </w:rPr>
-      </w:pPr>
-      <w:r>
-        <w:rPr>
-          <w:rFonts w:ascii="Arial" w:hAnsi="Arial" w:cs="Arial"/>
-        </w:rPr>
-        <w:t>Escriban posibles soluciones:</w:t>
-      </w:r>
-    </w:p>
-    <w:p>
-      <w:pPr>
-        <w:pStyle w:val="NormalWeb"/>
+          <w:color w:val="auto"/>
+          <w:sz w:val="24"/>
+          <w:szCs w:val="24"/>
+        </w:rPr>
+      </w:pPr>
+      <w:r>
+        <w:rPr>
+          <w:rFonts w:ascii="Arial" w:hAnsi="Arial" w:cs="Arial"/>
+          <w:color w:val="auto"/>
+          <w:sz w:val="24"/>
+          <w:szCs w:val="24"/>
+        </w:rPr>
+        <w:t>El servicio de notificaciones: los clientes no sabrían cuándo acercarse a la</w:t>
+      </w:r>
+      <w:r>
+        <w:rPr>
+          <w:rFonts w:ascii="Arial" w:hAnsi="Arial" w:cs="Arial"/>
+          <w:color w:val="auto"/>
+          <w:sz w:val="24"/>
+          <w:szCs w:val="24"/>
+        </w:rPr>
+        <w:t xml:space="preserve"> </w:t>
+      </w:r>
+      <w:r>
+        <w:rPr>
+          <w:rFonts w:ascii="Arial" w:hAnsi="Arial" w:cs="Arial"/>
+          <w:color w:val="auto"/>
+          <w:sz w:val="24"/>
+          <w:szCs w:val="24"/>
+        </w:rPr>
+        <w:t>ventanilla, generando aglomeraciones y confusión, aunque el resto del</w:t>
+      </w:r>
+      <w:r>
+        <w:rPr>
+          <w:rFonts w:ascii="Arial" w:hAnsi="Arial" w:cs="Arial"/>
+          <w:color w:val="auto"/>
+          <w:sz w:val="24"/>
+          <w:szCs w:val="24"/>
+        </w:rPr>
+        <w:t xml:space="preserve"> </w:t>
+      </w:r>
+      <w:r>
+        <w:rPr>
+          <w:rFonts w:ascii="Arial" w:hAnsi="Arial" w:cs="Arial"/>
+          <w:color w:val="auto"/>
+          <w:sz w:val="24"/>
+          <w:szCs w:val="24"/>
+        </w:rPr>
+        <w:t>sistema siga funcionando.</w:t>
+      </w:r>
+    </w:p>
+    <w:p>
+      <w:pPr>
+        <w:pStyle w:val="Ttulo1"/>
+        <w:jc w:val="both"/>
+        <w:rPr>
+          <w:rFonts w:ascii="Arial" w:hAnsi="Arial" w:cs="Arial"/>
+          <w:color w:val="auto"/>
+          <w:sz w:val="24"/>
+          <w:szCs w:val="24"/>
+        </w:rPr>
+      </w:pPr>
+    </w:p>
+    <w:p>
+      <w:pPr>
+        <w:pStyle w:val="Ttulo1"/>
+        <w:jc w:val="both"/>
+        <w:rPr>
+          <w:rFonts w:ascii="Arial" w:hAnsi="Arial" w:cs="Arial"/>
+          <w:b/>
+          <w:bCs/>
+          <w:color w:val="auto"/>
+          <w:sz w:val="24"/>
+          <w:szCs w:val="24"/>
+        </w:rPr>
+      </w:pPr>
+      <w:r>
+        <w:rPr>
+          <w:rFonts w:ascii="Arial" w:hAnsi="Arial" w:cs="Arial"/>
+          <w:b/>
+          <w:bCs/>
+          <w:color w:val="auto"/>
+          <w:sz w:val="24"/>
+          <w:szCs w:val="24"/>
+        </w:rPr>
+        <w:t>¿Posibles soluciones?</w:t>
+      </w:r>
+    </w:p>
+    <w:p>
+      <w:pPr>
+        <w:pStyle w:val="Ttulo1"/>
         <w:numPr>
           <w:ilvl w:val="0"/>
-          <w:numId w:val="25"/>
+          <w:numId w:val="47"/>
         </w:numPr>
         <w:jc w:val="both"/>
         <w:rPr>
           <w:rFonts w:ascii="Arial" w:hAnsi="Arial" w:cs="Arial"/>
-        </w:rPr>
-      </w:pPr>
-      <w:r>
-        <w:rPr>
-          <w:rFonts w:ascii="Arial" w:hAnsi="Arial" w:cs="Arial"/>
-        </w:rPr>
-        <w:t>reintentos</w:t>
-      </w:r>
-    </w:p>
-    <w:p>
-      <w:pPr>
-        <w:pStyle w:val="NormalWeb"/>
+          <w:color w:val="auto"/>
+          <w:sz w:val="24"/>
+          <w:szCs w:val="24"/>
+        </w:rPr>
+      </w:pPr>
+      <w:r>
+        <w:rPr>
+          <w:rFonts w:ascii="Arial" w:hAnsi="Arial" w:cs="Arial"/>
+          <w:color w:val="auto"/>
+          <w:sz w:val="24"/>
+          <w:szCs w:val="24"/>
+        </w:rPr>
+        <w:t>Reintentos automáticos: si una notificación o una llamada a otro servicio</w:t>
+      </w:r>
+      <w:r>
+        <w:rPr>
+          <w:rFonts w:ascii="Arial" w:hAnsi="Arial" w:cs="Arial"/>
+          <w:color w:val="auto"/>
+          <w:sz w:val="24"/>
+          <w:szCs w:val="24"/>
+        </w:rPr>
+        <w:t xml:space="preserve"> </w:t>
+      </w:r>
+      <w:r>
+        <w:rPr>
+          <w:rFonts w:ascii="Arial" w:hAnsi="Arial" w:cs="Arial"/>
+          <w:color w:val="auto"/>
+          <w:sz w:val="24"/>
+          <w:szCs w:val="24"/>
+        </w:rPr>
+        <w:t>falla, el sistema reintentar unas cuantas veces antes de marcarla como</w:t>
+      </w:r>
+      <w:r>
+        <w:rPr>
+          <w:rFonts w:ascii="Arial" w:hAnsi="Arial" w:cs="Arial"/>
+          <w:color w:val="auto"/>
+          <w:sz w:val="24"/>
+          <w:szCs w:val="24"/>
+        </w:rPr>
+        <w:t xml:space="preserve"> </w:t>
+      </w:r>
+      <w:r>
+        <w:rPr>
+          <w:rFonts w:ascii="Arial" w:hAnsi="Arial" w:cs="Arial"/>
+          <w:color w:val="auto"/>
+          <w:sz w:val="24"/>
+          <w:szCs w:val="24"/>
+        </w:rPr>
+        <w:t>fallida.</w:t>
+      </w:r>
+    </w:p>
+    <w:p>
+      <w:pPr>
+        <w:pStyle w:val="Ttulo1"/>
         <w:numPr>
           <w:ilvl w:val="0"/>
-          <w:numId w:val="25"/>
+          <w:numId w:val="47"/>
         </w:numPr>
         <w:jc w:val="both"/>
         <w:rPr>
           <w:rFonts w:ascii="Arial" w:hAnsi="Arial" w:cs="Arial"/>
-        </w:rPr>
-      </w:pPr>
-      <w:r>
-        <w:rPr>
-          <w:rFonts w:ascii="Arial" w:hAnsi="Arial" w:cs="Arial"/>
-        </w:rPr>
-        <w:t>notificaciones</w:t>
-      </w:r>
-      <w:bookmarkStart w:id="0" w:name="_GoBack"/>
-      <w:bookmarkEnd w:id="0"/>
-    </w:p>
-    <w:p>
-      <w:pPr>
-        <w:pStyle w:val="NormalWeb"/>
+          <w:color w:val="auto"/>
+          <w:sz w:val="24"/>
+          <w:szCs w:val="24"/>
+        </w:rPr>
+      </w:pPr>
+      <w:r>
+        <w:rPr>
+          <w:rFonts w:ascii="Arial" w:hAnsi="Arial" w:cs="Arial"/>
+          <w:color w:val="auto"/>
+          <w:sz w:val="24"/>
+          <w:szCs w:val="24"/>
+        </w:rPr>
+        <w:t>Notificaciones de respaldo: si falla el canal principal (</w:t>
+      </w:r>
+      <w:proofErr w:type="spellStart"/>
+      <w:r>
+        <w:rPr>
+          <w:rFonts w:ascii="Arial" w:hAnsi="Arial" w:cs="Arial"/>
+          <w:color w:val="auto"/>
+          <w:sz w:val="24"/>
+          <w:szCs w:val="24"/>
+        </w:rPr>
+        <w:t>push</w:t>
+      </w:r>
+      <w:proofErr w:type="spellEnd"/>
+      <w:r>
+        <w:rPr>
+          <w:rFonts w:ascii="Arial" w:hAnsi="Arial" w:cs="Arial"/>
+          <w:color w:val="auto"/>
+          <w:sz w:val="24"/>
+          <w:szCs w:val="24"/>
+        </w:rPr>
+        <w:t>/SMS), mostrar</w:t>
+      </w:r>
+      <w:r>
+        <w:rPr>
+          <w:rFonts w:ascii="Arial" w:hAnsi="Arial" w:cs="Arial"/>
+          <w:color w:val="auto"/>
+          <w:sz w:val="24"/>
+          <w:szCs w:val="24"/>
+        </w:rPr>
+        <w:t xml:space="preserve"> </w:t>
+      </w:r>
+      <w:r>
+        <w:rPr>
+          <w:rFonts w:ascii="Arial" w:hAnsi="Arial" w:cs="Arial"/>
+          <w:color w:val="auto"/>
+          <w:sz w:val="24"/>
+          <w:szCs w:val="24"/>
+        </w:rPr>
+        <w:t>el turno también en una pantalla física en la sucursal.</w:t>
+      </w:r>
+    </w:p>
+    <w:p>
+      <w:pPr>
+        <w:pStyle w:val="Ttulo1"/>
         <w:numPr>
           <w:ilvl w:val="0"/>
-          <w:numId w:val="25"/>
+          <w:numId w:val="47"/>
         </w:numPr>
         <w:jc w:val="both"/>
         <w:rPr>
           <w:rFonts w:ascii="Arial" w:hAnsi="Arial" w:cs="Arial"/>
-        </w:rPr>
-      </w:pPr>
-      <w:r>
-        <w:rPr>
-          <w:rFonts w:ascii="Arial" w:hAnsi="Arial" w:cs="Arial"/>
-        </w:rPr>
-        <w:t>respaldo de datos</w:t>
+          <w:color w:val="auto"/>
+          <w:sz w:val="24"/>
+          <w:szCs w:val="24"/>
+        </w:rPr>
+      </w:pPr>
+      <w:r>
+        <w:rPr>
+          <w:rFonts w:ascii="Arial" w:hAnsi="Arial" w:cs="Arial"/>
+          <w:color w:val="auto"/>
+          <w:sz w:val="24"/>
+          <w:szCs w:val="24"/>
+        </w:rPr>
+        <w:t>Respaldo (</w:t>
+      </w:r>
+      <w:proofErr w:type="spellStart"/>
+      <w:r>
+        <w:rPr>
+          <w:rFonts w:ascii="Arial" w:hAnsi="Arial" w:cs="Arial"/>
+          <w:color w:val="auto"/>
+          <w:sz w:val="24"/>
+          <w:szCs w:val="24"/>
+        </w:rPr>
+        <w:t>backup</w:t>
+      </w:r>
+      <w:proofErr w:type="spellEnd"/>
+      <w:r>
+        <w:rPr>
+          <w:rFonts w:ascii="Arial" w:hAnsi="Arial" w:cs="Arial"/>
+          <w:color w:val="auto"/>
+          <w:sz w:val="24"/>
+          <w:szCs w:val="24"/>
+        </w:rPr>
+        <w:t>) y replicación de datos: copias periódicas de la base</w:t>
+      </w:r>
+      <w:r>
+        <w:rPr>
+          <w:rFonts w:ascii="Arial" w:hAnsi="Arial" w:cs="Arial"/>
+          <w:color w:val="auto"/>
+          <w:sz w:val="24"/>
+          <w:szCs w:val="24"/>
+        </w:rPr>
+        <w:t xml:space="preserve"> </w:t>
+      </w:r>
+      <w:r>
+        <w:rPr>
+          <w:rFonts w:ascii="Arial" w:hAnsi="Arial" w:cs="Arial"/>
+          <w:color w:val="auto"/>
+          <w:sz w:val="24"/>
+          <w:szCs w:val="24"/>
+        </w:rPr>
+        <w:t>de datos de turnos, priorizando por ser la más crítica, para poder restaurar el</w:t>
+      </w:r>
+      <w:r>
+        <w:rPr>
+          <w:rFonts w:ascii="Arial" w:hAnsi="Arial" w:cs="Arial"/>
+          <w:color w:val="auto"/>
+          <w:sz w:val="24"/>
+          <w:szCs w:val="24"/>
+        </w:rPr>
+        <w:t xml:space="preserve"> </w:t>
+      </w:r>
+      <w:r>
+        <w:rPr>
+          <w:rFonts w:ascii="Arial" w:hAnsi="Arial" w:cs="Arial"/>
+          <w:color w:val="auto"/>
+          <w:sz w:val="24"/>
+          <w:szCs w:val="24"/>
+        </w:rPr>
+        <w:t>estado de la cola sin perder información.</w:t>
+      </w:r>
+    </w:p>
+    <w:p>
+      <w:pPr>
+        <w:pStyle w:val="Ttulo1"/>
+        <w:numPr>
+          <w:ilvl w:val="0"/>
+          <w:numId w:val="47"/>
+        </w:numPr>
+        <w:jc w:val="both"/>
+        <w:rPr>
+          <w:rFonts w:ascii="Arial" w:hAnsi="Arial" w:cs="Arial"/>
+          <w:color w:val="auto"/>
+          <w:sz w:val="24"/>
+          <w:szCs w:val="24"/>
+        </w:rPr>
+      </w:pPr>
+      <w:r>
+        <w:rPr>
+          <w:rFonts w:ascii="Arial" w:hAnsi="Arial" w:cs="Arial"/>
+          <w:color w:val="auto"/>
+          <w:sz w:val="24"/>
+          <w:szCs w:val="24"/>
+        </w:rPr>
+        <w:t>Modo degradado: si el servidor principal falla, permitir que las sucursales</w:t>
+      </w:r>
+      <w:r>
+        <w:rPr>
+          <w:rFonts w:ascii="Arial" w:hAnsi="Arial" w:cs="Arial"/>
+          <w:color w:val="auto"/>
+          <w:sz w:val="24"/>
+          <w:szCs w:val="24"/>
+        </w:rPr>
+        <w:t xml:space="preserve"> </w:t>
+      </w:r>
+      <w:r>
+        <w:rPr>
+          <w:rFonts w:ascii="Arial" w:hAnsi="Arial" w:cs="Arial"/>
+          <w:color w:val="auto"/>
+          <w:sz w:val="24"/>
+          <w:szCs w:val="24"/>
+        </w:rPr>
+        <w:t>sigan atendiendo manualmente (papel/orden de llegada) mientras se</w:t>
+      </w:r>
+      <w:r>
+        <w:rPr>
+          <w:rFonts w:ascii="Arial" w:hAnsi="Arial" w:cs="Arial"/>
+          <w:color w:val="auto"/>
+          <w:sz w:val="24"/>
+          <w:szCs w:val="24"/>
+        </w:rPr>
+        <w:t xml:space="preserve"> </w:t>
+      </w:r>
+      <w:r>
+        <w:rPr>
+          <w:rFonts w:ascii="Arial" w:hAnsi="Arial" w:cs="Arial"/>
+          <w:color w:val="auto"/>
+          <w:sz w:val="24"/>
+          <w:szCs w:val="24"/>
+        </w:rPr>
+        <w:t>restablece el sistema.</w:t>
+      </w:r>
+    </w:p>
+    <w:p>
+      <w:pPr>
+        <w:pStyle w:val="Ttulo1"/>
+        <w:numPr>
+          <w:ilvl w:val="0"/>
+          <w:numId w:val="47"/>
+        </w:numPr>
+        <w:jc w:val="both"/>
+        <w:rPr>
+          <w:rFonts w:ascii="Arial" w:hAnsi="Arial" w:cs="Arial"/>
+          <w:color w:val="auto"/>
+          <w:sz w:val="24"/>
+          <w:szCs w:val="24"/>
+        </w:rPr>
+      </w:pPr>
+      <w:r>
+        <w:rPr>
+          <w:rFonts w:ascii="Arial" w:hAnsi="Arial" w:cs="Arial"/>
+          <w:color w:val="auto"/>
+          <w:sz w:val="24"/>
+          <w:szCs w:val="24"/>
+        </w:rPr>
+        <w:t>Redundancia del servidor: tener un servidor secundario que tome el control</w:t>
+      </w:r>
+      <w:r>
+        <w:rPr>
+          <w:rFonts w:ascii="Arial" w:hAnsi="Arial" w:cs="Arial"/>
+          <w:color w:val="auto"/>
+          <w:sz w:val="24"/>
+          <w:szCs w:val="24"/>
+        </w:rPr>
+        <w:t xml:space="preserve"> </w:t>
+      </w:r>
+      <w:r>
+        <w:rPr>
+          <w:rFonts w:ascii="Arial" w:hAnsi="Arial" w:cs="Arial"/>
+          <w:color w:val="auto"/>
+          <w:sz w:val="24"/>
+          <w:szCs w:val="24"/>
+        </w:rPr>
+        <w:t xml:space="preserve">automáticamente si </w:t>
+      </w:r>
+      <w:proofErr w:type="gramStart"/>
+      <w:r>
+        <w:rPr>
+          <w:rFonts w:ascii="Arial" w:hAnsi="Arial" w:cs="Arial"/>
+          <w:color w:val="auto"/>
+          <w:sz w:val="24"/>
+          <w:szCs w:val="24"/>
+        </w:rPr>
+        <w:t>el principal falla</w:t>
+      </w:r>
+      <w:proofErr w:type="gramEnd"/>
+      <w:r>
+        <w:rPr>
+          <w:rFonts w:ascii="Arial" w:hAnsi="Arial" w:cs="Arial"/>
+          <w:color w:val="auto"/>
+          <w:sz w:val="24"/>
+          <w:szCs w:val="24"/>
+        </w:rPr>
+        <w:t xml:space="preserve"> (</w:t>
+      </w:r>
+      <w:proofErr w:type="spellStart"/>
+      <w:r>
+        <w:rPr>
+          <w:rFonts w:ascii="Arial" w:hAnsi="Arial" w:cs="Arial"/>
+          <w:color w:val="auto"/>
+          <w:sz w:val="24"/>
+          <w:szCs w:val="24"/>
+        </w:rPr>
+        <w:t>failover</w:t>
+      </w:r>
+      <w:proofErr w:type="spellEnd"/>
+      <w:r>
+        <w:rPr>
+          <w:rFonts w:ascii="Arial" w:hAnsi="Arial" w:cs="Arial"/>
+          <w:color w:val="auto"/>
+          <w:sz w:val="24"/>
+          <w:szCs w:val="24"/>
+        </w:rPr>
+        <w:t>)</w:t>
       </w:r>
     </w:p>
     <w:p>
@@ -3478,6 +3878,7 @@
     </w:p>
     <w:p>
       <w:pPr>
+        <w:jc w:val="both"/>
         <w:rPr>
           <w:rFonts w:ascii="Arial" w:eastAsia="Times New Roman" w:hAnsi="Arial" w:cs="Arial"/>
           <w:lang w:eastAsia="es-CO"/>
@@ -3727,98 +4128,1293 @@
           <w:sz w:val="24"/>
           <w:szCs w:val="24"/>
         </w:rPr>
+        <w:lastRenderedPageBreak/>
         <w:t>PARTE 10 — REVISIÓN DEL EQUIPO</w:t>
       </w:r>
     </w:p>
     <w:p>
       <w:pPr>
-        <w:pStyle w:val="NormalWeb"/>
-        <w:jc w:val="both"/>
-        <w:rPr>
-          <w:rFonts w:ascii="Arial" w:hAnsi="Arial" w:cs="Arial"/>
-        </w:rPr>
-      </w:pPr>
-      <w:r>
-        <w:rPr>
-          <w:rFonts w:ascii="Arial" w:hAnsi="Arial" w:cs="Arial"/>
-        </w:rPr>
-        <w:t>Cada integrante debe:</w:t>
-      </w:r>
-    </w:p>
-    <w:p>
-      <w:pPr>
-        <w:pStyle w:val="NormalWeb"/>
+        <w:pStyle w:val="Ttulo1"/>
+        <w:jc w:val="both"/>
+        <w:rPr>
+          <w:rFonts w:ascii="Arial" w:hAnsi="Arial" w:cs="Arial"/>
+          <w:b/>
+          <w:bCs/>
+          <w:color w:val="auto"/>
+          <w:sz w:val="24"/>
+          <w:szCs w:val="24"/>
+        </w:rPr>
+      </w:pPr>
+      <w:r>
+        <w:rPr>
+          <w:rFonts w:ascii="Arial" w:hAnsi="Arial" w:cs="Arial"/>
+          <w:b/>
+          <w:bCs/>
+          <w:color w:val="auto"/>
+          <w:sz w:val="24"/>
+          <w:szCs w:val="24"/>
+        </w:rPr>
+        <w:t>Revisión de Plataforma de reservas de Hoteles:</w:t>
+      </w:r>
+    </w:p>
+    <w:p>
+      <w:pPr>
+        <w:pStyle w:val="Ttulo1"/>
+        <w:jc w:val="both"/>
+        <w:rPr>
+          <w:rFonts w:ascii="Arial" w:hAnsi="Arial" w:cs="Arial"/>
+          <w:b/>
+          <w:bCs/>
+          <w:color w:val="auto"/>
+          <w:sz w:val="24"/>
+          <w:szCs w:val="24"/>
+        </w:rPr>
+      </w:pPr>
+      <w:r>
+        <w:rPr>
+          <w:rFonts w:ascii="Arial" w:hAnsi="Arial" w:cs="Arial"/>
+          <w:b/>
+          <w:bCs/>
+          <w:color w:val="auto"/>
+          <w:sz w:val="24"/>
+          <w:szCs w:val="24"/>
+        </w:rPr>
+        <w:t>Mejoras:</w:t>
+      </w:r>
+    </w:p>
+    <w:p>
+      <w:pPr>
+        <w:pStyle w:val="Ttulo1"/>
+        <w:jc w:val="both"/>
+        <w:rPr>
+          <w:rFonts w:ascii="Arial" w:hAnsi="Arial" w:cs="Arial"/>
+          <w:color w:val="auto"/>
+          <w:sz w:val="24"/>
+          <w:szCs w:val="24"/>
+        </w:rPr>
+      </w:pPr>
+      <w:r>
+        <w:rPr>
+          <w:rFonts w:ascii="Arial" w:hAnsi="Arial" w:cs="Arial"/>
+          <w:color w:val="auto"/>
+          <w:sz w:val="24"/>
+          <w:szCs w:val="24"/>
+        </w:rPr>
+        <w:t>Si es una aplicación que apenas está iniciando, separar la autenticación y la gestión</w:t>
+      </w:r>
+      <w:r>
+        <w:rPr>
+          <w:rFonts w:ascii="Arial" w:hAnsi="Arial" w:cs="Arial"/>
+          <w:color w:val="auto"/>
+          <w:sz w:val="24"/>
+          <w:szCs w:val="24"/>
+        </w:rPr>
+        <w:t xml:space="preserve"> </w:t>
+      </w:r>
+      <w:r>
+        <w:rPr>
+          <w:rFonts w:ascii="Arial" w:hAnsi="Arial" w:cs="Arial"/>
+          <w:color w:val="auto"/>
+          <w:sz w:val="24"/>
+          <w:szCs w:val="24"/>
+        </w:rPr>
+        <w:t>de los usuarios en servicios independientes no es una propuesta totalmente</w:t>
+      </w:r>
+      <w:r>
+        <w:rPr>
+          <w:rFonts w:ascii="Arial" w:hAnsi="Arial" w:cs="Arial"/>
+          <w:color w:val="auto"/>
+          <w:sz w:val="24"/>
+          <w:szCs w:val="24"/>
+        </w:rPr>
+        <w:t xml:space="preserve"> </w:t>
+      </w:r>
+      <w:r>
+        <w:rPr>
+          <w:rFonts w:ascii="Arial" w:hAnsi="Arial" w:cs="Arial"/>
+          <w:color w:val="auto"/>
+          <w:sz w:val="24"/>
+          <w:szCs w:val="24"/>
+        </w:rPr>
+        <w:t>adecuada, puede introducir una alta complejidad innecesaria. Aunque se puedan</w:t>
+      </w:r>
+      <w:r>
+        <w:rPr>
+          <w:rFonts w:ascii="Arial" w:hAnsi="Arial" w:cs="Arial"/>
+          <w:color w:val="auto"/>
+          <w:sz w:val="24"/>
+          <w:szCs w:val="24"/>
+        </w:rPr>
+        <w:t xml:space="preserve"> </w:t>
+      </w:r>
+      <w:r>
+        <w:rPr>
+          <w:rFonts w:ascii="Arial" w:hAnsi="Arial" w:cs="Arial"/>
+          <w:color w:val="auto"/>
+          <w:sz w:val="24"/>
+          <w:szCs w:val="24"/>
+        </w:rPr>
+        <w:t>ver como dos servicios con funciones diferentes, sería más conveniente</w:t>
+      </w:r>
+      <w:r>
+        <w:rPr>
+          <w:rFonts w:ascii="Arial" w:hAnsi="Arial" w:cs="Arial"/>
+          <w:color w:val="auto"/>
+          <w:sz w:val="24"/>
+          <w:szCs w:val="24"/>
+        </w:rPr>
+        <w:t xml:space="preserve"> </w:t>
+      </w:r>
+      <w:r>
+        <w:rPr>
+          <w:rFonts w:ascii="Arial" w:hAnsi="Arial" w:cs="Arial"/>
+          <w:color w:val="auto"/>
+          <w:sz w:val="24"/>
+          <w:szCs w:val="24"/>
+        </w:rPr>
+        <w:t>mantenerlas juntas inicialmente para evitar la duplicidad de datos, múltiples</w:t>
+      </w:r>
+      <w:r>
+        <w:rPr>
+          <w:rFonts w:ascii="Arial" w:hAnsi="Arial" w:cs="Arial"/>
+          <w:color w:val="auto"/>
+          <w:sz w:val="24"/>
+          <w:szCs w:val="24"/>
+        </w:rPr>
+        <w:t xml:space="preserve"> </w:t>
+      </w:r>
+      <w:r>
+        <w:rPr>
+          <w:rFonts w:ascii="Arial" w:hAnsi="Arial" w:cs="Arial"/>
+          <w:color w:val="auto"/>
+          <w:sz w:val="24"/>
+          <w:szCs w:val="24"/>
+        </w:rPr>
+        <w:t>despliegues, y problemas de comunicación entre servicios.</w:t>
+      </w:r>
+    </w:p>
+    <w:p>
+      <w:pPr>
+        <w:pStyle w:val="Ttulo1"/>
+        <w:jc w:val="both"/>
+        <w:rPr>
+          <w:rFonts w:ascii="Arial" w:hAnsi="Arial" w:cs="Arial"/>
+          <w:b/>
+          <w:bCs/>
+          <w:color w:val="auto"/>
+          <w:sz w:val="24"/>
+          <w:szCs w:val="24"/>
+        </w:rPr>
+      </w:pPr>
+      <w:r>
+        <w:rPr>
+          <w:rFonts w:ascii="Arial" w:hAnsi="Arial" w:cs="Arial"/>
+          <w:b/>
+          <w:bCs/>
+          <w:color w:val="auto"/>
+          <w:sz w:val="24"/>
+          <w:szCs w:val="24"/>
+        </w:rPr>
+        <w:t>Correcciones:</w:t>
+      </w:r>
+    </w:p>
+    <w:p>
+      <w:pPr>
+        <w:pStyle w:val="Ttulo1"/>
         <w:numPr>
           <w:ilvl w:val="0"/>
-          <w:numId w:val="28"/>
+          <w:numId w:val="49"/>
         </w:numPr>
         <w:jc w:val="both"/>
         <w:rPr>
           <w:rFonts w:ascii="Arial" w:hAnsi="Arial" w:cs="Arial"/>
-        </w:rPr>
-      </w:pPr>
-      <w:r>
-        <w:rPr>
-          <w:rFonts w:ascii="Arial" w:hAnsi="Arial" w:cs="Arial"/>
-        </w:rPr>
-        <w:t>leer la arquitectura</w:t>
-      </w:r>
-    </w:p>
-    <w:p>
-      <w:pPr>
-        <w:pStyle w:val="NormalWeb"/>
+          <w:color w:val="auto"/>
+          <w:sz w:val="24"/>
+          <w:szCs w:val="24"/>
+        </w:rPr>
+      </w:pPr>
+      <w:r>
+        <w:rPr>
+          <w:rFonts w:ascii="Arial" w:hAnsi="Arial" w:cs="Arial"/>
+          <w:color w:val="auto"/>
+          <w:sz w:val="24"/>
+          <w:szCs w:val="24"/>
+        </w:rPr>
+        <w:t>En la pregunta “¿Qué procesos son independientes?” solo se mencionan</w:t>
+      </w:r>
+      <w:r>
+        <w:rPr>
+          <w:rFonts w:ascii="Arial" w:hAnsi="Arial" w:cs="Arial"/>
+          <w:color w:val="auto"/>
+          <w:sz w:val="24"/>
+          <w:szCs w:val="24"/>
+        </w:rPr>
+        <w:t xml:space="preserve"> </w:t>
+      </w:r>
+      <w:r>
+        <w:rPr>
+          <w:rFonts w:ascii="Arial" w:hAnsi="Arial" w:cs="Arial"/>
+          <w:color w:val="auto"/>
+          <w:sz w:val="24"/>
+          <w:szCs w:val="24"/>
+        </w:rPr>
+        <w:t>Usuarios, Hoteles y Autenticación. Sin embargo, en la pregunta anterior,</w:t>
+      </w:r>
+      <w:r>
+        <w:rPr>
+          <w:rFonts w:ascii="Arial" w:hAnsi="Arial" w:cs="Arial"/>
+          <w:color w:val="auto"/>
+          <w:sz w:val="24"/>
+          <w:szCs w:val="24"/>
+        </w:rPr>
+        <w:t xml:space="preserve"> </w:t>
+      </w:r>
+      <w:r>
+        <w:rPr>
+          <w:rFonts w:ascii="Arial" w:hAnsi="Arial" w:cs="Arial"/>
+          <w:color w:val="auto"/>
+          <w:sz w:val="24"/>
+          <w:szCs w:val="24"/>
+        </w:rPr>
+        <w:t>“¿Qué partes pueden trabajar por separado?”, también se incluyen</w:t>
+      </w:r>
+    </w:p>
+    <w:p>
+      <w:pPr>
+        <w:pStyle w:val="Ttulo1"/>
         <w:numPr>
           <w:ilvl w:val="0"/>
-          <w:numId w:val="28"/>
+          <w:numId w:val="49"/>
         </w:numPr>
         <w:jc w:val="both"/>
         <w:rPr>
           <w:rFonts w:ascii="Arial" w:hAnsi="Arial" w:cs="Arial"/>
-        </w:rPr>
-      </w:pPr>
-      <w:r>
-        <w:rPr>
-          <w:rFonts w:ascii="Arial" w:hAnsi="Arial" w:cs="Arial"/>
-        </w:rPr>
-        <w:t>sugerir mejoras</w:t>
-      </w:r>
-    </w:p>
-    <w:p>
-      <w:pPr>
-        <w:pStyle w:val="NormalWeb"/>
+          <w:color w:val="auto"/>
+          <w:sz w:val="24"/>
+          <w:szCs w:val="24"/>
+        </w:rPr>
+      </w:pPr>
+      <w:r>
+        <w:rPr>
+          <w:rFonts w:ascii="Arial" w:hAnsi="Arial" w:cs="Arial"/>
+          <w:color w:val="auto"/>
+          <w:sz w:val="24"/>
+          <w:szCs w:val="24"/>
+        </w:rPr>
+        <w:t>Notificaciones y Reseñas. Por lo tanto, la información no es completamente</w:t>
+      </w:r>
+      <w:r>
+        <w:rPr>
+          <w:rFonts w:ascii="Arial" w:hAnsi="Arial" w:cs="Arial"/>
+          <w:color w:val="auto"/>
+          <w:sz w:val="24"/>
+          <w:szCs w:val="24"/>
+        </w:rPr>
+        <w:t xml:space="preserve"> </w:t>
+      </w:r>
+      <w:r>
+        <w:rPr>
+          <w:rFonts w:ascii="Arial" w:hAnsi="Arial" w:cs="Arial"/>
+          <w:color w:val="auto"/>
+          <w:sz w:val="24"/>
+          <w:szCs w:val="24"/>
+        </w:rPr>
+        <w:t>coherente y se deberían incluir todos los servicios que puedan funcionar de</w:t>
+      </w:r>
+      <w:r>
+        <w:rPr>
+          <w:rFonts w:ascii="Arial" w:hAnsi="Arial" w:cs="Arial"/>
+          <w:color w:val="auto"/>
+          <w:sz w:val="24"/>
+          <w:szCs w:val="24"/>
+        </w:rPr>
+        <w:t xml:space="preserve"> </w:t>
+      </w:r>
+      <w:r>
+        <w:rPr>
+          <w:rFonts w:ascii="Arial" w:hAnsi="Arial" w:cs="Arial"/>
+          <w:color w:val="auto"/>
+          <w:sz w:val="24"/>
+          <w:szCs w:val="24"/>
+        </w:rPr>
+        <w:t>manera independiente.</w:t>
+      </w:r>
+    </w:p>
+    <w:p>
+      <w:pPr>
+        <w:pStyle w:val="Ttulo1"/>
+        <w:jc w:val="both"/>
+        <w:rPr>
+          <w:rFonts w:ascii="Arial" w:hAnsi="Arial" w:cs="Arial"/>
+          <w:color w:val="auto"/>
+          <w:sz w:val="24"/>
+          <w:szCs w:val="24"/>
+        </w:rPr>
+      </w:pPr>
+    </w:p>
+    <w:p>
+      <w:pPr>
+        <w:pStyle w:val="Ttulo1"/>
         <w:numPr>
           <w:ilvl w:val="0"/>
-          <w:numId w:val="28"/>
+          <w:numId w:val="48"/>
         </w:numPr>
         <w:jc w:val="both"/>
         <w:rPr>
           <w:rFonts w:ascii="Arial" w:hAnsi="Arial" w:cs="Arial"/>
-        </w:rPr>
-      </w:pPr>
-      <w:r>
-        <w:rPr>
-          <w:rFonts w:ascii="Arial" w:hAnsi="Arial" w:cs="Arial"/>
-        </w:rPr>
-        <w:t>identificar fallos posibles</w:t>
-      </w:r>
-    </w:p>
-    <w:p>
-      <w:pPr>
-        <w:pStyle w:val="NormalWeb"/>
+          <w:color w:val="auto"/>
+          <w:sz w:val="24"/>
+          <w:szCs w:val="24"/>
+        </w:rPr>
+      </w:pPr>
+      <w:r>
+        <w:rPr>
+          <w:rFonts w:ascii="Arial" w:hAnsi="Arial" w:cs="Arial"/>
+          <w:color w:val="auto"/>
+          <w:sz w:val="24"/>
+          <w:szCs w:val="24"/>
+        </w:rPr>
+        <w:t>Se debería mencionar de forma clara cómo se comunicarán los servicios.</w:t>
+      </w:r>
+      <w:r>
+        <w:rPr>
+          <w:rFonts w:ascii="Arial" w:hAnsi="Arial" w:cs="Arial"/>
+          <w:color w:val="auto"/>
+          <w:sz w:val="24"/>
+          <w:szCs w:val="24"/>
+        </w:rPr>
+        <w:t xml:space="preserve"> </w:t>
+      </w:r>
+      <w:r>
+        <w:rPr>
+          <w:rFonts w:ascii="Arial" w:hAnsi="Arial" w:cs="Arial"/>
+          <w:color w:val="auto"/>
+          <w:sz w:val="24"/>
+          <w:szCs w:val="24"/>
+        </w:rPr>
+        <w:t>Por ejemplo, utilizar comunicación REST síncrona para consultas que</w:t>
+      </w:r>
+      <w:r>
+        <w:rPr>
+          <w:rFonts w:ascii="Arial" w:hAnsi="Arial" w:cs="Arial"/>
+          <w:color w:val="auto"/>
+          <w:sz w:val="24"/>
+          <w:szCs w:val="24"/>
+        </w:rPr>
+        <w:t xml:space="preserve"> </w:t>
+      </w:r>
+      <w:r>
+        <w:rPr>
+          <w:rFonts w:ascii="Arial" w:hAnsi="Arial" w:cs="Arial"/>
+          <w:color w:val="auto"/>
+          <w:sz w:val="24"/>
+          <w:szCs w:val="24"/>
+        </w:rPr>
+        <w:t>necesitan una respuesta inmediata, como la consulta de disponibilidad, y</w:t>
+      </w:r>
+      <w:r>
+        <w:rPr>
+          <w:rFonts w:ascii="Arial" w:hAnsi="Arial" w:cs="Arial"/>
+          <w:color w:val="auto"/>
+          <w:sz w:val="24"/>
+          <w:szCs w:val="24"/>
+        </w:rPr>
+        <w:t xml:space="preserve"> </w:t>
+      </w:r>
+      <w:r>
+        <w:rPr>
+          <w:rFonts w:ascii="Arial" w:hAnsi="Arial" w:cs="Arial"/>
+          <w:color w:val="auto"/>
+          <w:sz w:val="24"/>
+          <w:szCs w:val="24"/>
+        </w:rPr>
+        <w:t>mensajería asíncrona para procesos como el envío de notificaciones.</w:t>
+      </w:r>
+    </w:p>
+    <w:p>
+      <w:pPr>
+        <w:pStyle w:val="Ttulo1"/>
         <w:numPr>
           <w:ilvl w:val="0"/>
-          <w:numId w:val="28"/>
+          <w:numId w:val="48"/>
         </w:numPr>
         <w:jc w:val="both"/>
         <w:rPr>
           <w:rFonts w:ascii="Arial" w:hAnsi="Arial" w:cs="Arial"/>
-        </w:rPr>
-      </w:pPr>
-      <w:r>
-        <w:rPr>
-          <w:rFonts w:ascii="Arial" w:hAnsi="Arial" w:cs="Arial"/>
-        </w:rPr>
-        <w:t>confirmar si el diseño tiene sentido</w:t>
+          <w:color w:val="auto"/>
+          <w:sz w:val="24"/>
+          <w:szCs w:val="24"/>
+        </w:rPr>
+      </w:pPr>
+      <w:r>
+        <w:rPr>
+          <w:rFonts w:ascii="Arial" w:hAnsi="Arial" w:cs="Arial"/>
+          <w:color w:val="auto"/>
+          <w:sz w:val="24"/>
+          <w:szCs w:val="24"/>
+        </w:rPr>
+        <w:t>También sería conveniente mencionar el uso de un API Gateway como punto</w:t>
+      </w:r>
+      <w:r>
+        <w:rPr>
+          <w:rFonts w:ascii="Arial" w:hAnsi="Arial" w:cs="Arial"/>
+          <w:color w:val="auto"/>
+          <w:sz w:val="24"/>
+          <w:szCs w:val="24"/>
+        </w:rPr>
+        <w:t xml:space="preserve"> </w:t>
+      </w:r>
+      <w:r>
+        <w:rPr>
+          <w:rFonts w:ascii="Arial" w:hAnsi="Arial" w:cs="Arial"/>
+          <w:color w:val="auto"/>
+          <w:sz w:val="24"/>
+          <w:szCs w:val="24"/>
+        </w:rPr>
+        <w:t>de entrada para las solicitudes realizadas por los clientes.</w:t>
+      </w:r>
+    </w:p>
+    <w:p>
+      <w:pPr>
+        <w:pStyle w:val="Ttulo1"/>
+        <w:jc w:val="both"/>
+        <w:rPr>
+          <w:rFonts w:ascii="Arial" w:hAnsi="Arial" w:cs="Arial"/>
+          <w:color w:val="auto"/>
+          <w:sz w:val="24"/>
+          <w:szCs w:val="24"/>
+        </w:rPr>
+      </w:pPr>
+    </w:p>
+    <w:p>
+      <w:pPr>
+        <w:pStyle w:val="Ttulo1"/>
+        <w:numPr>
+          <w:ilvl w:val="0"/>
+          <w:numId w:val="48"/>
+        </w:numPr>
+        <w:jc w:val="both"/>
+        <w:rPr>
+          <w:rFonts w:ascii="Arial" w:hAnsi="Arial" w:cs="Arial"/>
+          <w:color w:val="auto"/>
+          <w:sz w:val="24"/>
+          <w:szCs w:val="24"/>
+        </w:rPr>
+      </w:pPr>
+      <w:r>
+        <w:rPr>
+          <w:rFonts w:ascii="Arial" w:hAnsi="Arial" w:cs="Arial"/>
+          <w:color w:val="auto"/>
+          <w:sz w:val="24"/>
+          <w:szCs w:val="24"/>
+        </w:rPr>
+        <w:t>La comunicación entre servicios está representada actualmente con</w:t>
+      </w:r>
+      <w:r>
+        <w:rPr>
+          <w:rFonts w:ascii="Arial" w:hAnsi="Arial" w:cs="Arial"/>
+          <w:color w:val="auto"/>
+          <w:sz w:val="24"/>
+          <w:szCs w:val="24"/>
+        </w:rPr>
+        <w:t xml:space="preserve"> </w:t>
+      </w:r>
+      <w:r>
+        <w:rPr>
+          <w:rFonts w:ascii="Arial" w:hAnsi="Arial" w:cs="Arial"/>
+          <w:color w:val="auto"/>
+          <w:sz w:val="24"/>
+          <w:szCs w:val="24"/>
+        </w:rPr>
+        <w:t>ejemplos que no corresponden a los servicios definidos, como “Pedidos →</w:t>
+      </w:r>
+      <w:r>
+        <w:rPr>
+          <w:rFonts w:ascii="Arial" w:hAnsi="Arial" w:cs="Arial"/>
+          <w:color w:val="auto"/>
+          <w:sz w:val="24"/>
+          <w:szCs w:val="24"/>
+        </w:rPr>
+        <w:t xml:space="preserve"> </w:t>
+      </w:r>
+      <w:r>
+        <w:rPr>
+          <w:rFonts w:ascii="Arial" w:hAnsi="Arial" w:cs="Arial"/>
+          <w:color w:val="auto"/>
+          <w:sz w:val="24"/>
+          <w:szCs w:val="24"/>
+        </w:rPr>
+        <w:t>solicita → Inventario” y “Pagos → confirma → Pedidos”. Se recomienda</w:t>
+      </w:r>
+      <w:r>
+        <w:rPr>
+          <w:rFonts w:ascii="Arial" w:hAnsi="Arial" w:cs="Arial"/>
+          <w:color w:val="auto"/>
+          <w:sz w:val="24"/>
+          <w:szCs w:val="24"/>
+        </w:rPr>
+        <w:t xml:space="preserve"> </w:t>
+      </w:r>
+      <w:r>
+        <w:rPr>
+          <w:rFonts w:ascii="Arial" w:hAnsi="Arial" w:cs="Arial"/>
+          <w:color w:val="auto"/>
+          <w:sz w:val="24"/>
+          <w:szCs w:val="24"/>
+        </w:rPr>
+        <w:t>reemplazarlos por ejemplos relacionados con la plataforma de reservas,</w:t>
+      </w:r>
+      <w:r>
+        <w:rPr>
+          <w:rFonts w:ascii="Arial" w:hAnsi="Arial" w:cs="Arial"/>
+          <w:color w:val="auto"/>
+          <w:sz w:val="24"/>
+          <w:szCs w:val="24"/>
+        </w:rPr>
+        <w:t xml:space="preserve"> </w:t>
+      </w:r>
+      <w:r>
+        <w:rPr>
+          <w:rFonts w:ascii="Arial" w:hAnsi="Arial" w:cs="Arial"/>
+          <w:color w:val="auto"/>
+          <w:sz w:val="24"/>
+          <w:szCs w:val="24"/>
+        </w:rPr>
+        <w:t>como:</w:t>
+      </w:r>
+    </w:p>
+    <w:p>
+      <w:pPr>
+        <w:pStyle w:val="Ttulo1"/>
+        <w:jc w:val="both"/>
+        <w:rPr>
+          <w:rFonts w:ascii="Arial" w:hAnsi="Arial" w:cs="Arial"/>
+          <w:color w:val="auto"/>
+          <w:sz w:val="24"/>
+          <w:szCs w:val="24"/>
+        </w:rPr>
+      </w:pPr>
+      <w:proofErr w:type="spellStart"/>
+      <w:r>
+        <w:rPr>
+          <w:rFonts w:ascii="Arial" w:hAnsi="Arial" w:cs="Arial"/>
+          <w:color w:val="auto"/>
+          <w:sz w:val="24"/>
+          <w:szCs w:val="24"/>
+        </w:rPr>
+        <w:t>Reservas→solicita→Disponibilidad</w:t>
+      </w:r>
+      <w:proofErr w:type="spellEnd"/>
+    </w:p>
+    <w:p>
+      <w:pPr>
+        <w:pStyle w:val="Ttulo1"/>
+        <w:jc w:val="both"/>
+        <w:rPr>
+          <w:rFonts w:ascii="Arial" w:hAnsi="Arial" w:cs="Arial"/>
+          <w:color w:val="auto"/>
+          <w:sz w:val="24"/>
+          <w:szCs w:val="24"/>
+        </w:rPr>
+      </w:pPr>
+      <w:proofErr w:type="spellStart"/>
+      <w:r>
+        <w:rPr>
+          <w:rFonts w:ascii="Arial" w:hAnsi="Arial" w:cs="Arial"/>
+          <w:color w:val="auto"/>
+          <w:sz w:val="24"/>
+          <w:szCs w:val="24"/>
+        </w:rPr>
+        <w:t>Reservas→solicita→Hoteles</w:t>
+      </w:r>
+      <w:proofErr w:type="spellEnd"/>
+    </w:p>
+    <w:p>
+      <w:pPr>
+        <w:pStyle w:val="Ttulo1"/>
+        <w:jc w:val="both"/>
+        <w:rPr>
+          <w:rFonts w:ascii="Arial" w:hAnsi="Arial" w:cs="Arial"/>
+          <w:color w:val="auto"/>
+          <w:sz w:val="24"/>
+          <w:szCs w:val="24"/>
+        </w:rPr>
+      </w:pPr>
+      <w:r>
+        <w:rPr>
+          <w:rFonts w:ascii="Arial" w:hAnsi="Arial" w:cs="Arial"/>
+          <w:color w:val="auto"/>
+          <w:sz w:val="24"/>
+          <w:szCs w:val="24"/>
+        </w:rPr>
+        <w:lastRenderedPageBreak/>
+        <w:t>Reservas → notifica → Notificaciones</w:t>
+      </w:r>
+    </w:p>
+    <w:p>
+      <w:pPr>
+        <w:pStyle w:val="Ttulo1"/>
+        <w:jc w:val="both"/>
+        <w:rPr>
+          <w:rFonts w:ascii="Arial" w:hAnsi="Arial" w:cs="Arial"/>
+          <w:b/>
+          <w:bCs/>
+          <w:color w:val="auto"/>
+          <w:sz w:val="24"/>
+          <w:szCs w:val="24"/>
+        </w:rPr>
+      </w:pPr>
+      <w:r>
+        <w:rPr>
+          <w:rFonts w:ascii="Arial" w:hAnsi="Arial" w:cs="Arial"/>
+          <w:b/>
+          <w:bCs/>
+          <w:color w:val="auto"/>
+          <w:sz w:val="24"/>
+          <w:szCs w:val="24"/>
+        </w:rPr>
+        <w:t>Fallos posibles</w:t>
+      </w:r>
+    </w:p>
+    <w:p>
+      <w:pPr>
+        <w:pStyle w:val="Ttulo1"/>
+        <w:numPr>
+          <w:ilvl w:val="0"/>
+          <w:numId w:val="48"/>
+        </w:numPr>
+        <w:jc w:val="both"/>
+        <w:rPr>
+          <w:rFonts w:ascii="Arial" w:hAnsi="Arial" w:cs="Arial"/>
+          <w:color w:val="auto"/>
+          <w:sz w:val="24"/>
+          <w:szCs w:val="24"/>
+        </w:rPr>
+      </w:pPr>
+      <w:r>
+        <w:rPr>
+          <w:rFonts w:ascii="Arial" w:hAnsi="Arial" w:cs="Arial"/>
+          <w:color w:val="auto"/>
+          <w:sz w:val="24"/>
+          <w:szCs w:val="24"/>
+        </w:rPr>
+        <w:t>Falta de un servicio de Pagos: Si la plataforma contempla pagos, debería</w:t>
+      </w:r>
+      <w:r>
+        <w:rPr>
+          <w:rFonts w:ascii="Arial" w:hAnsi="Arial" w:cs="Arial"/>
+          <w:color w:val="auto"/>
+          <w:sz w:val="24"/>
+          <w:szCs w:val="24"/>
+        </w:rPr>
+        <w:t xml:space="preserve"> </w:t>
+      </w:r>
+      <w:r>
+        <w:rPr>
+          <w:rFonts w:ascii="Arial" w:hAnsi="Arial" w:cs="Arial"/>
+          <w:color w:val="auto"/>
+          <w:sz w:val="24"/>
+          <w:szCs w:val="24"/>
+        </w:rPr>
+        <w:t>definirse este servicio. De lo contrario, podría presentarse un problema de</w:t>
+      </w:r>
+      <w:r>
+        <w:rPr>
+          <w:rFonts w:ascii="Arial" w:hAnsi="Arial" w:cs="Arial"/>
+          <w:color w:val="auto"/>
+          <w:sz w:val="24"/>
+          <w:szCs w:val="24"/>
+        </w:rPr>
+        <w:t xml:space="preserve"> </w:t>
+      </w:r>
+      <w:r>
+        <w:rPr>
+          <w:rFonts w:ascii="Arial" w:hAnsi="Arial" w:cs="Arial"/>
+          <w:color w:val="auto"/>
+          <w:sz w:val="24"/>
+          <w:szCs w:val="24"/>
+        </w:rPr>
+        <w:t>consistencia, como una reserva confirmada sin que se haya realizado el pago</w:t>
+      </w:r>
+      <w:r>
+        <w:rPr>
+          <w:rFonts w:ascii="Arial" w:hAnsi="Arial" w:cs="Arial"/>
+          <w:color w:val="auto"/>
+          <w:sz w:val="24"/>
+          <w:szCs w:val="24"/>
+        </w:rPr>
+        <w:t xml:space="preserve"> </w:t>
+      </w:r>
+      <w:r>
+        <w:rPr>
+          <w:rFonts w:ascii="Arial" w:hAnsi="Arial" w:cs="Arial"/>
+          <w:color w:val="auto"/>
+          <w:sz w:val="24"/>
+          <w:szCs w:val="24"/>
+        </w:rPr>
+        <w:t>o un pago realizado sin que la reserva haya sido confirmada.</w:t>
+      </w:r>
+    </w:p>
+    <w:p>
+      <w:pPr>
+        <w:pStyle w:val="Ttulo1"/>
+        <w:numPr>
+          <w:ilvl w:val="0"/>
+          <w:numId w:val="48"/>
+        </w:numPr>
+        <w:jc w:val="both"/>
+        <w:rPr>
+          <w:rFonts w:ascii="Arial" w:hAnsi="Arial" w:cs="Arial"/>
+          <w:color w:val="auto"/>
+          <w:sz w:val="24"/>
+          <w:szCs w:val="24"/>
+        </w:rPr>
+      </w:pPr>
+      <w:r>
+        <w:rPr>
+          <w:rFonts w:ascii="Arial" w:hAnsi="Arial" w:cs="Arial"/>
+          <w:color w:val="auto"/>
+          <w:sz w:val="24"/>
+          <w:szCs w:val="24"/>
+        </w:rPr>
+        <w:t>Inconsistencia de datos entre microservicios: Al manejar bases de datos</w:t>
+      </w:r>
+      <w:r>
+        <w:rPr>
+          <w:rFonts w:ascii="Arial" w:hAnsi="Arial" w:cs="Arial"/>
+          <w:color w:val="auto"/>
+          <w:sz w:val="24"/>
+          <w:szCs w:val="24"/>
+        </w:rPr>
+        <w:t xml:space="preserve"> </w:t>
+      </w:r>
+      <w:r>
+        <w:rPr>
+          <w:rFonts w:ascii="Arial" w:hAnsi="Arial" w:cs="Arial"/>
+          <w:color w:val="auto"/>
+          <w:sz w:val="24"/>
+          <w:szCs w:val="24"/>
+        </w:rPr>
+        <w:t>independientes, puede existir un fallo en la sincronización entre servicios. Por</w:t>
+      </w:r>
+      <w:r>
+        <w:rPr>
+          <w:rFonts w:ascii="Arial" w:hAnsi="Arial" w:cs="Arial"/>
+          <w:color w:val="auto"/>
+          <w:sz w:val="24"/>
+          <w:szCs w:val="24"/>
+        </w:rPr>
+        <w:t xml:space="preserve"> </w:t>
+      </w:r>
+      <w:r>
+        <w:rPr>
+          <w:rFonts w:ascii="Arial" w:hAnsi="Arial" w:cs="Arial"/>
+          <w:color w:val="auto"/>
+          <w:sz w:val="24"/>
+          <w:szCs w:val="24"/>
+        </w:rPr>
+        <w:t>ejemplo, si un usuario cancela una reserva y el servicio de Reservas actualiza</w:t>
+      </w:r>
+      <w:r>
+        <w:rPr>
+          <w:rFonts w:ascii="Arial" w:hAnsi="Arial" w:cs="Arial"/>
+          <w:color w:val="auto"/>
+          <w:sz w:val="24"/>
+          <w:szCs w:val="24"/>
+        </w:rPr>
+        <w:t xml:space="preserve"> </w:t>
+      </w:r>
+      <w:r>
+        <w:rPr>
+          <w:rFonts w:ascii="Arial" w:hAnsi="Arial" w:cs="Arial"/>
+          <w:color w:val="auto"/>
+          <w:sz w:val="24"/>
+          <w:szCs w:val="24"/>
+        </w:rPr>
+        <w:t>correctamente la información, pero la comunicación con el servicio de</w:t>
+      </w:r>
+    </w:p>
+    <w:p>
+      <w:pPr>
+        <w:pStyle w:val="Ttulo1"/>
+        <w:numPr>
+          <w:ilvl w:val="0"/>
+          <w:numId w:val="48"/>
+        </w:numPr>
+        <w:jc w:val="both"/>
+        <w:rPr>
+          <w:rFonts w:ascii="Arial" w:hAnsi="Arial" w:cs="Arial"/>
+          <w:color w:val="auto"/>
+          <w:sz w:val="24"/>
+          <w:szCs w:val="24"/>
+        </w:rPr>
+      </w:pPr>
+      <w:r>
+        <w:rPr>
+          <w:rFonts w:ascii="Arial" w:hAnsi="Arial" w:cs="Arial"/>
+          <w:color w:val="auto"/>
+          <w:sz w:val="24"/>
+          <w:szCs w:val="24"/>
+        </w:rPr>
+        <w:t>Notificaciones falla, este último podría no recibir la información de la</w:t>
+      </w:r>
+      <w:r>
+        <w:rPr>
+          <w:rFonts w:ascii="Arial" w:hAnsi="Arial" w:cs="Arial"/>
+          <w:color w:val="auto"/>
+          <w:sz w:val="24"/>
+          <w:szCs w:val="24"/>
+        </w:rPr>
+        <w:t xml:space="preserve"> </w:t>
+      </w:r>
+      <w:r>
+        <w:rPr>
+          <w:rFonts w:ascii="Arial" w:hAnsi="Arial" w:cs="Arial"/>
+          <w:color w:val="auto"/>
+          <w:sz w:val="24"/>
+          <w:szCs w:val="24"/>
+        </w:rPr>
+        <w:t>cancelación y mantener datos desactualizados.</w:t>
+      </w:r>
+    </w:p>
+    <w:p>
+      <w:pPr>
+        <w:pStyle w:val="Ttulo1"/>
+        <w:numPr>
+          <w:ilvl w:val="0"/>
+          <w:numId w:val="48"/>
+        </w:numPr>
+        <w:jc w:val="both"/>
+        <w:rPr>
+          <w:rFonts w:ascii="Arial" w:hAnsi="Arial" w:cs="Arial"/>
+          <w:color w:val="auto"/>
+          <w:sz w:val="24"/>
+          <w:szCs w:val="24"/>
+        </w:rPr>
+      </w:pPr>
+      <w:r>
+        <w:rPr>
+          <w:rFonts w:ascii="Arial" w:hAnsi="Arial" w:cs="Arial"/>
+          <w:color w:val="auto"/>
+          <w:sz w:val="24"/>
+          <w:szCs w:val="24"/>
+        </w:rPr>
+        <w:t>Punto único de fallo en Disponibilidad: Si el servicio de Disponibilidad deja</w:t>
+      </w:r>
+      <w:r>
+        <w:rPr>
+          <w:rFonts w:ascii="Arial" w:hAnsi="Arial" w:cs="Arial"/>
+          <w:color w:val="auto"/>
+          <w:sz w:val="24"/>
+          <w:szCs w:val="24"/>
+        </w:rPr>
+        <w:t xml:space="preserve"> </w:t>
+      </w:r>
+      <w:r>
+        <w:rPr>
+          <w:rFonts w:ascii="Arial" w:hAnsi="Arial" w:cs="Arial"/>
+          <w:color w:val="auto"/>
+          <w:sz w:val="24"/>
+          <w:szCs w:val="24"/>
+        </w:rPr>
+        <w:t>de funcionar, el servicio de Reservas no podrá comprobar si una habitación</w:t>
+      </w:r>
+      <w:r>
+        <w:rPr>
+          <w:rFonts w:ascii="Arial" w:hAnsi="Arial" w:cs="Arial"/>
+          <w:color w:val="auto"/>
+          <w:sz w:val="24"/>
+          <w:szCs w:val="24"/>
+        </w:rPr>
+        <w:t xml:space="preserve"> </w:t>
+      </w:r>
+      <w:r>
+        <w:rPr>
+          <w:rFonts w:ascii="Arial" w:hAnsi="Arial" w:cs="Arial"/>
+          <w:color w:val="auto"/>
+          <w:sz w:val="24"/>
+          <w:szCs w:val="24"/>
+        </w:rPr>
+        <w:t>está disponible. Esto podría bloquear temporalmente el proceso de creación</w:t>
+      </w:r>
+      <w:r>
+        <w:rPr>
+          <w:rFonts w:ascii="Arial" w:hAnsi="Arial" w:cs="Arial"/>
+          <w:color w:val="auto"/>
+          <w:sz w:val="24"/>
+          <w:szCs w:val="24"/>
+        </w:rPr>
+        <w:t xml:space="preserve"> </w:t>
+      </w:r>
+      <w:r>
+        <w:rPr>
+          <w:rFonts w:ascii="Arial" w:hAnsi="Arial" w:cs="Arial"/>
+          <w:color w:val="auto"/>
+          <w:sz w:val="24"/>
+          <w:szCs w:val="24"/>
+        </w:rPr>
+        <w:t>de nuevas reservas.</w:t>
+      </w:r>
+    </w:p>
+    <w:p>
+      <w:pPr>
+        <w:pStyle w:val="Ttulo1"/>
+        <w:jc w:val="both"/>
+        <w:rPr>
+          <w:rFonts w:ascii="Arial" w:hAnsi="Arial" w:cs="Arial"/>
+          <w:color w:val="auto"/>
+          <w:sz w:val="24"/>
+          <w:szCs w:val="24"/>
+        </w:rPr>
+      </w:pPr>
+      <w:r>
+        <w:rPr>
+          <w:rFonts w:ascii="Arial" w:hAnsi="Arial" w:cs="Arial"/>
+          <w:color w:val="auto"/>
+          <w:sz w:val="24"/>
+          <w:szCs w:val="24"/>
+        </w:rPr>
+        <w:t>Confirmar si el diseño tiene sentido</w:t>
+      </w:r>
+    </w:p>
+    <w:p>
+      <w:pPr>
+        <w:pStyle w:val="Ttulo1"/>
+        <w:jc w:val="both"/>
+        <w:rPr>
+          <w:rFonts w:ascii="Arial" w:hAnsi="Arial" w:cs="Arial"/>
+          <w:color w:val="auto"/>
+          <w:sz w:val="24"/>
+          <w:szCs w:val="24"/>
+        </w:rPr>
+      </w:pPr>
+      <w:r>
+        <w:rPr>
+          <w:rFonts w:ascii="Arial" w:hAnsi="Arial" w:cs="Arial"/>
+          <w:color w:val="auto"/>
+          <w:sz w:val="24"/>
+          <w:szCs w:val="24"/>
+        </w:rPr>
+        <w:t>El diseño propuesto sí tiene sentido para una plataforma de reservas de hoteles,</w:t>
+      </w:r>
+      <w:r>
+        <w:rPr>
+          <w:rFonts w:ascii="Arial" w:hAnsi="Arial" w:cs="Arial"/>
+          <w:color w:val="auto"/>
+          <w:sz w:val="24"/>
+          <w:szCs w:val="24"/>
+        </w:rPr>
+        <w:t xml:space="preserve"> </w:t>
+      </w:r>
+      <w:r>
+        <w:rPr>
+          <w:rFonts w:ascii="Arial" w:hAnsi="Arial" w:cs="Arial"/>
+          <w:color w:val="auto"/>
+          <w:sz w:val="24"/>
+          <w:szCs w:val="24"/>
+        </w:rPr>
+        <w:t>porque el sistema puede dividirse en diferentes servicios con responsabilidades</w:t>
+      </w:r>
+      <w:r>
+        <w:rPr>
+          <w:rFonts w:ascii="Arial" w:hAnsi="Arial" w:cs="Arial"/>
+          <w:color w:val="auto"/>
+          <w:sz w:val="24"/>
+          <w:szCs w:val="24"/>
+        </w:rPr>
+        <w:t xml:space="preserve"> </w:t>
+      </w:r>
+      <w:r>
+        <w:rPr>
+          <w:rFonts w:ascii="Arial" w:hAnsi="Arial" w:cs="Arial"/>
+          <w:color w:val="auto"/>
+          <w:sz w:val="24"/>
+          <w:szCs w:val="24"/>
+        </w:rPr>
+        <w:t>específicas, como Usuarios, Autenticación, Hoteles, Disponibilidad, Reservas,</w:t>
+      </w:r>
+    </w:p>
+    <w:p>
+      <w:pPr>
+        <w:pStyle w:val="Ttulo1"/>
+        <w:jc w:val="both"/>
+        <w:rPr>
+          <w:rFonts w:ascii="Arial" w:hAnsi="Arial" w:cs="Arial"/>
+          <w:color w:val="auto"/>
+          <w:sz w:val="24"/>
+          <w:szCs w:val="24"/>
+        </w:rPr>
+      </w:pPr>
+      <w:r>
+        <w:rPr>
+          <w:rFonts w:ascii="Arial" w:hAnsi="Arial" w:cs="Arial"/>
+          <w:color w:val="auto"/>
+          <w:sz w:val="24"/>
+          <w:szCs w:val="24"/>
+        </w:rPr>
+        <w:t>Notificaciones y Reseñas.</w:t>
+      </w:r>
+    </w:p>
+    <w:p>
+      <w:pPr>
+        <w:pStyle w:val="Ttulo1"/>
+        <w:jc w:val="both"/>
+        <w:rPr>
+          <w:rFonts w:ascii="Arial" w:hAnsi="Arial" w:cs="Arial"/>
+          <w:color w:val="auto"/>
+          <w:sz w:val="24"/>
+          <w:szCs w:val="24"/>
+        </w:rPr>
+      </w:pPr>
+      <w:r>
+        <w:rPr>
+          <w:rFonts w:ascii="Arial" w:hAnsi="Arial" w:cs="Arial"/>
+          <w:color w:val="auto"/>
+          <w:sz w:val="24"/>
+          <w:szCs w:val="24"/>
+        </w:rPr>
+        <w:t>Sin embargo, se deben tener en cuenta los posibles problemas mencionados</w:t>
+      </w:r>
+      <w:r>
+        <w:rPr>
+          <w:rFonts w:ascii="Arial" w:hAnsi="Arial" w:cs="Arial"/>
+          <w:color w:val="auto"/>
+          <w:sz w:val="24"/>
+          <w:szCs w:val="24"/>
+        </w:rPr>
+        <w:t xml:space="preserve"> </w:t>
+      </w:r>
+      <w:r>
+        <w:rPr>
+          <w:rFonts w:ascii="Arial" w:hAnsi="Arial" w:cs="Arial"/>
+          <w:color w:val="auto"/>
+          <w:sz w:val="24"/>
+          <w:szCs w:val="24"/>
+        </w:rPr>
+        <w:t>anteriormente, especialmente la comunicación entre servicios y la consistencia de</w:t>
+      </w:r>
+      <w:r>
+        <w:rPr>
+          <w:rFonts w:ascii="Arial" w:hAnsi="Arial" w:cs="Arial"/>
+          <w:color w:val="auto"/>
+          <w:sz w:val="24"/>
+          <w:szCs w:val="24"/>
+        </w:rPr>
+        <w:t xml:space="preserve"> </w:t>
+      </w:r>
+      <w:r>
+        <w:rPr>
+          <w:rFonts w:ascii="Arial" w:hAnsi="Arial" w:cs="Arial"/>
+          <w:color w:val="auto"/>
+          <w:sz w:val="24"/>
+          <w:szCs w:val="24"/>
+        </w:rPr>
+        <w:t>los datos cuando cada microservicio maneja su propio almacenamiento.</w:t>
+      </w:r>
+      <w:r>
+        <w:rPr>
+          <w:rFonts w:ascii="Arial" w:hAnsi="Arial" w:cs="Arial"/>
+          <w:color w:val="auto"/>
+          <w:sz w:val="24"/>
+          <w:szCs w:val="24"/>
+        </w:rPr>
+        <w:t xml:space="preserve"> </w:t>
+      </w:r>
+      <w:r>
+        <w:rPr>
+          <w:rFonts w:ascii="Arial" w:hAnsi="Arial" w:cs="Arial"/>
+          <w:color w:val="auto"/>
+          <w:sz w:val="24"/>
+          <w:szCs w:val="24"/>
+        </w:rPr>
+        <w:t>Por ejemplo, si un usuario cancela una reserva y el servicio de Reservas actualiza</w:t>
+      </w:r>
+      <w:r>
+        <w:rPr>
+          <w:rFonts w:ascii="Arial" w:hAnsi="Arial" w:cs="Arial"/>
+          <w:color w:val="auto"/>
+          <w:sz w:val="24"/>
+          <w:szCs w:val="24"/>
+        </w:rPr>
+        <w:t xml:space="preserve"> </w:t>
+      </w:r>
+      <w:r>
+        <w:rPr>
+          <w:rFonts w:ascii="Arial" w:hAnsi="Arial" w:cs="Arial"/>
+          <w:color w:val="auto"/>
+          <w:sz w:val="24"/>
+          <w:szCs w:val="24"/>
+        </w:rPr>
+        <w:t>correctamente la información, pero la comunicación con el servicio de Notificaciones</w:t>
+      </w:r>
+      <w:r>
+        <w:rPr>
+          <w:rFonts w:ascii="Arial" w:hAnsi="Arial" w:cs="Arial"/>
+          <w:color w:val="auto"/>
+          <w:sz w:val="24"/>
+          <w:szCs w:val="24"/>
+        </w:rPr>
+        <w:t xml:space="preserve"> </w:t>
+      </w:r>
+      <w:r>
+        <w:rPr>
+          <w:rFonts w:ascii="Arial" w:hAnsi="Arial" w:cs="Arial"/>
+          <w:color w:val="auto"/>
+          <w:sz w:val="24"/>
+          <w:szCs w:val="24"/>
+        </w:rPr>
+        <w:t>falla, este podría no recibir la información de la cancelación y mantener datos</w:t>
+      </w:r>
+      <w:r>
+        <w:rPr>
+          <w:rFonts w:ascii="Arial" w:hAnsi="Arial" w:cs="Arial"/>
+          <w:color w:val="auto"/>
+          <w:sz w:val="24"/>
+          <w:szCs w:val="24"/>
+        </w:rPr>
+        <w:t xml:space="preserve"> </w:t>
+      </w:r>
+      <w:r>
+        <w:rPr>
+          <w:rFonts w:ascii="Arial" w:hAnsi="Arial" w:cs="Arial"/>
+          <w:color w:val="auto"/>
+          <w:sz w:val="24"/>
+          <w:szCs w:val="24"/>
+        </w:rPr>
+        <w:t>desactualizados.</w:t>
+      </w:r>
+    </w:p>
+    <w:p>
+      <w:pPr>
+        <w:pStyle w:val="Ttulo1"/>
+        <w:jc w:val="both"/>
+        <w:rPr>
+          <w:rFonts w:ascii="Arial" w:hAnsi="Arial" w:cs="Arial"/>
+          <w:color w:val="auto"/>
+          <w:sz w:val="24"/>
+          <w:szCs w:val="24"/>
+        </w:rPr>
+      </w:pPr>
+      <w:r>
+        <w:rPr>
+          <w:rFonts w:ascii="Arial" w:hAnsi="Arial" w:cs="Arial"/>
+          <w:color w:val="auto"/>
+          <w:sz w:val="24"/>
+          <w:szCs w:val="24"/>
+        </w:rPr>
+        <w:t>A partir de lo anterior, se pueden incluir las mejoras y correcciones mencionadas</w:t>
+      </w:r>
+      <w:r>
+        <w:rPr>
+          <w:rFonts w:ascii="Arial" w:hAnsi="Arial" w:cs="Arial"/>
+          <w:color w:val="auto"/>
+          <w:sz w:val="24"/>
+          <w:szCs w:val="24"/>
+        </w:rPr>
+        <w:t xml:space="preserve"> </w:t>
+      </w:r>
+      <w:r>
+        <w:rPr>
+          <w:rFonts w:ascii="Arial" w:hAnsi="Arial" w:cs="Arial"/>
+          <w:color w:val="auto"/>
+          <w:sz w:val="24"/>
+          <w:szCs w:val="24"/>
+        </w:rPr>
+        <w:t>anteriormente, con el fin de hacer que el diseño sea más claro, coherente y</w:t>
+      </w:r>
+      <w:r>
+        <w:rPr>
+          <w:rFonts w:ascii="Arial" w:hAnsi="Arial" w:cs="Arial"/>
+          <w:color w:val="auto"/>
+          <w:sz w:val="24"/>
+          <w:szCs w:val="24"/>
+        </w:rPr>
+        <w:t xml:space="preserve"> </w:t>
+      </w:r>
+      <w:r>
+        <w:rPr>
+          <w:rFonts w:ascii="Arial" w:hAnsi="Arial" w:cs="Arial"/>
+          <w:color w:val="auto"/>
+          <w:sz w:val="24"/>
+          <w:szCs w:val="24"/>
+        </w:rPr>
+        <w:t>adecuado para una arquitectura de microservicios.</w:t>
+      </w:r>
+    </w:p>
+    <w:p>
+      <w:pPr>
+        <w:pStyle w:val="Ttulo1"/>
+        <w:jc w:val="both"/>
+        <w:rPr>
+          <w:rFonts w:ascii="Arial" w:hAnsi="Arial" w:cs="Arial"/>
+          <w:color w:val="auto"/>
+          <w:sz w:val="24"/>
+          <w:szCs w:val="24"/>
+        </w:rPr>
+      </w:pPr>
+      <w:r>
+        <w:rPr>
+          <w:rFonts w:ascii="Arial" w:hAnsi="Arial" w:cs="Arial"/>
+          <w:color w:val="auto"/>
+          <w:sz w:val="24"/>
+          <w:szCs w:val="24"/>
+        </w:rPr>
+        <w:lastRenderedPageBreak/>
+        <w:t>En conclusión, la propuesta es coherente con una arquitectura de microservicios,</w:t>
+      </w:r>
+      <w:r>
+        <w:rPr>
+          <w:rFonts w:ascii="Arial" w:hAnsi="Arial" w:cs="Arial"/>
+          <w:color w:val="auto"/>
+          <w:sz w:val="24"/>
+          <w:szCs w:val="24"/>
+        </w:rPr>
+        <w:t xml:space="preserve"> </w:t>
+      </w:r>
+      <w:r>
+        <w:rPr>
+          <w:rFonts w:ascii="Arial" w:hAnsi="Arial" w:cs="Arial"/>
+          <w:color w:val="auto"/>
+          <w:sz w:val="24"/>
+          <w:szCs w:val="24"/>
+        </w:rPr>
+        <w:t>ya que permite dividir el sistema en servicios independientes que pueden escalar y</w:t>
+      </w:r>
+      <w:r>
+        <w:rPr>
+          <w:rFonts w:ascii="Arial" w:hAnsi="Arial" w:cs="Arial"/>
+          <w:color w:val="auto"/>
+          <w:sz w:val="24"/>
+          <w:szCs w:val="24"/>
+        </w:rPr>
+        <w:t xml:space="preserve"> </w:t>
+      </w:r>
+      <w:r>
+        <w:rPr>
+          <w:rFonts w:ascii="Arial" w:hAnsi="Arial" w:cs="Arial"/>
+          <w:color w:val="auto"/>
+          <w:sz w:val="24"/>
+          <w:szCs w:val="24"/>
+        </w:rPr>
+        <w:t>evolucionar de manera individual. Sin embargo, es importante definir correctamente</w:t>
+      </w:r>
+      <w:r>
+        <w:rPr>
+          <w:rFonts w:ascii="Arial" w:hAnsi="Arial" w:cs="Arial"/>
+          <w:color w:val="auto"/>
+          <w:sz w:val="24"/>
+          <w:szCs w:val="24"/>
+        </w:rPr>
+        <w:t xml:space="preserve"> </w:t>
+      </w:r>
+      <w:r>
+        <w:rPr>
+          <w:rFonts w:ascii="Arial" w:hAnsi="Arial" w:cs="Arial"/>
+          <w:color w:val="auto"/>
+          <w:sz w:val="24"/>
+          <w:szCs w:val="24"/>
+        </w:rPr>
+        <w:t>las responsabilidades de cada servicio, la comunicación entre ellos, el manejo</w:t>
       </w:r>
     </w:p>
     <w:p>
@@ -3842,7 +5438,7 @@
 </file>
 
 <file path=word/endnotes.xml><?xml version="1.0" encoding="utf-8"?>
-<w:endnotes xmlns:wpc="http://schemas.microsoft.com/office/word/2010/wordprocessingCanvas" xmlns:cx="http://schemas.microsoft.com/office/drawing/2014/chartex" xmlns:mc="http://schemas.openxmlformats.org/markup-compatibility/2006" xmlns:o="urn:schemas-microsoft-com:office:office" xmlns:r="http://schemas.openxmlformats.org/officeDocument/2006/relationships" xmlns:m="http://schemas.openxmlformats.org/officeDocument/2006/math" xmlns:v="urn:schemas-microsoft-com:vml" xmlns:wp14="http://schemas.microsoft.com/office/word/2010/wordprocessingDrawing" xmlns:wp="http://schemas.openxmlformats.org/drawingml/2006/wordprocessingDrawing" xmlns:w10="urn:schemas-microsoft-com:office:word" xmlns:w="http://schemas.openxmlformats.org/wordprocessingml/2006/main" xmlns:w14="http://schemas.microsoft.com/office/word/2010/wordml" xmlns:w15="http://schemas.microsoft.com/office/word/2012/wordml" xmlns:w16se="http://schemas.microsoft.com/office/word/2015/wordml/symex" xmlns:wpg="http://schemas.microsoft.com/office/word/2010/wordprocessingGroup" xmlns:wpi="http://schemas.microsoft.com/office/word/2010/wordprocessingInk" xmlns:wne="http://schemas.microsoft.com/office/word/2006/wordml" xmlns:wps="http://schemas.microsoft.com/office/word/2010/wordprocessingShape" mc:Ignorable="w14 w15 w16se wp14">
+<w:endnotes xmlns:wpc="http://schemas.microsoft.com/office/word/2010/wordprocessingCanvas" xmlns:cx="http://schemas.microsoft.com/office/drawing/2014/chartex" xmlns:cx1="http://schemas.microsoft.com/office/drawing/2015/9/8/chartex" xmlns:cx2="http://schemas.microsoft.com/office/drawing/2015/10/21/chartex" xmlns:cx3="http://schemas.microsoft.com/office/drawing/2016/5/9/chartex" xmlns:cx4="http://schemas.microsoft.com/office/drawing/2016/5/10/chartex" xmlns:cx5="http://schemas.microsoft.com/office/drawing/2016/5/11/chartex" xmlns:cx6="http://schemas.microsoft.com/office/drawing/2016/5/12/chartex" xmlns:cx7="http://schemas.microsoft.com/office/drawing/2016/5/13/chartex" xmlns:cx8="http://schemas.microsoft.com/office/drawing/2016/5/14/chartex" xmlns:mc="http://schemas.openxmlformats.org/markup-compatibility/2006" xmlns:aink="http://schemas.microsoft.com/office/drawing/2016/ink" xmlns:am3d="http://schemas.microsoft.com/office/drawing/2017/model3d" xmlns:o="urn:schemas-microsoft-com:office:office" xmlns:r="http://schemas.openxmlformats.org/officeDocument/2006/relationships" xmlns:m="http://schemas.openxmlformats.org/officeDocument/2006/math" xmlns:v="urn:schemas-microsoft-com:vml" xmlns:wp14="http://schemas.microsoft.com/office/word/2010/wordprocessingDrawing" xmlns:wp="http://schemas.openxmlformats.org/drawingml/2006/wordprocessingDrawing" xmlns:w10="urn:schemas-microsoft-com:office:word" xmlns:w="http://schemas.openxmlformats.org/wordprocessingml/2006/main" xmlns:w14="http://schemas.microsoft.com/office/word/2010/wordml" xmlns:w15="http://schemas.microsoft.com/office/word/2012/wordml" xmlns:w16cex="http://schemas.microsoft.com/office/word/2018/wordml/cex" xmlns:w16cid="http://schemas.microsoft.com/office/word/2016/wordml/cid" xmlns:w16="http://schemas.microsoft.com/office/word/2018/wordml" xmlns:w16sdtdh="http://schemas.microsoft.com/office/word/2020/wordml/sdtdatahash" xmlns:w16se="http://schemas.microsoft.com/office/word/2015/wordml/symex" xmlns:wpg="http://schemas.microsoft.com/office/word/2010/wordprocessingGroup" xmlns:wpi="http://schemas.microsoft.com/office/word/2010/wordprocessingInk" xmlns:wne="http://schemas.microsoft.com/office/word/2006/wordml" xmlns:wps="http://schemas.microsoft.com/office/word/2010/wordprocessingShape" mc:Ignorable="w14 w15 w16se w16cid w16 w16cex w16sdtdh wp14">
   <w:endnote w:type="separator" w:id="-1">
     <w:p>
       <w:r>
@@ -3861,7 +5457,7 @@
 </file>
 
 <file path=word/footnotes.xml><?xml version="1.0" encoding="utf-8"?>
-<w:footnotes xmlns:wpc="http://schemas.microsoft.com/office/word/2010/wordprocessingCanvas" xmlns:cx="http://schemas.microsoft.com/office/drawing/2014/chartex" xmlns:mc="http://schemas.openxmlformats.org/markup-compatibility/2006" xmlns:o="urn:schemas-microsoft-com:office:office" xmlns:r="http://schemas.openxmlformats.org/officeDocument/2006/relationships" xmlns:m="http://schemas.openxmlformats.org/officeDocument/2006/math" xmlns:v="urn:schemas-microsoft-com:vml" xmlns:wp14="http://schemas.microsoft.com/office/word/2010/wordprocessingDrawing" xmlns:wp="http://schemas.openxmlformats.org/drawingml/2006/wordprocessingDrawing" xmlns:w10="urn:schemas-microsoft-com:office:word" xmlns:w="http://schemas.openxmlformats.org/wordprocessingml/2006/main" xmlns:w14="http://schemas.microsoft.com/office/word/2010/wordml" xmlns:w15="http://schemas.microsoft.com/office/word/2012/wordml" xmlns:w16se="http://schemas.microsoft.com/office/word/2015/wordml/symex" xmlns:wpg="http://schemas.microsoft.com/office/word/2010/wordprocessingGroup" xmlns:wpi="http://schemas.microsoft.com/office/word/2010/wordprocessingInk" xmlns:wne="http://schemas.microsoft.com/office/word/2006/wordml" xmlns:wps="http://schemas.microsoft.com/office/word/2010/wordprocessingShape" mc:Ignorable="w14 w15 w16se wp14">
+<w:footnotes xmlns:wpc="http://schemas.microsoft.com/office/word/2010/wordprocessingCanvas" xmlns:cx="http://schemas.microsoft.com/office/drawing/2014/chartex" xmlns:cx1="http://schemas.microsoft.com/office/drawing/2015/9/8/chartex" xmlns:cx2="http://schemas.microsoft.com/office/drawing/2015/10/21/chartex" xmlns:cx3="http://schemas.microsoft.com/office/drawing/2016/5/9/chartex" xmlns:cx4="http://schemas.microsoft.com/office/drawing/2016/5/10/chartex" xmlns:cx5="http://schemas.microsoft.com/office/drawing/2016/5/11/chartex" xmlns:cx6="http://schemas.microsoft.com/office/drawing/2016/5/12/chartex" xmlns:cx7="http://schemas.microsoft.com/office/drawing/2016/5/13/chartex" xmlns:cx8="http://schemas.microsoft.com/office/drawing/2016/5/14/chartex" xmlns:mc="http://schemas.openxmlformats.org/markup-compatibility/2006" xmlns:aink="http://schemas.microsoft.com/office/drawing/2016/ink" xmlns:am3d="http://schemas.microsoft.com/office/drawing/2017/model3d" xmlns:o="urn:schemas-microsoft-com:office:office" xmlns:r="http://schemas.openxmlformats.org/officeDocument/2006/relationships" xmlns:m="http://schemas.openxmlformats.org/officeDocument/2006/math" xmlns:v="urn:schemas-microsoft-com:vml" xmlns:wp14="http://schemas.microsoft.com/office/word/2010/wordprocessingDrawing" xmlns:wp="http://schemas.openxmlformats.org/drawingml/2006/wordprocessingDrawing" xmlns:w10="urn:schemas-microsoft-com:office:word" xmlns:w="http://schemas.openxmlformats.org/wordprocessingml/2006/main" xmlns:w14="http://schemas.microsoft.com/office/word/2010/wordml" xmlns:w15="http://schemas.microsoft.com/office/word/2012/wordml" xmlns:w16cex="http://schemas.microsoft.com/office/word/2018/wordml/cex" xmlns:w16cid="http://schemas.microsoft.com/office/word/2016/wordml/cid" xmlns:w16="http://schemas.microsoft.com/office/word/2018/wordml" xmlns:w16sdtdh="http://schemas.microsoft.com/office/word/2020/wordml/sdtdatahash" xmlns:w16se="http://schemas.microsoft.com/office/word/2015/wordml/symex" xmlns:wpg="http://schemas.microsoft.com/office/word/2010/wordprocessingGroup" xmlns:wpi="http://schemas.microsoft.com/office/word/2010/wordprocessingInk" xmlns:wne="http://schemas.microsoft.com/office/word/2006/wordml" xmlns:wps="http://schemas.microsoft.com/office/word/2010/wordprocessingShape" mc:Ignorable="w14 w15 w16se w16cid w16 w16cex w16sdtdh wp14">
   <w:footnote w:type="separator" w:id="-1">
     <w:p>
       <w:r>
@@ -3880,7 +5476,7 @@
 </file>
 
 <file path=word/header1.xml><?xml version="1.0" encoding="utf-8"?>
-<w:hdr xmlns:wpc="http://schemas.microsoft.com/office/word/2010/wordprocessingCanvas" xmlns:cx="http://schemas.microsoft.com/office/drawing/2014/chartex" xmlns:mc="http://schemas.openxmlformats.org/markup-compatibility/2006" xmlns:o="urn:schemas-microsoft-com:office:office" xmlns:r="http://schemas.openxmlformats.org/officeDocument/2006/relationships" xmlns:m="http://schemas.openxmlformats.org/officeDocument/2006/math" xmlns:v="urn:schemas-microsoft-com:vml" xmlns:wp14="http://schemas.microsoft.com/office/word/2010/wordprocessingDrawing" xmlns:wp="http://schemas.openxmlformats.org/drawingml/2006/wordprocessingDrawing" xmlns:w10="urn:schemas-microsoft-com:office:word" xmlns:w="http://schemas.openxmlformats.org/wordprocessingml/2006/main" xmlns:w14="http://schemas.microsoft.com/office/word/2010/wordml" xmlns:w15="http://schemas.microsoft.com/office/word/2012/wordml" xmlns:w16se="http://schemas.microsoft.com/office/word/2015/wordml/symex" xmlns:wpg="http://schemas.microsoft.com/office/word/2010/wordprocessingGroup" xmlns:wpi="http://schemas.microsoft.com/office/word/2010/wordprocessingInk" xmlns:wne="http://schemas.microsoft.com/office/word/2006/wordml" xmlns:wps="http://schemas.microsoft.com/office/word/2010/wordprocessingShape" mc:Ignorable="w14 w15 w16se wp14">
+<w:hdr xmlns:wpc="http://schemas.microsoft.com/office/word/2010/wordprocessingCanvas" xmlns:cx="http://schemas.microsoft.com/office/drawing/2014/chartex" xmlns:cx1="http://schemas.microsoft.com/office/drawing/2015/9/8/chartex" xmlns:cx2="http://schemas.microsoft.com/office/drawing/2015/10/21/chartex" xmlns:cx3="http://schemas.microsoft.com/office/drawing/2016/5/9/chartex" xmlns:cx4="http://schemas.microsoft.com/office/drawing/2016/5/10/chartex" xmlns:cx5="http://schemas.microsoft.com/office/drawing/2016/5/11/chartex" xmlns:cx6="http://schemas.microsoft.com/office/drawing/2016/5/12/chartex" xmlns:cx7="http://schemas.microsoft.com/office/drawing/2016/5/13/chartex" xmlns:cx8="http://schemas.microsoft.com/office/drawing/2016/5/14/chartex" xmlns:mc="http://schemas.openxmlformats.org/markup-compatibility/2006" xmlns:aink="http://schemas.microsoft.com/office/drawing/2016/ink" xmlns:am3d="http://schemas.microsoft.com/office/drawing/2017/model3d" xmlns:o="urn:schemas-microsoft-com:office:office" xmlns:r="http://schemas.openxmlformats.org/officeDocument/2006/relationships" xmlns:m="http://schemas.openxmlformats.org/officeDocument/2006/math" xmlns:v="urn:schemas-microsoft-com:vml" xmlns:wp14="http://schemas.microsoft.com/office/word/2010/wordprocessingDrawing" xmlns:wp="http://schemas.openxmlformats.org/drawingml/2006/wordprocessingDrawing" xmlns:w10="urn:schemas-microsoft-com:office:word" xmlns:w="http://schemas.openxmlformats.org/wordprocessingml/2006/main" xmlns:w14="http://schemas.microsoft.com/office/word/2010/wordml" xmlns:w15="http://schemas.microsoft.com/office/word/2012/wordml" xmlns:w16cex="http://schemas.microsoft.com/office/word/2018/wordml/cex" xmlns:w16cid="http://schemas.microsoft.com/office/word/2016/wordml/cid" xmlns:w16="http://schemas.microsoft.com/office/word/2018/wordml" xmlns:w16sdtdh="http://schemas.microsoft.com/office/word/2020/wordml/sdtdatahash" xmlns:w16se="http://schemas.microsoft.com/office/word/2015/wordml/symex" xmlns:wpg="http://schemas.microsoft.com/office/word/2010/wordprocessingGroup" xmlns:wpi="http://schemas.microsoft.com/office/word/2010/wordprocessingInk" xmlns:wne="http://schemas.microsoft.com/office/word/2006/wordml" xmlns:wps="http://schemas.microsoft.com/office/word/2010/wordprocessingShape" mc:Ignorable="w14 w15 w16se w16cid w16 w16cex w16sdtdh wp14">
   <w:p>
     <w:pPr>
       <w:pStyle w:val="Encabezado"/>
@@ -3951,7 +5547,7 @@
 </file>
 
 <file path=word/numbering.xml><?xml version="1.0" encoding="utf-8"?>
-<w:numbering xmlns:wpc="http://schemas.microsoft.com/office/word/2010/wordprocessingCanvas" xmlns:cx="http://schemas.microsoft.com/office/drawing/2014/chartex" xmlns:mc="http://schemas.openxmlformats.org/markup-compatibility/2006" xmlns:o="urn:schemas-microsoft-com:office:office" xmlns:r="http://schemas.openxmlformats.org/officeDocument/2006/relationships" xmlns:m="http://schemas.openxmlformats.org/officeDocument/2006/math" xmlns:v="urn:schemas-microsoft-com:vml" xmlns:wp14="http://schemas.microsoft.com/office/word/2010/wordprocessingDrawing" xmlns:wp="http://schemas.openxmlformats.org/drawingml/2006/wordprocessingDrawing" xmlns:w10="urn:schemas-microsoft-com:office:word" xmlns:w="http://schemas.openxmlformats.org/wordprocessingml/2006/main" xmlns:w14="http://schemas.microsoft.com/office/word/2010/wordml" xmlns:w15="http://schemas.microsoft.com/office/word/2012/wordml" xmlns:w16se="http://schemas.microsoft.com/office/word/2015/wordml/symex" xmlns:wpg="http://schemas.microsoft.com/office/word/2010/wordprocessingGroup" xmlns:wpi="http://schemas.microsoft.com/office/word/2010/wordprocessingInk" xmlns:wne="http://schemas.microsoft.com/office/word/2006/wordml" xmlns:wps="http://schemas.microsoft.com/office/word/2010/wordprocessingShape" mc:Ignorable="w14 w15 w16se wp14">
+<w:numbering xmlns:wpc="http://schemas.microsoft.com/office/word/2010/wordprocessingCanvas" xmlns:cx="http://schemas.microsoft.com/office/drawing/2014/chartex" xmlns:cx1="http://schemas.microsoft.com/office/drawing/2015/9/8/chartex" xmlns:cx2="http://schemas.microsoft.com/office/drawing/2015/10/21/chartex" xmlns:cx3="http://schemas.microsoft.com/office/drawing/2016/5/9/chartex" xmlns:cx4="http://schemas.microsoft.com/office/drawing/2016/5/10/chartex" xmlns:cx5="http://schemas.microsoft.com/office/drawing/2016/5/11/chartex" xmlns:cx6="http://schemas.microsoft.com/office/drawing/2016/5/12/chartex" xmlns:cx7="http://schemas.microsoft.com/office/drawing/2016/5/13/chartex" xmlns:cx8="http://schemas.microsoft.com/office/drawing/2016/5/14/chartex" xmlns:mc="http://schemas.openxmlformats.org/markup-compatibility/2006" xmlns:aink="http://schemas.microsoft.com/office/drawing/2016/ink" xmlns:am3d="http://schemas.microsoft.com/office/drawing/2017/model3d" xmlns:o="urn:schemas-microsoft-com:office:office" xmlns:r="http://schemas.openxmlformats.org/officeDocument/2006/relationships" xmlns:m="http://schemas.openxmlformats.org/officeDocument/2006/math" xmlns:v="urn:schemas-microsoft-com:vml" xmlns:wp14="http://schemas.microsoft.com/office/word/2010/wordprocessingDrawing" xmlns:wp="http://schemas.openxmlformats.org/drawingml/2006/wordprocessingDrawing" xmlns:w10="urn:schemas-microsoft-com:office:word" xmlns:w="http://schemas.openxmlformats.org/wordprocessingml/2006/main" xmlns:w14="http://schemas.microsoft.com/office/word/2010/wordml" xmlns:w15="http://schemas.microsoft.com/office/word/2012/wordml" xmlns:w16cex="http://schemas.microsoft.com/office/word/2018/wordml/cex" xmlns:w16cid="http://schemas.microsoft.com/office/word/2016/wordml/cid" xmlns:w16="http://schemas.microsoft.com/office/word/2018/wordml" xmlns:w16sdtdh="http://schemas.microsoft.com/office/word/2020/wordml/sdtdatahash" xmlns:w16se="http://schemas.microsoft.com/office/word/2015/wordml/symex" xmlns:wpg="http://schemas.microsoft.com/office/word/2010/wordprocessingGroup" xmlns:wpi="http://schemas.microsoft.com/office/word/2010/wordprocessingInk" xmlns:wne="http://schemas.microsoft.com/office/word/2006/wordml" xmlns:wps="http://schemas.microsoft.com/office/word/2010/wordprocessingShape" mc:Ignorable="w14 w15 w16se w16cid w16 w16cex w16sdtdh wp14">
   <w:abstractNum w:abstractNumId="0" w15:restartNumberingAfterBreak="0">
     <w:nsid w:val="06051E9F"/>
     <w:multiLevelType w:val="multilevel"/>
@@ -5507,6 +7103,119 @@
     </w:lvl>
   </w:abstractNum>
   <w:abstractNum w:abstractNumId="12" w15:restartNumberingAfterBreak="0">
+    <w:nsid w:val="24714AFC"/>
+    <w:multiLevelType w:val="hybridMultilevel"/>
+    <w:tmpl w:val="C45819E2"/>
+    <w:lvl w:ilvl="0" w:tplc="240A0001">
+      <w:start w:val="1"/>
+      <w:numFmt w:val="bullet"/>
+      <w:lvlText w:val=""/>
+      <w:lvlJc w:val="left"/>
+      <w:pPr>
+        <w:ind w:left="720" w:hanging="360"/>
+      </w:pPr>
+      <w:rPr>
+        <w:rFonts w:ascii="Symbol" w:hAnsi="Symbol" w:hint="default"/>
+      </w:rPr>
+    </w:lvl>
+    <w:lvl w:ilvl="1" w:tplc="240A0003" w:tentative="1">
+      <w:start w:val="1"/>
+      <w:numFmt w:val="bullet"/>
+      <w:lvlText w:val="o"/>
+      <w:lvlJc w:val="left"/>
+      <w:pPr>
+        <w:ind w:left="1440" w:hanging="360"/>
+      </w:pPr>
+      <w:rPr>
+        <w:rFonts w:ascii="Courier New" w:hAnsi="Courier New" w:cs="Courier New" w:hint="default"/>
+      </w:rPr>
+    </w:lvl>
+    <w:lvl w:ilvl="2" w:tplc="240A0005" w:tentative="1">
+      <w:start w:val="1"/>
+      <w:numFmt w:val="bullet"/>
+      <w:lvlText w:val=""/>
+      <w:lvlJc w:val="left"/>
+      <w:pPr>
+        <w:ind w:left="2160" w:hanging="360"/>
+      </w:pPr>
+      <w:rPr>
+        <w:rFonts w:ascii="Wingdings" w:hAnsi="Wingdings" w:hint="default"/>
+      </w:rPr>
+    </w:lvl>
+    <w:lvl w:ilvl="3" w:tplc="240A0001" w:tentative="1">
+      <w:start w:val="1"/>
+      <w:numFmt w:val="bullet"/>
+      <w:lvlText w:val=""/>
+      <w:lvlJc w:val="left"/>
+      <w:pPr>
+        <w:ind w:left="2880" w:hanging="360"/>
+      </w:pPr>
+      <w:rPr>
+        <w:rFonts w:ascii="Symbol" w:hAnsi="Symbol" w:hint="default"/>
+      </w:rPr>
+    </w:lvl>
+    <w:lvl w:ilvl="4" w:tplc="240A0003" w:tentative="1">
+      <w:start w:val="1"/>
+      <w:numFmt w:val="bullet"/>
+      <w:lvlText w:val="o"/>
+      <w:lvlJc w:val="left"/>
+      <w:pPr>
+        <w:ind w:left="3600" w:hanging="360"/>
+      </w:pPr>
+      <w:rPr>
+        <w:rFonts w:ascii="Courier New" w:hAnsi="Courier New" w:cs="Courier New" w:hint="default"/>
+      </w:rPr>
+    </w:lvl>
+    <w:lvl w:ilvl="5" w:tplc="240A0005" w:tentative="1">
+      <w:start w:val="1"/>
+      <w:numFmt w:val="bullet"/>
+      <w:lvlText w:val=""/>
+      <w:lvlJc w:val="left"/>
+      <w:pPr>
+        <w:ind w:left="4320" w:hanging="360"/>
+      </w:pPr>
+      <w:rPr>
+        <w:rFonts w:ascii="Wingdings" w:hAnsi="Wingdings" w:hint="default"/>
+      </w:rPr>
+    </w:lvl>
+    <w:lvl w:ilvl="6" w:tplc="240A0001" w:tentative="1">
+      <w:start w:val="1"/>
+      <w:numFmt w:val="bullet"/>
+      <w:lvlText w:val=""/>
+      <w:lvlJc w:val="left"/>
+      <w:pPr>
+        <w:ind w:left="5040" w:hanging="360"/>
+      </w:pPr>
+      <w:rPr>
+        <w:rFonts w:ascii="Symbol" w:hAnsi="Symbol" w:hint="default"/>
+      </w:rPr>
+    </w:lvl>
+    <w:lvl w:ilvl="7" w:tplc="240A0003" w:tentative="1">
+      <w:start w:val="1"/>
+      <w:numFmt w:val="bullet"/>
+      <w:lvlText w:val="o"/>
+      <w:lvlJc w:val="left"/>
+      <w:pPr>
+        <w:ind w:left="5760" w:hanging="360"/>
+      </w:pPr>
+      <w:rPr>
+        <w:rFonts w:ascii="Courier New" w:hAnsi="Courier New" w:cs="Courier New" w:hint="default"/>
+      </w:rPr>
+    </w:lvl>
+    <w:lvl w:ilvl="8" w:tplc="240A0005" w:tentative="1">
+      <w:start w:val="1"/>
+      <w:numFmt w:val="bullet"/>
+      <w:lvlText w:val=""/>
+      <w:lvlJc w:val="left"/>
+      <w:pPr>
+        <w:ind w:left="6480" w:hanging="360"/>
+      </w:pPr>
+      <w:rPr>
+        <w:rFonts w:ascii="Wingdings" w:hAnsi="Wingdings" w:hint="default"/>
+      </w:rPr>
+    </w:lvl>
+  </w:abstractNum>
+  <w:abstractNum w:abstractNumId="13" w15:restartNumberingAfterBreak="0">
     <w:nsid w:val="24D3779B"/>
     <w:multiLevelType w:val="multilevel"/>
     <w:tmpl w:val="B4DAA764"/>
@@ -5655,7 +7364,7 @@
       </w:rPr>
     </w:lvl>
   </w:abstractNum>
-  <w:abstractNum w:abstractNumId="13" w15:restartNumberingAfterBreak="0">
+  <w:abstractNum w:abstractNumId="14" w15:restartNumberingAfterBreak="0">
     <w:nsid w:val="28016436"/>
     <w:multiLevelType w:val="hybridMultilevel"/>
     <w:tmpl w:val="87D0CED6"/>
@@ -5768,7 +7477,120 @@
       </w:rPr>
     </w:lvl>
   </w:abstractNum>
-  <w:abstractNum w:abstractNumId="14" w15:restartNumberingAfterBreak="0">
+  <w:abstractNum w:abstractNumId="15" w15:restartNumberingAfterBreak="0">
+    <w:nsid w:val="2C12748B"/>
+    <w:multiLevelType w:val="hybridMultilevel"/>
+    <w:tmpl w:val="057CE41A"/>
+    <w:lvl w:ilvl="0" w:tplc="240A0001">
+      <w:start w:val="1"/>
+      <w:numFmt w:val="bullet"/>
+      <w:lvlText w:val=""/>
+      <w:lvlJc w:val="left"/>
+      <w:pPr>
+        <w:ind w:left="720" w:hanging="360"/>
+      </w:pPr>
+      <w:rPr>
+        <w:rFonts w:ascii="Symbol" w:hAnsi="Symbol" w:hint="default"/>
+      </w:rPr>
+    </w:lvl>
+    <w:lvl w:ilvl="1" w:tplc="240A0003" w:tentative="1">
+      <w:start w:val="1"/>
+      <w:numFmt w:val="bullet"/>
+      <w:lvlText w:val="o"/>
+      <w:lvlJc w:val="left"/>
+      <w:pPr>
+        <w:ind w:left="1440" w:hanging="360"/>
+      </w:pPr>
+      <w:rPr>
+        <w:rFonts w:ascii="Courier New" w:hAnsi="Courier New" w:cs="Courier New" w:hint="default"/>
+      </w:rPr>
+    </w:lvl>
+    <w:lvl w:ilvl="2" w:tplc="240A0005" w:tentative="1">
+      <w:start w:val="1"/>
+      <w:numFmt w:val="bullet"/>
+      <w:lvlText w:val=""/>
+      <w:lvlJc w:val="left"/>
+      <w:pPr>
+        <w:ind w:left="2160" w:hanging="360"/>
+      </w:pPr>
+      <w:rPr>
+        <w:rFonts w:ascii="Wingdings" w:hAnsi="Wingdings" w:hint="default"/>
+      </w:rPr>
+    </w:lvl>
+    <w:lvl w:ilvl="3" w:tplc="240A0001" w:tentative="1">
+      <w:start w:val="1"/>
+      <w:numFmt w:val="bullet"/>
+      <w:lvlText w:val=""/>
+      <w:lvlJc w:val="left"/>
+      <w:pPr>
+        <w:ind w:left="2880" w:hanging="360"/>
+      </w:pPr>
+      <w:rPr>
+        <w:rFonts w:ascii="Symbol" w:hAnsi="Symbol" w:hint="default"/>
+      </w:rPr>
+    </w:lvl>
+    <w:lvl w:ilvl="4" w:tplc="240A0003" w:tentative="1">
+      <w:start w:val="1"/>
+      <w:numFmt w:val="bullet"/>
+      <w:lvlText w:val="o"/>
+      <w:lvlJc w:val="left"/>
+      <w:pPr>
+        <w:ind w:left="3600" w:hanging="360"/>
+      </w:pPr>
+      <w:rPr>
+        <w:rFonts w:ascii="Courier New" w:hAnsi="Courier New" w:cs="Courier New" w:hint="default"/>
+      </w:rPr>
+    </w:lvl>
+    <w:lvl w:ilvl="5" w:tplc="240A0005" w:tentative="1">
+      <w:start w:val="1"/>
+      <w:numFmt w:val="bullet"/>
+      <w:lvlText w:val=""/>
+      <w:lvlJc w:val="left"/>
+      <w:pPr>
+        <w:ind w:left="4320" w:hanging="360"/>
+      </w:pPr>
+      <w:rPr>
+        <w:rFonts w:ascii="Wingdings" w:hAnsi="Wingdings" w:hint="default"/>
+      </w:rPr>
+    </w:lvl>
+    <w:lvl w:ilvl="6" w:tplc="240A0001" w:tentative="1">
+      <w:start w:val="1"/>
+      <w:numFmt w:val="bullet"/>
+      <w:lvlText w:val=""/>
+      <w:lvlJc w:val="left"/>
+      <w:pPr>
+        <w:ind w:left="5040" w:hanging="360"/>
+      </w:pPr>
+      <w:rPr>
+        <w:rFonts w:ascii="Symbol" w:hAnsi="Symbol" w:hint="default"/>
+      </w:rPr>
+    </w:lvl>
+    <w:lvl w:ilvl="7" w:tplc="240A0003" w:tentative="1">
+      <w:start w:val="1"/>
+      <w:numFmt w:val="bullet"/>
+      <w:lvlText w:val="o"/>
+      <w:lvlJc w:val="left"/>
+      <w:pPr>
+        <w:ind w:left="5760" w:hanging="360"/>
+      </w:pPr>
+      <w:rPr>
+        <w:rFonts w:ascii="Courier New" w:hAnsi="Courier New" w:cs="Courier New" w:hint="default"/>
+      </w:rPr>
+    </w:lvl>
+    <w:lvl w:ilvl="8" w:tplc="240A0005" w:tentative="1">
+      <w:start w:val="1"/>
+      <w:numFmt w:val="bullet"/>
+      <w:lvlText w:val=""/>
+      <w:lvlJc w:val="left"/>
+      <w:pPr>
+        <w:ind w:left="6480" w:hanging="360"/>
+      </w:pPr>
+      <w:rPr>
+        <w:rFonts w:ascii="Wingdings" w:hAnsi="Wingdings" w:hint="default"/>
+      </w:rPr>
+    </w:lvl>
+  </w:abstractNum>
+  <w:abstractNum w:abstractNumId="16" w15:restartNumberingAfterBreak="0">
     <w:nsid w:val="319D15EA"/>
     <w:multiLevelType w:val="hybridMultilevel"/>
     <w:tmpl w:val="BE78A338"/>
@@ -5881,7 +7703,7 @@
       </w:rPr>
     </w:lvl>
   </w:abstractNum>
-  <w:abstractNum w:abstractNumId="15" w15:restartNumberingAfterBreak="0">
+  <w:abstractNum w:abstractNumId="17" w15:restartNumberingAfterBreak="0">
     <w:nsid w:val="34E60CD4"/>
     <w:multiLevelType w:val="hybridMultilevel"/>
     <w:tmpl w:val="BB64676E"/>
@@ -5994,7 +7816,7 @@
       </w:rPr>
     </w:lvl>
   </w:abstractNum>
-  <w:abstractNum w:abstractNumId="16" w15:restartNumberingAfterBreak="0">
+  <w:abstractNum w:abstractNumId="18" w15:restartNumberingAfterBreak="0">
     <w:nsid w:val="365E72FC"/>
     <w:multiLevelType w:val="multilevel"/>
     <w:tmpl w:val="1542E52E"/>
@@ -6107,7 +7929,7 @@
       </w:pPr>
     </w:lvl>
   </w:abstractNum>
-  <w:abstractNum w:abstractNumId="17" w15:restartNumberingAfterBreak="0">
+  <w:abstractNum w:abstractNumId="19" w15:restartNumberingAfterBreak="0">
     <w:nsid w:val="37BD1C99"/>
     <w:multiLevelType w:val="multilevel"/>
     <w:tmpl w:val="90F8EF64"/>
@@ -6256,7 +8078,7 @@
       </w:rPr>
     </w:lvl>
   </w:abstractNum>
-  <w:abstractNum w:abstractNumId="18" w15:restartNumberingAfterBreak="0">
+  <w:abstractNum w:abstractNumId="20" w15:restartNumberingAfterBreak="0">
     <w:nsid w:val="37BF4FAA"/>
     <w:multiLevelType w:val="hybridMultilevel"/>
     <w:tmpl w:val="F71C8916"/>
@@ -6342,7 +8164,120 @@
       </w:pPr>
     </w:lvl>
   </w:abstractNum>
-  <w:abstractNum w:abstractNumId="19" w15:restartNumberingAfterBreak="0">
+  <w:abstractNum w:abstractNumId="21" w15:restartNumberingAfterBreak="0">
+    <w:nsid w:val="3A4F18D2"/>
+    <w:multiLevelType w:val="hybridMultilevel"/>
+    <w:tmpl w:val="C016C1A2"/>
+    <w:lvl w:ilvl="0" w:tplc="240A0001">
+      <w:start w:val="1"/>
+      <w:numFmt w:val="bullet"/>
+      <w:lvlText w:val=""/>
+      <w:lvlJc w:val="left"/>
+      <w:pPr>
+        <w:ind w:left="1080" w:hanging="360"/>
+      </w:pPr>
+      <w:rPr>
+        <w:rFonts w:ascii="Symbol" w:hAnsi="Symbol" w:hint="default"/>
+      </w:rPr>
+    </w:lvl>
+    <w:lvl w:ilvl="1" w:tplc="240A0003" w:tentative="1">
+      <w:start w:val="1"/>
+      <w:numFmt w:val="bullet"/>
+      <w:lvlText w:val="o"/>
+      <w:lvlJc w:val="left"/>
+      <w:pPr>
+        <w:ind w:left="1800" w:hanging="360"/>
+      </w:pPr>
+      <w:rPr>
+        <w:rFonts w:ascii="Courier New" w:hAnsi="Courier New" w:cs="Courier New" w:hint="default"/>
+      </w:rPr>
+    </w:lvl>
+    <w:lvl w:ilvl="2" w:tplc="240A0005" w:tentative="1">
+      <w:start w:val="1"/>
+      <w:numFmt w:val="bullet"/>
+      <w:lvlText w:val=""/>
+      <w:lvlJc w:val="left"/>
+      <w:pPr>
+        <w:ind w:left="2520" w:hanging="360"/>
+      </w:pPr>
+      <w:rPr>
+        <w:rFonts w:ascii="Wingdings" w:hAnsi="Wingdings" w:hint="default"/>
+      </w:rPr>
+    </w:lvl>
+    <w:lvl w:ilvl="3" w:tplc="240A0001" w:tentative="1">
+      <w:start w:val="1"/>
+      <w:numFmt w:val="bullet"/>
+      <w:lvlText w:val=""/>
+      <w:lvlJc w:val="left"/>
+      <w:pPr>
+        <w:ind w:left="3240" w:hanging="360"/>
+      </w:pPr>
+      <w:rPr>
+        <w:rFonts w:ascii="Symbol" w:hAnsi="Symbol" w:hint="default"/>
+      </w:rPr>
+    </w:lvl>
+    <w:lvl w:ilvl="4" w:tplc="240A0003" w:tentative="1">
+      <w:start w:val="1"/>
+      <w:numFmt w:val="bullet"/>
+      <w:lvlText w:val="o"/>
+      <w:lvlJc w:val="left"/>
+      <w:pPr>
+        <w:ind w:left="3960" w:hanging="360"/>
+      </w:pPr>
+      <w:rPr>
+        <w:rFonts w:ascii="Courier New" w:hAnsi="Courier New" w:cs="Courier New" w:hint="default"/>
+      </w:rPr>
+    </w:lvl>
+    <w:lvl w:ilvl="5" w:tplc="240A0005" w:tentative="1">
+      <w:start w:val="1"/>
+      <w:numFmt w:val="bullet"/>
+      <w:lvlText w:val=""/>
+      <w:lvlJc w:val="left"/>
+      <w:pPr>
+        <w:ind w:left="4680" w:hanging="360"/>
+      </w:pPr>
+      <w:rPr>
+        <w:rFonts w:ascii="Wingdings" w:hAnsi="Wingdings" w:hint="default"/>
+      </w:rPr>
+    </w:lvl>
+    <w:lvl w:ilvl="6" w:tplc="240A0001" w:tentative="1">
+      <w:start w:val="1"/>
+      <w:numFmt w:val="bullet"/>
+      <w:lvlText w:val=""/>
+      <w:lvlJc w:val="left"/>
+      <w:pPr>
+        <w:ind w:left="5400" w:hanging="360"/>
+      </w:pPr>
+      <w:rPr>
+        <w:rFonts w:ascii="Symbol" w:hAnsi="Symbol" w:hint="default"/>
+      </w:rPr>
+    </w:lvl>
+    <w:lvl w:ilvl="7" w:tplc="240A0003" w:tentative="1">
+      <w:start w:val="1"/>
+      <w:numFmt w:val="bullet"/>
+      <w:lvlText w:val="o"/>
+      <w:lvlJc w:val="left"/>
+      <w:pPr>
+        <w:ind w:left="6120" w:hanging="360"/>
+      </w:pPr>
+      <w:rPr>
+        <w:rFonts w:ascii="Courier New" w:hAnsi="Courier New" w:cs="Courier New" w:hint="default"/>
+      </w:rPr>
+    </w:lvl>
+    <w:lvl w:ilvl="8" w:tplc="240A0005" w:tentative="1">
+      <w:start w:val="1"/>
+      <w:numFmt w:val="bullet"/>
+      <w:lvlText w:val=""/>
+      <w:lvlJc w:val="left"/>
+      <w:pPr>
+        <w:ind w:left="6840" w:hanging="360"/>
+      </w:pPr>
+      <w:rPr>
+        <w:rFonts w:ascii="Wingdings" w:hAnsi="Wingdings" w:hint="default"/>
+      </w:rPr>
+    </w:lvl>
+  </w:abstractNum>
+  <w:abstractNum w:abstractNumId="22" w15:restartNumberingAfterBreak="0">
     <w:nsid w:val="3B4207A2"/>
     <w:multiLevelType w:val="multilevel"/>
     <w:tmpl w:val="04521ACC"/>
@@ -6491,7 +8426,7 @@
       </w:rPr>
     </w:lvl>
   </w:abstractNum>
-  <w:abstractNum w:abstractNumId="20" w15:restartNumberingAfterBreak="0">
+  <w:abstractNum w:abstractNumId="23" w15:restartNumberingAfterBreak="0">
     <w:nsid w:val="3CF834AF"/>
     <w:multiLevelType w:val="multilevel"/>
     <w:tmpl w:val="A7E0AE34"/>
@@ -6607,7 +8542,7 @@
       </w:pPr>
     </w:lvl>
   </w:abstractNum>
-  <w:abstractNum w:abstractNumId="21" w15:restartNumberingAfterBreak="0">
+  <w:abstractNum w:abstractNumId="24" w15:restartNumberingAfterBreak="0">
     <w:nsid w:val="3CFD72A3"/>
     <w:multiLevelType w:val="multilevel"/>
     <w:tmpl w:val="75EAFADE"/>
@@ -6720,7 +8655,7 @@
       </w:pPr>
     </w:lvl>
   </w:abstractNum>
-  <w:abstractNum w:abstractNumId="22" w15:restartNumberingAfterBreak="0">
+  <w:abstractNum w:abstractNumId="25" w15:restartNumberingAfterBreak="0">
     <w:nsid w:val="403F0003"/>
     <w:multiLevelType w:val="multilevel"/>
     <w:tmpl w:val="42668D3C"/>
@@ -6833,7 +8768,7 @@
       </w:pPr>
     </w:lvl>
   </w:abstractNum>
-  <w:abstractNum w:abstractNumId="23" w15:restartNumberingAfterBreak="0">
+  <w:abstractNum w:abstractNumId="26" w15:restartNumberingAfterBreak="0">
     <w:nsid w:val="425C02AD"/>
     <w:multiLevelType w:val="multilevel"/>
     <w:tmpl w:val="C38410E2"/>
@@ -6982,7 +8917,7 @@
       </w:rPr>
     </w:lvl>
   </w:abstractNum>
-  <w:abstractNum w:abstractNumId="24" w15:restartNumberingAfterBreak="0">
+  <w:abstractNum w:abstractNumId="27" w15:restartNumberingAfterBreak="0">
     <w:nsid w:val="427A018E"/>
     <w:multiLevelType w:val="multilevel"/>
     <w:tmpl w:val="9E3A91FA"/>
@@ -7131,7 +9066,7 @@
       </w:rPr>
     </w:lvl>
   </w:abstractNum>
-  <w:abstractNum w:abstractNumId="25" w15:restartNumberingAfterBreak="0">
+  <w:abstractNum w:abstractNumId="28" w15:restartNumberingAfterBreak="0">
     <w:nsid w:val="446525E2"/>
     <w:multiLevelType w:val="multilevel"/>
     <w:tmpl w:val="0DB42DFE"/>
@@ -7280,7 +9215,7 @@
       </w:rPr>
     </w:lvl>
   </w:abstractNum>
-  <w:abstractNum w:abstractNumId="26" w15:restartNumberingAfterBreak="0">
+  <w:abstractNum w:abstractNumId="29" w15:restartNumberingAfterBreak="0">
     <w:nsid w:val="45010147"/>
     <w:multiLevelType w:val="multilevel"/>
     <w:tmpl w:val="6E8C85EC"/>
@@ -7429,7 +9364,7 @@
       </w:rPr>
     </w:lvl>
   </w:abstractNum>
-  <w:abstractNum w:abstractNumId="27" w15:restartNumberingAfterBreak="0">
+  <w:abstractNum w:abstractNumId="30" w15:restartNumberingAfterBreak="0">
     <w:nsid w:val="45080D54"/>
     <w:multiLevelType w:val="hybridMultilevel"/>
     <w:tmpl w:val="8E1C6494"/>
@@ -7541,7 +9476,120 @@
       </w:rPr>
     </w:lvl>
   </w:abstractNum>
-  <w:abstractNum w:abstractNumId="28" w15:restartNumberingAfterBreak="0">
+  <w:abstractNum w:abstractNumId="31" w15:restartNumberingAfterBreak="0">
+    <w:nsid w:val="49063B46"/>
+    <w:multiLevelType w:val="hybridMultilevel"/>
+    <w:tmpl w:val="408227A2"/>
+    <w:lvl w:ilvl="0" w:tplc="240A0001">
+      <w:start w:val="1"/>
+      <w:numFmt w:val="bullet"/>
+      <w:lvlText w:val=""/>
+      <w:lvlJc w:val="left"/>
+      <w:pPr>
+        <w:ind w:left="720" w:hanging="360"/>
+      </w:pPr>
+      <w:rPr>
+        <w:rFonts w:ascii="Symbol" w:hAnsi="Symbol" w:hint="default"/>
+      </w:rPr>
+    </w:lvl>
+    <w:lvl w:ilvl="1" w:tplc="240A0003" w:tentative="1">
+      <w:start w:val="1"/>
+      <w:numFmt w:val="bullet"/>
+      <w:lvlText w:val="o"/>
+      <w:lvlJc w:val="left"/>
+      <w:pPr>
+        <w:ind w:left="1440" w:hanging="360"/>
+      </w:pPr>
+      <w:rPr>
+        <w:rFonts w:ascii="Courier New" w:hAnsi="Courier New" w:cs="Courier New" w:hint="default"/>
+      </w:rPr>
+    </w:lvl>
+    <w:lvl w:ilvl="2" w:tplc="240A0005" w:tentative="1">
+      <w:start w:val="1"/>
+      <w:numFmt w:val="bullet"/>
+      <w:lvlText w:val=""/>
+      <w:lvlJc w:val="left"/>
+      <w:pPr>
+        <w:ind w:left="2160" w:hanging="360"/>
+      </w:pPr>
+      <w:rPr>
+        <w:rFonts w:ascii="Wingdings" w:hAnsi="Wingdings" w:hint="default"/>
+      </w:rPr>
+    </w:lvl>
+    <w:lvl w:ilvl="3" w:tplc="240A0001" w:tentative="1">
+      <w:start w:val="1"/>
+      <w:numFmt w:val="bullet"/>
+      <w:lvlText w:val=""/>
+      <w:lvlJc w:val="left"/>
+      <w:pPr>
+        <w:ind w:left="2880" w:hanging="360"/>
+      </w:pPr>
+      <w:rPr>
+        <w:rFonts w:ascii="Symbol" w:hAnsi="Symbol" w:hint="default"/>
+      </w:rPr>
+    </w:lvl>
+    <w:lvl w:ilvl="4" w:tplc="240A0003" w:tentative="1">
+      <w:start w:val="1"/>
+      <w:numFmt w:val="bullet"/>
+      <w:lvlText w:val="o"/>
+      <w:lvlJc w:val="left"/>
+      <w:pPr>
+        <w:ind w:left="3600" w:hanging="360"/>
+      </w:pPr>
+      <w:rPr>
+        <w:rFonts w:ascii="Courier New" w:hAnsi="Courier New" w:cs="Courier New" w:hint="default"/>
+      </w:rPr>
+    </w:lvl>
+    <w:lvl w:ilvl="5" w:tplc="240A0005" w:tentative="1">
+      <w:start w:val="1"/>
+      <w:numFmt w:val="bullet"/>
+      <w:lvlText w:val=""/>
+      <w:lvlJc w:val="left"/>
+      <w:pPr>
+        <w:ind w:left="4320" w:hanging="360"/>
+      </w:pPr>
+      <w:rPr>
+        <w:rFonts w:ascii="Wingdings" w:hAnsi="Wingdings" w:hint="default"/>
+      </w:rPr>
+    </w:lvl>
+    <w:lvl w:ilvl="6" w:tplc="240A0001" w:tentative="1">
+      <w:start w:val="1"/>
+      <w:numFmt w:val="bullet"/>
+      <w:lvlText w:val=""/>
+      <w:lvlJc w:val="left"/>
+      <w:pPr>
+        <w:ind w:left="5040" w:hanging="360"/>
+      </w:pPr>
+      <w:rPr>
+        <w:rFonts w:ascii="Symbol" w:hAnsi="Symbol" w:hint="default"/>
+      </w:rPr>
+    </w:lvl>
+    <w:lvl w:ilvl="7" w:tplc="240A0003" w:tentative="1">
+      <w:start w:val="1"/>
+      <w:numFmt w:val="bullet"/>
+      <w:lvlText w:val="o"/>
+      <w:lvlJc w:val="left"/>
+      <w:pPr>
+        <w:ind w:left="5760" w:hanging="360"/>
+      </w:pPr>
+      <w:rPr>
+        <w:rFonts w:ascii="Courier New" w:hAnsi="Courier New" w:cs="Courier New" w:hint="default"/>
+      </w:rPr>
+    </w:lvl>
+    <w:lvl w:ilvl="8" w:tplc="240A0005" w:tentative="1">
+      <w:start w:val="1"/>
+      <w:numFmt w:val="bullet"/>
+      <w:lvlText w:val=""/>
+      <w:lvlJc w:val="left"/>
+      <w:pPr>
+        <w:ind w:left="6480" w:hanging="360"/>
+      </w:pPr>
+      <w:rPr>
+        <w:rFonts w:ascii="Wingdings" w:hAnsi="Wingdings" w:hint="default"/>
+      </w:rPr>
+    </w:lvl>
+  </w:abstractNum>
+  <w:abstractNum w:abstractNumId="32" w15:restartNumberingAfterBreak="0">
     <w:nsid w:val="4F954287"/>
     <w:multiLevelType w:val="multilevel"/>
     <w:tmpl w:val="CAD4B820"/>
@@ -7690,7 +9738,120 @@
       </w:rPr>
     </w:lvl>
   </w:abstractNum>
-  <w:abstractNum w:abstractNumId="29" w15:restartNumberingAfterBreak="0">
+  <w:abstractNum w:abstractNumId="33" w15:restartNumberingAfterBreak="0">
+    <w:nsid w:val="58FA273C"/>
+    <w:multiLevelType w:val="hybridMultilevel"/>
+    <w:tmpl w:val="35EAB7CE"/>
+    <w:lvl w:ilvl="0" w:tplc="240A0001">
+      <w:start w:val="1"/>
+      <w:numFmt w:val="bullet"/>
+      <w:lvlText w:val=""/>
+      <w:lvlJc w:val="left"/>
+      <w:pPr>
+        <w:ind w:left="720" w:hanging="360"/>
+      </w:pPr>
+      <w:rPr>
+        <w:rFonts w:ascii="Symbol" w:hAnsi="Symbol" w:hint="default"/>
+      </w:rPr>
+    </w:lvl>
+    <w:lvl w:ilvl="1" w:tplc="240A0003" w:tentative="1">
+      <w:start w:val="1"/>
+      <w:numFmt w:val="bullet"/>
+      <w:lvlText w:val="o"/>
+      <w:lvlJc w:val="left"/>
+      <w:pPr>
+        <w:ind w:left="1440" w:hanging="360"/>
+      </w:pPr>
+      <w:rPr>
+        <w:rFonts w:ascii="Courier New" w:hAnsi="Courier New" w:cs="Courier New" w:hint="default"/>
+      </w:rPr>
+    </w:lvl>
+    <w:lvl w:ilvl="2" w:tplc="240A0005" w:tentative="1">
+      <w:start w:val="1"/>
+      <w:numFmt w:val="bullet"/>
+      <w:lvlText w:val=""/>
+      <w:lvlJc w:val="left"/>
+      <w:pPr>
+        <w:ind w:left="2160" w:hanging="360"/>
+      </w:pPr>
+      <w:rPr>
+        <w:rFonts w:ascii="Wingdings" w:hAnsi="Wingdings" w:hint="default"/>
+      </w:rPr>
+    </w:lvl>
+    <w:lvl w:ilvl="3" w:tplc="240A0001" w:tentative="1">
+      <w:start w:val="1"/>
+      <w:numFmt w:val="bullet"/>
+      <w:lvlText w:val=""/>
+      <w:lvlJc w:val="left"/>
+      <w:pPr>
+        <w:ind w:left="2880" w:hanging="360"/>
+      </w:pPr>
+      <w:rPr>
+        <w:rFonts w:ascii="Symbol" w:hAnsi="Symbol" w:hint="default"/>
+      </w:rPr>
+    </w:lvl>
+    <w:lvl w:ilvl="4" w:tplc="240A0003" w:tentative="1">
+      <w:start w:val="1"/>
+      <w:numFmt w:val="bullet"/>
+      <w:lvlText w:val="o"/>
+      <w:lvlJc w:val="left"/>
+      <w:pPr>
+        <w:ind w:left="3600" w:hanging="360"/>
+      </w:pPr>
+      <w:rPr>
+        <w:rFonts w:ascii="Courier New" w:hAnsi="Courier New" w:cs="Courier New" w:hint="default"/>
+      </w:rPr>
+    </w:lvl>
+    <w:lvl w:ilvl="5" w:tplc="240A0005" w:tentative="1">
+      <w:start w:val="1"/>
+      <w:numFmt w:val="bullet"/>
+      <w:lvlText w:val=""/>
+      <w:lvlJc w:val="left"/>
+      <w:pPr>
+        <w:ind w:left="4320" w:hanging="360"/>
+      </w:pPr>
+      <w:rPr>
+        <w:rFonts w:ascii="Wingdings" w:hAnsi="Wingdings" w:hint="default"/>
+      </w:rPr>
+    </w:lvl>
+    <w:lvl w:ilvl="6" w:tplc="240A0001" w:tentative="1">
+      <w:start w:val="1"/>
+      <w:numFmt w:val="bullet"/>
+      <w:lvlText w:val=""/>
+      <w:lvlJc w:val="left"/>
+      <w:pPr>
+        <w:ind w:left="5040" w:hanging="360"/>
+      </w:pPr>
+      <w:rPr>
+        <w:rFonts w:ascii="Symbol" w:hAnsi="Symbol" w:hint="default"/>
+      </w:rPr>
+    </w:lvl>
+    <w:lvl w:ilvl="7" w:tplc="240A0003" w:tentative="1">
+      <w:start w:val="1"/>
+      <w:numFmt w:val="bullet"/>
+      <w:lvlText w:val="o"/>
+      <w:lvlJc w:val="left"/>
+      <w:pPr>
+        <w:ind w:left="5760" w:hanging="360"/>
+      </w:pPr>
+      <w:rPr>
+        <w:rFonts w:ascii="Courier New" w:hAnsi="Courier New" w:cs="Courier New" w:hint="default"/>
+      </w:rPr>
+    </w:lvl>
+    <w:lvl w:ilvl="8" w:tplc="240A0005" w:tentative="1">
+      <w:start w:val="1"/>
+      <w:numFmt w:val="bullet"/>
+      <w:lvlText w:val=""/>
+      <w:lvlJc w:val="left"/>
+      <w:pPr>
+        <w:ind w:left="6480" w:hanging="360"/>
+      </w:pPr>
+      <w:rPr>
+        <w:rFonts w:ascii="Wingdings" w:hAnsi="Wingdings" w:hint="default"/>
+      </w:rPr>
+    </w:lvl>
+  </w:abstractNum>
+  <w:abstractNum w:abstractNumId="34" w15:restartNumberingAfterBreak="0">
     <w:nsid w:val="5A94397A"/>
     <w:multiLevelType w:val="multilevel"/>
     <w:tmpl w:val="683882F8"/>
@@ -7839,7 +10000,7 @@
       </w:rPr>
     </w:lvl>
   </w:abstractNum>
-  <w:abstractNum w:abstractNumId="30" w15:restartNumberingAfterBreak="0">
+  <w:abstractNum w:abstractNumId="35" w15:restartNumberingAfterBreak="0">
     <w:nsid w:val="5BD721F0"/>
     <w:multiLevelType w:val="multilevel"/>
     <w:tmpl w:val="33F809F0"/>
@@ -7988,7 +10149,7 @@
       </w:rPr>
     </w:lvl>
   </w:abstractNum>
-  <w:abstractNum w:abstractNumId="31" w15:restartNumberingAfterBreak="0">
+  <w:abstractNum w:abstractNumId="36" w15:restartNumberingAfterBreak="0">
     <w:nsid w:val="5BE36AB3"/>
     <w:multiLevelType w:val="multilevel"/>
     <w:tmpl w:val="309E84D2"/>
@@ -8137,7 +10298,120 @@
       </w:rPr>
     </w:lvl>
   </w:abstractNum>
-  <w:abstractNum w:abstractNumId="32" w15:restartNumberingAfterBreak="0">
+  <w:abstractNum w:abstractNumId="37" w15:restartNumberingAfterBreak="0">
+    <w:nsid w:val="5C697116"/>
+    <w:multiLevelType w:val="hybridMultilevel"/>
+    <w:tmpl w:val="631EE3C8"/>
+    <w:lvl w:ilvl="0" w:tplc="240A0001">
+      <w:start w:val="1"/>
+      <w:numFmt w:val="bullet"/>
+      <w:lvlText w:val=""/>
+      <w:lvlJc w:val="left"/>
+      <w:pPr>
+        <w:ind w:left="1080" w:hanging="360"/>
+      </w:pPr>
+      <w:rPr>
+        <w:rFonts w:ascii="Symbol" w:hAnsi="Symbol" w:hint="default"/>
+      </w:rPr>
+    </w:lvl>
+    <w:lvl w:ilvl="1" w:tplc="240A0003" w:tentative="1">
+      <w:start w:val="1"/>
+      <w:numFmt w:val="bullet"/>
+      <w:lvlText w:val="o"/>
+      <w:lvlJc w:val="left"/>
+      <w:pPr>
+        <w:ind w:left="1800" w:hanging="360"/>
+      </w:pPr>
+      <w:rPr>
+        <w:rFonts w:ascii="Courier New" w:hAnsi="Courier New" w:cs="Courier New" w:hint="default"/>
+      </w:rPr>
+    </w:lvl>
+    <w:lvl w:ilvl="2" w:tplc="240A0005" w:tentative="1">
+      <w:start w:val="1"/>
+      <w:numFmt w:val="bullet"/>
+      <w:lvlText w:val=""/>
+      <w:lvlJc w:val="left"/>
+      <w:pPr>
+        <w:ind w:left="2520" w:hanging="360"/>
+      </w:pPr>
+      <w:rPr>
+        <w:rFonts w:ascii="Wingdings" w:hAnsi="Wingdings" w:hint="default"/>
+      </w:rPr>
+    </w:lvl>
+    <w:lvl w:ilvl="3" w:tplc="240A0001" w:tentative="1">
+      <w:start w:val="1"/>
+      <w:numFmt w:val="bullet"/>
+      <w:lvlText w:val=""/>
+      <w:lvlJc w:val="left"/>
+      <w:pPr>
+        <w:ind w:left="3240" w:hanging="360"/>
+      </w:pPr>
+      <w:rPr>
+        <w:rFonts w:ascii="Symbol" w:hAnsi="Symbol" w:hint="default"/>
+      </w:rPr>
+    </w:lvl>
+    <w:lvl w:ilvl="4" w:tplc="240A0003" w:tentative="1">
+      <w:start w:val="1"/>
+      <w:numFmt w:val="bullet"/>
+      <w:lvlText w:val="o"/>
+      <w:lvlJc w:val="left"/>
+      <w:pPr>
+        <w:ind w:left="3960" w:hanging="360"/>
+      </w:pPr>
+      <w:rPr>
+        <w:rFonts w:ascii="Courier New" w:hAnsi="Courier New" w:cs="Courier New" w:hint="default"/>
+      </w:rPr>
+    </w:lvl>
+    <w:lvl w:ilvl="5" w:tplc="240A0005" w:tentative="1">
+      <w:start w:val="1"/>
+      <w:numFmt w:val="bullet"/>
+      <w:lvlText w:val=""/>
+      <w:lvlJc w:val="left"/>
+      <w:pPr>
+        <w:ind w:left="4680" w:hanging="360"/>
+      </w:pPr>
+      <w:rPr>
+        <w:rFonts w:ascii="Wingdings" w:hAnsi="Wingdings" w:hint="default"/>
+      </w:rPr>
+    </w:lvl>
+    <w:lvl w:ilvl="6" w:tplc="240A0001" w:tentative="1">
+      <w:start w:val="1"/>
+      <w:numFmt w:val="bullet"/>
+      <w:lvlText w:val=""/>
+      <w:lvlJc w:val="left"/>
+      <w:pPr>
+        <w:ind w:left="5400" w:hanging="360"/>
+      </w:pPr>
+      <w:rPr>
+        <w:rFonts w:ascii="Symbol" w:hAnsi="Symbol" w:hint="default"/>
+      </w:rPr>
+    </w:lvl>
+    <w:lvl w:ilvl="7" w:tplc="240A0003" w:tentative="1">
+      <w:start w:val="1"/>
+      <w:numFmt w:val="bullet"/>
+      <w:lvlText w:val="o"/>
+      <w:lvlJc w:val="left"/>
+      <w:pPr>
+        <w:ind w:left="6120" w:hanging="360"/>
+      </w:pPr>
+      <w:rPr>
+        <w:rFonts w:ascii="Courier New" w:hAnsi="Courier New" w:cs="Courier New" w:hint="default"/>
+      </w:rPr>
+    </w:lvl>
+    <w:lvl w:ilvl="8" w:tplc="240A0005" w:tentative="1">
+      <w:start w:val="1"/>
+      <w:numFmt w:val="bullet"/>
+      <w:lvlText w:val=""/>
+      <w:lvlJc w:val="left"/>
+      <w:pPr>
+        <w:ind w:left="6840" w:hanging="360"/>
+      </w:pPr>
+      <w:rPr>
+        <w:rFonts w:ascii="Wingdings" w:hAnsi="Wingdings" w:hint="default"/>
+      </w:rPr>
+    </w:lvl>
+  </w:abstractNum>
+  <w:abstractNum w:abstractNumId="38" w15:restartNumberingAfterBreak="0">
     <w:nsid w:val="5E4B3584"/>
     <w:multiLevelType w:val="hybridMultilevel"/>
     <w:tmpl w:val="B25CFA1C"/>
@@ -8250,7 +10524,7 @@
       </w:rPr>
     </w:lvl>
   </w:abstractNum>
-  <w:abstractNum w:abstractNumId="33" w15:restartNumberingAfterBreak="0">
+  <w:abstractNum w:abstractNumId="39" w15:restartNumberingAfterBreak="0">
     <w:nsid w:val="5F2E2D37"/>
     <w:multiLevelType w:val="multilevel"/>
     <w:tmpl w:val="889E9256"/>
@@ -8399,7 +10673,7 @@
       </w:rPr>
     </w:lvl>
   </w:abstractNum>
-  <w:abstractNum w:abstractNumId="34" w15:restartNumberingAfterBreak="0">
+  <w:abstractNum w:abstractNumId="40" w15:restartNumberingAfterBreak="0">
     <w:nsid w:val="604B5C22"/>
     <w:multiLevelType w:val="hybridMultilevel"/>
     <w:tmpl w:val="7AB6367C"/>
@@ -8512,7 +10786,7 @@
       </w:rPr>
     </w:lvl>
   </w:abstractNum>
-  <w:abstractNum w:abstractNumId="35" w15:restartNumberingAfterBreak="0">
+  <w:abstractNum w:abstractNumId="41" w15:restartNumberingAfterBreak="0">
     <w:nsid w:val="60586D04"/>
     <w:multiLevelType w:val="multilevel"/>
     <w:tmpl w:val="EB40BB90"/>
@@ -8661,7 +10935,7 @@
       </w:rPr>
     </w:lvl>
   </w:abstractNum>
-  <w:abstractNum w:abstractNumId="36" w15:restartNumberingAfterBreak="0">
+  <w:abstractNum w:abstractNumId="42" w15:restartNumberingAfterBreak="0">
     <w:nsid w:val="6611690C"/>
     <w:multiLevelType w:val="hybridMultilevel"/>
     <w:tmpl w:val="69D44F0A"/>
@@ -8774,7 +11048,7 @@
       </w:rPr>
     </w:lvl>
   </w:abstractNum>
-  <w:abstractNum w:abstractNumId="37" w15:restartNumberingAfterBreak="0">
+  <w:abstractNum w:abstractNumId="43" w15:restartNumberingAfterBreak="0">
     <w:nsid w:val="68280189"/>
     <w:multiLevelType w:val="hybridMultilevel"/>
     <w:tmpl w:val="16729304"/>
@@ -8887,7 +11161,7 @@
       </w:rPr>
     </w:lvl>
   </w:abstractNum>
-  <w:abstractNum w:abstractNumId="38" w15:restartNumberingAfterBreak="0">
+  <w:abstractNum w:abstractNumId="44" w15:restartNumberingAfterBreak="0">
     <w:nsid w:val="6BF2715A"/>
     <w:multiLevelType w:val="multilevel"/>
     <w:tmpl w:val="AEC42A86"/>
@@ -9000,7 +11274,7 @@
       </w:pPr>
     </w:lvl>
   </w:abstractNum>
-  <w:abstractNum w:abstractNumId="39" w15:restartNumberingAfterBreak="0">
+  <w:abstractNum w:abstractNumId="45" w15:restartNumberingAfterBreak="0">
     <w:nsid w:val="6C57047E"/>
     <w:multiLevelType w:val="multilevel"/>
     <w:tmpl w:val="19CAB288"/>
@@ -9149,7 +11423,7 @@
       </w:rPr>
     </w:lvl>
   </w:abstractNum>
-  <w:abstractNum w:abstractNumId="40" w15:restartNumberingAfterBreak="0">
+  <w:abstractNum w:abstractNumId="46" w15:restartNumberingAfterBreak="0">
     <w:nsid w:val="6C5828B1"/>
     <w:multiLevelType w:val="hybridMultilevel"/>
     <w:tmpl w:val="9BACA330"/>
@@ -9262,7 +11536,7 @@
       </w:rPr>
     </w:lvl>
   </w:abstractNum>
-  <w:abstractNum w:abstractNumId="41" w15:restartNumberingAfterBreak="0">
+  <w:abstractNum w:abstractNumId="47" w15:restartNumberingAfterBreak="0">
     <w:nsid w:val="6EEB7D62"/>
     <w:multiLevelType w:val="multilevel"/>
     <w:tmpl w:val="FBF0E09E"/>
@@ -9411,7 +11685,7 @@
       </w:rPr>
     </w:lvl>
   </w:abstractNum>
-  <w:abstractNum w:abstractNumId="42" w15:restartNumberingAfterBreak="0">
+  <w:abstractNum w:abstractNumId="48" w15:restartNumberingAfterBreak="0">
     <w:nsid w:val="78232C45"/>
     <w:multiLevelType w:val="multilevel"/>
     <w:tmpl w:val="2D767BA6"/>
@@ -9561,103 +11835,103 @@
     </w:lvl>
   </w:abstractNum>
   <w:num w:numId="1">
-    <w:abstractNumId w:val="33"/>
+    <w:abstractNumId w:val="39"/>
   </w:num>
   <w:num w:numId="2">
-    <w:abstractNumId w:val="38"/>
+    <w:abstractNumId w:val="44"/>
   </w:num>
   <w:num w:numId="3">
-    <w:abstractNumId w:val="21"/>
+    <w:abstractNumId w:val="24"/>
   </w:num>
   <w:num w:numId="4">
     <w:abstractNumId w:val="9"/>
   </w:num>
   <w:num w:numId="5">
-    <w:abstractNumId w:val="29"/>
+    <w:abstractNumId w:val="34"/>
   </w:num>
   <w:num w:numId="6">
-    <w:abstractNumId w:val="24"/>
+    <w:abstractNumId w:val="27"/>
   </w:num>
   <w:num w:numId="7">
-    <w:abstractNumId w:val="25"/>
+    <w:abstractNumId w:val="28"/>
   </w:num>
   <w:num w:numId="8">
     <w:abstractNumId w:val="6"/>
   </w:num>
   <w:num w:numId="9">
-    <w:abstractNumId w:val="23"/>
+    <w:abstractNumId w:val="26"/>
   </w:num>
   <w:num w:numId="10">
-    <w:abstractNumId w:val="16"/>
+    <w:abstractNumId w:val="18"/>
   </w:num>
   <w:num w:numId="11">
     <w:abstractNumId w:val="11"/>
   </w:num>
   <w:num w:numId="12">
-    <w:abstractNumId w:val="22"/>
+    <w:abstractNumId w:val="25"/>
   </w:num>
   <w:num w:numId="13">
-    <w:abstractNumId w:val="39"/>
+    <w:abstractNumId w:val="45"/>
   </w:num>
   <w:num w:numId="14">
-    <w:abstractNumId w:val="26"/>
+    <w:abstractNumId w:val="29"/>
   </w:num>
   <w:num w:numId="15">
     <w:abstractNumId w:val="3"/>
   </w:num>
   <w:num w:numId="16">
-    <w:abstractNumId w:val="42"/>
+    <w:abstractNumId w:val="48"/>
   </w:num>
   <w:num w:numId="17">
-    <w:abstractNumId w:val="40"/>
+    <w:abstractNumId w:val="46"/>
   </w:num>
   <w:num w:numId="18">
-    <w:abstractNumId w:val="35"/>
+    <w:abstractNumId w:val="41"/>
   </w:num>
   <w:num w:numId="19">
-    <w:abstractNumId w:val="27"/>
+    <w:abstractNumId w:val="30"/>
   </w:num>
   <w:num w:numId="20">
-    <w:abstractNumId w:val="36"/>
+    <w:abstractNumId w:val="42"/>
   </w:num>
   <w:num w:numId="21">
     <w:abstractNumId w:val="7"/>
   </w:num>
   <w:num w:numId="22">
-    <w:abstractNumId w:val="28"/>
+    <w:abstractNumId w:val="32"/>
   </w:num>
   <w:num w:numId="23">
-    <w:abstractNumId w:val="37"/>
+    <w:abstractNumId w:val="43"/>
   </w:num>
   <w:num w:numId="24">
-    <w:abstractNumId w:val="32"/>
+    <w:abstractNumId w:val="38"/>
   </w:num>
   <w:num w:numId="25">
-    <w:abstractNumId w:val="13"/>
+    <w:abstractNumId w:val="14"/>
   </w:num>
   <w:num w:numId="26">
-    <w:abstractNumId w:val="14"/>
+    <w:abstractNumId w:val="16"/>
   </w:num>
   <w:num w:numId="27">
-    <w:abstractNumId w:val="30"/>
+    <w:abstractNumId w:val="35"/>
   </w:num>
   <w:num w:numId="28">
-    <w:abstractNumId w:val="34"/>
+    <w:abstractNumId w:val="40"/>
   </w:num>
   <w:num w:numId="29">
-    <w:abstractNumId w:val="18"/>
+    <w:abstractNumId w:val="20"/>
   </w:num>
   <w:num w:numId="30">
     <w:abstractNumId w:val="2"/>
   </w:num>
   <w:num w:numId="31">
-    <w:abstractNumId w:val="20"/>
+    <w:abstractNumId w:val="23"/>
   </w:num>
   <w:num w:numId="32">
     <w:abstractNumId w:val="10"/>
   </w:num>
   <w:num w:numId="33">
-    <w:abstractNumId w:val="19"/>
+    <w:abstractNumId w:val="22"/>
   </w:num>
   <w:num w:numId="34">
     <w:abstractNumId w:val="5"/>
@@ -9666,13 +11940,13 @@
     <w:abstractNumId w:val="0"/>
   </w:num>
   <w:num w:numId="36">
-    <w:abstractNumId w:val="15"/>
+    <w:abstractNumId w:val="17"/>
   </w:num>
   <w:num w:numId="37">
-    <w:abstractNumId w:val="31"/>
+    <w:abstractNumId w:val="36"/>
   </w:num>
   <w:num w:numId="38">
-    <w:abstractNumId w:val="41"/>
+    <w:abstractNumId w:val="47"/>
   </w:num>
   <w:num w:numId="39">
     <w:abstractNumId w:val="1"/>
@@ -9684,17 +11958,35 @@
     <w:abstractNumId w:val="4"/>
   </w:num>
   <w:num w:numId="42">
-    <w:abstractNumId w:val="17"/>
+    <w:abstractNumId w:val="19"/>
   </w:num>
   <w:num w:numId="43">
+    <w:abstractNumId w:val="13"/>
+  </w:num>
+  <w:num w:numId="44">
+    <w:abstractNumId w:val="31"/>
+  </w:num>
+  <w:num w:numId="45">
     <w:abstractNumId w:val="12"/>
+  </w:num>
+  <w:num w:numId="46">
+    <w:abstractNumId w:val="37"/>
+  </w:num>
+  <w:num w:numId="47">
+    <w:abstractNumId w:val="21"/>
+  </w:num>
+  <w:num w:numId="48">
+    <w:abstractNumId w:val="33"/>
+  </w:num>
+  <w:num w:numId="49">
+    <w:abstractNumId w:val="15"/>
   </w:num>
   <w:numIdMacAtCleanup w:val="16"/>
 </w:numbering>
 </file>
 
 <file path=word/styles.xml><?xml version="1.0" encoding="utf-8"?>
-<w:styles xmlns:mc="http://schemas.openxmlformats.org/markup-compatibility/2006" xmlns:r="http://schemas.openxmlformats.org/officeDocument/2006/relationships" xmlns:w="http://schemas.openxmlformats.org/wordprocessingml/2006/main" xmlns:w14="http://schemas.microsoft.com/office/word/2010/wordml" xmlns:w15="http://schemas.microsoft.com/office/word/2012/wordml" xmlns:w16se="http://schemas.microsoft.com/office/word/2015/wordml/symex" mc:Ignorable="w14 w15 w16se">
+<w:styles xmlns:mc="http://schemas.openxmlformats.org/markup-compatibility/2006" xmlns:r="http://schemas.openxmlformats.org/officeDocument/2006/relationships" xmlns:w="http://schemas.openxmlformats.org/wordprocessingml/2006/main" xmlns:w14="http://schemas.microsoft.com/office/word/2010/wordml" xmlns:w15="http://schemas.microsoft.com/office/word/2012/wordml" xmlns:w16cex="http://schemas.microsoft.com/office/word/2018/wordml/cex" xmlns:w16cid="http://schemas.microsoft.com/office/word/2016/wordml/cid" xmlns:w16="http://schemas.microsoft.com/office/word/2018/wordml" xmlns:w16sdtdh="http://schemas.microsoft.com/office/word/2020/wordml/sdtdatahash" xmlns:w16se="http://schemas.microsoft.com/office/word/2015/wordml/symex" mc:Ignorable="w14 w15 w16se w16cid w16 w16cex w16sdtdh">
   <w:docDefaults>
     <w:rPrDefault>
       <w:rPr>
@@ -9706,7 +11998,7 @@
     </w:rPrDefault>
     <w:pPrDefault/>
   </w:docDefaults>
-  <w:latentStyles w:defLockedState="0" w:defUIPriority="99" w:defSemiHidden="0" w:defUnhideWhenUsed="0" w:defQFormat="0" w:count="371">
+  <w:latentStyles w:defLockedState="0" w:defUIPriority="99" w:defSemiHidden="0" w:defUnhideWhenUsed="0" w:defQFormat="0" w:count="376">
     <w:lsdException w:name="Normal" w:uiPriority="0" w:qFormat="1"/>
     <w:lsdException w:name="heading 1" w:uiPriority="9" w:qFormat="1"/>
     <w:lsdException w:name="heading 2" w:semiHidden="1" w:uiPriority="9" w:unhideWhenUsed="1" w:qFormat="1"/>
@@ -9812,7 +12104,6 @@
     <w:lsdException w:name="HTML Sample" w:semiHidden="1" w:unhideWhenUsed="1"/>
     <w:lsdException w:name="HTML Typewriter" w:semiHidden="1" w:unhideWhenUsed="1"/>
     <w:lsdException w:name="HTML Variable" w:semiHidden="1" w:unhideWhenUsed="1"/>
-    <w:lsdException w:name="Normal Table" w:semiHidden="1" w:unhideWhenUsed="1"/>
     <w:lsdException w:name="annotation subject" w:semiHidden="1" w:unhideWhenUsed="1"/>
     <w:lsdException w:name="No List" w:semiHidden="1" w:unhideWhenUsed="1"/>
     <w:lsdException w:name="Outline List 1" w:semiHidden="1" w:unhideWhenUsed="1"/>
@@ -9855,11 +12146,8 @@
     <w:lsdException w:name="Table Contemporary" w:semiHidden="1" w:unhideWhenUsed="1"/>
     <w:lsdException w:name="Table Elegant" w:semiHidden="1" w:unhideWhenUsed="1"/>
     <w:lsdException w:name="Table Professional" w:semiHidden="1" w:unhideWhenUsed="1"/>
-    <w:lsdException w:name="Table Subtle 1" w:semiHidden="1" w:unhideWhenUsed="1"/>
     <w:lsdException w:name="Table Subtle 2" w:semiHidden="1" w:unhideWhenUsed="1"/>
     <w:lsdException w:name="Table Web 1" w:semiHidden="1" w:unhideWhenUsed="1"/>
-    <w:lsdException w:name="Table Web 2" w:semiHidden="1" w:unhideWhenUsed="1"/>
-    <w:lsdException w:name="Table Web 3" w:semiHidden="1" w:unhideWhenUsed="1"/>
     <w:lsdException w:name="Balloon Text" w:semiHidden="1" w:unhideWhenUsed="1"/>
     <w:lsdException w:name="Table Grid" w:uiPriority="39"/>
     <w:lsdException w:name="Table Theme" w:semiHidden="1" w:unhideWhenUsed="1"/>
@@ -10078,6 +12366,11 @@
     <w:lsdException w:name="List Table 5 Dark Accent 6" w:uiPriority="50"/>
     <w:lsdException w:name="List Table 6 Colorful Accent 6" w:uiPriority="51"/>
     <w:lsdException w:name="List Table 7 Colorful Accent 6" w:uiPriority="52"/>
+    <w:lsdException w:name="Mention" w:semiHidden="1" w:unhideWhenUsed="1"/>
+    <w:lsdException w:name="Smart Hyperlink" w:semiHidden="1" w:unhideWhenUsed="1"/>
+    <w:lsdException w:name="Hashtag" w:semiHidden="1" w:unhideWhenUsed="1"/>
+    <w:lsdException w:name="Unresolved Mention" w:semiHidden="1" w:unhideWhenUsed="1"/>
+    <w:lsdException w:name="Smart Link" w:semiHidden="1" w:unhideWhenUsed="1"/>
   </w:latentStyles>
   <w:style w:type="paragraph" w:default="1" w:styleId="Normal">
     <w:name w:val="Normal"/>

</xml_diff>